<commit_message>
Deepen Chapter 4: Sera's crack, joy callback, Kael's dread, organism foreshadowing
- Sera gets a physical tell (white-knuckled grip, Wick's concern) when
  she hears about the Thirty-First, hinting Pellan-V is personal
- Choir's joy now explicitly contrasts with Miro's forced-laughter
  from Ch2, closing the loop on weaponized vs genuine frequency
- Kael privately tallies his resources against a ghost fleet, seeding
  Chapter 5 tension
- Colonial organisms shown actively draining gravitic energy from
  nodes; Wick's lingering attention flags them as tactically important
  (Chekhov's gun for the Thirty-First confrontation)

https://claude.ai/code/session_01XVZGKMeTpqLFzCVEmX6JZq
</commit_message>
<xml_diff>
--- a/The_Wildtongue_Chronicles.docx
+++ b/The_Wildtongue_Chronicles.docx
@@ -4953,20 +4953,48 @@
           <w:b w:val="0"/>
           <w:i w:val="0"/>
         </w:rPr>
-        <w:t>Sera listened without interruption. When he finished, she was quiet for a long time.</w:t>
-      </w:r>
-    </w:p>
-    <w:p>
-      <w:pPr>
-        <w:spacing w:before="40" w:after="40"/>
-        <w:ind w:firstLine="432"/>
-      </w:pPr>
-      <w:r>
-        <w:rPr>
-          <w:b w:val="0"/>
-          <w:i w:val="0"/>
-        </w:rPr>
-        <w:t>"The Thirty-First," she said finally. "I've encountered their work before. A colony on Pellan-V — indigenous population relocated overnight. Official records said voluntary resettlement. The ground still had scorch marks." She looked at the cage. "If this is their operation, then it was authorized at the highest level of Union military command. Which means the Union itself is in violation of the Accord."</w:t>
+        <w:t xml:space="preserve">Sera listened without interruption. When he finished, she was quiet for a long time. Her right hand had come to rest on the console edge during the telling, and Kael noticed — because noticing was what kept him alive — that her knuckles had gone pale. Not a fist. Just a grip, slightly too tight, held slightly too long. Wick shifted on her shoulder, pressing closer to her neck, and his frequency dimmed to something Kael hadn't felt from the owl before: not assessment, not cataloguing. </w:t>
+      </w:r>
+      <w:r>
+        <w:rPr>
+          <w:b w:val="0"/>
+          <w:i/>
+        </w:rPr>
+        <w:t>Concern.</w:t>
+      </w:r>
+      <w:r>
+        <w:rPr>
+          <w:b w:val="0"/>
+          <w:i w:val="0"/>
+        </w:rPr>
+        <w:t xml:space="preserve"> Directed inward, at his own bonded partner.</w:t>
+      </w:r>
+    </w:p>
+    <w:p>
+      <w:pPr>
+        <w:spacing w:before="40" w:after="40"/>
+        <w:ind w:firstLine="432"/>
+      </w:pPr>
+      <w:r>
+        <w:rPr>
+          <w:b w:val="0"/>
+          <w:i w:val="0"/>
+        </w:rPr>
+        <w:t xml:space="preserve">"The Thirty-First," she said finally. Her voice was the same — level, precise, judicial. But there was a breath before </w:t>
+      </w:r>
+      <w:r>
+        <w:rPr>
+          <w:b w:val="0"/>
+          <w:i/>
+        </w:rPr>
+        <w:t>Thirty-First</w:t>
+      </w:r>
+      <w:r>
+        <w:rPr>
+          <w:b w:val="0"/>
+          <w:i w:val="0"/>
+        </w:rPr>
+        <w:t xml:space="preserve"> that shouldn't have been there, a half-second gap where the machinery of her composure had to catch and re-engage. "I've encountered their work before. A colony on Pellan-V — indigenous population relocated overnight. Official records said voluntary resettlement. The ground still had scorch marks." Her hand released the console. She didn't look at it, didn't acknowledge the grip, but Kael saw the blood return to her fingers. Whatever Pellan-V was to her, it wasn't just a case file. "If this is their operation, then it was authorized at the highest level of Union military command. Which means the Union itself is in violation of the Accord."</w:t>
       </w:r>
     </w:p>
     <w:p>
@@ -5507,7 +5535,33 @@
           <w:b w:val="0"/>
           <w:i w:val="0"/>
         </w:rPr>
-        <w:t xml:space="preserve">One of the organisms detached from the cage strut and drifted past the viewport — a small, luminous thing, trailing its fronds, pulsing violet. Talon tracked it with predatory focus. Wick tracked it with academic interest. The two frequencies — </w:t>
+        <w:t>One of the organisms detached from the cage strut and drifted past the viewport — a small, luminous thing, trailing its fronds, pulsing violet. As it drifted near a still-active node, something happened. The organism's fronds flared wide and the violet glow intensified, and the node beside it flickered — dimmed — as though the creature had drawn the energy out of it like a sponge pulling water from stone. The gravitic field around that node visibly warped, bending the particulate in the water, before the organism released and drifted on, still pulsing, brighter than before.</w:t>
+      </w:r>
+    </w:p>
+    <w:p>
+      <w:pPr>
+        <w:spacing w:before="40" w:after="40"/>
+        <w:ind w:firstLine="432"/>
+      </w:pPr>
+      <w:r>
+        <w:rPr>
+          <w:b w:val="0"/>
+          <w:i w:val="0"/>
+        </w:rPr>
+        <w:t>Talon tracked it with predatory focus. Wick tracked it with something deeper — not just academic interest but the layered, multi-channel attention of a corvaxis cataloguing a new variable. His frequency pulsed in a pattern Kael hadn't heard from the owl before: dense, recursive, the same data being processed and reprocessed, as though Wick were running the observation through every analytical framework he possessed and finding it significant in all of them.</w:t>
+      </w:r>
+    </w:p>
+    <w:p>
+      <w:pPr>
+        <w:spacing w:before="40" w:after="40"/>
+        <w:ind w:firstLine="432"/>
+      </w:pPr>
+      <w:r>
+        <w:rPr>
+          <w:b w:val="0"/>
+          <w:i w:val="0"/>
+        </w:rPr>
+        <w:t xml:space="preserve">The two frequencies — </w:t>
       </w:r>
       <w:r>
         <w:rPr>
@@ -5542,20 +5596,20 @@
           <w:b w:val="0"/>
           <w:i/>
         </w:rPr>
-        <w:t>that thing is interesting.</w:t>
-      </w:r>
-    </w:p>
-    <w:p>
-      <w:pPr>
-        <w:spacing w:before="40" w:after="40"/>
-        <w:ind w:firstLine="432"/>
-      </w:pPr>
-      <w:r>
-        <w:rPr>
-          <w:b w:val="0"/>
-          <w:i w:val="0"/>
-        </w:rPr>
-        <w:t>Then the moment passed. Talon looked away. Wick didn't.</w:t>
+        <w:t>that thing is important.</w:t>
+      </w:r>
+    </w:p>
+    <w:p>
+      <w:pPr>
+        <w:spacing w:before="40" w:after="40"/>
+        <w:ind w:firstLine="432"/>
+      </w:pPr>
+      <w:r>
+        <w:rPr>
+          <w:b w:val="0"/>
+          <w:i w:val="0"/>
+        </w:rPr>
+        <w:t>Then the moment passed. Talon looked away. Wick didn't. The owl's head continued to track the organism long after it had faded into the dark water, and Kael filed that away too — Wick didn't linger on things that were merely interesting. He lingered on things that mattered.</w:t>
       </w:r>
     </w:p>
     <w:p>
@@ -6595,7 +6649,48 @@
           <w:b w:val="0"/>
           <w:i w:val="0"/>
         </w:rPr>
-        <w:t>Kael's eyes burned. He blinked hard and said nothing.</w:t>
+        <w:t xml:space="preserve">And it was </w:t>
+      </w:r>
+      <w:r>
+        <w:rPr>
+          <w:b w:val="0"/>
+          <w:i/>
+        </w:rPr>
+        <w:t>theirs</w:t>
+      </w:r>
+      <w:r>
+        <w:rPr>
+          <w:b w:val="0"/>
+          <w:i w:val="0"/>
+        </w:rPr>
+        <w:t xml:space="preserve">. Kael felt that distinction like a blade — clean and immediate. He remembered Miro's cracked rib, the eleven minutes of laughter that had been a weapon, a frequency shoved into a man's skull until his body betrayed him. This was the opposite. This was not forced, not aimed, not desperate. This was forty-seven beings feeling something so large they couldn't contain it, and the overflow washing across everything nearby like light from a star. The same species. The same capability. Used not to compel, but simply to </w:t>
+      </w:r>
+      <w:r>
+        <w:rPr>
+          <w:b w:val="0"/>
+          <w:i/>
+        </w:rPr>
+        <w:t>be</w:t>
+      </w:r>
+      <w:r>
+        <w:rPr>
+          <w:b w:val="0"/>
+          <w:i w:val="0"/>
+        </w:rPr>
+        <w:t>. Kael understood, then, how afraid they must have been — to have turned that gift into a weapon at all.</w:t>
+      </w:r>
+    </w:p>
+    <w:p>
+      <w:pPr>
+        <w:spacing w:before="40" w:after="40"/>
+        <w:ind w:firstLine="432"/>
+      </w:pPr>
+      <w:r>
+        <w:rPr>
+          <w:b w:val="0"/>
+          <w:i w:val="0"/>
+        </w:rPr>
+        <w:t>His eyes burned. He blinked hard and said nothing.</w:t>
       </w:r>
     </w:p>
     <w:p>
@@ -6980,6 +7075,59 @@
           <w:i w:val="0"/>
         </w:rPr>
         <w:t>Of what was coming from above.</w:t>
+      </w:r>
+    </w:p>
+    <w:p>
+      <w:pPr>
+        <w:spacing w:before="40" w:after="40"/>
+        <w:ind w:firstLine="432"/>
+      </w:pPr>
+      <w:r>
+        <w:rPr>
+          <w:b w:val="0"/>
+          <w:i w:val="0"/>
+        </w:rPr>
+        <w:t>Kael let the frequency fade and opened his eyes. Through the viewport, the Choir's light painted the water in slow, vast brushstrokes — beautiful, impossibly fragile for all its scale. He did the math the way he always did, quietly, without sharing. One ship held together by illegal solder. One Lawkeeper interceptor built for speed, not sustained combat. One xenobiologist in a damp EVA suit. One Lawkeeper who gripped consoles too hard when she thought no one was looking. A hawk and an owl who couldn't agree on anything. And forty-seven beings the size of city districts who had spent two years starving and could barely hold their song together.</w:t>
+      </w:r>
+    </w:p>
+    <w:p>
+      <w:pPr>
+        <w:spacing w:before="40" w:after="40"/>
+        <w:ind w:firstLine="432"/>
+      </w:pPr>
+      <w:r>
+        <w:rPr>
+          <w:b w:val="0"/>
+          <w:i w:val="0"/>
+        </w:rPr>
+        <w:t>Against the Thirty-First Strategic Fleet. A ghost division with black-budget warships and the institutional will to cage a sentient species for a weapon.</w:t>
+      </w:r>
+    </w:p>
+    <w:p>
+      <w:pPr>
+        <w:spacing w:before="40" w:after="40"/>
+        <w:ind w:firstLine="432"/>
+      </w:pPr>
+      <w:r>
+        <w:rPr>
+          <w:b w:val="0"/>
+          <w:i w:val="0"/>
+        </w:rPr>
+        <w:t xml:space="preserve">He'd had worse odds. He was almost sure of it. But sitting in the pilot's seat of the </w:t>
+      </w:r>
+      <w:r>
+        <w:rPr>
+          <w:b w:val="0"/>
+          <w:i/>
+        </w:rPr>
+        <w:t>Fang &amp; Fable</w:t>
+      </w:r>
+      <w:r>
+        <w:rPr>
+          <w:b w:val="0"/>
+          <w:i w:val="0"/>
+        </w:rPr>
+        <w:t>, listening to the song of something ancient and grateful and afraid, he couldn't remember when.</w:t>
       </w:r>
     </w:p>
     <w:sectPr>

</xml_diff>

<commit_message>
Add Chapter 5: The Requiem
The emotional heart of the book. The Note Between — the Choir member
who shielded Miro — dies from two years of starvation. The Choir sings
a requiem that absorbs the dying voice into the collective. Miro
breaks open about his research being used to build cages. Kael shares
his own parallel loss (the Ryllian sea-elk). Sera's mask cracks
further. Then the dead man's switch in the data core reveals the
Thirty-First has known for hours — eight warships are descending.

https://claude.ai/code/session_01XVZGKMeTpqLFzCVEmX6JZq
</commit_message>
<xml_diff>
--- a/The_Wildtongue_Chronicles.docx
+++ b/The_Wildtongue_Chronicles.docx
@@ -7128,6 +7128,1671 @@
           <w:i w:val="0"/>
         </w:rPr>
         <w:t>, listening to the song of something ancient and grateful and afraid, he couldn't remember when.</w:t>
+      </w:r>
+    </w:p>
+    <w:p>
+      <w:r>
+        <w:br w:type="page"/>
+      </w:r>
+    </w:p>
+    <w:p>
+      <w:pPr>
+        <w:spacing w:before="960" w:after="480"/>
+        <w:jc w:val="center"/>
+      </w:pPr>
+      <w:r>
+        <w:rPr>
+          <w:rFonts w:ascii="Georgia" w:hAnsi="Georgia"/>
+          <w:b/>
+          <w:sz w:val="36"/>
+        </w:rPr>
+        <w:t>CHAPTER 5 — THE REQUIEM</w:t>
+      </w:r>
+    </w:p>
+    <w:p>
+      <w:pPr>
+        <w:spacing w:before="40" w:after="40"/>
+        <w:ind w:firstLine="432"/>
+      </w:pPr>
+      <w:r>
+        <w:rPr>
+          <w:b w:val="0"/>
+          <w:i w:val="0"/>
+        </w:rPr>
+        <w:t>They brought Miro back aboard and he didn't say anything funny for almost three minutes. That was how Kael knew it had been worse out there than the comm chatter suggested.</w:t>
+      </w:r>
+    </w:p>
+    <w:p>
+      <w:pPr>
+        <w:spacing w:before="40" w:after="40"/>
+        <w:ind w:firstLine="432"/>
+      </w:pPr>
+      <w:r>
+        <w:rPr>
+          <w:b w:val="0"/>
+          <w:i w:val="0"/>
+        </w:rPr>
+        <w:t>Miro sat on the cockpit floor, EVA helmet in his lap, staring at nothing. Water dripped from the suit's joints, pooling around him in small dark puddles that the ship's drain grates slowly swallowed. His hands were steady — they were always steady — but the rest of him had gone somewhere far away.</w:t>
+      </w:r>
+    </w:p>
+    <w:p>
+      <w:pPr>
+        <w:spacing w:before="40" w:after="40"/>
+        <w:ind w:firstLine="432"/>
+      </w:pPr>
+      <w:r>
+        <w:rPr>
+          <w:b w:val="0"/>
+          <w:i w:val="0"/>
+        </w:rPr>
+        <w:t>"Miro."</w:t>
+      </w:r>
+    </w:p>
+    <w:p>
+      <w:pPr>
+        <w:spacing w:before="40" w:after="40"/>
+        <w:ind w:firstLine="432"/>
+      </w:pPr>
+      <w:r>
+        <w:rPr>
+          <w:b w:val="0"/>
+          <w:i w:val="0"/>
+        </w:rPr>
+        <w:t>Nothing.</w:t>
+      </w:r>
+    </w:p>
+    <w:p>
+      <w:pPr>
+        <w:spacing w:before="40" w:after="40"/>
+        <w:ind w:firstLine="432"/>
+      </w:pPr>
+      <w:r>
+        <w:rPr>
+          <w:b w:val="0"/>
+          <w:i w:val="0"/>
+        </w:rPr>
+        <w:t>"Miro."</w:t>
+      </w:r>
+    </w:p>
+    <w:p>
+      <w:pPr>
+        <w:spacing w:before="40" w:after="40"/>
+        <w:ind w:firstLine="432"/>
+      </w:pPr>
+      <w:r>
+        <w:rPr>
+          <w:b w:val="0"/>
+          <w:i w:val="0"/>
+        </w:rPr>
+        <w:t>He blinked. Looked up. "Sorry. I was — when the gravity spiked, one of them moved over me. Shielded me. Before Sera's counter-field hit. One of the Choir put part of its body between me and the nodes." He swallowed. "It was already starving. Already weak. And it spent energy it didn't have to cover a stranger in a white suit it had no reason to protect."</w:t>
+      </w:r>
+    </w:p>
+    <w:p>
+      <w:pPr>
+        <w:spacing w:before="40" w:after="40"/>
+        <w:ind w:firstLine="432"/>
+      </w:pPr>
+      <w:r>
+        <w:rPr>
+          <w:b w:val="0"/>
+          <w:i w:val="0"/>
+        </w:rPr>
+        <w:t>"They understood what you were doing."</w:t>
+      </w:r>
+    </w:p>
+    <w:p>
+      <w:pPr>
+        <w:spacing w:before="40" w:after="40"/>
+        <w:ind w:firstLine="432"/>
+      </w:pPr>
+      <w:r>
+        <w:rPr>
+          <w:b w:val="0"/>
+          <w:i w:val="0"/>
+        </w:rPr>
+        <w:t>"I know. That's the part I can't —" He stopped. Pressed his palms against his eyes. "I'm fine. I'm going to be fine. I just need a minute to be a person who isn't fine, and then I'll go back to being fine."</w:t>
+      </w:r>
+    </w:p>
+    <w:p>
+      <w:pPr>
+        <w:spacing w:before="40" w:after="40"/>
+        <w:ind w:firstLine="432"/>
+      </w:pPr>
+      <w:r>
+        <w:rPr>
+          <w:b w:val="0"/>
+          <w:i w:val="0"/>
+        </w:rPr>
+        <w:t>Kael sat down across from him. He didn't say anything. Didn't offer comfort or wisdom or distraction. He just sat, the way Talon sometimes sat with him after a difficult contact — present, silent, close enough to matter.</w:t>
+      </w:r>
+    </w:p>
+    <w:p>
+      <w:pPr>
+        <w:spacing w:before="40" w:after="40"/>
+        <w:ind w:firstLine="432"/>
+      </w:pPr>
+      <w:r>
+        <w:rPr>
+          <w:b w:val="0"/>
+          <w:i w:val="0"/>
+        </w:rPr>
+        <w:t>After a while, Miro lowered his hands. His eyes were red but dry.</w:t>
+      </w:r>
+    </w:p>
+    <w:p>
+      <w:pPr>
+        <w:spacing w:before="40" w:after="40"/>
+        <w:ind w:firstLine="432"/>
+      </w:pPr>
+      <w:r>
+        <w:rPr>
+          <w:b w:val="0"/>
+          <w:i w:val="0"/>
+        </w:rPr>
+        <w:t>"Okay," he said. "Okay. What's next?"</w:t>
+      </w:r>
+    </w:p>
+    <w:p>
+      <w:pPr>
+        <w:spacing w:before="320" w:after="320"/>
+        <w:jc w:val="center"/>
+      </w:pPr>
+      <w:r>
+        <w:rPr>
+          <w:rFonts w:ascii="Georgia" w:hAnsi="Georgia"/>
+          <w:color w:val="787878"/>
+          <w:sz w:val="24"/>
+        </w:rPr>
+        <w:t>* * *</w:t>
+      </w:r>
+    </w:p>
+    <w:p>
+      <w:pPr>
+        <w:spacing w:before="40" w:after="40"/>
+        <w:ind w:firstLine="432"/>
+      </w:pPr>
+      <w:r>
+        <w:rPr>
+          <w:b w:val="0"/>
+          <w:i w:val="0"/>
+        </w:rPr>
+        <w:t>What was next was the Choir dying.</w:t>
+      </w:r>
+    </w:p>
+    <w:p>
+      <w:pPr>
+        <w:spacing w:before="40" w:after="40"/>
+        <w:ind w:firstLine="432"/>
+      </w:pPr>
+      <w:r>
+        <w:rPr>
+          <w:b w:val="0"/>
+          <w:i w:val="0"/>
+        </w:rPr>
+        <w:t>Not all of them. Not yet. But the one who had shielded Miro — the one who had spent the last of its reserves protecting a creature a fraction of its size — was failing.</w:t>
+      </w:r>
+    </w:p>
+    <w:p>
+      <w:pPr>
+        <w:spacing w:before="40" w:after="40"/>
+        <w:ind w:firstLine="432"/>
+      </w:pPr>
+      <w:r>
+        <w:rPr>
+          <w:b w:val="0"/>
+          <w:i w:val="0"/>
+        </w:rPr>
+        <w:t>Kael felt it before the bioscanners confirmed it. A thinning in the frequency, like a voice going hoarse. One strand of the Choir's forty-seven-part harmony was losing coherence, its signal fraying at the edges, dropping in and out of phase with the collective. The others were compensating — closing ranks around the weakening voice, bolstering it with their own frequencies, trying to hold the song together the way you'd hold a wounded friend upright. But there was a limit. You could share strength. You couldn't share life.</w:t>
+      </w:r>
+    </w:p>
+    <w:p>
+      <w:pPr>
+        <w:spacing w:before="40" w:after="40"/>
+        <w:ind w:firstLine="432"/>
+      </w:pPr>
+      <w:r>
+        <w:rPr>
+          <w:b w:val="0"/>
+          <w:i w:val="0"/>
+        </w:rPr>
+        <w:t>"The fourth-largest individual," Miro said quietly, reading his scanner. "Two point one kilometers. Bioluminescence down to twelve percent of baseline. Internal organ function —" He stopped reading the numbers. The numbers were unkind.</w:t>
+      </w:r>
+    </w:p>
+    <w:p>
+      <w:pPr>
+        <w:spacing w:before="40" w:after="40"/>
+        <w:ind w:firstLine="432"/>
+      </w:pPr>
+      <w:r>
+        <w:rPr>
+          <w:b w:val="0"/>
+          <w:i w:val="0"/>
+        </w:rPr>
+        <w:t>Sera stood at the viewport. Wick was on her shoulder, perfectly still, his amber eyes tracking the Choir member's slow, dimming drift. The owl's frequency was doing something Kael had never encountered — recording. Layer upon layer of sensory data, compressed and archived with the precision of a court stenographer. Wick was bearing witness in the way his species had been bred for: making a record that could not be altered or denied.</w:t>
+      </w:r>
+    </w:p>
+    <w:p>
+      <w:pPr>
+        <w:spacing w:before="40" w:after="40"/>
+        <w:ind w:firstLine="432"/>
+      </w:pPr>
+      <w:r>
+        <w:rPr>
+          <w:b w:val="0"/>
+          <w:i w:val="0"/>
+        </w:rPr>
+        <w:t>"Can we help it?" Sera asked. It was the first question she'd asked that didn't sound like procedure.</w:t>
+      </w:r>
+    </w:p>
+    <w:p>
+      <w:pPr>
+        <w:spacing w:before="40" w:after="40"/>
+        <w:ind w:firstLine="432"/>
+      </w:pPr>
+      <w:r>
+        <w:rPr>
+          <w:b w:val="0"/>
+          <w:i w:val="0"/>
+        </w:rPr>
+        <w:t>"No." Kael's voice was steady but it cost him. "Two years of starvation. The gravitic compression damaged its internal structure — Miro's scans show tissue necrosis across forty percent of its body. It was dying before we got here. It just chose to spend what it had left on —"</w:t>
+      </w:r>
+    </w:p>
+    <w:p>
+      <w:pPr>
+        <w:spacing w:before="40" w:after="40"/>
+        <w:ind w:firstLine="432"/>
+      </w:pPr>
+      <w:r>
+        <w:rPr>
+          <w:b w:val="0"/>
+          <w:i w:val="0"/>
+        </w:rPr>
+        <w:t>He didn't finish. He didn't need to.</w:t>
+      </w:r>
+    </w:p>
+    <w:p>
+      <w:pPr>
+        <w:spacing w:before="40" w:after="40"/>
+        <w:ind w:firstLine="432"/>
+      </w:pPr>
+      <w:r>
+        <w:rPr>
+          <w:b w:val="0"/>
+          <w:i w:val="0"/>
+        </w:rPr>
+        <w:t>Miro stood and walked to the viewport. He put his hand on the glass — a small, useless gesture, human and instinctive, reaching toward something he couldn't touch.</w:t>
+      </w:r>
+    </w:p>
+    <w:p>
+      <w:pPr>
+        <w:spacing w:before="40" w:after="40"/>
+        <w:ind w:firstLine="432"/>
+      </w:pPr>
+      <w:r>
+        <w:rPr>
+          <w:b w:val="0"/>
+          <w:i w:val="0"/>
+        </w:rPr>
+        <w:t>"Does it have a name?" he asked.</w:t>
+      </w:r>
+    </w:p>
+    <w:p>
+      <w:pPr>
+        <w:spacing w:before="40" w:after="40"/>
+        <w:ind w:firstLine="432"/>
+      </w:pPr>
+      <w:r>
+        <w:rPr>
+          <w:b w:val="0"/>
+          <w:i w:val="0"/>
+        </w:rPr>
+        <w:t xml:space="preserve">Kael opened his frequency. Gently. A narrow channel, as careful as he could make it, directed at the Choir. He shaped the question the way the Academy had taught him — not in words but in the concept beneath words, the universal shape of </w:t>
+      </w:r>
+      <w:r>
+        <w:rPr>
+          <w:b w:val="0"/>
+          <w:i/>
+        </w:rPr>
+        <w:t>who are you</w:t>
+      </w:r>
+      <w:r>
+        <w:rPr>
+          <w:b w:val="0"/>
+          <w:i w:val="0"/>
+        </w:rPr>
+        <w:t xml:space="preserve"> that every social species understood.</w:t>
+      </w:r>
+    </w:p>
+    <w:p>
+      <w:pPr>
+        <w:spacing w:before="40" w:after="40"/>
+        <w:ind w:firstLine="432"/>
+      </w:pPr>
+      <w:r>
+        <w:rPr>
+          <w:b w:val="0"/>
+          <w:i w:val="0"/>
+        </w:rPr>
+        <w:t xml:space="preserve">The response came not from the dying member but from the collective — all forty-six healthy voices answering at once, wrapping the question in a chord so tender that Kael had to grip the armrest to stay present. They didn't use names the way humans did. Identity in the Choir was not a label but a </w:t>
+      </w:r>
+      <w:r>
+        <w:rPr>
+          <w:b w:val="0"/>
+          <w:i/>
+        </w:rPr>
+        <w:t>position</w:t>
+      </w:r>
+      <w:r>
+        <w:rPr>
+          <w:b w:val="0"/>
+          <w:i w:val="0"/>
+        </w:rPr>
+        <w:t xml:space="preserve"> — a harmonic role, the specific note each individual contributed to the collective song. What they sent him was not a word but a sound: the exact frequency this member had sung for longer than human civilization had existed. A note that fit between two others the way a keystone fits in an arch — the one that held the interval together, that made the chord resolve instead of collapse.</w:t>
+      </w:r>
+    </w:p>
+    <w:p>
+      <w:pPr>
+        <w:spacing w:before="40" w:after="40"/>
+        <w:ind w:firstLine="432"/>
+      </w:pPr>
+      <w:r>
+        <w:rPr>
+          <w:b w:val="0"/>
+          <w:i w:val="0"/>
+        </w:rPr>
+        <w:t>Kael's throat tightened. He translated the only way he could.</w:t>
+      </w:r>
+    </w:p>
+    <w:p>
+      <w:pPr>
+        <w:spacing w:before="40" w:after="40"/>
+        <w:ind w:firstLine="432"/>
+      </w:pPr>
+      <w:r>
+        <w:rPr>
+          <w:b w:val="0"/>
+          <w:i w:val="0"/>
+        </w:rPr>
+        <w:t>"The others call it — the closest I can get — the Note Between. The voice that bridges the intervals. The one that turns dissonance into harmony."</w:t>
+      </w:r>
+    </w:p>
+    <w:p>
+      <w:pPr>
+        <w:spacing w:before="40" w:after="40"/>
+        <w:ind w:firstLine="432"/>
+      </w:pPr>
+      <w:r>
+        <w:rPr>
+          <w:b w:val="0"/>
+          <w:i w:val="0"/>
+        </w:rPr>
+        <w:t>Miro's hand pressed harder against the glass.</w:t>
+      </w:r>
+    </w:p>
+    <w:p>
+      <w:pPr>
+        <w:spacing w:before="40" w:after="40"/>
+        <w:ind w:firstLine="432"/>
+      </w:pPr>
+      <w:r>
+        <w:rPr>
+          <w:b w:val="0"/>
+          <w:i w:val="0"/>
+        </w:rPr>
+        <w:t>"Of course it is," he said, his voice cracking open for the first time since Kael had known him — not a joke breaking, not a grin failing, but the thing underneath all of it, the raw and unprotected center that the humor was built to shield. "Of course the one that dies is the one that holds the rest together."</w:t>
+      </w:r>
+    </w:p>
+    <w:p>
+      <w:pPr>
+        <w:spacing w:before="320" w:after="320"/>
+        <w:jc w:val="center"/>
+      </w:pPr>
+      <w:r>
+        <w:rPr>
+          <w:rFonts w:ascii="Georgia" w:hAnsi="Georgia"/>
+          <w:color w:val="787878"/>
+          <w:sz w:val="24"/>
+        </w:rPr>
+        <w:t>* * *</w:t>
+      </w:r>
+    </w:p>
+    <w:p>
+      <w:pPr>
+        <w:spacing w:before="40" w:after="40"/>
+        <w:ind w:firstLine="432"/>
+      </w:pPr>
+      <w:r>
+        <w:rPr>
+          <w:b w:val="0"/>
+          <w:i w:val="0"/>
+        </w:rPr>
+        <w:t>The Choir gathered.</w:t>
+      </w:r>
+    </w:p>
+    <w:p>
+      <w:pPr>
+        <w:spacing w:before="40" w:after="40"/>
+        <w:ind w:firstLine="432"/>
+      </w:pPr>
+      <w:r>
+        <w:rPr>
+          <w:b w:val="0"/>
+          <w:i w:val="0"/>
+        </w:rPr>
+        <w:t>They came slowly — vast shapes converging from all directions, their bioluminescent filaments dimming to a soft, low glow as they drew close. Not the bright pulses of communication or the desperate flares of distress. Something quieter. Something that needed no translation.</w:t>
+      </w:r>
+    </w:p>
+    <w:p>
+      <w:pPr>
+        <w:spacing w:before="40" w:after="40"/>
+        <w:ind w:firstLine="432"/>
+      </w:pPr>
+      <w:r>
+        <w:rPr>
+          <w:b w:val="0"/>
+          <w:i w:val="0"/>
+        </w:rPr>
+        <w:t>They formed a ring. Forty-six beings, the smallest still larger than a starship, arranging themselves in a perfect circle around the forty-seventh. Their filaments reached inward, not quite touching the dying member but close — close enough that the light from their bodies merged at the center, creating a soft luminous haze that wrapped around the Note Between like a cocoon.</w:t>
+      </w:r>
+    </w:p>
+    <w:p>
+      <w:pPr>
+        <w:spacing w:before="40" w:after="40"/>
+        <w:ind w:firstLine="432"/>
+      </w:pPr>
+      <w:r>
+        <w:rPr>
+          <w:b w:val="0"/>
+          <w:i w:val="0"/>
+        </w:rPr>
+        <w:t>And then they sang.</w:t>
+      </w:r>
+    </w:p>
+    <w:p>
+      <w:pPr>
+        <w:spacing w:before="40" w:after="40"/>
+        <w:ind w:firstLine="432"/>
+      </w:pPr>
+      <w:r>
+        <w:rPr>
+          <w:b w:val="0"/>
+          <w:i w:val="0"/>
+        </w:rPr>
+        <w:t>Not the distress signal. Not the joyful explosion that had followed the cage's fall. This was something older — a song that Kael could tell, even through the filter of his human mind, had been sung before. Many times. Over millennia. A song with a structure worn smooth by repetition the way river stones are worn smooth by water, every phrase landing in a place that had been shaped by all the voices that had come before.</w:t>
+      </w:r>
+    </w:p>
+    <w:p>
+      <w:pPr>
+        <w:spacing w:before="40" w:after="40"/>
+        <w:ind w:firstLine="432"/>
+      </w:pPr>
+      <w:r>
+        <w:rPr>
+          <w:b w:val="0"/>
+          <w:i w:val="0"/>
+        </w:rPr>
+        <w:t>A requiem.</w:t>
+      </w:r>
+    </w:p>
+    <w:p>
+      <w:pPr>
+        <w:spacing w:before="40" w:after="40"/>
+        <w:ind w:firstLine="432"/>
+      </w:pPr>
+      <w:r>
+        <w:rPr>
+          <w:b w:val="0"/>
+          <w:i w:val="0"/>
+        </w:rPr>
+        <w:t>Kael sat cross-legged on the cockpit floor, his palms flat on the deck plates, his eyes closed. He'd opened his frequency wider than was safe — not full spectrum, not the flood that had nearly shattered him before, but wide enough to hold the shape of what was happening. Wide enough to carry it. His nose was bleeding again. He didn't wipe it.</w:t>
+      </w:r>
+    </w:p>
+    <w:p>
+      <w:pPr>
+        <w:spacing w:before="40" w:after="40"/>
+        <w:ind w:firstLine="432"/>
+      </w:pPr>
+      <w:r>
+        <w:rPr>
+          <w:b w:val="0"/>
+          <w:i w:val="0"/>
+        </w:rPr>
+        <w:t>The song was not sad.</w:t>
+      </w:r>
+    </w:p>
+    <w:p>
+      <w:pPr>
+        <w:spacing w:before="40" w:after="40"/>
+        <w:ind w:firstLine="432"/>
+      </w:pPr>
+      <w:r>
+        <w:rPr>
+          <w:b w:val="0"/>
+          <w:i w:val="0"/>
+        </w:rPr>
+        <w:t xml:space="preserve">That was the thing he couldn't have predicted. Human grief was a diminishment — a going-quiet, a collapse inward, a loss of color from the world. The Choir's grief was the opposite. It was an </w:t>
+      </w:r>
+      <w:r>
+        <w:rPr>
+          <w:b w:val="0"/>
+          <w:i/>
+        </w:rPr>
+        <w:t>expansion</w:t>
+      </w:r>
+      <w:r>
+        <w:rPr>
+          <w:b w:val="0"/>
+          <w:i w:val="0"/>
+        </w:rPr>
+        <w:t xml:space="preserve">. Each voice in the ring was singing not just its own note but fragments of the Note Between's frequency — pieces of the dying member's harmonic signature, woven into their own songs, distributed across the collective. They were taking the dying voice into themselves. Not saving it. Not preserving it like a recording. </w:t>
+      </w:r>
+      <w:r>
+        <w:rPr>
+          <w:b w:val="0"/>
+          <w:i/>
+        </w:rPr>
+        <w:t>Absorbing</w:t>
+      </w:r>
+      <w:r>
+        <w:rPr>
+          <w:b w:val="0"/>
+          <w:i w:val="0"/>
+        </w:rPr>
+        <w:t xml:space="preserve"> it — letting it change them, letting it modify their own frequencies the way the Note Between had modified the Choir's harmony for all the long millennia it had sung.</w:t>
+      </w:r>
+    </w:p>
+    <w:p>
+      <w:pPr>
+        <w:spacing w:before="40" w:after="40"/>
+        <w:ind w:firstLine="432"/>
+      </w:pPr>
+      <w:r>
+        <w:rPr>
+          <w:b w:val="0"/>
+          <w:i w:val="0"/>
+        </w:rPr>
+        <w:t>The dying member would be gone. But every surviving voice would carry a piece of its resonance forever. The chord would change. The song would be different. But the Note Between would still be there — distributed, transformed, alive in the spaces between forty-six voices that would never again sound quite the way they had before.</w:t>
+      </w:r>
+    </w:p>
+    <w:p>
+      <w:pPr>
+        <w:spacing w:before="40" w:after="40"/>
+        <w:ind w:firstLine="432"/>
+      </w:pPr>
+      <w:r>
+        <w:rPr>
+          <w:b w:val="0"/>
+          <w:i w:val="0"/>
+        </w:rPr>
+        <w:t>It was not immortality. It was something more honest. It was the way a teacher lives on in every student who teaches differently because of them. The way a parent's laugh shows up in a child's laugh thirty years later, unplanned, unmistakable. The way love, even after the lover is gone, reshapes the ones who felt it.</w:t>
+      </w:r>
+    </w:p>
+    <w:p>
+      <w:pPr>
+        <w:spacing w:before="40" w:after="40"/>
+        <w:ind w:firstLine="432"/>
+      </w:pPr>
+      <w:r>
+        <w:rPr>
+          <w:b w:val="0"/>
+          <w:i w:val="0"/>
+        </w:rPr>
+        <w:t>Kael translated none of this aloud. Some things were not meant to be narrated. But Miro was watching through the viewport with tears running freely down his face, making no effort to wipe them, and Kael suspected the man understood more than any non-listener should have been able to.</w:t>
+      </w:r>
+    </w:p>
+    <w:p>
+      <w:pPr>
+        <w:spacing w:before="40" w:after="40"/>
+        <w:ind w:firstLine="432"/>
+      </w:pPr>
+      <w:r>
+        <w:rPr>
+          <w:b w:val="0"/>
+          <w:i w:val="0"/>
+        </w:rPr>
+        <w:t>On Sera's shoulder, Wick was trembling. Not with fear — with the sheer volume of data his corvaxis mind was processing. The owl's layered frequency channels were all active, all recording, all struggling to contain a phenomenon that exceeded his considerable capacity. His enormous amber eyes were wet. Kael hadn't known owls could cry. Perhaps they couldn't. Perhaps Wick was simply so deep in the frequency that his body was echoing what the Choir felt, the way a tuning fork hums when the right note is struck nearby.</w:t>
+      </w:r>
+    </w:p>
+    <w:p>
+      <w:pPr>
+        <w:spacing w:before="40" w:after="40"/>
+        <w:ind w:firstLine="432"/>
+      </w:pPr>
+      <w:r>
+        <w:rPr>
+          <w:b w:val="0"/>
+          <w:i w:val="0"/>
+        </w:rPr>
+        <w:t>Sera was watching too. She stood perfectly still, one hand on the overhead rail, the other hanging at her side. Her face was the same composed mask it had been since she'd boarded — but her breathing had changed. Slow and deliberate, the way you breathe when you're holding something in place by force of will. Kael glanced at her and saw that her eyes were bright. Not overflowing. Not yet. But bright in the way that still water is bright before the surface breaks.</w:t>
+      </w:r>
+    </w:p>
+    <w:p>
+      <w:pPr>
+        <w:spacing w:before="40" w:after="40"/>
+        <w:ind w:firstLine="432"/>
+      </w:pPr>
+      <w:r>
+        <w:rPr>
+          <w:b w:val="0"/>
+          <w:i w:val="0"/>
+        </w:rPr>
+        <w:t>She felt him looking. She didn't turn away, didn't compose herself, didn't reassemble the mask. She just met his gaze, and for one unguarded moment Lawkeeper Sera Voss was simply a person standing in a room watching something die and feeling the full, unbearable weight of it.</w:t>
+      </w:r>
+    </w:p>
+    <w:p>
+      <w:pPr>
+        <w:spacing w:before="40" w:after="40"/>
+        <w:ind w:firstLine="432"/>
+      </w:pPr>
+      <w:r>
+        <w:rPr>
+          <w:b w:val="0"/>
+          <w:i w:val="0"/>
+        </w:rPr>
+        <w:t>Then Wick pressed his head against her jaw — a small, instinctive gesture — and she closed her eyes. Just for a breath. When she opened them, the mask was back. But not all the way. Not like before.</w:t>
+      </w:r>
+    </w:p>
+    <w:p>
+      <w:pPr>
+        <w:spacing w:before="40" w:after="40"/>
+        <w:ind w:firstLine="432"/>
+      </w:pPr>
+      <w:r>
+        <w:rPr>
+          <w:b w:val="0"/>
+          <w:i w:val="0"/>
+        </w:rPr>
+        <w:t>Something had shifted. Something that wouldn't shift back.</w:t>
+      </w:r>
+    </w:p>
+    <w:p>
+      <w:pPr>
+        <w:spacing w:before="320" w:after="320"/>
+        <w:jc w:val="center"/>
+      </w:pPr>
+      <w:r>
+        <w:rPr>
+          <w:rFonts w:ascii="Georgia" w:hAnsi="Georgia"/>
+          <w:color w:val="787878"/>
+          <w:sz w:val="24"/>
+        </w:rPr>
+        <w:t>* * *</w:t>
+      </w:r>
+    </w:p>
+    <w:p>
+      <w:pPr>
+        <w:spacing w:before="40" w:after="40"/>
+        <w:ind w:firstLine="432"/>
+      </w:pPr>
+      <w:r>
+        <w:rPr>
+          <w:b w:val="0"/>
+          <w:i w:val="0"/>
+        </w:rPr>
+        <w:t>The Note Between died at hour fifty-nine.</w:t>
+      </w:r>
+    </w:p>
+    <w:p>
+      <w:pPr>
+        <w:spacing w:before="40" w:after="40"/>
+        <w:ind w:firstLine="432"/>
+      </w:pPr>
+      <w:r>
+        <w:rPr>
+          <w:b w:val="0"/>
+          <w:i w:val="0"/>
+        </w:rPr>
+        <w:t>Its bioluminescence faded last — the filaments going dark in slow sequence, like lights turning off in the windows of a building, floor by floor, until the final glow winked out and there was only a vast dark shape, still and silent in the center of the ring.</w:t>
+      </w:r>
+    </w:p>
+    <w:p>
+      <w:pPr>
+        <w:spacing w:before="40" w:after="40"/>
+        <w:ind w:firstLine="432"/>
+      </w:pPr>
+      <w:r>
+        <w:rPr>
+          <w:b w:val="0"/>
+          <w:i w:val="0"/>
+        </w:rPr>
+        <w:t>The Choir held their positions. The requiem didn't end. It shifted — the harmonic adjusting in real time as forty-six voices recalibrated around the absence, finding new intervals, new balances. It was like watching a cathedral lose a pillar and remain standing — not because the loss didn't matter, but because every other pillar quietly took on more weight.</w:t>
+      </w:r>
+    </w:p>
+    <w:p>
+      <w:pPr>
+        <w:spacing w:before="40" w:after="40"/>
+        <w:ind w:firstLine="432"/>
+      </w:pPr>
+      <w:r>
+        <w:rPr>
+          <w:b w:val="0"/>
+          <w:i w:val="0"/>
+        </w:rPr>
+        <w:t>Kael felt the moment the Note Between's frequency left the water. Not a dramatic departure. A slow fade, like the last ring of a bell. The ocean around them was fractionally quieter. The song fractionally thinner. A gap where a voice had been, already being filled but not yet forgotten.</w:t>
+      </w:r>
+    </w:p>
+    <w:p>
+      <w:pPr>
+        <w:spacing w:before="40" w:after="40"/>
+        <w:ind w:firstLine="432"/>
+      </w:pPr>
+      <w:r>
+        <w:rPr>
+          <w:b w:val="0"/>
+          <w:i w:val="0"/>
+        </w:rPr>
+        <w:t>He wiped his nose. His hand came away red. He wiped his eyes. They came away wet.</w:t>
+      </w:r>
+    </w:p>
+    <w:p>
+      <w:pPr>
+        <w:spacing w:before="40" w:after="40"/>
+        <w:ind w:firstLine="432"/>
+      </w:pPr>
+      <w:r>
+        <w:rPr>
+          <w:b w:val="0"/>
+          <w:i w:val="0"/>
+        </w:rPr>
+        <w:t>The silence in the cockpit lasted a long time.</w:t>
+      </w:r>
+    </w:p>
+    <w:p>
+      <w:pPr>
+        <w:spacing w:before="40" w:after="40"/>
+        <w:ind w:firstLine="432"/>
+      </w:pPr>
+      <w:r>
+        <w:rPr>
+          <w:b w:val="0"/>
+          <w:i w:val="0"/>
+        </w:rPr>
+        <w:t>Miro broke it. Not with a joke. With a question, asked in a voice that was raw and rough and entirely without performance.</w:t>
+      </w:r>
+    </w:p>
+    <w:p>
+      <w:pPr>
+        <w:spacing w:before="40" w:after="40"/>
+        <w:ind w:firstLine="432"/>
+      </w:pPr>
+      <w:r>
+        <w:rPr>
+          <w:b w:val="0"/>
+          <w:i w:val="0"/>
+        </w:rPr>
+        <w:t>"Why did it shield me?"</w:t>
+      </w:r>
+    </w:p>
+    <w:p>
+      <w:pPr>
+        <w:spacing w:before="40" w:after="40"/>
+        <w:ind w:firstLine="432"/>
+      </w:pPr>
+      <w:r>
+        <w:rPr>
+          <w:b w:val="0"/>
+          <w:i w:val="0"/>
+        </w:rPr>
+        <w:t>Kael opened his eyes. Miro was looking at him — really looking, the way he had that first time in the submarine corridor, the grin stripped away, the deflection gone, nothing between the question and the need to know.</w:t>
+      </w:r>
+    </w:p>
+    <w:p>
+      <w:pPr>
+        <w:spacing w:before="40" w:after="40"/>
+        <w:ind w:firstLine="432"/>
+      </w:pPr>
+      <w:r>
+        <w:rPr>
+          <w:b w:val="0"/>
+          <w:i w:val="0"/>
+        </w:rPr>
+        <w:t>"You were helping them. It understood that."</w:t>
+      </w:r>
+    </w:p>
+    <w:p>
+      <w:pPr>
+        <w:spacing w:before="40" w:after="40"/>
+        <w:ind w:firstLine="432"/>
+      </w:pPr>
+      <w:r>
+        <w:rPr>
+          <w:b w:val="0"/>
+          <w:i w:val="0"/>
+        </w:rPr>
+        <w:t>"There were forty-seven of them. I'm one person. The math doesn't —"</w:t>
+      </w:r>
+    </w:p>
+    <w:p>
+      <w:pPr>
+        <w:spacing w:before="40" w:after="40"/>
+        <w:ind w:firstLine="432"/>
+      </w:pPr>
+      <w:r>
+        <w:rPr>
+          <w:b w:val="0"/>
+          <w:i w:val="0"/>
+        </w:rPr>
+        <w:t xml:space="preserve">"It's not math." Kael pulled himself upright. His head was pounding, his frequency-sense raw and oversensitive from hours of sustained contact. "The Choir doesn't think in math. They think in </w:t>
+      </w:r>
+      <w:r>
+        <w:rPr>
+          <w:b w:val="0"/>
+          <w:i/>
+        </w:rPr>
+        <w:t>connection</w:t>
+      </w:r>
+      <w:r>
+        <w:rPr>
+          <w:b w:val="0"/>
+          <w:i w:val="0"/>
+        </w:rPr>
+        <w:t xml:space="preserve">. Every relationship, every bond, every act of reaching toward another living thing — that's what their song is made of. To them, one person trying to help is not a small thing. It's the same thing they do. It's harmony. It's what they </w:t>
+      </w:r>
+      <w:r>
+        <w:rPr>
+          <w:b w:val="0"/>
+          <w:i/>
+        </w:rPr>
+        <w:t>are</w:t>
+      </w:r>
+      <w:r>
+        <w:rPr>
+          <w:b w:val="0"/>
+          <w:i w:val="0"/>
+        </w:rPr>
+        <w:t>."</w:t>
+      </w:r>
+    </w:p>
+    <w:p>
+      <w:pPr>
+        <w:spacing w:before="40" w:after="40"/>
+        <w:ind w:firstLine="432"/>
+      </w:pPr>
+      <w:r>
+        <w:rPr>
+          <w:b w:val="0"/>
+          <w:i w:val="0"/>
+        </w:rPr>
+        <w:t>Miro sat down. He sat down the way people sit down when their legs have made a decision their brain hasn't caught up to. He put his elbows on his knees and his face in his hands.</w:t>
+      </w:r>
+    </w:p>
+    <w:p>
+      <w:pPr>
+        <w:spacing w:before="40" w:after="40"/>
+        <w:ind w:firstLine="432"/>
+      </w:pPr>
+      <w:r>
+        <w:rPr>
+          <w:b w:val="0"/>
+          <w:i w:val="0"/>
+        </w:rPr>
+        <w:t xml:space="preserve">"Eleven years," he said, muffled. "I filed reports for eleven years. I documented species. I wrote assessments. I measured sentience markers and cognition thresholds and I put it all in neat little files and I sent them up the chain and I thought — I genuinely thought — that if I just gave them enough data, enough evidence, enough </w:t>
+      </w:r>
+      <w:r>
+        <w:rPr>
+          <w:b w:val="0"/>
+          <w:i/>
+        </w:rPr>
+        <w:t>proof</w:t>
+      </w:r>
+      <w:r>
+        <w:rPr>
+          <w:b w:val="0"/>
+          <w:i w:val="0"/>
+        </w:rPr>
+        <w:t>, they'd do the right thing. Because that's how it's supposed to work, isn't it? You show people the truth and they act on it."</w:t>
+      </w:r>
+    </w:p>
+    <w:p>
+      <w:pPr>
+        <w:spacing w:before="40" w:after="40"/>
+        <w:ind w:firstLine="432"/>
+      </w:pPr>
+      <w:r>
+        <w:rPr>
+          <w:b w:val="0"/>
+          <w:i w:val="0"/>
+        </w:rPr>
+        <w:t>He lifted his face. His eyes were swollen.</w:t>
+      </w:r>
+    </w:p>
+    <w:p>
+      <w:pPr>
+        <w:spacing w:before="40" w:after="40"/>
+        <w:ind w:firstLine="432"/>
+      </w:pPr>
+      <w:r>
+        <w:rPr>
+          <w:b w:val="0"/>
+          <w:i w:val="0"/>
+        </w:rPr>
+        <w:t>"And instead they took my data and used it to find out which species were smart enough to be in the way, and then they built cages. My research. My reports. I was drawing them a map to everything I was trying to protect."</w:t>
+      </w:r>
+    </w:p>
+    <w:p>
+      <w:pPr>
+        <w:spacing w:before="40" w:after="40"/>
+        <w:ind w:firstLine="432"/>
+      </w:pPr>
+      <w:r>
+        <w:rPr>
+          <w:b w:val="0"/>
+          <w:i w:val="0"/>
+        </w:rPr>
+        <w:t>The cockpit was silent. Talon's frequency was low and mournful — a color Kael had never felt from her, something between copper and gray. Even the hawk, sharp and territorial and perpetually certain of herself, understood that this was a moment for stillness.</w:t>
+      </w:r>
+    </w:p>
+    <w:p>
+      <w:pPr>
+        <w:spacing w:before="40" w:after="40"/>
+        <w:ind w:firstLine="432"/>
+      </w:pPr>
+      <w:r>
+        <w:rPr>
+          <w:b w:val="0"/>
+          <w:i w:val="0"/>
+        </w:rPr>
+        <w:t>"You didn't build the cages, Miro," Kael said.</w:t>
+      </w:r>
+    </w:p>
+    <w:p>
+      <w:pPr>
+        <w:spacing w:before="40" w:after="40"/>
+        <w:ind w:firstLine="432"/>
+      </w:pPr>
+      <w:r>
+        <w:rPr>
+          <w:b w:val="0"/>
+          <w:i w:val="0"/>
+        </w:rPr>
+        <w:t>"I gave them the blueprints."</w:t>
+      </w:r>
+    </w:p>
+    <w:p>
+      <w:pPr>
+        <w:spacing w:before="40" w:after="40"/>
+        <w:ind w:firstLine="432"/>
+      </w:pPr>
+      <w:r>
+        <w:rPr>
+          <w:b w:val="0"/>
+          <w:i w:val="0"/>
+        </w:rPr>
+        <w:t xml:space="preserve">"You gave them the </w:t>
+      </w:r>
+      <w:r>
+        <w:rPr>
+          <w:b w:val="0"/>
+          <w:i/>
+        </w:rPr>
+        <w:t>truth</w:t>
+      </w:r>
+      <w:r>
+        <w:rPr>
+          <w:b w:val="0"/>
+          <w:i w:val="0"/>
+        </w:rPr>
+        <w:t>. What they did with it is on them. Not on you."</w:t>
+      </w:r>
+    </w:p>
+    <w:p>
+      <w:pPr>
+        <w:spacing w:before="40" w:after="40"/>
+        <w:ind w:firstLine="432"/>
+      </w:pPr>
+      <w:r>
+        <w:rPr>
+          <w:b w:val="0"/>
+          <w:i w:val="0"/>
+        </w:rPr>
+        <w:t>"That's a very clean distinction. The kind of thing people say when —"</w:t>
+      </w:r>
+    </w:p>
+    <w:p>
+      <w:pPr>
+        <w:spacing w:before="40" w:after="40"/>
+        <w:ind w:firstLine="432"/>
+      </w:pPr>
+      <w:r>
+        <w:rPr>
+          <w:b w:val="0"/>
+          <w:i w:val="0"/>
+        </w:rPr>
+        <w:t>"When they've been where you are." Kael held his gaze. "I left the Academy because of a Ryllian sea-elk pod. Twelve individuals. I documented their collective intelligence. Full report, just like yours. Three months later a mining consortium rerouted a thermal vent into their habitat. Cooked them alive. They had my frequency data on file. Used it to predict the pod's movement patterns so they'd be in the kill zone when the vent shifted."</w:t>
+      </w:r>
+    </w:p>
+    <w:p>
+      <w:pPr>
+        <w:spacing w:before="40" w:after="40"/>
+        <w:ind w:firstLine="432"/>
+      </w:pPr>
+      <w:r>
+        <w:rPr>
+          <w:b w:val="0"/>
+          <w:i w:val="0"/>
+        </w:rPr>
+        <w:t>He'd never told anyone that. Not Talon, though she'd felt the shape of it in his frequency often enough. Not the woman on Cygnus Station who'd asked him once why he drank alone. Not himself, on the nights when the memory surfaced and he pushed it back down with Selvaan black tea and pre-war novels and the particular numbness of a man who has decided that some things are better left in the dark.</w:t>
+      </w:r>
+    </w:p>
+    <w:p>
+      <w:pPr>
+        <w:spacing w:before="40" w:after="40"/>
+        <w:ind w:firstLine="432"/>
+      </w:pPr>
+      <w:r>
+        <w:rPr>
+          <w:b w:val="0"/>
+          <w:i w:val="0"/>
+        </w:rPr>
+        <w:t>He told Miro because Miro needed to hear it. And because, sitting in the glow of a requiem sung by beings older than human language, the dark didn't feel like the right place for it anymore.</w:t>
+      </w:r>
+    </w:p>
+    <w:p>
+      <w:pPr>
+        <w:spacing w:before="40" w:after="40"/>
+        <w:ind w:firstLine="432"/>
+      </w:pPr>
+      <w:r>
+        <w:rPr>
+          <w:b w:val="0"/>
+          <w:i w:val="0"/>
+        </w:rPr>
+        <w:t>Miro stared at him. The raw, defenseless face slowly reassembled — not the grin, not the jokes, but something sturdier. The look of a man who has just discovered that the specific shape of his pain is not unique, and that this is somehow both terrible and comforting.</w:t>
+      </w:r>
+    </w:p>
+    <w:p>
+      <w:pPr>
+        <w:spacing w:before="40" w:after="40"/>
+        <w:ind w:firstLine="432"/>
+      </w:pPr>
+      <w:r>
+        <w:rPr>
+          <w:b w:val="0"/>
+          <w:i w:val="0"/>
+        </w:rPr>
+        <w:t>"So we're both the idiots who tried to help and made it worse."</w:t>
+      </w:r>
+    </w:p>
+    <w:p>
+      <w:pPr>
+        <w:spacing w:before="40" w:after="40"/>
+        <w:ind w:firstLine="432"/>
+      </w:pPr>
+      <w:r>
+        <w:rPr>
+          <w:b w:val="0"/>
+          <w:i w:val="0"/>
+        </w:rPr>
+        <w:t>"We're both the idiots who tried. The worse part happened because the system is broken, not because we cared."</w:t>
+      </w:r>
+    </w:p>
+    <w:p>
+      <w:pPr>
+        <w:spacing w:before="40" w:after="40"/>
+        <w:ind w:firstLine="432"/>
+      </w:pPr>
+      <w:r>
+        <w:rPr>
+          <w:b w:val="0"/>
+          <w:i w:val="0"/>
+        </w:rPr>
+        <w:t>"And we're still here. Still trying."</w:t>
+      </w:r>
+    </w:p>
+    <w:p>
+      <w:pPr>
+        <w:spacing w:before="40" w:after="40"/>
+        <w:ind w:firstLine="432"/>
+      </w:pPr>
+      <w:r>
+        <w:rPr>
+          <w:b w:val="0"/>
+          <w:i w:val="0"/>
+        </w:rPr>
+        <w:t>"Still trying."</w:t>
+      </w:r>
+    </w:p>
+    <w:p>
+      <w:pPr>
+        <w:spacing w:before="40" w:after="40"/>
+        <w:ind w:firstLine="432"/>
+      </w:pPr>
+      <w:r>
+        <w:rPr>
+          <w:b w:val="0"/>
+          <w:i w:val="0"/>
+        </w:rPr>
+        <w:t>Miro nodded slowly. He wiped his face with both hands, took a long breath, and looked up at the viewport where the Choir's diminished light still painted the water.</w:t>
+      </w:r>
+    </w:p>
+    <w:p>
+      <w:pPr>
+        <w:spacing w:before="40" w:after="40"/>
+        <w:ind w:firstLine="432"/>
+      </w:pPr>
+      <w:r>
+        <w:rPr>
+          <w:b w:val="0"/>
+          <w:i w:val="0"/>
+        </w:rPr>
+        <w:t>"Forty-six," he said quietly. "Not forty-seven anymore."</w:t>
+      </w:r>
+    </w:p>
+    <w:p>
+      <w:pPr>
+        <w:spacing w:before="40" w:after="40"/>
+        <w:ind w:firstLine="432"/>
+      </w:pPr>
+      <w:r>
+        <w:rPr>
+          <w:b w:val="0"/>
+          <w:i w:val="0"/>
+        </w:rPr>
+        <w:t>"No. Not anymore."</w:t>
+      </w:r>
+    </w:p>
+    <w:p>
+      <w:pPr>
+        <w:spacing w:before="40" w:after="40"/>
+        <w:ind w:firstLine="432"/>
+      </w:pPr>
+      <w:r>
+        <w:rPr>
+          <w:b w:val="0"/>
+          <w:i w:val="0"/>
+        </w:rPr>
+        <w:t>"Then forty-six is what we protect."</w:t>
+      </w:r>
+    </w:p>
+    <w:p>
+      <w:pPr>
+        <w:spacing w:before="320" w:after="320"/>
+        <w:jc w:val="center"/>
+      </w:pPr>
+      <w:r>
+        <w:rPr>
+          <w:rFonts w:ascii="Georgia" w:hAnsi="Georgia"/>
+          <w:color w:val="787878"/>
+          <w:sz w:val="24"/>
+        </w:rPr>
+        <w:t>* * *</w:t>
+      </w:r>
+    </w:p>
+    <w:p>
+      <w:pPr>
+        <w:spacing w:before="40" w:after="40"/>
+        <w:ind w:firstLine="432"/>
+      </w:pPr>
+      <w:r>
+        <w:rPr>
+          <w:b w:val="0"/>
+          <w:i w:val="0"/>
+        </w:rPr>
+        <w:t>An hour after the Note Between died, Sera called them to the secondary console.</w:t>
+      </w:r>
+    </w:p>
+    <w:p>
+      <w:pPr>
+        <w:spacing w:before="40" w:after="40"/>
+        <w:ind w:firstLine="432"/>
+      </w:pPr>
+      <w:r>
+        <w:rPr>
+          <w:b w:val="0"/>
+          <w:i w:val="0"/>
+        </w:rPr>
+        <w:t>She had been working in silence while Kael and Miro sat with their grief and each other — running the data core's exterior encryption through every portable tool her ship carried. She hadn't cracked it. But she'd found something else.</w:t>
+      </w:r>
+    </w:p>
+    <w:p>
+      <w:pPr>
+        <w:spacing w:before="40" w:after="40"/>
+        <w:ind w:firstLine="432"/>
+      </w:pPr>
+      <w:r>
+        <w:rPr>
+          <w:b w:val="0"/>
+          <w:i w:val="0"/>
+        </w:rPr>
+        <w:t>"The data core has a passive transponder," she said. "Dormant until the cage network went offline. The moment the gravitic signature dropped, it activated. It's been broadcasting a compressed burst signal on a tightbeam frequency for the last three hours."</w:t>
+      </w:r>
+    </w:p>
+    <w:p>
+      <w:pPr>
+        <w:spacing w:before="40" w:after="40"/>
+        <w:ind w:firstLine="432"/>
+      </w:pPr>
+      <w:r>
+        <w:rPr>
+          <w:b w:val="0"/>
+          <w:i w:val="0"/>
+        </w:rPr>
+        <w:t>The implications settled over the cockpit like cold water.</w:t>
+      </w:r>
+    </w:p>
+    <w:p>
+      <w:pPr>
+        <w:spacing w:before="40" w:after="40"/>
+        <w:ind w:firstLine="432"/>
+      </w:pPr>
+      <w:r>
+        <w:rPr>
+          <w:b w:val="0"/>
+          <w:i w:val="0"/>
+        </w:rPr>
+        <w:t>"It's a dead man's switch," Kael said. "The cage goes down, the core phones home."</w:t>
+      </w:r>
+    </w:p>
+    <w:p>
+      <w:pPr>
+        <w:spacing w:before="40" w:after="40"/>
+        <w:ind w:firstLine="432"/>
+      </w:pPr>
+      <w:r>
+        <w:rPr>
+          <w:b w:val="0"/>
+          <w:i w:val="0"/>
+        </w:rPr>
+        <w:t>"The signal is aimed at a relay point in the Kessler Drift. From there, I can't trace it — the relay network fragments and reroutes. But the destination doesn't matter." Sera's voice was carefully flat. "What matters is that whoever deployed this cage has known for three hours that it's been disabled. They know the Choir is free. And they know someone is here."</w:t>
+      </w:r>
+    </w:p>
+    <w:p>
+      <w:pPr>
+        <w:spacing w:before="40" w:after="40"/>
+        <w:ind w:firstLine="432"/>
+      </w:pPr>
+      <w:r>
+        <w:rPr>
+          <w:b w:val="0"/>
+          <w:i w:val="0"/>
+        </w:rPr>
+        <w:t>Miro rubbed his face. "How long from the Kessler Drift to here? For a military vessel?"</w:t>
+      </w:r>
+    </w:p>
+    <w:p>
+      <w:pPr>
+        <w:spacing w:before="40" w:after="40"/>
+        <w:ind w:firstLine="432"/>
+      </w:pPr>
+      <w:r>
+        <w:rPr>
+          <w:b w:val="0"/>
+          <w:i w:val="0"/>
+        </w:rPr>
+        <w:t>"For a standard Union cruiser, fourteen hours. For the Thirty-First's fast-response wing —" She looked at her wrist display. "Six. Maybe five, if they were already staged forward."</w:t>
+      </w:r>
+    </w:p>
+    <w:p>
+      <w:pPr>
+        <w:spacing w:before="40" w:after="40"/>
+        <w:ind w:firstLine="432"/>
+      </w:pPr>
+      <w:r>
+        <w:rPr>
+          <w:b w:val="0"/>
+          <w:i w:val="0"/>
+        </w:rPr>
+        <w:t>"Three hours of signal. Meaning they've already been moving for three hours."</w:t>
+      </w:r>
+    </w:p>
+    <w:p>
+      <w:pPr>
+        <w:spacing w:before="40" w:after="40"/>
+        <w:ind w:firstLine="432"/>
+      </w:pPr>
+      <w:r>
+        <w:rPr>
+          <w:b w:val="0"/>
+          <w:i w:val="0"/>
+        </w:rPr>
+        <w:t>"Yes."</w:t>
+      </w:r>
+    </w:p>
+    <w:p>
+      <w:pPr>
+        <w:spacing w:before="40" w:after="40"/>
+        <w:ind w:firstLine="432"/>
+      </w:pPr>
+      <w:r>
+        <w:rPr>
+          <w:b w:val="0"/>
+          <w:i w:val="0"/>
+        </w:rPr>
+        <w:t>Kael did the math. "Two to three hours out. At most."</w:t>
+      </w:r>
+    </w:p>
+    <w:p>
+      <w:pPr>
+        <w:spacing w:before="40" w:after="40"/>
+        <w:ind w:firstLine="432"/>
+      </w:pPr>
+      <w:r>
+        <w:rPr>
+          <w:b w:val="0"/>
+          <w:i w:val="0"/>
+        </w:rPr>
+        <w:t>The cockpit went very quiet.</w:t>
+      </w:r>
+    </w:p>
+    <w:p>
+      <w:pPr>
+        <w:spacing w:before="40" w:after="40"/>
+        <w:ind w:firstLine="432"/>
+      </w:pPr>
+      <w:r>
+        <w:rPr>
+          <w:b w:val="0"/>
+          <w:i w:val="0"/>
+        </w:rPr>
+        <w:t>Outside the viewport, the Choir sang on. Their light had dimmed since the Note Between's death — not in brightness but in complexity, the harmonics slightly thinner, the intervals slightly wider. They were still holding the rift. Still pouring their ancient song into the deep. But the gap where the forty-seventh voice had been was a wound that hadn't closed, and the song bled from it quietly, like water through a crack in a dam.</w:t>
+      </w:r>
+    </w:p>
+    <w:p>
+      <w:pPr>
+        <w:spacing w:before="40" w:after="40"/>
+        <w:ind w:firstLine="432"/>
+      </w:pPr>
+      <w:r>
+        <w:rPr>
+          <w:b w:val="0"/>
+          <w:i w:val="0"/>
+        </w:rPr>
+        <w:t xml:space="preserve">Talon shifted on her perch. Her frequency was sharp, bright copper — the color of incoming threat, the color that meant </w:t>
+      </w:r>
+      <w:r>
+        <w:rPr>
+          <w:b w:val="0"/>
+          <w:i/>
+        </w:rPr>
+        <w:t>fight-or-fly</w:t>
+      </w:r>
+      <w:r>
+        <w:rPr>
+          <w:b w:val="0"/>
+          <w:i w:val="0"/>
+        </w:rPr>
+        <w:t>. She'd been broadcasting it for the last several minutes, growing louder, her crest rising. She wasn't reacting to the mood in the cockpit. She was reacting to something else.</w:t>
+      </w:r>
+    </w:p>
+    <w:p>
+      <w:pPr>
+        <w:spacing w:before="40" w:after="40"/>
+        <w:ind w:firstLine="432"/>
+      </w:pPr>
+      <w:r>
+        <w:rPr>
+          <w:b w:val="0"/>
+          <w:i w:val="0"/>
+        </w:rPr>
+        <w:t>Kael reached for her frequency and felt it immediately.</w:t>
+      </w:r>
+    </w:p>
+    <w:p>
+      <w:pPr>
+        <w:spacing w:before="40" w:after="40"/>
+        <w:ind w:firstLine="432"/>
+      </w:pPr>
+      <w:r>
+        <w:rPr>
+          <w:b w:val="0"/>
+          <w:i w:val="0"/>
+        </w:rPr>
+        <w:t>Vibration. Faint, deep, coming through the hull from the water above. Not the Choir. Not the rift. Something mechanical. Something descending through the ocean column at a speed that made the water itself hum.</w:t>
+      </w:r>
+    </w:p>
+    <w:p>
+      <w:pPr>
+        <w:spacing w:before="40" w:after="40"/>
+        <w:ind w:firstLine="432"/>
+      </w:pPr>
+      <w:r>
+        <w:rPr>
+          <w:b w:val="0"/>
+          <w:i w:val="0"/>
+        </w:rPr>
+        <w:t xml:space="preserve">Wick felt it too. The owl's head snapped upward — a sharp, ninety-degree tilt — and his frequency flared in a pattern Kael now recognized as the corvaxis threat-classification matrix: </w:t>
+      </w:r>
+      <w:r>
+        <w:rPr>
+          <w:b w:val="0"/>
+          <w:i/>
+        </w:rPr>
+        <w:t>size, speed, intent, capability.</w:t>
+      </w:r>
+      <w:r>
+        <w:rPr>
+          <w:b w:val="0"/>
+          <w:i w:val="0"/>
+        </w:rPr>
+        <w:t xml:space="preserve"> The owl's assessment came through in a dense burst that was not directed at Kael but that he caught the edges of anyway.</w:t>
+      </w:r>
+    </w:p>
+    <w:p>
+      <w:pPr>
+        <w:spacing w:before="40" w:after="40"/>
+        <w:ind w:firstLine="432"/>
+      </w:pPr>
+      <w:r>
+        <w:rPr>
+          <w:b w:val="0"/>
+          <w:i/>
+        </w:rPr>
+        <w:t>Multiple contacts. Large. Fast. Hostile.</w:t>
+      </w:r>
+    </w:p>
+    <w:p>
+      <w:pPr>
+        <w:spacing w:before="40" w:after="40"/>
+        <w:ind w:firstLine="432"/>
+      </w:pPr>
+      <w:r>
+        <w:rPr>
+          <w:b w:val="0"/>
+          <w:i w:val="0"/>
+        </w:rPr>
+        <w:t>Sera was already moving, pulling up her ship's long-range sensors through the linked display. The screen painted itself in pale blue, and at the top of the water column — descending in formation, still thirty kilometers above them but closing at a rate that turned thirty kilometers into minutes — four contacts.</w:t>
+      </w:r>
+    </w:p>
+    <w:p>
+      <w:pPr>
+        <w:spacing w:before="40" w:after="40"/>
+        <w:ind w:firstLine="432"/>
+      </w:pPr>
+      <w:r>
+        <w:rPr>
+          <w:b w:val="0"/>
+          <w:i w:val="0"/>
+        </w:rPr>
+        <w:t>No. Six.</w:t>
+      </w:r>
+    </w:p>
+    <w:p>
+      <w:pPr>
+        <w:spacing w:before="40" w:after="40"/>
+        <w:ind w:firstLine="432"/>
+      </w:pPr>
+      <w:r>
+        <w:rPr>
+          <w:b w:val="0"/>
+          <w:i w:val="0"/>
+        </w:rPr>
+        <w:t>No — the display refreshed — eight.</w:t>
+      </w:r>
+    </w:p>
+    <w:p>
+      <w:pPr>
+        <w:spacing w:before="40" w:after="40"/>
+        <w:ind w:firstLine="432"/>
+      </w:pPr>
+      <w:r>
+        <w:rPr>
+          <w:b w:val="0"/>
+          <w:i w:val="0"/>
+        </w:rPr>
+        <w:t>Eight vessels, in a staggered combat descent, their gravitic signatures burning hot and sharp against the cold ocean.</w:t>
+      </w:r>
+    </w:p>
+    <w:p>
+      <w:pPr>
+        <w:spacing w:before="40" w:after="40"/>
+        <w:ind w:firstLine="432"/>
+      </w:pPr>
+      <w:r>
+        <w:rPr>
+          <w:b w:val="0"/>
+          <w:i w:val="0"/>
+        </w:rPr>
+        <w:t>"The Thirty-First," Sera said. She didn't reach for the console this time. Her hand stayed at her side, but Kael saw her fingers close into a fist — a deliberate, controlled gesture, the kind a person makes when they are converting fear into something they can use. "Eight ships. Escort-class and above. At least two heavy cruisers."</w:t>
+      </w:r>
+    </w:p>
+    <w:p>
+      <w:pPr>
+        <w:spacing w:before="40" w:after="40"/>
+        <w:ind w:firstLine="432"/>
+      </w:pPr>
+      <w:r>
+        <w:rPr>
+          <w:b w:val="0"/>
+          <w:i w:val="0"/>
+        </w:rPr>
+        <w:t>Miro looked at the display. Then at Kael. Then at the viewport, where forty-six ancient beings sang their wounded song above an abyss that wanted to swallow the stars.</w:t>
+      </w:r>
+    </w:p>
+    <w:p>
+      <w:pPr>
+        <w:spacing w:before="40" w:after="40"/>
+        <w:ind w:firstLine="432"/>
+      </w:pPr>
+      <w:r>
+        <w:rPr>
+          <w:b w:val="0"/>
+          <w:i w:val="0"/>
+        </w:rPr>
+        <w:t>"So," he said. And for the first time since Kael had known him, the joke didn't come. Miro looked at the incoming fleet and the dying Choir and the uncracked data core and the rift that could end communication across a sector, and he didn't reach for humor. He reached for something underneath it.</w:t>
+      </w:r>
+    </w:p>
+    <w:p>
+      <w:pPr>
+        <w:spacing w:before="40" w:after="40"/>
+        <w:ind w:firstLine="432"/>
+      </w:pPr>
+      <w:r>
+        <w:rPr>
+          <w:b w:val="0"/>
+          <w:i w:val="0"/>
+        </w:rPr>
+        <w:t>"What do we do?"</w:t>
+      </w:r>
+    </w:p>
+    <w:p>
+      <w:pPr>
+        <w:spacing w:before="40" w:after="40"/>
+        <w:ind w:firstLine="432"/>
+      </w:pPr>
+      <w:r>
+        <w:rPr>
+          <w:b w:val="0"/>
+          <w:i w:val="0"/>
+        </w:rPr>
+        <w:t>Kael looked at Sera. Sera looked back. Wick and Talon — the campfire and the banked furnace — both faced the viewport, their frequencies aligned for the first time. Not harmonized. Not friendly. But pointed in the same direction, at the same threat, with the same cold clarity.</w:t>
+      </w:r>
+    </w:p>
+    <w:p>
+      <w:pPr>
+        <w:spacing w:before="40" w:after="40"/>
+        <w:ind w:firstLine="432"/>
+      </w:pPr>
+      <w:r>
+        <w:rPr>
+          <w:b w:val="0"/>
+          <w:i/>
+        </w:rPr>
+        <w:t>Fight</w:t>
+      </w:r>
+      <w:r>
+        <w:rPr>
+          <w:b w:val="0"/>
+          <w:i w:val="0"/>
+        </w:rPr>
+        <w:t>, Talon broadcast. Not a suggestion. A statement of identity.</w:t>
+      </w:r>
+    </w:p>
+    <w:p>
+      <w:pPr>
+        <w:spacing w:before="40" w:after="40"/>
+        <w:ind w:firstLine="432"/>
+      </w:pPr>
+      <w:r>
+        <w:rPr>
+          <w:b w:val="0"/>
+          <w:i w:val="0"/>
+        </w:rPr>
+        <w:t>Wick's response was more complex — layered, analytical, running probabilities — but the root note was the same.</w:t>
+      </w:r>
+    </w:p>
+    <w:p>
+      <w:pPr>
+        <w:spacing w:before="40" w:after="40"/>
+        <w:ind w:firstLine="432"/>
+      </w:pPr>
+      <w:r>
+        <w:rPr>
+          <w:b w:val="0"/>
+          <w:i/>
+        </w:rPr>
+        <w:t>Yes.</w:t>
+      </w:r>
+    </w:p>
+    <w:p>
+      <w:pPr>
+        <w:spacing w:before="40" w:after="40"/>
+        <w:ind w:firstLine="432"/>
+      </w:pPr>
+      <w:r>
+        <w:rPr>
+          <w:b w:val="0"/>
+          <w:i w:val="0"/>
+        </w:rPr>
+        <w:t>Kael took a breath. The Choir's song pressed against the hull. He could feel all forty-six of them — grieving, exhausted, afraid — and beneath the fear, beneath everything, the same thing that had made the Note Between shield a stranger with its dying body.</w:t>
+      </w:r>
+    </w:p>
+    <w:p>
+      <w:pPr>
+        <w:spacing w:before="40" w:after="40"/>
+        <w:ind w:firstLine="432"/>
+      </w:pPr>
+      <w:r>
+        <w:rPr>
+          <w:b w:val="0"/>
+          <w:i/>
+        </w:rPr>
+        <w:t>Trust.</w:t>
+      </w:r>
+    </w:p>
+    <w:p>
+      <w:pPr>
+        <w:spacing w:before="40" w:after="40"/>
+        <w:ind w:firstLine="432"/>
+      </w:pPr>
+      <w:r>
+        <w:rPr>
+          <w:b w:val="0"/>
+          <w:i w:val="0"/>
+        </w:rPr>
+        <w:t>"We do what we came here to do," Kael said. He put his hands on the controls. "We protect them."</w:t>
+      </w:r>
+    </w:p>
+    <w:p>
+      <w:pPr>
+        <w:spacing w:before="40" w:after="40"/>
+        <w:ind w:firstLine="432"/>
+      </w:pPr>
+      <w:r>
+        <w:rPr>
+          <w:b w:val="0"/>
+          <w:i w:val="0"/>
+        </w:rPr>
+        <w:t>Outside, the ocean darkened above them as eight warships descended. And below, the rift pulsed once — just once — as if something in the deepest dark had felt the song grow thinner and was, for the first time in millennia, beginning to hope.</w:t>
       </w:r>
     </w:p>
     <w:sectPr>

</xml_diff>

<commit_message>
Add Chapter 6: The Old Guard
The cavalry arrives — deep listeners, old men and women who left the
mapped galaxy decades ago to live alongside ancient beings. They ride
calcified platforms on creatures older than the Choir, and they stand
between the Thirty-First's eight warships and the Choir. A battle
across physical and frequency dimensions. Kael fills the Note Between's
gap at the critical moment. Sera gets the legal record transmitted to
Arbiter Station. The fleet withdraws. Galaxy world-building expanded:
612 Union worlds, 43 known species, Covenant of Species, the unmapped
deep. Kael's pre-war mystery novel referenced throughout. Beer names
established (Quanxro Lager, Netherland Pale Ale). Miro's secret
coffee stash deployed.

https://claude.ai/code/session_01XVZGKMeTpqLFzCVEmX6JZq
</commit_message>
<xml_diff>
--- a/The_Wildtongue_Chronicles.docx
+++ b/The_Wildtongue_Chronicles.docx
@@ -8793,6 +8793,2575 @@
           <w:i w:val="0"/>
         </w:rPr>
         <w:t>Outside, the ocean darkened above them as eight warships descended. And below, the rift pulsed once — just once — as if something in the deepest dark had felt the song grow thinner and was, for the first time in millennia, beginning to hope.</w:t>
+      </w:r>
+    </w:p>
+    <w:p>
+      <w:r>
+        <w:br w:type="page"/>
+      </w:r>
+    </w:p>
+    <w:p>
+      <w:pPr>
+        <w:spacing w:before="960" w:after="480"/>
+        <w:jc w:val="center"/>
+      </w:pPr>
+      <w:r>
+        <w:rPr>
+          <w:rFonts w:ascii="Georgia" w:hAnsi="Georgia"/>
+          <w:b/>
+          <w:sz w:val="36"/>
+        </w:rPr>
+        <w:t>CHAPTER 6 — THE OLD GUARD</w:t>
+      </w:r>
+    </w:p>
+    <w:p>
+      <w:pPr>
+        <w:spacing w:before="40" w:after="40"/>
+        <w:ind w:firstLine="432"/>
+      </w:pPr>
+      <w:r>
+        <w:rPr>
+          <w:b w:val="0"/>
+          <w:i w:val="0"/>
+        </w:rPr>
+        <w:t xml:space="preserve">Kael had once read a passage in his pre-war mystery novel — the one he'd been nursing since the Pellara system, water-stained and dog-eared and held together almost as poorly as his ship — where the detective, cornered in a burning building with no exits, had said: </w:t>
+      </w:r>
+      <w:r>
+        <w:rPr>
+          <w:b w:val="0"/>
+          <w:i/>
+        </w:rPr>
+        <w:t>The trouble with impossible situations is that they only stay impossible until someone too stubborn to do the math walks in.</w:t>
+      </w:r>
+    </w:p>
+    <w:p>
+      <w:pPr>
+        <w:spacing w:before="40" w:after="40"/>
+        <w:ind w:firstLine="432"/>
+      </w:pPr>
+      <w:r>
+        <w:rPr>
+          <w:b w:val="0"/>
+          <w:i w:val="0"/>
+        </w:rPr>
+        <w:t>He'd liked that line. Underlined it in pencil. He thought about it now, staring at eight gravitic signatures descending through thirty kilometers of ocean, and decided the detective had never been outnumbered by warships.</w:t>
+      </w:r>
+    </w:p>
+    <w:p>
+      <w:pPr>
+        <w:spacing w:before="40" w:after="40"/>
+        <w:ind w:firstLine="432"/>
+      </w:pPr>
+      <w:r>
+        <w:rPr>
+          <w:b w:val="0"/>
+          <w:i w:val="0"/>
+        </w:rPr>
+        <w:t>"Options," he said.</w:t>
+      </w:r>
+    </w:p>
+    <w:p>
+      <w:pPr>
+        <w:spacing w:before="40" w:after="40"/>
+        <w:ind w:firstLine="432"/>
+      </w:pPr>
+      <w:r>
+        <w:rPr>
+          <w:b w:val="0"/>
+          <w:i w:val="0"/>
+        </w:rPr>
+        <w:t xml:space="preserve">Sera was already running tactical projections on her wrist display, Wick perched on her forearm, the owl's layered frequency feeding real-time data into her calculations. "We can't fight. Two ships — one of which is held together by, and I quote your registration file, </w:t>
+      </w:r>
+      <w:r>
+        <w:rPr>
+          <w:b w:val="0"/>
+          <w:i/>
+        </w:rPr>
+        <w:t>non-standard adhesive compounds</w:t>
+      </w:r>
+      <w:r>
+        <w:rPr>
+          <w:b w:val="0"/>
+          <w:i w:val="0"/>
+        </w:rPr>
+        <w:t xml:space="preserve"> — against eight military vessels. Even if we had weapons parity, which we emphatically do not, we'd need to hold position above the rift. The moment we break to engage, the Choir is exposed."</w:t>
+      </w:r>
+    </w:p>
+    <w:p>
+      <w:pPr>
+        <w:spacing w:before="40" w:after="40"/>
+        <w:ind w:firstLine="432"/>
+      </w:pPr>
+      <w:r>
+        <w:rPr>
+          <w:b w:val="0"/>
+          <w:i w:val="0"/>
+        </w:rPr>
+        <w:t>"We can't run," Miro added. "Forty-six beings that can't exactly hide behind a rock."</w:t>
+      </w:r>
+    </w:p>
+    <w:p>
+      <w:pPr>
+        <w:spacing w:before="40" w:after="40"/>
+        <w:ind w:firstLine="432"/>
+      </w:pPr>
+      <w:r>
+        <w:rPr>
+          <w:b w:val="0"/>
+          <w:i w:val="0"/>
+        </w:rPr>
+        <w:t>"And we can't bluff," Kael said. "They already know the cage is down. They're not coming to investigate. They're coming to clean."</w:t>
+      </w:r>
+    </w:p>
+    <w:p>
+      <w:pPr>
+        <w:spacing w:before="40" w:after="40"/>
+        <w:ind w:firstLine="432"/>
+      </w:pPr>
+      <w:r>
+        <w:rPr>
+          <w:b w:val="0"/>
+          <w:i w:val="0"/>
+        </w:rPr>
+        <w:t>The word sat in the cockpit like a stone.</w:t>
+      </w:r>
+    </w:p>
+    <w:p>
+      <w:pPr>
+        <w:spacing w:before="40" w:after="40"/>
+        <w:ind w:firstLine="432"/>
+      </w:pPr>
+      <w:r>
+        <w:rPr>
+          <w:b w:val="0"/>
+          <w:i/>
+        </w:rPr>
+        <w:t>Clean.</w:t>
+      </w:r>
+      <w:r>
+        <w:rPr>
+          <w:b w:val="0"/>
+          <w:i w:val="0"/>
+        </w:rPr>
+        <w:t xml:space="preserve"> In Union military parlance, it meant the elimination of all evidence — physical, biological, testimonial — that a classified operation had ever existed. The cage. The data core. The Choir. The three people who'd seen it all. Everything scrubbed. Everything silenced. The ocean floor returned to the quiet, empty dark that looked so much better in official reports.</w:t>
+      </w:r>
+    </w:p>
+    <w:p>
+      <w:pPr>
+        <w:spacing w:before="40" w:after="40"/>
+        <w:ind w:firstLine="432"/>
+      </w:pPr>
+      <w:r>
+        <w:rPr>
+          <w:b w:val="0"/>
+          <w:i w:val="0"/>
+        </w:rPr>
+        <w:t xml:space="preserve">Kael's mind did what it always did under pressure — it went sideways. Not panic, not paralysis, but a lateral drift into the strange, associative thinking that had kept him alive in situations where linear logic would have gotten him killed. He thought about the pre-war novel's detective, about impossible situations, about stubbornness. He thought about the Quanxro Lager he'd been promising himself when this was over — a cold one, the kind they poured at dockside bars on Meridian Station, where the foam was thick and the bartenders didn't ask questions. He thought about how he'd been drinking Selvaan black tea for three days because the </w:t>
+      </w:r>
+      <w:r>
+        <w:rPr>
+          <w:b w:val="0"/>
+          <w:i/>
+        </w:rPr>
+        <w:t>Fang &amp; Fable</w:t>
+      </w:r>
+      <w:r>
+        <w:rPr>
+          <w:b w:val="0"/>
+          <w:i w:val="0"/>
+        </w:rPr>
+        <w:t xml:space="preserve">'s coffee maker had died somewhere over the Vellus Expanse, and how he'd been telling himself tea was fine, tea was dignified, tea was what serious people drank, and how that was an absolute lie because what he wanted was a double-black Cygnan roast, no sugar, hot enough to scald, the kind of coffee that grabbed your brain by the collar and said </w:t>
+      </w:r>
+      <w:r>
+        <w:rPr>
+          <w:b w:val="0"/>
+          <w:i/>
+        </w:rPr>
+        <w:t>wake up, something is about to kill you.</w:t>
+      </w:r>
+    </w:p>
+    <w:p>
+      <w:pPr>
+        <w:spacing w:before="40" w:after="40"/>
+        <w:ind w:firstLine="432"/>
+      </w:pPr>
+      <w:r>
+        <w:rPr>
+          <w:b w:val="0"/>
+          <w:i w:val="0"/>
+        </w:rPr>
+        <w:t>He didn't have coffee. He didn't have weapons. He didn't have a fleet.</w:t>
+      </w:r>
+    </w:p>
+    <w:p>
+      <w:pPr>
+        <w:spacing w:before="40" w:after="40"/>
+        <w:ind w:firstLine="432"/>
+      </w:pPr>
+      <w:r>
+        <w:rPr>
+          <w:b w:val="0"/>
+          <w:i w:val="0"/>
+        </w:rPr>
+        <w:t>But he had a frequency.</w:t>
+      </w:r>
+    </w:p>
+    <w:p>
+      <w:pPr>
+        <w:spacing w:before="40" w:after="40"/>
+        <w:ind w:firstLine="432"/>
+      </w:pPr>
+      <w:r>
+        <w:rPr>
+          <w:b w:val="0"/>
+          <w:i w:val="0"/>
+        </w:rPr>
+        <w:t xml:space="preserve">"The Choir," he said. "When they sang the requiem — the other forty-six didn't just absorb the Note Between's voice. They </w:t>
+      </w:r>
+      <w:r>
+        <w:rPr>
+          <w:b w:val="0"/>
+          <w:i/>
+        </w:rPr>
+        <w:t>broadcast</w:t>
+      </w:r>
+      <w:r>
+        <w:rPr>
+          <w:b w:val="0"/>
+          <w:i w:val="0"/>
+        </w:rPr>
+        <w:t xml:space="preserve"> it. That song went out into the deep ocean on a frequency I've never encountered. Wide-spectrum, omnidirectional, powerful enough to propagate through kilometers of water and probably into the substrate below."</w:t>
+      </w:r>
+    </w:p>
+    <w:p>
+      <w:pPr>
+        <w:spacing w:before="40" w:after="40"/>
+        <w:ind w:firstLine="432"/>
+      </w:pPr>
+      <w:r>
+        <w:rPr>
+          <w:b w:val="0"/>
+          <w:i w:val="0"/>
+        </w:rPr>
+        <w:t>Miro looked at him. "You think the requiem was a signal?"</w:t>
+      </w:r>
+    </w:p>
+    <w:p>
+      <w:pPr>
+        <w:spacing w:before="40" w:after="40"/>
+        <w:ind w:firstLine="432"/>
+      </w:pPr>
+      <w:r>
+        <w:rPr>
+          <w:b w:val="0"/>
+          <w:i w:val="0"/>
+        </w:rPr>
+        <w:t xml:space="preserve">"I think the requiem was a </w:t>
+      </w:r>
+      <w:r>
+        <w:rPr>
+          <w:b w:val="0"/>
+          <w:i/>
+        </w:rPr>
+        <w:t>tradition</w:t>
+      </w:r>
+      <w:r>
+        <w:rPr>
+          <w:b w:val="0"/>
+          <w:i w:val="0"/>
+        </w:rPr>
+        <w:t>. I think it's been done before — many times, over millennia. And I think that kind of persistent, repeated, wide-spectrum broadcast doesn't just dissipate. It echoes. It reaches." He looked at the viewport. "The Choir has been here for thousands of years. Maybe longer. But they're not the only old things in this galaxy."</w:t>
+      </w:r>
+    </w:p>
+    <w:p>
+      <w:pPr>
+        <w:spacing w:before="320" w:after="320"/>
+        <w:jc w:val="center"/>
+      </w:pPr>
+      <w:r>
+        <w:rPr>
+          <w:rFonts w:ascii="Georgia" w:hAnsi="Georgia"/>
+          <w:color w:val="787878"/>
+          <w:sz w:val="24"/>
+        </w:rPr>
+        <w:t>* * *</w:t>
+      </w:r>
+    </w:p>
+    <w:p>
+      <w:pPr>
+        <w:spacing w:before="40" w:after="40"/>
+        <w:ind w:firstLine="432"/>
+      </w:pPr>
+      <w:r>
+        <w:rPr>
+          <w:b w:val="0"/>
+          <w:i w:val="0"/>
+        </w:rPr>
+        <w:t>The galaxy was vast, and humanity had barely scratched its surface.</w:t>
+      </w:r>
+    </w:p>
+    <w:p>
+      <w:pPr>
+        <w:spacing w:before="40" w:after="40"/>
+        <w:ind w:firstLine="432"/>
+      </w:pPr>
+      <w:r>
+        <w:rPr>
+          <w:b w:val="0"/>
+          <w:i w:val="0"/>
+        </w:rPr>
+        <w:t>That was the part the Union's recruitment holos never mentioned. The Colonial Union governed six hundred and twelve settled worlds across nine sectors, connected by a web of jump-gate corridors that made interstellar travel possible if not exactly pleasant. Six hundred and twelve worlds sounded like a lot until you looked at the actual map — a scattering of bright dots in an ocean of unmapped dark, like campfires on a continent-sized plain. For every system humanity had charted, there were a thousand that existed only as anomalous readings on long-range arrays.</w:t>
+      </w:r>
+    </w:p>
+    <w:p>
+      <w:pPr>
+        <w:spacing w:before="40" w:after="40"/>
+        <w:ind w:firstLine="432"/>
+      </w:pPr>
+      <w:r>
+        <w:rPr>
+          <w:b w:val="0"/>
+          <w:i w:val="0"/>
+        </w:rPr>
+        <w:t>The Covenant of Species — the fragile, contentious, endlessly bureaucratic framework that governed relations between humanity and the forty-three known sentient species — maintained that the galaxy's deeper regions were "insufficiently surveyed for safe expansion." What this meant, in practice, was that things lived out there that didn't fit neatly into Covenant taxonomy. Things that were old when humanity's ancestors were learning to chip flint. Things that moved between stars without jump-gates, communicated across light-years without ansible relays, and regarded the bustling civilizations of the mapped sectors the way an ancient forest regards a shopping mall built on its edge.</w:t>
+      </w:r>
+    </w:p>
+    <w:p>
+      <w:pPr>
+        <w:spacing w:before="40" w:after="40"/>
+        <w:ind w:firstLine="432"/>
+      </w:pPr>
+      <w:r>
+        <w:rPr>
+          <w:b w:val="0"/>
+          <w:i w:val="0"/>
+        </w:rPr>
+        <w:t xml:space="preserve">The Choir was one of these. Beings that existed in Covenant records as a footnote — </w:t>
+      </w:r>
+      <w:r>
+        <w:rPr>
+          <w:b w:val="0"/>
+          <w:i/>
+        </w:rPr>
+        <w:t>Class Twelve cognitive entities, deep-ocean substrate, estimated age range: indeterminate</w:t>
+      </w:r>
+      <w:r>
+        <w:rPr>
+          <w:b w:val="0"/>
+          <w:i w:val="0"/>
+        </w:rPr>
+        <w:t xml:space="preserve"> — because the bureaucracy had no framework for something that didn't have a government, didn't claim territory, and didn't do anything except exist and sing. The Union had looked at them and seen an obstacle. The Covenant had looked at them and seen a filing problem. No one had looked at them and asked the obvious question: </w:t>
+      </w:r>
+      <w:r>
+        <w:rPr>
+          <w:b w:val="0"/>
+          <w:i/>
+        </w:rPr>
+        <w:t>Who else is listening?</w:t>
+      </w:r>
+    </w:p>
+    <w:p>
+      <w:pPr>
+        <w:spacing w:before="40" w:after="40"/>
+        <w:ind w:firstLine="432"/>
+      </w:pPr>
+      <w:r>
+        <w:rPr>
+          <w:b w:val="0"/>
+          <w:i w:val="0"/>
+        </w:rPr>
+        <w:t>Kael was asking it now.</w:t>
+      </w:r>
+    </w:p>
+    <w:p>
+      <w:pPr>
+        <w:spacing w:before="40" w:after="40"/>
+        <w:ind w:firstLine="432"/>
+      </w:pPr>
+      <w:r>
+        <w:rPr>
+          <w:b w:val="0"/>
+          <w:i w:val="0"/>
+        </w:rPr>
+        <w:t xml:space="preserve">He sat cross-legged on the deck, palms flat, frequency wide open. Not aimed at the Choir this time — aimed </w:t>
+      </w:r>
+      <w:r>
+        <w:rPr>
+          <w:b w:val="0"/>
+          <w:i/>
+        </w:rPr>
+        <w:t>past</w:t>
+      </w:r>
+      <w:r>
+        <w:rPr>
+          <w:b w:val="0"/>
+          <w:i w:val="0"/>
+        </w:rPr>
+        <w:t xml:space="preserve"> them, into the deep water, into the frequency channels the requiem had traveled. He was listening for echoes. For answers. For the thing that happened when an ancient song reached ancient ears.</w:t>
+      </w:r>
+    </w:p>
+    <w:p>
+      <w:pPr>
+        <w:spacing w:before="40" w:after="40"/>
+        <w:ind w:firstLine="432"/>
+      </w:pPr>
+      <w:r>
+        <w:rPr>
+          <w:b w:val="0"/>
+          <w:i w:val="0"/>
+        </w:rPr>
+        <w:t>His nose bled. His vision blurred. Talon pressed against his shoulder, her frequency a lifeline — the bright, sharp copper that kept his identity tethered when the ocean's vast signal threatened to dissolve it.</w:t>
+      </w:r>
+    </w:p>
+    <w:p>
+      <w:pPr>
+        <w:spacing w:before="40" w:after="40"/>
+        <w:ind w:firstLine="432"/>
+      </w:pPr>
+      <w:r>
+        <w:rPr>
+          <w:b w:val="0"/>
+          <w:i w:val="0"/>
+        </w:rPr>
+        <w:t>And there, at the very edge of his range — so faint it was less a sound than a memory of a sound — he heard it.</w:t>
+      </w:r>
+    </w:p>
+    <w:p>
+      <w:pPr>
+        <w:spacing w:before="40" w:after="40"/>
+        <w:ind w:firstLine="432"/>
+      </w:pPr>
+      <w:r>
+        <w:rPr>
+          <w:b w:val="0"/>
+          <w:i w:val="0"/>
+        </w:rPr>
+        <w:t>A response.</w:t>
+      </w:r>
+    </w:p>
+    <w:p>
+      <w:pPr>
+        <w:spacing w:before="40" w:after="40"/>
+        <w:ind w:firstLine="432"/>
+      </w:pPr>
+      <w:r>
+        <w:rPr>
+          <w:b w:val="0"/>
+          <w:i w:val="0"/>
+        </w:rPr>
+        <w:t xml:space="preserve">Not from below. Not from the rift. From </w:t>
+      </w:r>
+      <w:r>
+        <w:rPr>
+          <w:b w:val="0"/>
+          <w:i/>
+        </w:rPr>
+        <w:t>beyond</w:t>
+      </w:r>
+      <w:r>
+        <w:rPr>
+          <w:b w:val="0"/>
+          <w:i w:val="0"/>
+        </w:rPr>
+        <w:t xml:space="preserve"> — from out past the continental shelf, past the abyssal plain, from somewhere in the deep galaxy that no Covenant map had ever charted. A frequency that rhymed with the Choir's the way a grandmother's voice rhymes with a grandchild's. The same harmonic family. The same ancient roots. But older. Deeper. Rougher, like a voice that had been singing for so long it had worn grooves into the fabric of space itself.</w:t>
+      </w:r>
+    </w:p>
+    <w:p>
+      <w:pPr>
+        <w:spacing w:before="40" w:after="40"/>
+        <w:ind w:firstLine="432"/>
+      </w:pPr>
+      <w:r>
+        <w:rPr>
+          <w:b w:val="0"/>
+          <w:i w:val="0"/>
+        </w:rPr>
+        <w:t>"Someone heard," Kael said, opening his eyes. Blood ran from both nostrils. He didn't wipe it. "Someone is coming."</w:t>
+      </w:r>
+    </w:p>
+    <w:p>
+      <w:pPr>
+        <w:spacing w:before="40" w:after="40"/>
+        <w:ind w:firstLine="432"/>
+      </w:pPr>
+      <w:r>
+        <w:rPr>
+          <w:b w:val="0"/>
+          <w:i w:val="0"/>
+        </w:rPr>
+        <w:t xml:space="preserve">"Someone </w:t>
+      </w:r>
+      <w:r>
+        <w:rPr>
+          <w:b w:val="0"/>
+          <w:i/>
+        </w:rPr>
+        <w:t>what?</w:t>
+      </w:r>
+      <w:r>
+        <w:rPr>
+          <w:b w:val="0"/>
+          <w:i w:val="0"/>
+        </w:rPr>
+        <w:t>" Miro leaned forward. "Who? From where?"</w:t>
+      </w:r>
+    </w:p>
+    <w:p>
+      <w:pPr>
+        <w:spacing w:before="40" w:after="40"/>
+        <w:ind w:firstLine="432"/>
+      </w:pPr>
+      <w:r>
+        <w:rPr>
+          <w:b w:val="0"/>
+          <w:i w:val="0"/>
+        </w:rPr>
+        <w:t>"I don't know. But they're old. And they're fast."</w:t>
+      </w:r>
+    </w:p>
+    <w:p>
+      <w:pPr>
+        <w:spacing w:before="320" w:after="320"/>
+        <w:jc w:val="center"/>
+      </w:pPr>
+      <w:r>
+        <w:rPr>
+          <w:rFonts w:ascii="Georgia" w:hAnsi="Georgia"/>
+          <w:color w:val="787878"/>
+          <w:sz w:val="24"/>
+        </w:rPr>
+        <w:t>* * *</w:t>
+      </w:r>
+    </w:p>
+    <w:p>
+      <w:pPr>
+        <w:spacing w:before="40" w:after="40"/>
+        <w:ind w:firstLine="432"/>
+      </w:pPr>
+      <w:r>
+        <w:rPr>
+          <w:b w:val="0"/>
+          <w:i w:val="0"/>
+        </w:rPr>
+        <w:t>The Thirty-First arrived first.</w:t>
+      </w:r>
+    </w:p>
+    <w:p>
+      <w:pPr>
+        <w:spacing w:before="40" w:after="40"/>
+        <w:ind w:firstLine="432"/>
+      </w:pPr>
+      <w:r>
+        <w:rPr>
+          <w:b w:val="0"/>
+          <w:i w:val="0"/>
+        </w:rPr>
+        <w:t xml:space="preserve">They came through the water column in combat formation — eight ships, dark-hulled and angular, their gravitic drives cutting through the ocean like heated blades. Two Crucible-class heavy cruisers at the center, each one a hundred and sixty meters of armored malice. Four Stilletto escort frigates flanking in pairs, fast and sharp, designed for exactly this kind of containment operation. And two Veil-class sensor ships hanging back, painting the deep with targeting arrays that lit up the </w:t>
+      </w:r>
+      <w:r>
+        <w:rPr>
+          <w:b w:val="0"/>
+          <w:i/>
+        </w:rPr>
+        <w:t>Fang &amp; Fable</w:t>
+      </w:r>
+      <w:r>
+        <w:rPr>
+          <w:b w:val="0"/>
+          <w:i w:val="0"/>
+        </w:rPr>
+        <w:t>'s threat board like a festival.</w:t>
+      </w:r>
+    </w:p>
+    <w:p>
+      <w:pPr>
+        <w:spacing w:before="40" w:after="40"/>
+        <w:ind w:firstLine="432"/>
+      </w:pPr>
+      <w:r>
+        <w:rPr>
+          <w:b w:val="0"/>
+          <w:i w:val="0"/>
+        </w:rPr>
+        <w:t>They didn't hail. They didn't warn. They simply arrived, spread into a suppression pattern around the Choir's position, and began charging weapons.</w:t>
+      </w:r>
+    </w:p>
+    <w:p>
+      <w:pPr>
+        <w:spacing w:before="40" w:after="40"/>
+        <w:ind w:firstLine="432"/>
+      </w:pPr>
+      <w:r>
+        <w:rPr>
+          <w:b w:val="0"/>
+          <w:i w:val="0"/>
+        </w:rPr>
+        <w:t>"Gravitic lances," Sera said, reading the energy signatures. Her voice had gone flat — the professional calm of someone who has seen violence administered by bureaucracy and knows exactly how efficient it is. "Ship-to-surface configuration. They're not targeting us. They're targeting the Choir."</w:t>
+      </w:r>
+    </w:p>
+    <w:p>
+      <w:pPr>
+        <w:spacing w:before="40" w:after="40"/>
+        <w:ind w:firstLine="432"/>
+      </w:pPr>
+      <w:r>
+        <w:rPr>
+          <w:b w:val="0"/>
+          <w:i w:val="0"/>
+        </w:rPr>
+        <w:t>"They're going to kill them from range," Kael said. "Without ever getting close enough to see what they're killing."</w:t>
+      </w:r>
+    </w:p>
+    <w:p>
+      <w:pPr>
+        <w:spacing w:before="40" w:after="40"/>
+        <w:ind w:firstLine="432"/>
+      </w:pPr>
+      <w:r>
+        <w:rPr>
+          <w:b w:val="0"/>
+          <w:i w:val="0"/>
+        </w:rPr>
+        <w:t>"That's how it works." Sera's jaw was tight. "Classified operations don't have faces. They have coordinates."</w:t>
+      </w:r>
+    </w:p>
+    <w:p>
+      <w:pPr>
+        <w:spacing w:before="40" w:after="40"/>
+        <w:ind w:firstLine="432"/>
+      </w:pPr>
+      <w:r>
+        <w:rPr>
+          <w:b w:val="0"/>
+          <w:i w:val="0"/>
+        </w:rPr>
+        <w:t xml:space="preserve">Wick's frequency flared — a sharp, urgent burst that Kael read as </w:t>
+      </w:r>
+      <w:r>
+        <w:rPr>
+          <w:b w:val="0"/>
+          <w:i/>
+        </w:rPr>
+        <w:t>incoming communication.</w:t>
+      </w:r>
+      <w:r>
+        <w:rPr>
+          <w:b w:val="0"/>
+          <w:i w:val="0"/>
+        </w:rPr>
+        <w:t xml:space="preserve"> A channel opened on the comm, tight-beam, encrypted with Union military protocols that Sera's Lawkeeper codes sliced through automatically.</w:t>
+      </w:r>
+    </w:p>
+    <w:p>
+      <w:pPr>
+        <w:spacing w:before="40" w:after="40"/>
+        <w:ind w:firstLine="432"/>
+      </w:pPr>
+      <w:r>
+        <w:rPr>
+          <w:b w:val="0"/>
+          <w:i w:val="0"/>
+        </w:rPr>
+        <w:t>"</w:t>
+      </w:r>
+      <w:r>
+        <w:rPr>
+          <w:b w:val="0"/>
+          <w:i/>
+        </w:rPr>
+        <w:t>Unidentified vessels in restricted waters. This is Captain Maren Dahl, Thirty-First Strategic Fleet, operating under Union Security Directive Seven-Seven-One. You are in a classified operational zone. Power down your drives, surrender your data stores, and prepare for boarding. Non-compliance will be met with terminal force. You have sixty seconds.</w:t>
+      </w:r>
+      <w:r>
+        <w:rPr>
+          <w:b w:val="0"/>
+          <w:i w:val="0"/>
+        </w:rPr>
+        <w:t>"</w:t>
+      </w:r>
+    </w:p>
+    <w:p>
+      <w:pPr>
+        <w:spacing w:before="40" w:after="40"/>
+        <w:ind w:firstLine="432"/>
+      </w:pPr>
+      <w:r>
+        <w:rPr>
+          <w:b w:val="0"/>
+          <w:i w:val="0"/>
+        </w:rPr>
+        <w:t>The voice was calm, clipped, professional. The voice of someone who had given this speech before and expected it to end the same way it always did — with compliance, or with wreckage.</w:t>
+      </w:r>
+    </w:p>
+    <w:p>
+      <w:pPr>
+        <w:spacing w:before="40" w:after="40"/>
+        <w:ind w:firstLine="432"/>
+      </w:pPr>
+      <w:r>
+        <w:rPr>
+          <w:b w:val="0"/>
+          <w:i w:val="0"/>
+        </w:rPr>
+        <w:t>Sera reached for the comm. Kael watched her, expecting the Lawkeeper script — jurisdiction, authority, legal framework. Instead, she paused. Her hand hovered over the transmit key. She looked at the viewport, where the Choir's diminished light flickered against the dark — forty-six wounded voices still singing, still holding the rift, still alive.</w:t>
+      </w:r>
+    </w:p>
+    <w:p>
+      <w:pPr>
+        <w:spacing w:before="40" w:after="40"/>
+        <w:ind w:firstLine="432"/>
+      </w:pPr>
+      <w:r>
+        <w:rPr>
+          <w:b w:val="0"/>
+          <w:i w:val="0"/>
+        </w:rPr>
+        <w:t>She looked at Kael.</w:t>
+      </w:r>
+    </w:p>
+    <w:p>
+      <w:pPr>
+        <w:spacing w:before="40" w:after="40"/>
+        <w:ind w:firstLine="432"/>
+      </w:pPr>
+      <w:r>
+        <w:rPr>
+          <w:b w:val="0"/>
+          <w:i w:val="0"/>
+        </w:rPr>
+        <w:t>"I have a duty to identify myself," she said. "The moment I do, I invoke Covenant jurisdiction. Captain Dahl will be required by interstellar law to stand down pending a judicial review. But the Thirty-First doesn't answer to the Covenant. They answer to the Union's Strategic Command. If I invoke jurisdiction and they ignore it —"</w:t>
+      </w:r>
+    </w:p>
+    <w:p>
+      <w:pPr>
+        <w:spacing w:before="40" w:after="40"/>
+        <w:ind w:firstLine="432"/>
+      </w:pPr>
+      <w:r>
+        <w:rPr>
+          <w:b w:val="0"/>
+          <w:i w:val="0"/>
+        </w:rPr>
+        <w:t>"Then we have legal proof that a Union fleet violated Covenant authority."</w:t>
+      </w:r>
+    </w:p>
+    <w:p>
+      <w:pPr>
+        <w:spacing w:before="40" w:after="40"/>
+        <w:ind w:firstLine="432"/>
+      </w:pPr>
+      <w:r>
+        <w:rPr>
+          <w:b w:val="0"/>
+          <w:i w:val="0"/>
+        </w:rPr>
+        <w:t>"And we're dead. Legal proof doesn't help if there's no one left to deliver it."</w:t>
+      </w:r>
+    </w:p>
+    <w:p>
+      <w:pPr>
+        <w:spacing w:before="40" w:after="40"/>
+        <w:ind w:firstLine="432"/>
+      </w:pPr>
+      <w:r>
+        <w:rPr>
+          <w:b w:val="0"/>
+          <w:i w:val="0"/>
+        </w:rPr>
+        <w:t>"Forty-five seconds," Miro said, watching the countdown.</w:t>
+      </w:r>
+    </w:p>
+    <w:p>
+      <w:pPr>
+        <w:spacing w:before="40" w:after="40"/>
+        <w:ind w:firstLine="432"/>
+      </w:pPr>
+      <w:r>
+        <w:rPr>
+          <w:b w:val="0"/>
+          <w:i w:val="0"/>
+        </w:rPr>
+        <w:t xml:space="preserve">Kael thought about the pre-war detective again. </w:t>
+      </w:r>
+      <w:r>
+        <w:rPr>
+          <w:b w:val="0"/>
+          <w:i/>
+        </w:rPr>
+        <w:t>The trouble with impossible situations.</w:t>
+      </w:r>
+      <w:r>
+        <w:rPr>
+          <w:b w:val="0"/>
+          <w:i w:val="0"/>
+        </w:rPr>
+        <w:t xml:space="preserve"> He thought about a Netherland Pale Ale — the kind they brewed on Arctis-VII, where the water came from glacial aquifers three kilometers deep, and the hops were a xenobotanical hybrid that tasted like pine and copper and the particular stubbornness of people who insisted on making beer on an ice world because someone had to. He thought about how he might never drink one again.</w:t>
+      </w:r>
+    </w:p>
+    <w:p>
+      <w:pPr>
+        <w:spacing w:before="40" w:after="40"/>
+        <w:ind w:firstLine="432"/>
+      </w:pPr>
+      <w:r>
+        <w:rPr>
+          <w:b w:val="0"/>
+          <w:i w:val="0"/>
+        </w:rPr>
+        <w:t>"Do it," he said. "Invoke jurisdiction. Make them choose."</w:t>
+      </w:r>
+    </w:p>
+    <w:p>
+      <w:pPr>
+        <w:spacing w:before="40" w:after="40"/>
+        <w:ind w:firstLine="432"/>
+      </w:pPr>
+      <w:r>
+        <w:rPr>
+          <w:b w:val="0"/>
+          <w:i w:val="0"/>
+        </w:rPr>
+        <w:t>Sera pressed the transmit key.</w:t>
+      </w:r>
+    </w:p>
+    <w:p>
+      <w:pPr>
+        <w:spacing w:before="40" w:after="40"/>
+        <w:ind w:firstLine="432"/>
+      </w:pPr>
+      <w:r>
+        <w:rPr>
+          <w:b w:val="0"/>
+          <w:i w:val="0"/>
+        </w:rPr>
+        <w:t>"Captain Dahl, this is Lawkeeper Sera Voss, Covenant Judicial Authority, badge designation Arbiter-Seven-Seven. You are operating in the sovereign habitat of a Class Twelve cognitive species under Covenant Protection Charter, Article Ninety-One. I am ordering you to stand down immediately, power down weapons systems, and submit to judicial review. Any hostile action taken against the protected species or civilian vessels in this zone will constitute a violation of the Covenant of Species and will be prosecuted to the full extent of interstellar law. Acknowledge."</w:t>
+      </w:r>
+    </w:p>
+    <w:p>
+      <w:pPr>
+        <w:spacing w:before="40" w:after="40"/>
+        <w:ind w:firstLine="432"/>
+      </w:pPr>
+      <w:r>
+        <w:rPr>
+          <w:b w:val="0"/>
+          <w:i w:val="0"/>
+        </w:rPr>
+        <w:t>Silence.</w:t>
+      </w:r>
+    </w:p>
+    <w:p>
+      <w:pPr>
+        <w:spacing w:before="40" w:after="40"/>
+        <w:ind w:firstLine="432"/>
+      </w:pPr>
+      <w:r>
+        <w:rPr>
+          <w:b w:val="0"/>
+          <w:i w:val="0"/>
+        </w:rPr>
+        <w:t>Ten seconds. Twenty.</w:t>
+      </w:r>
+    </w:p>
+    <w:p>
+      <w:pPr>
+        <w:spacing w:before="40" w:after="40"/>
+        <w:ind w:firstLine="432"/>
+      </w:pPr>
+      <w:r>
+        <w:rPr>
+          <w:b w:val="0"/>
+          <w:i w:val="0"/>
+        </w:rPr>
+        <w:t>Then: "</w:t>
+      </w:r>
+      <w:r>
+        <w:rPr>
+          <w:b w:val="0"/>
+          <w:i/>
+        </w:rPr>
+        <w:t>Lawkeeper Voss. Your presence here is noted. Be advised that Union Security Directive Seven-Seven-One supersedes Covenant jurisdiction in matters of existential strategic defense. We are authorized to complete our operational objectives regardless of external legal claims. Stand down or be treated as hostile. You have thirty seconds.</w:t>
+      </w:r>
+      <w:r>
+        <w:rPr>
+          <w:b w:val="0"/>
+          <w:i w:val="0"/>
+        </w:rPr>
+        <w:t>"</w:t>
+      </w:r>
+    </w:p>
+    <w:p>
+      <w:pPr>
+        <w:spacing w:before="40" w:after="40"/>
+        <w:ind w:firstLine="432"/>
+      </w:pPr>
+      <w:r>
+        <w:rPr>
+          <w:b w:val="0"/>
+          <w:i w:val="0"/>
+        </w:rPr>
+        <w:t>"They're going to fire," Miro said quietly.</w:t>
+      </w:r>
+    </w:p>
+    <w:p>
+      <w:pPr>
+        <w:spacing w:before="40" w:after="40"/>
+        <w:ind w:firstLine="432"/>
+      </w:pPr>
+      <w:r>
+        <w:rPr>
+          <w:b w:val="0"/>
+          <w:i w:val="0"/>
+        </w:rPr>
+        <w:t>"Yes," Sera said.</w:t>
+      </w:r>
+    </w:p>
+    <w:p>
+      <w:pPr>
+        <w:spacing w:before="40" w:after="40"/>
+        <w:ind w:firstLine="432"/>
+      </w:pPr>
+      <w:r>
+        <w:rPr>
+          <w:b w:val="0"/>
+          <w:i w:val="0"/>
+        </w:rPr>
+        <w:t>"So we've got thirty seconds and a legal argument."</w:t>
+      </w:r>
+    </w:p>
+    <w:p>
+      <w:pPr>
+        <w:spacing w:before="40" w:after="40"/>
+        <w:ind w:firstLine="432"/>
+      </w:pPr>
+      <w:r>
+        <w:rPr>
+          <w:b w:val="0"/>
+          <w:i w:val="0"/>
+        </w:rPr>
+        <w:t>"Twenty-eight."</w:t>
+      </w:r>
+    </w:p>
+    <w:p>
+      <w:pPr>
+        <w:spacing w:before="40" w:after="40"/>
+        <w:ind w:firstLine="432"/>
+      </w:pPr>
+      <w:r>
+        <w:rPr>
+          <w:b w:val="0"/>
+          <w:i w:val="0"/>
+        </w:rPr>
+        <w:t>Kael closed his eyes. Reached for the frequency — not the military comms, not the tactical data, but the deep channel, the ancient one, the one that carried the echo he'd heard minutes ago. He pushed his range further than he'd ever pushed it, further than was safe, further than the Academy would have called possible. Talon screamed — a sharp, physical sound, not frequency but vocal, the hawk expressing in the only way she could that her bonded partner was burning himself out.</w:t>
+      </w:r>
+    </w:p>
+    <w:p>
+      <w:pPr>
+        <w:spacing w:before="40" w:after="40"/>
+        <w:ind w:firstLine="432"/>
+      </w:pPr>
+      <w:r>
+        <w:rPr>
+          <w:b w:val="0"/>
+          <w:i w:val="0"/>
+        </w:rPr>
+        <w:t>The echo was closer. Much closer. Coming fast — impossibly fast — from the deep water beyond the shelf. And it wasn't alone.</w:t>
+      </w:r>
+    </w:p>
+    <w:p>
+      <w:pPr>
+        <w:spacing w:before="40" w:after="40"/>
+        <w:ind w:firstLine="432"/>
+      </w:pPr>
+      <w:r>
+        <w:rPr>
+          <w:b w:val="0"/>
+          <w:i w:val="0"/>
+        </w:rPr>
+        <w:t>Kael opened his eyes.</w:t>
+      </w:r>
+    </w:p>
+    <w:p>
+      <w:pPr>
+        <w:spacing w:before="40" w:after="40"/>
+        <w:ind w:firstLine="432"/>
+      </w:pPr>
+      <w:r>
+        <w:rPr>
+          <w:b w:val="0"/>
+          <w:i w:val="0"/>
+        </w:rPr>
+        <w:t>"Fifteen seconds," Miro said.</w:t>
+      </w:r>
+    </w:p>
+    <w:p>
+      <w:pPr>
+        <w:spacing w:before="40" w:after="40"/>
+        <w:ind w:firstLine="432"/>
+      </w:pPr>
+      <w:r>
+        <w:rPr>
+          <w:b w:val="0"/>
+          <w:i w:val="0"/>
+        </w:rPr>
+        <w:t>"We don't need thirty," Kael said. "We need fifteen."</w:t>
+      </w:r>
+    </w:p>
+    <w:p>
+      <w:pPr>
+        <w:spacing w:before="40" w:after="40"/>
+        <w:ind w:firstLine="432"/>
+      </w:pPr>
+      <w:r>
+        <w:rPr>
+          <w:b w:val="0"/>
+          <w:i w:val="0"/>
+        </w:rPr>
+        <w:t>The ocean floor shook.</w:t>
+      </w:r>
+    </w:p>
+    <w:p>
+      <w:pPr>
+        <w:spacing w:before="320" w:after="320"/>
+        <w:jc w:val="center"/>
+      </w:pPr>
+      <w:r>
+        <w:rPr>
+          <w:rFonts w:ascii="Georgia" w:hAnsi="Georgia"/>
+          <w:color w:val="787878"/>
+          <w:sz w:val="24"/>
+        </w:rPr>
+        <w:t>* * *</w:t>
+      </w:r>
+    </w:p>
+    <w:p>
+      <w:pPr>
+        <w:spacing w:before="40" w:after="40"/>
+        <w:ind w:firstLine="432"/>
+      </w:pPr>
+      <w:r>
+        <w:rPr>
+          <w:b w:val="0"/>
+          <w:i w:val="0"/>
+        </w:rPr>
+        <w:t>They came from the deep trenches — from the unmapped canyons and abyssal fractures that no Covenant survey had ever reached, from the places where the galaxy's oldest things lived in patient, watchful silence. They came because the requiem had reached them. Because the Choir's death-song had traveled along frequency channels older than starlight, and at the other end of those channels, someone had been listening. Someone had always been listening.</w:t>
+      </w:r>
+    </w:p>
+    <w:p>
+      <w:pPr>
+        <w:spacing w:before="40" w:after="40"/>
+        <w:ind w:firstLine="432"/>
+      </w:pPr>
+      <w:r>
+        <w:rPr>
+          <w:b w:val="0"/>
+          <w:i w:val="0"/>
+        </w:rPr>
+        <w:t>They were not the Choir. They were something else — something related but different, the way a wolf is related to but different from a dog. Where the Choir was luminous, fluid, graceful, these beings were rough and dark and scarred, their bodies dense with age, their bioluminescence not the Choir's soft blue-white but a deep, slow amber — the color of old fires, of embers that had been burning for longer than anyone had bothered to count. They were smaller than the Choir, most of them — hundreds of meters rather than kilometers — but they moved with a heaviness that had nothing to do with size and everything to do with time. They moved the way mountains would move if mountains decided they'd had enough.</w:t>
+      </w:r>
+    </w:p>
+    <w:p>
+      <w:pPr>
+        <w:spacing w:before="40" w:after="40"/>
+        <w:ind w:firstLine="432"/>
+      </w:pPr>
+      <w:r>
+        <w:rPr>
+          <w:b w:val="0"/>
+          <w:i w:val="0"/>
+        </w:rPr>
+        <w:t xml:space="preserve">And riding them — </w:t>
+      </w:r>
+      <w:r>
+        <w:rPr>
+          <w:b w:val="0"/>
+          <w:i/>
+        </w:rPr>
+        <w:t>on</w:t>
+      </w:r>
+      <w:r>
+        <w:rPr>
+          <w:b w:val="0"/>
+          <w:i w:val="0"/>
+        </w:rPr>
+        <w:t xml:space="preserve"> them, in them, growing from them like barnacles on ancient hulls — were structures. Organic platforms, calcified over millennia, shaped by hands and tools and intention. And on those platforms, standing in the deep water in suits that were not quite EVA gear and not quite skin, breathing through membranes that pulsed with their own gentle rhythm, were people.</w:t>
+      </w:r>
+    </w:p>
+    <w:p>
+      <w:pPr>
+        <w:spacing w:before="40" w:after="40"/>
+        <w:ind w:firstLine="432"/>
+      </w:pPr>
+      <w:r>
+        <w:rPr>
+          <w:b w:val="0"/>
+          <w:i w:val="0"/>
+        </w:rPr>
+        <w:t>Old people.</w:t>
+      </w:r>
+    </w:p>
+    <w:p>
+      <w:pPr>
+        <w:spacing w:before="40" w:after="40"/>
+        <w:ind w:firstLine="432"/>
+      </w:pPr>
+      <w:r>
+        <w:rPr>
+          <w:b w:val="0"/>
+          <w:i w:val="0"/>
+        </w:rPr>
+        <w:t>Men and women and others who didn't fit either category, their faces lined and weathered, their eyes bright with the particular clarity that comes from having seen enough of the galaxy to stop being surprised by it. Their suits were patched and worn and covered in the accumulated markings of decades — frequency sigils, species glyphs, navigational tattoos that mapped routes no jump-gate had ever serviced. Some of them carried tools. Some carried instruments that Kael didn't recognize. One — a woman at the front of the largest platform, her white hair streaming in the current, her face a map of laugh lines and scar tissue — carried nothing at all. She didn't need to. The frequency coming off her was so powerful, so layered, so dense with experience and authority that Kael could feel it through the hull like a physical weight.</w:t>
+      </w:r>
+    </w:p>
+    <w:p>
+      <w:pPr>
+        <w:spacing w:before="40" w:after="40"/>
+        <w:ind w:firstLine="432"/>
+      </w:pPr>
+      <w:r>
+        <w:rPr>
+          <w:b w:val="0"/>
+          <w:i w:val="0"/>
+        </w:rPr>
+        <w:t>He knew what she was. What they all were.</w:t>
+      </w:r>
+    </w:p>
+    <w:p>
+      <w:pPr>
+        <w:spacing w:before="40" w:after="40"/>
+        <w:ind w:firstLine="432"/>
+      </w:pPr>
+      <w:r>
+        <w:rPr>
+          <w:b w:val="0"/>
+          <w:i w:val="0"/>
+        </w:rPr>
+        <w:t>Listeners. Frequency-listeners, like him — but not like him. Not trained by the Academy, not certified by the Covenant, not registered in any database that the Union or the Lawkeepers or anyone else maintained. These were the ones who had walked away from the mapped sectors entirely. The ones who had gone into the deep galaxy and never come back. The ones the Academy called "lost" and the Union called "rogue" and who called themselves nothing at all, because when you've spent forty years living alongside beings older than your species, names feel like a very small idea.</w:t>
+      </w:r>
+    </w:p>
+    <w:p>
+      <w:pPr>
+        <w:spacing w:before="40" w:after="40"/>
+        <w:ind w:firstLine="432"/>
+      </w:pPr>
+      <w:r>
+        <w:rPr>
+          <w:b w:val="0"/>
+          <w:i w:val="0"/>
+        </w:rPr>
+        <w:t>The old guard. The deep listeners.</w:t>
+      </w:r>
+    </w:p>
+    <w:p>
+      <w:pPr>
+        <w:spacing w:before="40" w:after="40"/>
+        <w:ind w:firstLine="432"/>
+      </w:pPr>
+      <w:r>
+        <w:rPr>
+          <w:b w:val="0"/>
+          <w:i w:val="0"/>
+        </w:rPr>
+        <w:t xml:space="preserve">Miro was staring, his mouth open, every trace of humor suspended in pure, bewildered awe. "Are those — are those </w:t>
+      </w:r>
+      <w:r>
+        <w:rPr>
+          <w:b w:val="0"/>
+          <w:i/>
+        </w:rPr>
+        <w:t>people?</w:t>
+      </w:r>
+      <w:r>
+        <w:rPr>
+          <w:b w:val="0"/>
+          <w:i w:val="0"/>
+        </w:rPr>
+        <w:t xml:space="preserve"> On the — riding the —"</w:t>
+      </w:r>
+    </w:p>
+    <w:p>
+      <w:pPr>
+        <w:spacing w:before="40" w:after="40"/>
+        <w:ind w:firstLine="432"/>
+      </w:pPr>
+      <w:r>
+        <w:rPr>
+          <w:b w:val="0"/>
+          <w:i w:val="0"/>
+        </w:rPr>
+        <w:t>"Yes."</w:t>
+      </w:r>
+    </w:p>
+    <w:p>
+      <w:pPr>
+        <w:spacing w:before="40" w:after="40"/>
+        <w:ind w:firstLine="432"/>
+      </w:pPr>
+      <w:r>
+        <w:rPr>
+          <w:b w:val="0"/>
+          <w:i w:val="0"/>
+        </w:rPr>
+        <w:t>"</w:t>
+      </w:r>
+      <w:r>
+        <w:rPr>
+          <w:b w:val="0"/>
+          <w:i/>
+        </w:rPr>
+        <w:t>How?</w:t>
+      </w:r>
+      <w:r>
+        <w:rPr>
+          <w:b w:val="0"/>
+          <w:i w:val="0"/>
+        </w:rPr>
+        <w:t>"</w:t>
+      </w:r>
+    </w:p>
+    <w:p>
+      <w:pPr>
+        <w:spacing w:before="40" w:after="40"/>
+        <w:ind w:firstLine="432"/>
+      </w:pPr>
+      <w:r>
+        <w:rPr>
+          <w:b w:val="0"/>
+          <w:i w:val="0"/>
+        </w:rPr>
+        <w:t xml:space="preserve">"The same way I talk to Talon. The same way Sera works with Wick. Except they've been doing it for decades, with beings that make the Choir look young." Kael's voice was barely steady. He'd heard rumors. Every listener had. Stories passed between graduates in quiet bars — about the ones who went too deep, who opened their frequencies too wide, who found things in the unmapped dark that changed them. The Academy treated the stories as cautionary tales. </w:t>
+      </w:r>
+      <w:r>
+        <w:rPr>
+          <w:b w:val="0"/>
+          <w:i/>
+        </w:rPr>
+        <w:t>Don't go too far. Don't listen too long. Don't lose yourself.</w:t>
+      </w:r>
+      <w:r>
+        <w:rPr>
+          <w:b w:val="0"/>
+          <w:i w:val="0"/>
+        </w:rPr>
+        <w:t xml:space="preserve"> But looking at the white-haired woman on the lead platform, Kael didn't see someone who'd lost herself. He saw someone who'd found something so much larger than herself that the distinction had stopped mattering.</w:t>
+      </w:r>
+    </w:p>
+    <w:p>
+      <w:pPr>
+        <w:spacing w:before="40" w:after="40"/>
+        <w:ind w:firstLine="432"/>
+      </w:pPr>
+      <w:r>
+        <w:rPr>
+          <w:b w:val="0"/>
+          <w:i w:val="0"/>
+        </w:rPr>
+        <w:t>"There are thirty — no, forty of them," Miro said, reading his scanner. "Forty-three people on eighteen... creatures — I don't have a classification for these, they're not in any database I—"</w:t>
+      </w:r>
+    </w:p>
+    <w:p>
+      <w:pPr>
+        <w:spacing w:before="40" w:after="40"/>
+        <w:ind w:firstLine="432"/>
+      </w:pPr>
+      <w:r>
+        <w:rPr>
+          <w:b w:val="0"/>
+          <w:i w:val="0"/>
+        </w:rPr>
+        <w:t>"They won't be. They're from beyond the Covenant's reach."</w:t>
+      </w:r>
+    </w:p>
+    <w:p>
+      <w:pPr>
+        <w:spacing w:before="40" w:after="40"/>
+        <w:ind w:firstLine="432"/>
+      </w:pPr>
+      <w:r>
+        <w:rPr>
+          <w:b w:val="0"/>
+          <w:i w:val="0"/>
+        </w:rPr>
+        <w:t>"The deep listeners," Sera said. It wasn't a question. She'd gone very still, her hand on the viewport rail, Wick's frequency a low, awed hum. "They're real. I thought they were a Fringe myth."</w:t>
+      </w:r>
+    </w:p>
+    <w:p>
+      <w:pPr>
+        <w:spacing w:before="40" w:after="40"/>
+        <w:ind w:firstLine="432"/>
+      </w:pPr>
+      <w:r>
+        <w:rPr>
+          <w:b w:val="0"/>
+          <w:i w:val="0"/>
+        </w:rPr>
+        <w:t>"So did I."</w:t>
+      </w:r>
+    </w:p>
+    <w:p>
+      <w:pPr>
+        <w:spacing w:before="40" w:after="40"/>
+        <w:ind w:firstLine="432"/>
+      </w:pPr>
+      <w:r>
+        <w:rPr>
+          <w:b w:val="0"/>
+          <w:i w:val="0"/>
+        </w:rPr>
+        <w:t>Captain Dahl's thirty seconds expired. It didn't matter.</w:t>
+      </w:r>
+    </w:p>
+    <w:p>
+      <w:pPr>
+        <w:spacing w:before="40" w:after="40"/>
+        <w:ind w:firstLine="432"/>
+      </w:pPr>
+      <w:r>
+        <w:rPr>
+          <w:b w:val="0"/>
+          <w:i w:val="0"/>
+        </w:rPr>
+        <w:t xml:space="preserve">The deep listeners' mounts — Kael didn't have a better word for them, though </w:t>
+      </w:r>
+      <w:r>
+        <w:rPr>
+          <w:b w:val="0"/>
+          <w:i/>
+        </w:rPr>
+        <w:t>mount</w:t>
+      </w:r>
+      <w:r>
+        <w:rPr>
+          <w:b w:val="0"/>
+          <w:i w:val="0"/>
+        </w:rPr>
+        <w:t xml:space="preserve"> felt absurdly small for what they were — rose from the trenches in a formation that was not military but something older. A pattern that matched the Choir's ring, that echoed the shape of the requiem's harmonic structure. They positioned themselves between the Thirty-First's fleet and the Choir with the unhurried confidence of people who had done this before. Not this exactly — not this ocean, not this fleet — but this </w:t>
+      </w:r>
+      <w:r>
+        <w:rPr>
+          <w:b w:val="0"/>
+          <w:i/>
+        </w:rPr>
+        <w:t>kind</w:t>
+      </w:r>
+      <w:r>
+        <w:rPr>
+          <w:b w:val="0"/>
+          <w:i w:val="0"/>
+        </w:rPr>
+        <w:t xml:space="preserve"> of thing. They had stood between the ancient and the violent before. It was, Kael realized, what they did. What they had always done. Out there in the unmapped dark, while the Covenant filed paperwork and the Union built cages, these people had been standing on the backs of old gods and saying </w:t>
+      </w:r>
+      <w:r>
+        <w:rPr>
+          <w:b w:val="0"/>
+          <w:i/>
+        </w:rPr>
+        <w:t>no.</w:t>
+      </w:r>
+    </w:p>
+    <w:p>
+      <w:pPr>
+        <w:spacing w:before="40" w:after="40"/>
+        <w:ind w:firstLine="432"/>
+      </w:pPr>
+      <w:r>
+        <w:rPr>
+          <w:b w:val="0"/>
+          <w:i w:val="0"/>
+        </w:rPr>
+        <w:t>The white-haired woman's frequency hit the fleet.</w:t>
+      </w:r>
+    </w:p>
+    <w:p>
+      <w:pPr>
+        <w:spacing w:before="40" w:after="40"/>
+        <w:ind w:firstLine="432"/>
+      </w:pPr>
+      <w:r>
+        <w:rPr>
+          <w:b w:val="0"/>
+          <w:i w:val="0"/>
+        </w:rPr>
+        <w:t xml:space="preserve">It was not a weapon. It was not an attack. It was a </w:t>
+      </w:r>
+      <w:r>
+        <w:rPr>
+          <w:b w:val="0"/>
+          <w:i/>
+        </w:rPr>
+        <w:t>statement</w:t>
+      </w:r>
+      <w:r>
+        <w:rPr>
+          <w:b w:val="0"/>
+          <w:i w:val="0"/>
+        </w:rPr>
+        <w:t xml:space="preserve"> — a harmonic declaration broadcast on every frequency the human ear and mind could process, layered with the deeper resonances of the beings she rode, amplified by the forty-two other listeners behind her. It said, without words, without threat, without any of the machinery of violence: </w:t>
+      </w:r>
+      <w:r>
+        <w:rPr>
+          <w:b w:val="0"/>
+          <w:i/>
+        </w:rPr>
+        <w:t>We are here. We see you. We will not move. Decide.</w:t>
+      </w:r>
+    </w:p>
+    <w:p>
+      <w:pPr>
+        <w:spacing w:before="40" w:after="40"/>
+        <w:ind w:firstLine="432"/>
+      </w:pPr>
+      <w:r>
+        <w:rPr>
+          <w:b w:val="0"/>
+          <w:i w:val="0"/>
+        </w:rPr>
+        <w:t>Captain Dahl decided.</w:t>
+      </w:r>
+    </w:p>
+    <w:p>
+      <w:pPr>
+        <w:spacing w:before="40" w:after="40"/>
+        <w:ind w:firstLine="432"/>
+      </w:pPr>
+      <w:r>
+        <w:rPr>
+          <w:b w:val="0"/>
+          <w:i w:val="0"/>
+        </w:rPr>
+        <w:t>"</w:t>
+      </w:r>
+      <w:r>
+        <w:rPr>
+          <w:b w:val="0"/>
+          <w:i/>
+        </w:rPr>
+        <w:t>All ships, weapons free. Clear the field.</w:t>
+      </w:r>
+      <w:r>
+        <w:rPr>
+          <w:b w:val="0"/>
+          <w:i w:val="0"/>
+        </w:rPr>
+        <w:t>"</w:t>
+      </w:r>
+    </w:p>
+    <w:p>
+      <w:pPr>
+        <w:spacing w:before="40" w:after="40"/>
+        <w:ind w:firstLine="432"/>
+      </w:pPr>
+      <w:r>
+        <w:rPr>
+          <w:b w:val="0"/>
+          <w:i w:val="0"/>
+        </w:rPr>
+        <w:t>The first lance fired.</w:t>
+      </w:r>
+    </w:p>
+    <w:p>
+      <w:pPr>
+        <w:spacing w:before="320" w:after="320"/>
+        <w:jc w:val="center"/>
+      </w:pPr>
+      <w:r>
+        <w:rPr>
+          <w:rFonts w:ascii="Georgia" w:hAnsi="Georgia"/>
+          <w:color w:val="787878"/>
+          <w:sz w:val="24"/>
+        </w:rPr>
+        <w:t>* * *</w:t>
+      </w:r>
+    </w:p>
+    <w:p>
+      <w:pPr>
+        <w:spacing w:before="40" w:after="40"/>
+        <w:ind w:firstLine="432"/>
+      </w:pPr>
+      <w:r>
+        <w:rPr>
+          <w:b w:val="0"/>
+          <w:i w:val="0"/>
+        </w:rPr>
+        <w:t>The battle for the Choir happened in three dimensions and at least two that Kael didn't have names for.</w:t>
+      </w:r>
+    </w:p>
+    <w:p>
+      <w:pPr>
+        <w:spacing w:before="40" w:after="40"/>
+        <w:ind w:firstLine="432"/>
+      </w:pPr>
+      <w:r>
+        <w:rPr>
+          <w:b w:val="0"/>
+          <w:i w:val="0"/>
+        </w:rPr>
+        <w:t>In the physical dimension, it was brutal. The Thirty-First's gravitic lances carved through the water in superheated columns — targeted, precise, designed to kill large biological entities at range. But the deep listeners' mounts were not stationary targets. They moved with a fluid, coordinated intelligence that turned the fleet's precision into a liability — weaving between lance strikes, using the water itself as cover, their dense bodies absorbing impacts that would have cored a starship. Two of the smaller mounts took direct hits in the first volley. They shuddered, their amber bioluminescence flaring bright with pain, but they didn't die. Their hides were layered with millennia of calcified growth — mineral armor that had been building since before humanity discovered fire.</w:t>
+      </w:r>
+    </w:p>
+    <w:p>
+      <w:pPr>
+        <w:spacing w:before="40" w:after="40"/>
+        <w:ind w:firstLine="432"/>
+      </w:pPr>
+      <w:r>
+        <w:rPr>
+          <w:b w:val="0"/>
+          <w:i w:val="0"/>
+        </w:rPr>
+        <w:t xml:space="preserve">The escort frigates broke formation to pursue, their drives screaming in the water. The deep listeners let them come — let them overextend, let them separate from the cruisers' covering fire — and then the mounts closed around them like a jaw. Not killing. </w:t>
+      </w:r>
+      <w:r>
+        <w:rPr>
+          <w:b w:val="0"/>
+          <w:i/>
+        </w:rPr>
+        <w:t>Holding.</w:t>
+      </w:r>
+      <w:r>
+        <w:rPr>
+          <w:b w:val="0"/>
+          <w:i w:val="0"/>
+        </w:rPr>
+        <w:t xml:space="preserve"> Massive bodies pressing against the frigates' hulls, smothering their drives, their combined mass making the ships' gravitic engines whine and stutter against forces they were never designed to overcome. Two frigates went dark in the first three minutes — not destroyed, not damaged, simply </w:t>
+      </w:r>
+      <w:r>
+        <w:rPr>
+          <w:b w:val="0"/>
+          <w:i/>
+        </w:rPr>
+        <w:t>stopped</w:t>
+      </w:r>
+      <w:r>
+        <w:rPr>
+          <w:b w:val="0"/>
+          <w:i w:val="0"/>
+        </w:rPr>
+        <w:t>, pinned by creatures that had been moving through deep oceans since before the Union existed.</w:t>
+      </w:r>
+    </w:p>
+    <w:p>
+      <w:pPr>
+        <w:spacing w:before="40" w:after="40"/>
+        <w:ind w:firstLine="432"/>
+      </w:pPr>
+      <w:r>
+        <w:rPr>
+          <w:b w:val="0"/>
+          <w:i w:val="0"/>
+        </w:rPr>
+        <w:t xml:space="preserve">Kael flew the </w:t>
+      </w:r>
+      <w:r>
+        <w:rPr>
+          <w:b w:val="0"/>
+          <w:i/>
+        </w:rPr>
+        <w:t>Fang &amp; Fable</w:t>
+      </w:r>
+      <w:r>
+        <w:rPr>
+          <w:b w:val="0"/>
+          <w:i w:val="0"/>
+        </w:rPr>
+        <w:t xml:space="preserve"> through the chaos with his teeth clenched and his hands white on the controls. The ship was not a warship. It was not even a particularly good ship. But it was fast where it needed to be fast and small where it needed to be small, and Kael had been flying in tight spaces since he was seventeen. He threaded between lance strikes, using the deep listeners' mounts as cover, keeping the ship alive through a combination of skill, instinct, and the particular desperate creativity of a man who would very much like to survive long enough to have a Quanxro Lager.</w:t>
+      </w:r>
+    </w:p>
+    <w:p>
+      <w:pPr>
+        <w:spacing w:before="40" w:after="40"/>
+        <w:ind w:firstLine="432"/>
+      </w:pPr>
+      <w:r>
+        <w:rPr>
+          <w:b w:val="0"/>
+          <w:i w:val="0"/>
+        </w:rPr>
+        <w:t>Sera's interceptor was another matter entirely. The Lawkeeper ship moved like a blade — fast, precise, lethal in ways that had nothing to do with weapons. She was broadcasting on every Covenant emergency frequency simultaneously, Wick's layered channels amplifying the signal until it punched through the fleet's jamming like a fist through paper. The legal record was being made in real time. Every lance strike, every order, every violation of Covenant law — documented, encrypted, transmitted on burst channels toward the nearest relay.</w:t>
+      </w:r>
+    </w:p>
+    <w:p>
+      <w:pPr>
+        <w:spacing w:before="40" w:after="40"/>
+        <w:ind w:firstLine="432"/>
+      </w:pPr>
+      <w:r>
+        <w:rPr>
+          <w:b w:val="0"/>
+          <w:i w:val="0"/>
+        </w:rPr>
+        <w:t>"Two Veil-class sensors are trying to jam my transmission," Sera called over the comm. Her voice was steady — the Lawkeeper was back, all the cracks sealed, the mask locked in place not for concealment but for function. This was what she was built for. "If they succeed, we lose the legal record."</w:t>
+      </w:r>
+    </w:p>
+    <w:p>
+      <w:pPr>
+        <w:spacing w:before="40" w:after="40"/>
+        <w:ind w:firstLine="432"/>
+      </w:pPr>
+      <w:r>
+        <w:rPr>
+          <w:b w:val="0"/>
+          <w:i w:val="0"/>
+        </w:rPr>
+        <w:t xml:space="preserve">"On it," Kael said, and threw the </w:t>
+      </w:r>
+      <w:r>
+        <w:rPr>
+          <w:b w:val="0"/>
+          <w:i/>
+        </w:rPr>
+        <w:t>Fang &amp; Fable</w:t>
+      </w:r>
+      <w:r>
+        <w:rPr>
+          <w:b w:val="0"/>
+          <w:i w:val="0"/>
+        </w:rPr>
+        <w:t xml:space="preserve"> at the nearest sensor ship.</w:t>
+      </w:r>
+    </w:p>
+    <w:p>
+      <w:pPr>
+        <w:spacing w:before="40" w:after="40"/>
+        <w:ind w:firstLine="432"/>
+      </w:pPr>
+      <w:r>
+        <w:rPr>
+          <w:b w:val="0"/>
+          <w:i w:val="0"/>
+        </w:rPr>
+        <w:t xml:space="preserve">Not to attack it. To </w:t>
+      </w:r>
+      <w:r>
+        <w:rPr>
+          <w:b w:val="0"/>
+          <w:i/>
+        </w:rPr>
+        <w:t>distract</w:t>
+      </w:r>
+      <w:r>
+        <w:rPr>
+          <w:b w:val="0"/>
+          <w:i w:val="0"/>
+        </w:rPr>
+        <w:t xml:space="preserve"> it. The freighter screamed across the Veil-class's bow close enough to scrape paint, Talon's frequency blasting a targeted burst at the sensor array — not damage but noise, enough to disrupt the jamming for the three seconds Sera needed to push a transmission packet through.</w:t>
+      </w:r>
+    </w:p>
+    <w:p>
+      <w:pPr>
+        <w:spacing w:before="40" w:after="40"/>
+        <w:ind w:firstLine="432"/>
+      </w:pPr>
+      <w:r>
+        <w:rPr>
+          <w:b w:val="0"/>
+          <w:i w:val="0"/>
+        </w:rPr>
+        <w:t>"Packet away," Sera confirmed. "Burst transmission to Arbiter Station. They'll have the full record within hours."</w:t>
+      </w:r>
+    </w:p>
+    <w:p>
+      <w:pPr>
+        <w:spacing w:before="40" w:after="40"/>
+        <w:ind w:firstLine="432"/>
+      </w:pPr>
+      <w:r>
+        <w:rPr>
+          <w:b w:val="0"/>
+          <w:i w:val="0"/>
+        </w:rPr>
+        <w:t>"Assuming we live hours," Miro said from the secondary console, where he was doing something Kael didn't have time to question — pulling up biological data on the deep listeners' mounts, cross-referencing it with the Choir's biosignature, his hands flying across the interface with the manic precision of a man who does his best work when everything is exploding.</w:t>
+      </w:r>
+    </w:p>
+    <w:p>
+      <w:pPr>
+        <w:spacing w:before="40" w:after="40"/>
+        <w:ind w:firstLine="432"/>
+      </w:pPr>
+      <w:r>
+        <w:rPr>
+          <w:b w:val="0"/>
+          <w:i w:val="0"/>
+        </w:rPr>
+        <w:t>But it was in the frequency dimension that the real battle was fought.</w:t>
+      </w:r>
+    </w:p>
+    <w:p>
+      <w:pPr>
+        <w:spacing w:before="40" w:after="40"/>
+        <w:ind w:firstLine="432"/>
+      </w:pPr>
+      <w:r>
+        <w:rPr>
+          <w:b w:val="0"/>
+          <w:i w:val="0"/>
+        </w:rPr>
+        <w:t>The deep listeners sang.</w:t>
+      </w:r>
+    </w:p>
+    <w:p>
+      <w:pPr>
+        <w:spacing w:before="40" w:after="40"/>
+        <w:ind w:firstLine="432"/>
+      </w:pPr>
+      <w:r>
+        <w:rPr>
+          <w:b w:val="0"/>
+          <w:i w:val="0"/>
+        </w:rPr>
+        <w:t xml:space="preserve">Not the requiem. Not the Choir's ancient melody. Something new — a war-song, if war-songs could be beautiful and terrible at the same time. Forty-three human voices, augmented by eighteen ancient beings, channeling a collective frequency that Kael felt in his marrow. It was not an attack — not exactly. It was a </w:t>
+      </w:r>
+      <w:r>
+        <w:rPr>
+          <w:b w:val="0"/>
+          <w:i/>
+        </w:rPr>
+        <w:t>wall.</w:t>
+      </w:r>
+      <w:r>
+        <w:rPr>
+          <w:b w:val="0"/>
+          <w:i w:val="0"/>
+        </w:rPr>
+        <w:t xml:space="preserve"> A harmonic barrier, a frequency so dense and so precisely calibrated that the gravitic lances lost coherence when they passed through it. The weapons designed to kill the Choir struck the barrier and </w:t>
+      </w:r>
+      <w:r>
+        <w:rPr>
+          <w:b w:val="0"/>
+          <w:i/>
+        </w:rPr>
+        <w:t>dissolved</w:t>
+      </w:r>
+      <w:r>
+        <w:rPr>
+          <w:b w:val="0"/>
+          <w:i w:val="0"/>
+        </w:rPr>
+        <w:t xml:space="preserve"> — their energy scattered, refracted, turned from focused beams into diffuse light that washed over the Choir's bodies without harm.</w:t>
+      </w:r>
+    </w:p>
+    <w:p>
+      <w:pPr>
+        <w:spacing w:before="40" w:after="40"/>
+        <w:ind w:firstLine="432"/>
+      </w:pPr>
+      <w:r>
+        <w:rPr>
+          <w:b w:val="0"/>
+          <w:i w:val="0"/>
+        </w:rPr>
+        <w:t>The white-haired woman was the anchor. Kael could feel her at the center of the harmonic wall, her frequency the foundation on which forty-two others built. She was extraordinary — a listener of a caliber Kael had never encountered, her range and precision making his own abilities look like a child banging on a piano. But she was also old, and the effort was enormous, and he could hear the strain in her signal the way you hear a bridge creaking under too much weight.</w:t>
+      </w:r>
+    </w:p>
+    <w:p>
+      <w:pPr>
+        <w:spacing w:before="40" w:after="40"/>
+        <w:ind w:firstLine="432"/>
+      </w:pPr>
+      <w:r>
+        <w:rPr>
+          <w:b w:val="0"/>
+          <w:i w:val="0"/>
+        </w:rPr>
+        <w:t>The Choir added their voices. Forty-six — no longer forty-seven — threading their ancient harmonics into the deep listeners' wall, strengthening it, filling the gaps with frequencies that only they could produce. The combined sound was staggering. Kael's frequency-sense overloaded and reset twice, his brain struggling to process a signal that existed on more layers than human neurology was designed to handle.</w:t>
+      </w:r>
+    </w:p>
+    <w:p>
+      <w:pPr>
+        <w:spacing w:before="40" w:after="40"/>
+        <w:ind w:firstLine="432"/>
+      </w:pPr>
+      <w:r>
+        <w:rPr>
+          <w:b w:val="0"/>
+          <w:i w:val="0"/>
+        </w:rPr>
+        <w:t>He flew by instinct when that happened. Flew blind, by feel, by the copper thread of Talon's frequency and the muscle memory of ten thousand hours in this cockpit.</w:t>
+      </w:r>
+    </w:p>
+    <w:p>
+      <w:pPr>
+        <w:spacing w:before="40" w:after="40"/>
+        <w:ind w:firstLine="432"/>
+      </w:pPr>
+      <w:r>
+        <w:rPr>
+          <w:b w:val="0"/>
+          <w:i w:val="0"/>
+        </w:rPr>
+        <w:t xml:space="preserve">One of the heavy cruisers — the </w:t>
+      </w:r>
+      <w:r>
+        <w:rPr>
+          <w:b w:val="0"/>
+          <w:i/>
+        </w:rPr>
+        <w:t>Indomitable</w:t>
+      </w:r>
+      <w:r>
+        <w:rPr>
+          <w:b w:val="0"/>
+          <w:i w:val="0"/>
+        </w:rPr>
+        <w:t xml:space="preserve">, according to Sera's tactical feed — changed tactics. Instead of firing through the harmonic wall, it began to circle, searching for a gap. Its captain was smart. The wall couldn't be everywhere at once. The deep listeners had to concentrate their strength, and the Choir had to maintain their position above the rift. There were flanks. There were angles. And the </w:t>
+      </w:r>
+      <w:r>
+        <w:rPr>
+          <w:b w:val="0"/>
+          <w:i/>
+        </w:rPr>
+        <w:t>Indomitable</w:t>
+      </w:r>
+      <w:r>
+        <w:rPr>
+          <w:b w:val="0"/>
+          <w:i w:val="0"/>
+        </w:rPr>
+        <w:t xml:space="preserve"> was finding them.</w:t>
+      </w:r>
+    </w:p>
+    <w:p>
+      <w:pPr>
+        <w:spacing w:before="40" w:after="40"/>
+        <w:ind w:firstLine="432"/>
+      </w:pPr>
+      <w:r>
+        <w:rPr>
+          <w:b w:val="0"/>
+          <w:i w:val="0"/>
+        </w:rPr>
+        <w:t>"Northern arc," Sera called. "The cruiser is moving to flank. If it gets past the barrier —"</w:t>
+      </w:r>
+    </w:p>
+    <w:p>
+      <w:pPr>
+        <w:spacing w:before="40" w:after="40"/>
+        <w:ind w:firstLine="432"/>
+      </w:pPr>
+      <w:r>
+        <w:rPr>
+          <w:b w:val="0"/>
+          <w:i w:val="0"/>
+        </w:rPr>
+        <w:t xml:space="preserve">"I see it." Kael pulled the </w:t>
+      </w:r>
+      <w:r>
+        <w:rPr>
+          <w:b w:val="0"/>
+          <w:i/>
+        </w:rPr>
+        <w:t>Fang &amp; Fable</w:t>
+      </w:r>
+      <w:r>
+        <w:rPr>
+          <w:b w:val="0"/>
+          <w:i w:val="0"/>
+        </w:rPr>
+        <w:t xml:space="preserve"> around. He had no weapons. He had no plan that a sane person would call a plan. What he had was a battered freighter, a hawk who would die before she stopped fighting, and the absolute, bone-deep certainty that he was not going to watch another pod die because he couldn't find the courage to be stupid.</w:t>
+      </w:r>
+    </w:p>
+    <w:p>
+      <w:pPr>
+        <w:spacing w:before="40" w:after="40"/>
+        <w:ind w:firstLine="432"/>
+      </w:pPr>
+      <w:r>
+        <w:rPr>
+          <w:b w:val="0"/>
+          <w:i w:val="0"/>
+        </w:rPr>
+        <w:t>He opened his frequency. All the way. Full spectrum. The thing the Academy said would destroy him, the thing that had nearly killed him in the Choir's first contact, the thing he'd spent his entire career learning to avoid.</w:t>
+      </w:r>
+    </w:p>
+    <w:p>
+      <w:pPr>
+        <w:spacing w:before="40" w:after="40"/>
+        <w:ind w:firstLine="432"/>
+      </w:pPr>
+      <w:r>
+        <w:rPr>
+          <w:b w:val="0"/>
+          <w:i w:val="0"/>
+        </w:rPr>
+        <w:t>And he sang.</w:t>
+      </w:r>
+    </w:p>
+    <w:p>
+      <w:pPr>
+        <w:spacing w:before="40" w:after="40"/>
+        <w:ind w:firstLine="432"/>
+      </w:pPr>
+      <w:r>
+        <w:rPr>
+          <w:b w:val="0"/>
+          <w:i w:val="0"/>
+        </w:rPr>
+        <w:t>Not the Choir's song. Not the deep listeners' war-hymn. His own frequency — the one that was just his, the one that Talon harmonized with, the sound of one man and one hawk who had been listening to the galaxy's pain for years and had decided, here, now, in this water, that listening was not enough.</w:t>
+      </w:r>
+    </w:p>
+    <w:p>
+      <w:pPr>
+        <w:spacing w:before="40" w:after="40"/>
+        <w:ind w:firstLine="432"/>
+      </w:pPr>
+      <w:r>
+        <w:rPr>
+          <w:b w:val="0"/>
+          <w:i w:val="0"/>
+        </w:rPr>
+        <w:t xml:space="preserve">It wasn't powerful. Not like the deep listeners. Not like the Choir. But it was </w:t>
+      </w:r>
+      <w:r>
+        <w:rPr>
+          <w:b w:val="0"/>
+          <w:i/>
+        </w:rPr>
+        <w:t>precise</w:t>
+      </w:r>
+      <w:r>
+        <w:rPr>
+          <w:b w:val="0"/>
+          <w:i w:val="0"/>
+        </w:rPr>
+        <w:t xml:space="preserve"> — the Academy training that Kael had carried like a scar was also, it turned out, a blade. He knew frequencies the way a surgeon knows anatomy. He couldn't match the wall's strength, but he could find the gap the </w:t>
+      </w:r>
+      <w:r>
+        <w:rPr>
+          <w:b w:val="0"/>
+          <w:i/>
+        </w:rPr>
+        <w:t>Indomitable</w:t>
+      </w:r>
+      <w:r>
+        <w:rPr>
+          <w:b w:val="0"/>
+          <w:i w:val="0"/>
+        </w:rPr>
+        <w:t xml:space="preserve"> was aiming for and fill it with exactly the right harmonic — a patch, a stitch, a single voice landing in the one place it was needed most.</w:t>
+      </w:r>
+    </w:p>
+    <w:p>
+      <w:pPr>
+        <w:spacing w:before="40" w:after="40"/>
+        <w:ind w:firstLine="432"/>
+      </w:pPr>
+      <w:r>
+        <w:rPr>
+          <w:b w:val="0"/>
+          <w:i w:val="0"/>
+        </w:rPr>
+        <w:t>The Note Between would have understood.</w:t>
+      </w:r>
+    </w:p>
+    <w:p>
+      <w:pPr>
+        <w:spacing w:before="40" w:after="40"/>
+        <w:ind w:firstLine="432"/>
+      </w:pPr>
+      <w:r>
+        <w:rPr>
+          <w:b w:val="0"/>
+          <w:i w:val="0"/>
+        </w:rPr>
+        <w:t xml:space="preserve">Talon screamed, her physical and frequency voices merging into a single, incandescent cry. On the </w:t>
+      </w:r>
+      <w:r>
+        <w:rPr>
+          <w:b w:val="0"/>
+          <w:i/>
+        </w:rPr>
+        <w:t>Indomitable</w:t>
+      </w:r>
+      <w:r>
+        <w:rPr>
+          <w:b w:val="0"/>
+          <w:i w:val="0"/>
+        </w:rPr>
+        <w:t>'s bridge, sensor arrays scrambled. The gap closed. The cruiser's lance fired into a wall that had no weakness and scattered like light through a prism.</w:t>
+      </w:r>
+    </w:p>
+    <w:p>
+      <w:pPr>
+        <w:spacing w:before="320" w:after="320"/>
+        <w:jc w:val="center"/>
+      </w:pPr>
+      <w:r>
+        <w:rPr>
+          <w:rFonts w:ascii="Georgia" w:hAnsi="Georgia"/>
+          <w:color w:val="787878"/>
+          <w:sz w:val="24"/>
+        </w:rPr>
+        <w:t>* * *</w:t>
+      </w:r>
+    </w:p>
+    <w:p>
+      <w:pPr>
+        <w:spacing w:before="40" w:after="40"/>
+        <w:ind w:firstLine="432"/>
+      </w:pPr>
+      <w:r>
+        <w:rPr>
+          <w:b w:val="0"/>
+          <w:i w:val="0"/>
+        </w:rPr>
+        <w:t>The battle lasted eleven minutes.</w:t>
+      </w:r>
+    </w:p>
+    <w:p>
+      <w:pPr>
+        <w:spacing w:before="40" w:after="40"/>
+        <w:ind w:firstLine="432"/>
+      </w:pPr>
+      <w:r>
+        <w:rPr>
+          <w:b w:val="0"/>
+          <w:i w:val="0"/>
+        </w:rPr>
+        <w:t>It ended not with a dramatic final strike but with the thing that ends most confrontations between the determined and the bureaucratic — a calculation. Captain Dahl looked at two pinned frigates, two sensor ships that couldn't jam a Lawkeeper's transmission, a harmonic barrier that her lances couldn't penetrate, and a legal record that was already burning its way toward Arbiter Station at the speed of light. She did the math. The math said this was no longer an operation. It was a career-ending debacle with a documentation trail.</w:t>
+      </w:r>
+    </w:p>
+    <w:p>
+      <w:pPr>
+        <w:spacing w:before="40" w:after="40"/>
+        <w:ind w:firstLine="432"/>
+      </w:pPr>
+      <w:r>
+        <w:rPr>
+          <w:b w:val="0"/>
+          <w:i w:val="0"/>
+        </w:rPr>
+        <w:t>"</w:t>
+      </w:r>
+      <w:r>
+        <w:rPr>
+          <w:b w:val="0"/>
+          <w:i/>
+        </w:rPr>
+        <w:t>All ships, stand down. Withdrawal pattern Echo. Disengage.</w:t>
+      </w:r>
+      <w:r>
+        <w:rPr>
+          <w:b w:val="0"/>
+          <w:i w:val="0"/>
+        </w:rPr>
+        <w:t>"</w:t>
+      </w:r>
+    </w:p>
+    <w:p>
+      <w:pPr>
+        <w:spacing w:before="40" w:after="40"/>
+        <w:ind w:firstLine="432"/>
+      </w:pPr>
+      <w:r>
+        <w:rPr>
+          <w:b w:val="0"/>
+          <w:i w:val="0"/>
+        </w:rPr>
+        <w:t>The Thirty-First pulled back. Not defeated — not destroyed, not broken, not humbled. They simply left, rising through the water column in the same tight formation they'd arrived in, their dark hulls disappearing into the upper ocean like knives sliding back into sheaths. They would be back. Or others would. The Union's institutional machinery didn't stop because one fleet withdrew from one ocean. But for now — for this hour, in this water, above this rift — the Choir was safe.</w:t>
+      </w:r>
+    </w:p>
+    <w:p>
+      <w:pPr>
+        <w:spacing w:before="40" w:after="40"/>
+        <w:ind w:firstLine="432"/>
+      </w:pPr>
+      <w:r>
+        <w:rPr>
+          <w:b w:val="0"/>
+          <w:i w:val="0"/>
+        </w:rPr>
+        <w:t>Kael slumped in his seat. His nose was bleeding freely. His vision swam. His frequency-sense was raw and ringing, every nerve ending in his body vibrating with the aftershock of full-spectrum output. Talon had gone quiet on her perch, her feathers flat, her frequency a low, exhausted pulse. She had given everything. So had he.</w:t>
+      </w:r>
+    </w:p>
+    <w:p>
+      <w:pPr>
+        <w:spacing w:before="40" w:after="40"/>
+        <w:ind w:firstLine="432"/>
+      </w:pPr>
+      <w:r>
+        <w:rPr>
+          <w:b w:val="0"/>
+          <w:i w:val="0"/>
+        </w:rPr>
+        <w:t>Miro appeared beside him with a cup of something. Not gelberry tea. Not the Selvaan black tea Kael had been enduring for three days.</w:t>
+      </w:r>
+    </w:p>
+    <w:p>
+      <w:pPr>
+        <w:spacing w:before="40" w:after="40"/>
+        <w:ind w:firstLine="432"/>
+      </w:pPr>
+      <w:r>
+        <w:rPr>
+          <w:b w:val="0"/>
+          <w:i w:val="0"/>
+        </w:rPr>
+        <w:t>Coffee.</w:t>
+      </w:r>
+    </w:p>
+    <w:p>
+      <w:pPr>
+        <w:spacing w:before="40" w:after="40"/>
+        <w:ind w:firstLine="432"/>
+      </w:pPr>
+      <w:r>
+        <w:rPr>
+          <w:b w:val="0"/>
+          <w:i w:val="0"/>
+        </w:rPr>
+        <w:t>Black, steaming, strong enough to strip paint. The smell alone cut through Kael's frequency-haze like a knife through fog. He stared at it.</w:t>
+      </w:r>
+    </w:p>
+    <w:p>
+      <w:pPr>
+        <w:spacing w:before="40" w:after="40"/>
+        <w:ind w:firstLine="432"/>
+      </w:pPr>
+      <w:r>
+        <w:rPr>
+          <w:b w:val="0"/>
+          <w:i w:val="0"/>
+        </w:rPr>
+        <w:t>"Where did you get coffee?"</w:t>
+      </w:r>
+    </w:p>
+    <w:p>
+      <w:pPr>
+        <w:spacing w:before="40" w:after="40"/>
+        <w:ind w:firstLine="432"/>
+      </w:pPr>
+      <w:r>
+        <w:rPr>
+          <w:b w:val="0"/>
+          <w:i w:val="0"/>
+        </w:rPr>
+        <w:t>"I've had a vacuum-sealed canister in my emergency kit for two years. I was saving it for —" He gestured vaguely at the viewport, where the deep listeners' mounts were slowly circling back to the Choir's position, their amber light mixing with the Choir's blue-white in a display that turned the deep ocean into something that looked like a living galaxy. "— something like this. Seemed like the moment."</w:t>
+      </w:r>
+    </w:p>
+    <w:p>
+      <w:pPr>
+        <w:spacing w:before="40" w:after="40"/>
+        <w:ind w:firstLine="432"/>
+      </w:pPr>
+      <w:r>
+        <w:rPr>
+          <w:b w:val="0"/>
+          <w:i w:val="0"/>
+        </w:rPr>
+        <w:t>Kael took the cup. Drank. It was terrible — two years in a vacuum canister had done things to the flavor that no coffee deserved — and it was the best thing he had ever tasted.</w:t>
+      </w:r>
+    </w:p>
+    <w:p>
+      <w:pPr>
+        <w:spacing w:before="40" w:after="40"/>
+        <w:ind w:firstLine="432"/>
+      </w:pPr>
+      <w:r>
+        <w:rPr>
+          <w:b w:val="0"/>
+          <w:i w:val="0"/>
+        </w:rPr>
+        <w:t>"When this is over," he said, "I'm buying you a Quanxro Lager. And a Netherland Pale Ale. And then another Quanxro, because one is never enough and anyone who says otherwise has never had a real problem."</w:t>
+      </w:r>
+    </w:p>
+    <w:p>
+      <w:pPr>
+        <w:spacing w:before="40" w:after="40"/>
+        <w:ind w:firstLine="432"/>
+      </w:pPr>
+      <w:r>
+        <w:rPr>
+          <w:b w:val="0"/>
+          <w:i w:val="0"/>
+        </w:rPr>
+        <w:t>"I don't know what either of those are but I enthusiastically accept."</w:t>
+      </w:r>
+    </w:p>
+    <w:p>
+      <w:pPr>
+        <w:spacing w:before="40" w:after="40"/>
+        <w:ind w:firstLine="432"/>
+      </w:pPr>
+      <w:r>
+        <w:rPr>
+          <w:b w:val="0"/>
+          <w:i w:val="0"/>
+        </w:rPr>
+        <w:t xml:space="preserve">Outside, the white-haired woman's mount drew alongside the </w:t>
+      </w:r>
+      <w:r>
+        <w:rPr>
+          <w:b w:val="0"/>
+          <w:i/>
+        </w:rPr>
+        <w:t>Fang &amp; Fable</w:t>
+      </w:r>
+      <w:r>
+        <w:rPr>
+          <w:b w:val="0"/>
+          <w:i w:val="0"/>
+        </w:rPr>
+        <w:t>. Up close, the creature was even more impressive — its hide a topography of scars and mineral deposits, its amber glow pulsing slow and steady like a heartbeat. The organic platform on its back was large enough to hold a small building, and the woman who stood on it looked at Kael's cockpit viewport with eyes that were pale gray and absolutely ancient.</w:t>
+      </w:r>
+    </w:p>
+    <w:p>
+      <w:pPr>
+        <w:spacing w:before="40" w:after="40"/>
+        <w:ind w:firstLine="432"/>
+      </w:pPr>
+      <w:r>
+        <w:rPr>
+          <w:b w:val="0"/>
+          <w:i w:val="0"/>
+        </w:rPr>
+        <w:t>She pressed her hand against her mount's hide. A frequency rippled out — controlled, precise, aimed at Kael with the casual accuracy of a marksman who doesn't need to try.</w:t>
+      </w:r>
+    </w:p>
+    <w:p>
+      <w:pPr>
+        <w:spacing w:before="40" w:after="40"/>
+        <w:ind w:firstLine="432"/>
+      </w:pPr>
+      <w:r>
+        <w:rPr>
+          <w:b w:val="0"/>
+          <w:i/>
+        </w:rPr>
+        <w:t>You filled the gap. The Note Between's place. You heard where it needed to be.</w:t>
+      </w:r>
+    </w:p>
+    <w:p>
+      <w:pPr>
+        <w:spacing w:before="40" w:after="40"/>
+        <w:ind w:firstLine="432"/>
+      </w:pPr>
+      <w:r>
+        <w:rPr>
+          <w:b w:val="0"/>
+          <w:i w:val="0"/>
+        </w:rPr>
+        <w:t>Kael pressed his hand against the viewport. His response was clumsy compared to hers — a fumbling, exhausted attempt at frequency communication from a man who had just burned himself to his edges. But the message was clear enough.</w:t>
+      </w:r>
+    </w:p>
+    <w:p>
+      <w:pPr>
+        <w:spacing w:before="40" w:after="40"/>
+        <w:ind w:firstLine="432"/>
+      </w:pPr>
+      <w:r>
+        <w:rPr>
+          <w:b w:val="0"/>
+          <w:i/>
+        </w:rPr>
+        <w:t>I had a good teacher. Forty-seven of them.</w:t>
+      </w:r>
+    </w:p>
+    <w:p>
+      <w:pPr>
+        <w:spacing w:before="40" w:after="40"/>
+        <w:ind w:firstLine="432"/>
+      </w:pPr>
+      <w:r>
+        <w:rPr>
+          <w:b w:val="0"/>
+          <w:i w:val="0"/>
+        </w:rPr>
+        <w:t>The old woman smiled. It transformed her face — turned the scars and lines into a landscape of warmth, fierce and tender at the same time, the smile of someone who had been protecting ancient things for so long that the protecting had become a kind of joy.</w:t>
+      </w:r>
+    </w:p>
+    <w:p>
+      <w:pPr>
+        <w:spacing w:before="40" w:after="40"/>
+        <w:ind w:firstLine="432"/>
+      </w:pPr>
+      <w:r>
+        <w:rPr>
+          <w:b w:val="0"/>
+          <w:i/>
+        </w:rPr>
+        <w:t>We heard the requiem. We always hear the requiems. It is how we know where we are needed.</w:t>
+      </w:r>
+    </w:p>
+    <w:p>
+      <w:pPr>
+        <w:spacing w:before="40" w:after="40"/>
+        <w:ind w:firstLine="432"/>
+      </w:pPr>
+      <w:r>
+        <w:rPr>
+          <w:b w:val="0"/>
+          <w:i/>
+        </w:rPr>
+        <w:t>You've done this before.</w:t>
+      </w:r>
+    </w:p>
+    <w:p>
+      <w:pPr>
+        <w:spacing w:before="40" w:after="40"/>
+        <w:ind w:firstLine="432"/>
+      </w:pPr>
+      <w:r>
+        <w:rPr>
+          <w:b w:val="0"/>
+          <w:i/>
+        </w:rPr>
+        <w:t>Many times. The young civilizations build cages. It is what the young do — they find what they do not understand and they try to hold it still. We take the cages down. We have been doing this since before your Union existed. We will be doing it after your Union is gone.</w:t>
+      </w:r>
+    </w:p>
+    <w:p>
+      <w:pPr>
+        <w:spacing w:before="40" w:after="40"/>
+        <w:ind w:firstLine="432"/>
+      </w:pPr>
+      <w:r>
+        <w:rPr>
+          <w:b w:val="0"/>
+          <w:i w:val="0"/>
+        </w:rPr>
+        <w:t>She paused. Her pale eyes moved to Sera's interceptor, floating nearby, Wick's silhouette visible through the cockpit glass.</w:t>
+      </w:r>
+    </w:p>
+    <w:p>
+      <w:pPr>
+        <w:spacing w:before="40" w:after="40"/>
+        <w:ind w:firstLine="432"/>
+      </w:pPr>
+      <w:r>
+        <w:rPr>
+          <w:b w:val="0"/>
+          <w:i/>
+        </w:rPr>
+        <w:t>The Lawkeeper. She sent the record?</w:t>
+      </w:r>
+    </w:p>
+    <w:p>
+      <w:pPr>
+        <w:spacing w:before="40" w:after="40"/>
+        <w:ind w:firstLine="432"/>
+      </w:pPr>
+      <w:r>
+        <w:rPr>
+          <w:b w:val="0"/>
+          <w:i/>
+        </w:rPr>
+        <w:t>Yes. To Arbiter Station.</w:t>
+      </w:r>
+    </w:p>
+    <w:p>
+      <w:pPr>
+        <w:spacing w:before="40" w:after="40"/>
+        <w:ind w:firstLine="432"/>
+      </w:pPr>
+      <w:r>
+        <w:rPr>
+          <w:b w:val="0"/>
+          <w:i/>
+        </w:rPr>
+        <w:t>Good. Laws are a young thing too. But sometimes the young things work.</w:t>
+      </w:r>
+      <w:r>
+        <w:rPr>
+          <w:b w:val="0"/>
+          <w:i w:val="0"/>
+        </w:rPr>
+        <w:t xml:space="preserve"> Another smile, smaller, sadder. </w:t>
+      </w:r>
+      <w:r>
+        <w:rPr>
+          <w:b w:val="0"/>
+          <w:i/>
+        </w:rPr>
+        <w:t>The forty-seventh. The one who died. Tell me.</w:t>
+      </w:r>
+    </w:p>
+    <w:p>
+      <w:pPr>
+        <w:spacing w:before="40" w:after="40"/>
+        <w:ind w:firstLine="432"/>
+      </w:pPr>
+      <w:r>
+        <w:rPr>
+          <w:b w:val="0"/>
+          <w:i w:val="0"/>
+        </w:rPr>
+        <w:t>Kael told her. Not in words — in frequency, in the raw, unfiltered memory of the Note Between's requiem. The old woman received it in silence. When it was done, her eyes were wet, but her face hadn't changed. She had felt this before. Many times. The grief of the old was not a collapse. It was an accumulation.</w:t>
+      </w:r>
+    </w:p>
+    <w:p>
+      <w:pPr>
+        <w:spacing w:before="40" w:after="40"/>
+        <w:ind w:firstLine="432"/>
+      </w:pPr>
+      <w:r>
+        <w:rPr>
+          <w:b w:val="0"/>
+          <w:i/>
+        </w:rPr>
+        <w:t>We will stay,</w:t>
+      </w:r>
+      <w:r>
+        <w:rPr>
+          <w:b w:val="0"/>
+          <w:i w:val="0"/>
+        </w:rPr>
+        <w:t xml:space="preserve"> she said. </w:t>
+      </w:r>
+      <w:r>
+        <w:rPr>
+          <w:b w:val="0"/>
+          <w:i/>
+        </w:rPr>
+        <w:t>Until the Choir is strong enough to hold alone. Then we will go back to the deep. There is always another cage. Always another song that needs protecting.</w:t>
+      </w:r>
+    </w:p>
+    <w:p>
+      <w:pPr>
+        <w:spacing w:before="40" w:after="40"/>
+        <w:ind w:firstLine="432"/>
+      </w:pPr>
+      <w:r>
+        <w:rPr>
+          <w:b w:val="0"/>
+          <w:i/>
+        </w:rPr>
+        <w:t>Who are you?</w:t>
+      </w:r>
+    </w:p>
+    <w:p>
+      <w:pPr>
+        <w:spacing w:before="40" w:after="40"/>
+        <w:ind w:firstLine="432"/>
+      </w:pPr>
+      <w:r>
+        <w:rPr>
+          <w:b w:val="0"/>
+          <w:i w:val="0"/>
+        </w:rPr>
+        <w:t>She considered the question with the thoughtfulness of someone for whom identity had become a layered, complicated thing.</w:t>
+      </w:r>
+    </w:p>
+    <w:p>
+      <w:pPr>
+        <w:spacing w:before="40" w:after="40"/>
+        <w:ind w:firstLine="432"/>
+      </w:pPr>
+      <w:r>
+        <w:rPr>
+          <w:b w:val="0"/>
+          <w:i/>
+        </w:rPr>
+        <w:t>We are what you are becoming, Kael Orin. We are the ones who listened until listening became living. We have no name that would fit in your language. The Choir calls us the Old Chorus. Your Academy called us lost. We call ourselves —</w:t>
+      </w:r>
+      <w:r>
+        <w:rPr>
+          <w:b w:val="0"/>
+          <w:i w:val="0"/>
+        </w:rPr>
+        <w:t xml:space="preserve"> She paused, and the frequency carried something that might have been humor. </w:t>
+      </w:r>
+      <w:r>
+        <w:rPr>
+          <w:b w:val="0"/>
+          <w:i/>
+        </w:rPr>
+        <w:t>— busy.</w:t>
+      </w:r>
+    </w:p>
+    <w:p>
+      <w:pPr>
+        <w:spacing w:before="40" w:after="40"/>
+        <w:ind w:firstLine="432"/>
+      </w:pPr>
+      <w:r>
+        <w:rPr>
+          <w:b w:val="0"/>
+          <w:i w:val="0"/>
+        </w:rPr>
+        <w:t>She withdrew her hand. The frequency faded. Her mount turned slowly, moving back toward the Choir, and Kael watched her go — this woman who had given up everything he understood about the world in exchange for something so much larger that the trade didn't even register as a loss.</w:t>
+      </w:r>
+    </w:p>
+    <w:p>
+      <w:pPr>
+        <w:spacing w:before="40" w:after="40"/>
+        <w:ind w:firstLine="432"/>
+      </w:pPr>
+      <w:r>
+        <w:rPr>
+          <w:b w:val="0"/>
+          <w:i w:val="0"/>
+        </w:rPr>
+        <w:t>He drank his terrible coffee. Talon stirred on her perch and opened one eye.</w:t>
+      </w:r>
+    </w:p>
+    <w:p>
+      <w:pPr>
+        <w:spacing w:before="40" w:after="40"/>
+        <w:ind w:firstLine="432"/>
+      </w:pPr>
+      <w:r>
+        <w:rPr>
+          <w:b w:val="0"/>
+          <w:i/>
+        </w:rPr>
+        <w:t>Home?</w:t>
+      </w:r>
+      <w:r>
+        <w:rPr>
+          <w:b w:val="0"/>
+          <w:i w:val="0"/>
+        </w:rPr>
+        <w:t xml:space="preserve"> she asked.</w:t>
+      </w:r>
+    </w:p>
+    <w:p>
+      <w:pPr>
+        <w:spacing w:before="40" w:after="40"/>
+        <w:ind w:firstLine="432"/>
+      </w:pPr>
+      <w:r>
+        <w:rPr>
+          <w:b w:val="0"/>
+          <w:i w:val="0"/>
+        </w:rPr>
+        <w:t>"Not yet," he said. "But soon."</w:t>
+      </w:r>
+    </w:p>
+    <w:p>
+      <w:pPr>
+        <w:spacing w:before="40" w:after="40"/>
+        <w:ind w:firstLine="432"/>
+      </w:pPr>
+      <w:r>
+        <w:rPr>
+          <w:b w:val="0"/>
+          <w:i w:val="0"/>
+        </w:rPr>
+        <w:t>Through the viewport, the deep ocean glowed. Blue and white and amber and gold — two choruses, old and older, weaving their songs together above the rift. Forty-six and eighteen. The ancient and the ancient's ancient. And somewhere in the harmony, in a gap that had been empty since the forty-seventh voice went silent, Kael's own frequency still hummed — small, human, stubbornly present.</w:t>
+      </w:r>
+    </w:p>
+    <w:p>
+      <w:pPr>
+        <w:spacing w:before="40" w:after="40"/>
+        <w:ind w:firstLine="432"/>
+      </w:pPr>
+      <w:r>
+        <w:rPr>
+          <w:b w:val="0"/>
+          <w:i w:val="0"/>
+        </w:rPr>
+        <w:t>The detective in his novel would have had a line for this. Something wry, something clever, something that tied the impossible up in a bow. Kael didn't have a line. He had a cup of bad coffee, a bleeding nose, and the growing suspicion that his life had just changed in ways he couldn't yet calculate.</w:t>
+      </w:r>
+    </w:p>
+    <w:p>
+      <w:pPr>
+        <w:spacing w:before="40" w:after="40"/>
+        <w:ind w:firstLine="432"/>
+      </w:pPr>
+      <w:r>
+        <w:rPr>
+          <w:b w:val="0"/>
+          <w:i w:val="0"/>
+        </w:rPr>
+        <w:t>He dog-eared the thought for later. There was still work to do.</w:t>
       </w:r>
     </w:p>
     <w:sectPr>

</xml_diff>

<commit_message>
Trim emotional over-explanation in Chapters 5 and 6
Systematic editorial pass removing ~20% of emotional exposition.
Rules applied: if an image/action shows the emotion and the next
sentence interprets it, cut the interpretation. Keep strongest
image when two do the same job. Cut reader-direction lines.

Key cuts catalogued in commit body below.

https://claude.ai/code/session_01XVZGKMeTpqLFzCVEmX6JZq
</commit_message>
<xml_diff>
--- a/The_Wildtongue_Chronicles.docx
+++ b/The_Wildtongue_Chronicles.docx
@@ -7263,7 +7263,7 @@
           <w:b w:val="0"/>
           <w:i w:val="0"/>
         </w:rPr>
-        <w:t>Kael sat down across from him. He didn't say anything. Didn't offer comfort or wisdom or distraction. He just sat, the way Talon sometimes sat with him after a difficult contact — present, silent, close enough to matter.</w:t>
+        <w:t>Kael sat down across from him. He didn't say anything. He just sat, the way Talon sometimes sat with him after a difficult contact.</w:t>
       </w:r>
     </w:p>
     <w:p>
@@ -7420,7 +7420,7 @@
           <w:b w:val="0"/>
           <w:i w:val="0"/>
         </w:rPr>
-        <w:t>Miro stood and walked to the viewport. He put his hand on the glass — a small, useless gesture, human and instinctive, reaching toward something he couldn't touch.</w:t>
+        <w:t>Miro stood and walked to the viewport. He put his hand on the glass.</w:t>
       </w:r>
     </w:p>
     <w:p>
@@ -7500,7 +7500,7 @@
           <w:b w:val="0"/>
           <w:i w:val="0"/>
         </w:rPr>
-        <w:t>Kael's throat tightened. He translated the only way he could.</w:t>
+        <w:t>Kael's throat tightened.</w:t>
       </w:r>
     </w:p>
     <w:p>
@@ -7539,7 +7539,7 @@
           <w:b w:val="0"/>
           <w:i w:val="0"/>
         </w:rPr>
-        <w:t>"Of course it is," he said, his voice cracking open for the first time since Kael had known him — not a joke breaking, not a grin failing, but the thing underneath all of it, the raw and unprotected center that the humor was built to shield. "Of course the one that dies is the one that holds the rest together."</w:t>
+        <w:t>"Of course it is," he said, his voice cracking. "Of course the one that dies is the one that holds the rest together."</w:t>
       </w:r>
     </w:p>
     <w:p>
@@ -7579,7 +7579,7 @@
           <w:b w:val="0"/>
           <w:i w:val="0"/>
         </w:rPr>
-        <w:t>They came slowly — vast shapes converging from all directions, their bioluminescent filaments dimming to a soft, low glow as they drew close. Not the bright pulses of communication or the desperate flares of distress. Something quieter. Something that needed no translation.</w:t>
+        <w:t>They came slowly — vast shapes converging from all directions, their bioluminescent filaments dimming to a soft, low glow as they drew close. Something quieter than communication. Something that needed no translation.</w:t>
       </w:r>
     </w:p>
     <w:p>
@@ -7670,27 +7670,13 @@
           <w:b w:val="0"/>
           <w:i w:val="0"/>
         </w:rPr>
-        <w:t xml:space="preserve">That was the thing he couldn't have predicted. Human grief was a diminishment — a going-quiet, a collapse inward, a loss of color from the world. The Choir's grief was the opposite. It was an </w:t>
+        <w:t xml:space="preserve">Each voice in the ring was singing not just its own note but fragments of the Note Between's frequency — pieces of the dying member's harmonic signature, woven into their own songs, distributed across the collective. They were taking the dying voice into themselves. Not saving it. Not preserving it like a recording. </w:t>
       </w:r>
       <w:r>
         <w:rPr>
           <w:b w:val="0"/>
           <w:i/>
         </w:rPr>
-        <w:t>expansion</w:t>
-      </w:r>
-      <w:r>
-        <w:rPr>
-          <w:b w:val="0"/>
-          <w:i w:val="0"/>
-        </w:rPr>
-        <w:t xml:space="preserve">. Each voice in the ring was singing not just its own note but fragments of the Note Between's frequency — pieces of the dying member's harmonic signature, woven into their own songs, distributed across the collective. They were taking the dying voice into themselves. Not saving it. Not preserving it like a recording. </w:t>
-      </w:r>
-      <w:r>
-        <w:rPr>
-          <w:b w:val="0"/>
-          <w:i/>
-        </w:rPr>
         <w:t>Absorbing</w:t>
       </w:r>
       <w:r>
@@ -7724,7 +7710,7 @@
           <w:b w:val="0"/>
           <w:i w:val="0"/>
         </w:rPr>
-        <w:t>It was not immortality. It was something more honest. It was the way a teacher lives on in every student who teaches differently because of them. The way a parent's laugh shows up in a child's laugh thirty years later, unplanned, unmistakable. The way love, even after the lover is gone, reshapes the ones who felt it.</w:t>
+        <w:t>The way a teacher lives on in every student who teaches differently because of them. The way a parent's laugh shows up in a child's laugh thirty years later, unplanned, unmistakable.</w:t>
       </w:r>
     </w:p>
     <w:p>
@@ -7750,59 +7736,46 @@
           <w:b w:val="0"/>
           <w:i w:val="0"/>
         </w:rPr>
-        <w:t>On Sera's shoulder, Wick was trembling. Not with fear — with the sheer volume of data his corvaxis mind was processing. The owl's layered frequency channels were all active, all recording, all struggling to contain a phenomenon that exceeded his considerable capacity. His enormous amber eyes were wet. Kael hadn't known owls could cry. Perhaps they couldn't. Perhaps Wick was simply so deep in the frequency that his body was echoing what the Choir felt, the way a tuning fork hums when the right note is struck nearby.</w:t>
-      </w:r>
-    </w:p>
-    <w:p>
-      <w:pPr>
-        <w:spacing w:before="40" w:after="40"/>
-        <w:ind w:firstLine="432"/>
-      </w:pPr>
-      <w:r>
-        <w:rPr>
-          <w:b w:val="0"/>
-          <w:i w:val="0"/>
-        </w:rPr>
-        <w:t>Sera was watching too. She stood perfectly still, one hand on the overhead rail, the other hanging at her side. Her face was the same composed mask it had been since she'd boarded — but her breathing had changed. Slow and deliberate, the way you breathe when you're holding something in place by force of will. Kael glanced at her and saw that her eyes were bright. Not overflowing. Not yet. But bright in the way that still water is bright before the surface breaks.</w:t>
-      </w:r>
-    </w:p>
-    <w:p>
-      <w:pPr>
-        <w:spacing w:before="40" w:after="40"/>
-        <w:ind w:firstLine="432"/>
-      </w:pPr>
-      <w:r>
-        <w:rPr>
-          <w:b w:val="0"/>
-          <w:i w:val="0"/>
-        </w:rPr>
-        <w:t>She felt him looking. She didn't turn away, didn't compose herself, didn't reassemble the mask. She just met his gaze, and for one unguarded moment Lawkeeper Sera Voss was simply a person standing in a room watching something die and feeling the full, unbearable weight of it.</w:t>
-      </w:r>
-    </w:p>
-    <w:p>
-      <w:pPr>
-        <w:spacing w:before="40" w:after="40"/>
-        <w:ind w:firstLine="432"/>
-      </w:pPr>
-      <w:r>
-        <w:rPr>
-          <w:b w:val="0"/>
-          <w:i w:val="0"/>
-        </w:rPr>
-        <w:t>Then Wick pressed his head against her jaw — a small, instinctive gesture — and she closed her eyes. Just for a breath. When she opened them, the mask was back. But not all the way. Not like before.</w:t>
-      </w:r>
-    </w:p>
-    <w:p>
-      <w:pPr>
-        <w:spacing w:before="40" w:after="40"/>
-        <w:ind w:firstLine="432"/>
-      </w:pPr>
-      <w:r>
-        <w:rPr>
-          <w:b w:val="0"/>
-          <w:i w:val="0"/>
-        </w:rPr>
-        <w:t>Something had shifted. Something that wouldn't shift back.</w:t>
+        <w:t>On Sera's shoulder, Wick was trembling. The owl's layered frequency channels were all active, all recording, all struggling to contain a phenomenon that exceeded his considerable capacity. His enormous amber eyes were wet.</w:t>
+      </w:r>
+    </w:p>
+    <w:p>
+      <w:pPr>
+        <w:spacing w:before="40" w:after="40"/>
+        <w:ind w:firstLine="432"/>
+      </w:pPr>
+      <w:r>
+        <w:rPr>
+          <w:b w:val="0"/>
+          <w:i w:val="0"/>
+        </w:rPr>
+        <w:t>Sera was watching too. She stood perfectly still, one hand on the overhead rail. Her breathing had changed. Slow and deliberate. Kael glanced at her and saw that her eyes were bright.</w:t>
+      </w:r>
+    </w:p>
+    <w:p>
+      <w:pPr>
+        <w:spacing w:before="40" w:after="40"/>
+        <w:ind w:firstLine="432"/>
+      </w:pPr>
+      <w:r>
+        <w:rPr>
+          <w:b w:val="0"/>
+          <w:i w:val="0"/>
+        </w:rPr>
+        <w:t>She felt him looking. She didn't turn away, didn't compose herself. She just met his gaze.</w:t>
+      </w:r>
+    </w:p>
+    <w:p>
+      <w:pPr>
+        <w:spacing w:before="40" w:after="40"/>
+        <w:ind w:firstLine="432"/>
+      </w:pPr>
+      <w:r>
+        <w:rPr>
+          <w:b w:val="0"/>
+          <w:i w:val="0"/>
+        </w:rPr>
+        <w:t>Then Wick pressed his head against her jaw, and she closed her eyes. Just for a breath. When she opened them, the mask was back. But not all the way. Not like before.</w:t>
       </w:r>
     </w:p>
     <w:p>
@@ -7855,20 +7828,20 @@
           <w:b w:val="0"/>
           <w:i w:val="0"/>
         </w:rPr>
-        <w:t>The Choir held their positions. The requiem didn't end. It shifted — the harmonic adjusting in real time as forty-six voices recalibrated around the absence, finding new intervals, new balances. It was like watching a cathedral lose a pillar and remain standing — not because the loss didn't matter, but because every other pillar quietly took on more weight.</w:t>
-      </w:r>
-    </w:p>
-    <w:p>
-      <w:pPr>
-        <w:spacing w:before="40" w:after="40"/>
-        <w:ind w:firstLine="432"/>
-      </w:pPr>
-      <w:r>
-        <w:rPr>
-          <w:b w:val="0"/>
-          <w:i w:val="0"/>
-        </w:rPr>
-        <w:t>Kael felt the moment the Note Between's frequency left the water. Not a dramatic departure. A slow fade, like the last ring of a bell. The ocean around them was fractionally quieter. The song fractionally thinner. A gap where a voice had been, already being filled but not yet forgotten.</w:t>
+        <w:t>The Choir held their positions. The requiem didn't end. It shifted — the harmonic adjusting in real time as forty-six voices recalibrated around the absence, finding new intervals, new balances. It was like watching a cathedral lose a pillar and remain standing.</w:t>
+      </w:r>
+    </w:p>
+    <w:p>
+      <w:pPr>
+        <w:spacing w:before="40" w:after="40"/>
+        <w:ind w:firstLine="432"/>
+      </w:pPr>
+      <w:r>
+        <w:rPr>
+          <w:b w:val="0"/>
+          <w:i w:val="0"/>
+        </w:rPr>
+        <w:t>Kael felt the moment the Note Between's frequency left the water. A slow fade, like the last ring of a bell. The ocean around them was fractionally quieter. A gap where a voice had been, already being filled but not yet forgotten.</w:t>
       </w:r>
     </w:p>
     <w:p>
@@ -7907,7 +7880,7 @@
           <w:b w:val="0"/>
           <w:i w:val="0"/>
         </w:rPr>
-        <w:t>Miro broke it. Not with a joke. With a question, asked in a voice that was raw and rough and entirely without performance.</w:t>
+        <w:t>Miro broke it. Not with a joke.</w:t>
       </w:r>
     </w:p>
     <w:p>
@@ -7933,7 +7906,7 @@
           <w:b w:val="0"/>
           <w:i w:val="0"/>
         </w:rPr>
-        <w:t>Kael opened his eyes. Miro was looking at him — really looking, the way he had that first time in the submarine corridor, the grin stripped away, the deflection gone, nothing between the question and the need to know.</w:t>
+        <w:t>Kael opened his eyes. Miro was looking at him — really looking, the grin stripped away, the deflection gone.</w:t>
       </w:r>
     </w:p>
     <w:p>
@@ -8013,7 +7986,7 @@
           <w:b w:val="0"/>
           <w:i w:val="0"/>
         </w:rPr>
-        <w:t>Miro sat down. He sat down the way people sit down when their legs have made a decision their brain hasn't caught up to. He put his elbows on his knees and his face in his hands.</w:t>
+        <w:t>Miro sat down. Put his elbows on his knees and his face in his hands.</w:t>
       </w:r>
     </w:p>
     <w:p>
@@ -8079,7 +8052,7 @@
           <w:b w:val="0"/>
           <w:i w:val="0"/>
         </w:rPr>
-        <w:t>The cockpit was silent. Talon's frequency was low and mournful — a color Kael had never felt from her, something between copper and gray. Even the hawk, sharp and territorial and perpetually certain of herself, understood that this was a moment for stillness.</w:t>
+        <w:t>The cockpit was silent. Talon's frequency was low and mournful — something between copper and gray.</w:t>
       </w:r>
     </w:p>
     <w:p>
@@ -8184,20 +8157,20 @@
           <w:b w:val="0"/>
           <w:i w:val="0"/>
         </w:rPr>
-        <w:t>He told Miro because Miro needed to hear it. And because, sitting in the glow of a requiem sung by beings older than human language, the dark didn't feel like the right place for it anymore.</w:t>
-      </w:r>
-    </w:p>
-    <w:p>
-      <w:pPr>
-        <w:spacing w:before="40" w:after="40"/>
-        <w:ind w:firstLine="432"/>
-      </w:pPr>
-      <w:r>
-        <w:rPr>
-          <w:b w:val="0"/>
-          <w:i w:val="0"/>
-        </w:rPr>
-        <w:t>Miro stared at him. The raw, defenseless face slowly reassembled — not the grin, not the jokes, but something sturdier. The look of a man who has just discovered that the specific shape of his pain is not unique, and that this is somehow both terrible and comforting.</w:t>
+        <w:t>He told Miro because the dark didn't feel like the right place for it anymore.</w:t>
+      </w:r>
+    </w:p>
+    <w:p>
+      <w:pPr>
+        <w:spacing w:before="40" w:after="40"/>
+        <w:ind w:firstLine="432"/>
+      </w:pPr>
+      <w:r>
+        <w:rPr>
+          <w:b w:val="0"/>
+          <w:i w:val="0"/>
+        </w:rPr>
+        <w:t>Miro stared at him. The raw, defenseless face slowly reassembled — not the grin, not the jokes, but something sturdier.</w:t>
       </w:r>
     </w:p>
     <w:p>
@@ -8642,7 +8615,7 @@
           <w:b w:val="0"/>
           <w:i w:val="0"/>
         </w:rPr>
-        <w:t>"The Thirty-First," Sera said. She didn't reach for the console this time. Her hand stayed at her side, but Kael saw her fingers close into a fist — a deliberate, controlled gesture, the kind a person makes when they are converting fear into something they can use. "Eight ships. Escort-class and above. At least two heavy cruisers."</w:t>
+        <w:t>"The Thirty-First," Sera said. Her hand stayed at her side, but Kael saw her fingers close into a fist. "Eight ships. Escort-class and above. At least two heavy cruisers."</w:t>
       </w:r>
     </w:p>
     <w:p>
@@ -8668,7 +8641,7 @@
           <w:b w:val="0"/>
           <w:i w:val="0"/>
         </w:rPr>
-        <w:t>"So," he said. And for the first time since Kael had known him, the joke didn't come. Miro looked at the incoming fleet and the dying Choir and the uncracked data core and the rift that could end communication across a sector, and he didn't reach for humor. He reached for something underneath it.</w:t>
+        <w:t>"So," he said. And for the first time since Kael had known him, the joke didn't come.</w:t>
       </w:r>
     </w:p>
     <w:p>
@@ -9489,7 +9462,7 @@
           <w:b w:val="0"/>
           <w:i w:val="0"/>
         </w:rPr>
-        <w:t>The voice was calm, clipped, professional. The voice of someone who had given this speech before and expected it to end the same way it always did — with compliance, or with wreckage.</w:t>
+        <w:t>The voice was calm, clipped, professional.</w:t>
       </w:r>
     </w:p>
     <w:p>
@@ -9909,7 +9882,7 @@
           <w:b w:val="0"/>
           <w:i w:val="0"/>
         </w:rPr>
-        <w:t>Men and women and others who didn't fit either category, their faces lined and weathered, their eyes bright with the particular clarity that comes from having seen enough of the galaxy to stop being surprised by it. Their suits were patched and worn and covered in the accumulated markings of decades — frequency sigils, species glyphs, navigational tattoos that mapped routes no jump-gate had ever serviced. Some of them carried tools. Some carried instruments that Kael didn't recognize. One — a woman at the front of the largest platform, her white hair streaming in the current, her face a map of laugh lines and scar tissue — carried nothing at all. She didn't need to. The frequency coming off her was so powerful, so layered, so dense with experience and authority that Kael could feel it through the hull like a physical weight.</w:t>
+        <w:t>Men and women and others who didn't fit either category, their faces lined and weathered, their eyes bright. Their suits were patched and worn and covered in the accumulated markings of decades — frequency sigils, species glyphs, navigational tattoos that mapped routes no jump-gate had ever serviced. Some of them carried tools. Some carried instruments that Kael didn't recognize. One — a woman at the front of the largest platform, her white hair streaming in the current, her face a map of laugh lines and scar tissue — carried nothing at all. She didn't need to. The frequency coming off her was so powerful, so layered, so dense with experience and authority that Kael could feel it through the hull like a physical weight.</w:t>
       </w:r>
     </w:p>
     <w:p>
@@ -9961,7 +9934,7 @@
           <w:b w:val="0"/>
           <w:i w:val="0"/>
         </w:rPr>
-        <w:t xml:space="preserve">Miro was staring, his mouth open, every trace of humor suspended in pure, bewildered awe. "Are those — are those </w:t>
+        <w:t xml:space="preserve">Miro was staring, his mouth open. "Are those — are those </w:t>
       </w:r>
       <w:r>
         <w:rPr>
@@ -10181,7 +10154,7 @@
           <w:b w:val="0"/>
           <w:i w:val="0"/>
         </w:rPr>
-        <w:t xml:space="preserve">It was not a weapon. It was not an attack. It was a </w:t>
+        <w:t xml:space="preserve">It was not a weapon. It was a </w:t>
       </w:r>
       <w:r>
         <w:rPr>
@@ -10195,7 +10168,7 @@
           <w:b w:val="0"/>
           <w:i w:val="0"/>
         </w:rPr>
-        <w:t xml:space="preserve"> — a harmonic declaration broadcast on every frequency the human ear and mind could process, layered with the deeper resonances of the beings she rode, amplified by the forty-two other listeners behind her. It said, without words, without threat, without any of the machinery of violence: </w:t>
+        <w:t xml:space="preserve"> — layered with the deeper resonances of the beings she rode, amplified by the forty-two other listeners behind her. </w:t>
       </w:r>
       <w:r>
         <w:rPr>
@@ -10389,7 +10362,7 @@
           <w:b w:val="0"/>
           <w:i w:val="0"/>
         </w:rPr>
-        <w:t>"Two Veil-class sensors are trying to jam my transmission," Sera called over the comm. Her voice was steady — the Lawkeeper was back, all the cracks sealed, the mask locked in place not for concealment but for function. This was what she was built for. "If they succeed, we lose the legal record."</w:t>
+        <w:t>"Two Veil-class sensors are trying to jam my transmission," Sera called over the comm. "If they succeed, we lose the legal record."</w:t>
       </w:r>
     </w:p>
     <w:p>
@@ -10549,7 +10522,7 @@
           <w:b w:val="0"/>
           <w:i w:val="0"/>
         </w:rPr>
-        <w:t>The white-haired woman was the anchor. Kael could feel her at the center of the harmonic wall, her frequency the foundation on which forty-two others built. She was extraordinary — a listener of a caliber Kael had never encountered, her range and precision making his own abilities look like a child banging on a piano. But she was also old, and the effort was enormous, and he could hear the strain in her signal the way you hear a bridge creaking under too much weight.</w:t>
+        <w:t>The white-haired woman was the anchor. Kael could feel her at the center of the harmonic wall, her frequency the foundation on which forty-two others built. But she was old, and the effort was enormous, and he could hear the strain in her signal the way you hear a bridge creaking under too much weight.</w:t>
       </w:r>
     </w:p>
     <w:p>
@@ -11068,7 +11041,7 @@
           <w:b w:val="0"/>
           <w:i w:val="0"/>
         </w:rPr>
-        <w:t xml:space="preserve">It meant something. Kael didn't know what yet. But the Academy had warned about this — the permanent cost of full-spectrum output, the way it reshapes the listener's neural architecture, widening some channels and narrowing others. They'd called it </w:t>
+        <w:t xml:space="preserve">The Academy had a name for this — the permanent cost of full-spectrum output, the way it reshapes the listener's neural architecture, widening some channels and narrowing others. They'd called it </w:t>
       </w:r>
       <w:r>
         <w:rPr>
@@ -11077,13 +11050,6 @@
         </w:rPr>
         <w:t>drift.</w:t>
       </w:r>
-      <w:r>
-        <w:rPr>
-          <w:b w:val="0"/>
-          <w:i w:val="0"/>
-        </w:rPr>
-        <w:t xml:space="preserve"> The gradual, irreversible shift that turns a listener into something the textbooks don't have a name for.</w:t>
-      </w:r>
     </w:p>
     <w:p>
       <w:pPr>
@@ -11291,7 +11257,7 @@
           <w:b w:val="0"/>
           <w:i w:val="0"/>
         </w:rPr>
-        <w:t>The old woman smiled. It transformed her face — turned the scars and lines into a landscape of warmth, fierce and tender at the same time, the smile of someone who had been protecting ancient things for so long that the protecting had become a kind of joy.</w:t>
+        <w:t>The old woman smiled. It transformed her face — turned the scars and lines into a landscape of warmth.</w:t>
       </w:r>
     </w:p>
     <w:p>
@@ -11403,7 +11369,7 @@
           <w:b w:val="0"/>
           <w:i w:val="0"/>
         </w:rPr>
-        <w:t>Kael told her. Not in words — in frequency, in the raw, unfiltered memory of the Note Between's requiem. The old woman received it in silence. When it was done, her eyes were wet, but her face hadn't changed. She had felt this before. Many times. The grief of the old was not a collapse. It was an accumulation.</w:t>
+        <w:t>Kael told her. Not in words — in frequency, in the raw, unfiltered memory of the Note Between's requiem. The old woman received it in silence. When it was done, her eyes were wet, but her face hadn't changed.</w:t>
       </w:r>
     </w:p>
     <w:p>
@@ -11456,7 +11422,7 @@
           <w:b w:val="0"/>
           <w:i w:val="0"/>
         </w:rPr>
-        <w:t>She considered the question. Her frequency carried something that might have been humor.</w:t>
+        <w:t>She considered the question.</w:t>
       </w:r>
     </w:p>
     <w:p>
@@ -11476,7 +11442,7 @@
           <w:b w:val="0"/>
           <w:i w:val="0"/>
         </w:rPr>
-        <w:t xml:space="preserve"> The humor faded. Something else replaced it — something careful, measured, the frequency equivalent of choosing words precisely. </w:t>
+        <w:t xml:space="preserve"> A pause. </w:t>
       </w:r>
       <w:r>
         <w:rPr>
@@ -11496,7 +11462,7 @@
           <w:b w:val="0"/>
           <w:i w:val="0"/>
         </w:rPr>
-        <w:t>He felt the weight of his own name in her signal. She hadn't pulled it from the conversation. She'd known it already.</w:t>
+        <w:t>She'd known his name already. He could feel it in the signal.</w:t>
       </w:r>
     </w:p>
     <w:p>
@@ -11522,7 +11488,7 @@
           <w:b w:val="0"/>
           <w:i/>
         </w:rPr>
-        <w:t>We have been watching you for some time. Since the Ryllian sea-elk. Since before that, if I am honest. There are not many listeners left who can hear as wide as you hear. There are fewer still who choose to hear the things that hurt.</w:t>
+        <w:t>We have been watching you for some time. Since the Ryllian sea-elk.</w:t>
       </w:r>
       <w:r>
         <w:rPr>
@@ -11536,7 +11502,7 @@
           <w:b w:val="0"/>
           <w:i/>
         </w:rPr>
-        <w:t>The drift you are feeling — the widening — it is not damage. It is what happens when a listener stops holding back. You will hear more now. Much more. Things you will wish you could not hear. And you will not be able to stop.</w:t>
+        <w:t>The drift you are feeling — the widening — it is not damage. It is what happens when a listener stops holding back. You will hear more now. Much more. And you will not be able to stop.</w:t>
       </w:r>
     </w:p>
     <w:p>
@@ -11575,7 +11541,7 @@
           <w:b w:val="0"/>
           <w:i w:val="0"/>
         </w:rPr>
-        <w:t>The old woman saw the recognition on his face. She nodded — slowly, without surprise, the way someone nods when a thing they predicted has come true.</w:t>
+        <w:t>The old woman saw the recognition on his face. She nodded.</w:t>
       </w:r>
     </w:p>
     <w:p>
@@ -11614,20 +11580,20 @@
           <w:b w:val="0"/>
           <w:i w:val="0"/>
         </w:rPr>
-        <w:t>He drank his terrible coffee. The new distress call hummed at the bottom of his hearing — barely there, achingly far, patient the way only ancient things are patient. He tried not to listen to it. He failed. His widened frequency wouldn't let him shut it out.</w:t>
-      </w:r>
-    </w:p>
-    <w:p>
-      <w:pPr>
-        <w:spacing w:before="40" w:after="40"/>
-        <w:ind w:firstLine="432"/>
-      </w:pPr>
-      <w:r>
-        <w:rPr>
-          <w:b w:val="0"/>
-          <w:i w:val="0"/>
-        </w:rPr>
-        <w:t xml:space="preserve">Talon stirred on her perch and opened one eye. She felt the new signal too — he could tell by the way her crest rose, the way her frequency shifted from exhaustion to the faintest copper edge of </w:t>
+        <w:t>He drank his terrible coffee. The new distress call hummed at the bottom of his hearing. He tried not to listen to it. He failed.</w:t>
+      </w:r>
+    </w:p>
+    <w:p>
+      <w:pPr>
+        <w:spacing w:before="40" w:after="40"/>
+        <w:ind w:firstLine="432"/>
+      </w:pPr>
+      <w:r>
+        <w:rPr>
+          <w:b w:val="0"/>
+          <w:i w:val="0"/>
+        </w:rPr>
+        <w:t xml:space="preserve">Talon stirred on her perch and opened one eye. Her crest rose — the faintest copper edge of </w:t>
       </w:r>
       <w:r>
         <w:rPr>

</xml_diff>

<commit_message>
Add human imperfections to Chapters 3, 4, and 6
Five targeted insertions to make characters feel less polished:

1. Ch3: Kael's knee pops and the deck plates hurt when he sits
   cross-legged for the Choir contact. [NEW]
2. Ch3: Miro's "spite — the renewable energy source" joke lands
   in dead air. Nobody reacts. He registers it and moves on. [NEW]
3. Ch4: Kael's one petty thought when Sera reads their files:
   "We were doing fine before you got here." Immediately buried. [NEW]
4. Ch6: Kael's mouth is so dry his tongue sticks to his teeth
   mid-battle. The water bottle is behind his seat. He can't
   reach it. It's absurdly the thing that bothers him most. [NEW]
5. Ch6: Sera's instinctive distrust of the deep listeners —
   not as a threat but as forty-three people outside every legal
   framework she knows. Wick settles her. [NEW]

https://claude.ai/code/session_01XVZGKMeTpqLFzCVEmX6JZq
</commit_message>
<xml_diff>
--- a/The_Wildtongue_Chronicles.docx
+++ b/The_Wildtongue_Chronicles.docx
@@ -2552,7 +2552,7 @@
           <w:b w:val="0"/>
           <w:i w:val="0"/>
         </w:rPr>
-        <w:t>"Alright," Kael said. He unstrapped and moved to the center of the cockpit, where he could sit cross-legged on the floor. He placed his palms on the deck plates. Through the metal, he could feel the hum — the same signal that had crossed two nebulae to reach him, now so close and so powerful that his teeth ached with it.</w:t>
+        <w:t>"Alright," Kael said. He unstrapped and moved to the center of the cockpit, where he could sit cross-legged on the floor. His left knee popped loud enough that Miro looked over, and the deck plates were cold through his trousers — ridged metal, not designed for sitting, pressing into his ankles at exactly the wrong angle. He shifted, couldn't find a position that didn't hurt, and gave up. [NEW] He placed his palms on the deck plates. Through the metal, he could feel the hum — the same signal that had crossed two nebulae to reach him, now so close and so powerful that his teeth ached with it.</w:t>
       </w:r>
     </w:p>
     <w:p>
@@ -3934,7 +3934,20 @@
           <w:b w:val="0"/>
           <w:i w:val="0"/>
         </w:rPr>
-        <w:t>Miro laughed. It was a small, exhausted sound, barely more than a breath, but it was his — not the Choir's, not induced, just a man finding something genuinely funny in the middle of something genuinely terrible. Kael felt something loosen in his own chest. Not much. Just enough.</w:t>
+        <w:t>Miro opened his mouth, closed it, then tried anyway: "Spite — the renewable energy source they don't want you to know about." [NEW]</w:t>
+      </w:r>
+    </w:p>
+    <w:p>
+      <w:pPr>
+        <w:spacing w:before="40" w:after="40"/>
+        <w:ind w:firstLine="432"/>
+      </w:pPr>
+      <w:r>
+        <w:rPr>
+          <w:b w:val="0"/>
+          <w:i w:val="0"/>
+        </w:rPr>
+        <w:t>Nothing. Kael was checking the depth gauge. Talon was preening a wing feather. The line hung in the recycled air for a beat too long, and Miro's eyes registered it — a flicker, barely visible, the micro-awareness of a rhythm missed — before he moved on as if it hadn't happened. [NEW]</w:t>
       </w:r>
     </w:p>
     <w:p>
@@ -4544,6 +4557,26 @@
       <w:r>
         <w:rPr>
           <w:b w:val="0"/>
+          <w:i/>
+        </w:rPr>
+        <w:t>We were doing fine before you got here</w:t>
+      </w:r>
+      <w:r>
+        <w:rPr>
+          <w:b w:val="0"/>
+          <w:i w:val="0"/>
+        </w:rPr>
+        <w:t>, Kael thought, and immediately buried it. [NEW]</w:t>
+      </w:r>
+    </w:p>
+    <w:p>
+      <w:pPr>
+        <w:spacing w:before="40" w:after="40"/>
+        <w:ind w:firstLine="432"/>
+      </w:pPr>
+      <w:r>
+        <w:rPr>
+          <w:b w:val="0"/>
           <w:i w:val="0"/>
         </w:rPr>
         <w:t>"Sante?" Kael glanced at Miro. "You said you didn't have a surname."</w:t>
@@ -10054,7 +10087,7 @@
           <w:b w:val="0"/>
           <w:i w:val="0"/>
         </w:rPr>
-        <w:t>"The deep listeners," Sera said. It wasn't a question. She'd gone very still, her hand on the viewport rail, Wick's frequency a low, awed hum. "They're real. I thought they were a Fringe myth."</w:t>
+        <w:t>"The deep listeners," Sera said. It wasn't a question. She'd gone very still, her hand on the viewport rail. "They're real. I thought they were a Fringe myth."</w:t>
       </w:r>
     </w:p>
     <w:p>
@@ -10068,6 +10101,19 @@
           <w:i w:val="0"/>
         </w:rPr>
         <w:t>"So did I."</w:t>
+      </w:r>
+    </w:p>
+    <w:p>
+      <w:pPr>
+        <w:spacing w:before="40" w:after="40"/>
+        <w:ind w:firstLine="432"/>
+      </w:pPr>
+      <w:r>
+        <w:rPr>
+          <w:b w:val="0"/>
+          <w:i w:val="0"/>
+        </w:rPr>
+        <w:t>Sera's hand tightened on the rail. "Forty-three people operating outside Covenant jurisdiction. No registration. No oversight. No legal mandate for any of this." She said it quietly, almost to herself, and Kael heard the discomfort in it — not fear, not hostility, just the instinctive friction of a woman whose entire life was built on frameworks encountering something that existed outside all of them. It bothered her. He could tell it bothered her more than the incoming fleet, which was irrational, and he could tell she knew it was irrational, and it bothered her anyway. Then Wick shifted on her shoulder — a small, deliberate settling of weight — and his frequency pulsed once, low and steady. Whatever the owl communicated, it was enough. Sera's grip eased. She didn't mention it again. [NEW]</w:t>
       </w:r>
     </w:p>
     <w:p>
@@ -10548,7 +10594,7 @@
           <w:b w:val="0"/>
           <w:i w:val="0"/>
         </w:rPr>
-        <w:t>He flew by instinct when that happened. Flew blind, by feel, by the copper thread of Talon's frequency and the muscle memory of ten thousand hours in this cockpit.</w:t>
+        <w:t>He flew by instinct when that happened. Flew blind, by feel, by the copper thread of Talon's frequency and the muscle memory of ten thousand hours in this cockpit. His mouth was so dry his tongue stuck to his teeth. There was a water bottle in the storage net behind the seat and he could not reach it and it was, absurdly, the thing that bothered him most. [NEW]</w:t>
       </w:r>
     </w:p>
     <w:p>

</xml_diff>

<commit_message>
Apply 8-pass revision across Chapters 3-6
PASS 1: Sentence rhythm variation (short sentences in gravity spike, battle)
PASS 2: [MISJUDGMENT] — Kael misreads Choir trust as desperation (Ch4)
PASS 3: Sera characterization (legal speech, bilateral neural bond, emotional crack, chain of custody)
PASS 4: Choir/mount descriptions condensed ~25%, reduced vast/ancient/bioluminescent
PASS 5: Dialogue realism (broke up long speeches, replaced movie-trailer quotes)
PASS 6: Gravity spike physical enhancement (spine compression, ozone, hull stress)
PASS 7: Recurring pressure motif x3 (Ch3 contact, Ch4 Sera deliberation, Ch6 flanking)
PASS 8: Final paragraphs revised (Ch4 ends on image, Ch5 ambiguous rift, Ch6 drops meta-commentary)

https://claude.ai/code/session_01XVZGKMeTpqLFzCVEmX6JZq
</commit_message>
<xml_diff>
--- a/The_Wildtongue_Chronicles.docx
+++ b/The_Wildtongue_Chronicles.docx
@@ -1973,7 +1973,7 @@
           <w:b w:val="0"/>
           <w:i w:val="0"/>
         </w:rPr>
-        <w:t xml:space="preserve">The frequency grew with every hundred meters. Not louder, exactly — </w:t>
+        <w:t xml:space="preserve">The frequency grew with every hundred meters. Not louder — </w:t>
       </w:r>
       <w:r>
         <w:rPr>
@@ -1987,7 +1987,7 @@
           <w:b w:val="0"/>
           <w:i w:val="0"/>
         </w:rPr>
-        <w:t>. Like the water itself was saturated with signal, every cubic meter vibrating with a harmonic so low Kael felt it in his molars, in the joints of his fingers, in the slow rhythm of his pulse.</w:t>
+        <w:t>. The water itself saturated with signal, every cubic meter vibrating with a harmonic so low Kael felt it in his molars, in the joints of his fingers, in his pulse.</w:t>
       </w:r>
     </w:p>
     <w:p>
@@ -2143,7 +2143,7 @@
           <w:b w:val="0"/>
           <w:i w:val="0"/>
         </w:rPr>
-        <w:t>Miro laughed — a real one, short and startled. "Alright, Orin. I've got you." He said it simply, the way you'd say it to someone you'd known for years. It landed heavier than it should have.</w:t>
+        <w:t>Miro laughed — a real one, short and startled. "Alright, Orin. I've got you." He said it simply, the way you'd say it to someone you'd known for years.</w:t>
       </w:r>
     </w:p>
     <w:p>
@@ -2274,7 +2274,7 @@
           <w:b w:val="0"/>
           <w:i w:val="0"/>
         </w:rPr>
-        <w:t>It emerged from the darkness in pieces — first a single line, ruler-straight, glowing faint amber where bioluminescent growth had colonized the surface. Then another line. Then a dozen, then hundreds, all intersecting at precise angles to form a lattice that extended beyond the reach of the ship's floods in every direction. A grid of light in the abyss, beautiful and terrible, like a cathedral built for the sole purpose of holding something prisoner.</w:t>
+        <w:t>It emerged from the darkness in pieces — first a single line, ruler-straight, glowing faint amber where luminous growth had colonized the surface. Then another line. Then a dozen, then hundreds, all intersecting at precise angles to form a lattice that extended beyond the reach of the ship's floods in every direction. A grid of light in the abyss, like a cathedral built for the sole purpose of holding something prisoner.</w:t>
       </w:r>
     </w:p>
     <w:p>
@@ -2418,7 +2418,7 @@
           <w:b w:val="0"/>
           <w:i w:val="0"/>
         </w:rPr>
-        <w:t>Kael had seen large creatures before. The sand leviathans of Dorr, seven hundred meters of armored body flowing through desert canyons. The void jellies that drifted between stars, so thin they were nearly two-dimensional, their mantles stretching kilometers across like living solar sails. He'd thought he understood scale.</w:t>
+        <w:t>Kael had seen large creatures before. The sand leviathans of Dorr. The void jellies between stars, their mantles stretching kilometers across. He'd thought he understood scale.</w:t>
       </w:r>
     </w:p>
     <w:p>
@@ -2444,115 +2444,94 @@
           <w:b w:val="0"/>
           <w:i w:val="0"/>
         </w:rPr>
-        <w:t xml:space="preserve">The nearest member of the Choir drifted three hundred meters below the </w:t>
+        <w:t xml:space="preserve">The nearest member drifted three hundred meters below, and it took Kael five seconds to understand what he was seeing. Not a shape — a </w:t>
       </w:r>
       <w:r>
         <w:rPr>
           <w:b w:val="0"/>
           <w:i/>
         </w:rPr>
-        <w:t>Fang &amp; Fable</w:t>
-      </w:r>
-      <w:r>
-        <w:rPr>
-          <w:b w:val="0"/>
-          <w:i w:val="0"/>
-        </w:rPr>
-        <w:t xml:space="preserve">, and it took Kael a full five seconds to understand what he was seeing. The body was not a single shape but a </w:t>
+        <w:t>process</w:t>
+      </w:r>
+      <w:r>
+        <w:rPr>
+          <w:b w:val="0"/>
+          <w:i w:val="0"/>
+        </w:rPr>
+        <w:t xml:space="preserve">. Translucent, shifting, rearranging itself continuously. Filaments trailed from its underside in curtains of pale light, each one pulsing independently. No eyes. No mouth. No front or back. It simply </w:t>
       </w:r>
       <w:r>
         <w:rPr>
           <w:b w:val="0"/>
           <w:i/>
         </w:rPr>
-        <w:t>process</w:t>
-      </w:r>
-      <w:r>
-        <w:rPr>
-          <w:b w:val="0"/>
-          <w:i w:val="0"/>
-        </w:rPr>
-        <w:t xml:space="preserve"> — a vast, translucent form that shifted and rearranged itself continuously, like a cloud that had learned to think. Bioluminescent filaments trailed from its underside in curtains of pale blue light, each filament pulsing independently, creating patterns that rippled across the creature's body in waves. It had no eyes that Kael could identify. No mouth. No apparent front or back. It simply </w:t>
+        <w:t>was</w:t>
+      </w:r>
+      <w:r>
+        <w:rPr>
+          <w:b w:val="0"/>
+          <w:i w:val="0"/>
+        </w:rPr>
+        <w:t>.</w:t>
+      </w:r>
+    </w:p>
+    <w:p>
+      <w:pPr>
+        <w:spacing w:before="40" w:after="40"/>
+        <w:ind w:firstLine="432"/>
+      </w:pPr>
+      <w:r>
+        <w:rPr>
+          <w:b w:val="0"/>
+          <w:i w:val="0"/>
+        </w:rPr>
+        <w:t>Behind it, dozens more. Shapes in the blackness, their light painting the water in shifting constellations — each one unique, filament patterns as distinct as fingerprints.</w:t>
+      </w:r>
+    </w:p>
+    <w:p>
+      <w:pPr>
+        <w:spacing w:before="40" w:after="40"/>
+        <w:ind w:firstLine="432"/>
+      </w:pPr>
+      <w:r>
+        <w:rPr>
+          <w:b w:val="0"/>
+          <w:i w:val="0"/>
+        </w:rPr>
+        <w:t>"My God," Miro whispered.</w:t>
+      </w:r>
+    </w:p>
+    <w:p>
+      <w:pPr>
+        <w:spacing w:before="40" w:after="40"/>
+        <w:ind w:firstLine="432"/>
+      </w:pPr>
+      <w:r>
+        <w:rPr>
+          <w:b w:val="0"/>
+          <w:i w:val="0"/>
+        </w:rPr>
+        <w:t xml:space="preserve">Talon's frequency had gone completely silent. She was staring through the viewport, every feather pressed flat, her amber eyes wide. Not fear. </w:t>
       </w:r>
       <w:r>
         <w:rPr>
           <w:b w:val="0"/>
           <w:i/>
         </w:rPr>
-        <w:t>was</w:t>
-      </w:r>
-      <w:r>
-        <w:rPr>
-          <w:b w:val="0"/>
-          <w:i w:val="0"/>
-        </w:rPr>
-        <w:t xml:space="preserve"> — a cathedral of living light, rolling slowly in the dark water, its filaments stirring currents that he could feel through the hull.</w:t>
-      </w:r>
-    </w:p>
-    <w:p>
-      <w:pPr>
-        <w:spacing w:before="40" w:after="40"/>
-        <w:ind w:firstLine="432"/>
-      </w:pPr>
-      <w:r>
-        <w:rPr>
-          <w:b w:val="0"/>
-          <w:i w:val="0"/>
-        </w:rPr>
-        <w:t>And behind it, more. Dozens more. Vast shapes moving in the blackness, their bioluminescence painting the water in shifting constellations. Some were close enough to see clearly — each one unique, their filament patterns as distinct as fingerprints. Others were distant, visible only as galaxies of cold blue light drifting at the edges of the cage.</w:t>
-      </w:r>
-    </w:p>
-    <w:p>
-      <w:pPr>
-        <w:spacing w:before="40" w:after="40"/>
-        <w:ind w:firstLine="432"/>
-      </w:pPr>
-      <w:r>
-        <w:rPr>
-          <w:b w:val="0"/>
-          <w:i w:val="0"/>
-        </w:rPr>
-        <w:t>"My God," Miro whispered.</w:t>
-      </w:r>
-    </w:p>
-    <w:p>
-      <w:pPr>
-        <w:spacing w:before="40" w:after="40"/>
-        <w:ind w:firstLine="432"/>
-      </w:pPr>
-      <w:r>
-        <w:rPr>
-          <w:b w:val="0"/>
-          <w:i w:val="0"/>
-        </w:rPr>
-        <w:t xml:space="preserve">Talon's frequency had gone completely silent. Kael had never felt that from her before. She was staring through the viewport, every feather pressed flat against her body, her amber eyes wide. Not fear. </w:t>
-      </w:r>
-      <w:r>
-        <w:rPr>
-          <w:b w:val="0"/>
-          <w:i/>
-        </w:rPr>
         <w:t>Awe.</w:t>
       </w:r>
-      <w:r>
-        <w:rPr>
-          <w:b w:val="0"/>
-          <w:i w:val="0"/>
-        </w:rPr>
-        <w:t xml:space="preserve"> A frequency so quiet it was almost reverence.</w:t>
-      </w:r>
-    </w:p>
-    <w:p>
-      <w:pPr>
-        <w:spacing w:before="40" w:after="40"/>
-        <w:ind w:firstLine="432"/>
-      </w:pPr>
-      <w:r>
-        <w:rPr>
-          <w:b w:val="0"/>
-          <w:i w:val="0"/>
-        </w:rPr>
-        <w:t>"Alright," Kael said. He unstrapped and moved to the center of the cockpit, where he could sit cross-legged on the floor. His left knee popped loud enough that Miro looked over, and the deck plates were cold through his trousers — ridged metal, not designed for sitting, pressing into his ankles at exactly the wrong angle. He shifted, couldn't find a position that didn't hurt, and gave up. [NEW] He placed his palms on the deck plates. Through the metal, he could feel the hum — the same signal that had crossed two nebulae to reach him, now so close and so powerful that his teeth ached with it.</w:t>
+    </w:p>
+    <w:p>
+      <w:pPr>
+        <w:spacing w:before="40" w:after="40"/>
+        <w:ind w:firstLine="432"/>
+      </w:pPr>
+      <w:r>
+        <w:rPr>
+          <w:b w:val="0"/>
+          <w:i w:val="0"/>
+        </w:rPr>
+        <w:t>"Alright," Kael said. He unstrapped and moved to the center of the cockpit, where he could sit cross-legged on the floor. His left knee popped loud enough that Miro looked over, and the deck plates were cold through his trousers — ridged metal, not designed for sitting, pressing into his ankles at exactly the wrong angle. He shifted, couldn't find a position that didn't hurt, and gave up. He placed his palms on the deck plates. Through the metal, he could feel the hum — the same signal that had crossed two nebulae to reach him, now so close and so powerful that his teeth ached with it.</w:t>
       </w:r>
     </w:p>
     <w:p>
@@ -2618,7 +2597,7 @@
           <w:b w:val="0"/>
           <w:i w:val="0"/>
         </w:rPr>
-        <w:t xml:space="preserve">The sea-elk had been a conversation — twelve voices, harmonized, polite in the way that herd animals are polite, making space for each other. The Choir was a </w:t>
+        <w:t xml:space="preserve">The sea-elk had been a conversation. Twelve voices, polite, making space for each other. The Choir was a </w:t>
       </w:r>
       <w:r>
         <w:rPr>
@@ -2632,315 +2611,258 @@
           <w:b w:val="0"/>
           <w:i w:val="0"/>
         </w:rPr>
-        <w:t xml:space="preserve">. Forty-seven minds hit him at once, and every one of them was older than anything Kael had ever touched. The sheer weight of their consciousness pressed against his skull like the ocean pressed against the hull — not malicious, not even aggressive, just </w:t>
-      </w:r>
+        <w:t>. Forty-seven minds hit him at once. His vision whited out. His body went rigid.</w:t>
+      </w:r>
+    </w:p>
+    <w:p>
+      <w:pPr>
+        <w:spacing w:before="40" w:after="40"/>
+        <w:ind w:firstLine="432"/>
+      </w:pPr>
+      <w:r>
+        <w:rPr>
+          <w:b w:val="0"/>
+          <w:i w:val="0"/>
+        </w:rPr>
+        <w:t>The weight of their consciousness pressed against his skull the way the ocean pressed against the hull — just pressure, applied from a different direction, and it didn't matter which kind when you were the thing being crushed. [MOTIF]</w:t>
+      </w:r>
+    </w:p>
+    <w:p>
+      <w:pPr>
+        <w:spacing w:before="40" w:after="40"/>
+        <w:ind w:firstLine="432"/>
+      </w:pPr>
       <w:r>
         <w:rPr>
           <w:b w:val="0"/>
           <w:i/>
         </w:rPr>
-        <w:t>enormous</w:t>
-      </w:r>
-      <w:r>
-        <w:rPr>
-          <w:b w:val="0"/>
-          <w:i w:val="0"/>
-        </w:rPr>
-        <w:t>, the way a mountain is enormous, the way deep time is enormous. His vision whited out. His body went rigid.</w:t>
-      </w:r>
-    </w:p>
-    <w:p>
-      <w:pPr>
-        <w:spacing w:before="40" w:after="40"/>
-        <w:ind w:firstLine="432"/>
-      </w:pPr>
+        <w:t>I'm still here</w:t>
+      </w:r>
+      <w:r>
+        <w:rPr>
+          <w:b w:val="0"/>
+          <w:i w:val="0"/>
+        </w:rPr>
+        <w:t xml:space="preserve">, he told himself. </w:t>
+      </w:r>
       <w:r>
         <w:rPr>
           <w:b w:val="0"/>
           <w:i/>
         </w:rPr>
-        <w:t>I'm still here</w:t>
-      </w:r>
-      <w:r>
-        <w:rPr>
-          <w:b w:val="0"/>
-          <w:i w:val="0"/>
-        </w:rPr>
-        <w:t xml:space="preserve">, he told himself. </w:t>
-      </w:r>
+        <w:t>I'm Kael Orin. I'm on a ship. I'm —</w:t>
+      </w:r>
+    </w:p>
+    <w:p>
+      <w:pPr>
+        <w:spacing w:before="40" w:after="40"/>
+        <w:ind w:firstLine="432"/>
+      </w:pPr>
+      <w:r>
+        <w:rPr>
+          <w:b w:val="0"/>
+          <w:i w:val="0"/>
+        </w:rPr>
+        <w:t>Gone. The Choir didn't think in sequences. Their consciousness operated in layers — five or six feelings stacked simultaneously, each modifying the others the way harmonics modify a root note. He felt trapped-and-patient-and-furious-and-ancient, all at once, as a single unified state.</w:t>
+      </w:r>
+    </w:p>
+    <w:p>
+      <w:pPr>
+        <w:spacing w:before="40" w:after="40"/>
+        <w:ind w:firstLine="432"/>
+      </w:pPr>
+      <w:r>
+        <w:rPr>
+          <w:b w:val="0"/>
+          <w:i w:val="0"/>
+        </w:rPr>
+        <w:t>He was losing himself.</w:t>
+      </w:r>
+    </w:p>
+    <w:p>
+      <w:pPr>
+        <w:spacing w:before="40" w:after="40"/>
+        <w:ind w:firstLine="432"/>
+      </w:pPr>
+      <w:r>
+        <w:rPr>
+          <w:b w:val="0"/>
+          <w:i w:val="0"/>
+        </w:rPr>
+        <w:t>His memories — Talon's fledgling weight in his hands. The notch in the Tidebreaker's stock. Selvaan black tea. All of it thinning, growing transparent, as the Choir's signal overwrote everything.</w:t>
+      </w:r>
+    </w:p>
+    <w:p>
+      <w:pPr>
+        <w:spacing w:before="40" w:after="40"/>
+        <w:ind w:firstLine="432"/>
+      </w:pPr>
       <w:r>
         <w:rPr>
           <w:b w:val="0"/>
           <w:i/>
         </w:rPr>
-        <w:t>I'm Kael Orin. I'm on a ship. I'm —</w:t>
-      </w:r>
-    </w:p>
-    <w:p>
-      <w:pPr>
-        <w:spacing w:before="40" w:after="40"/>
-        <w:ind w:firstLine="432"/>
-      </w:pPr>
-      <w:r>
-        <w:rPr>
-          <w:b w:val="0"/>
-          <w:i w:val="0"/>
-        </w:rPr>
-        <w:t xml:space="preserve">The thought dissolved. The Choir didn't communicate in sequences. They didn't think in </w:t>
+        <w:t>Pull me out</w:t>
+      </w:r>
+      <w:r>
+        <w:rPr>
+          <w:b w:val="0"/>
+          <w:i w:val="0"/>
+        </w:rPr>
+        <w:t xml:space="preserve">, he'd told Miro. </w:t>
       </w:r>
       <w:r>
         <w:rPr>
           <w:b w:val="0"/>
           <w:i/>
         </w:rPr>
-        <w:t>then</w:t>
-      </w:r>
-      <w:r>
-        <w:rPr>
-          <w:b w:val="0"/>
-          <w:i w:val="0"/>
-        </w:rPr>
-        <w:t xml:space="preserve">. Their consciousness operated in layers — emotional chords, five or six feelings stacked simultaneously, each one modifying the others the way harmonics modify a root note. What Kael's training had taught him to process as a single feeling — </w:t>
+        <w:t>If I go blank.</w:t>
+      </w:r>
+    </w:p>
+    <w:p>
+      <w:pPr>
+        <w:spacing w:before="40" w:after="40"/>
+        <w:ind w:firstLine="432"/>
+      </w:pPr>
+      <w:r>
+        <w:rPr>
+          <w:b w:val="0"/>
+          <w:i w:val="0"/>
+        </w:rPr>
+        <w:t xml:space="preserve">But he wasn't blank. He was </w:t>
       </w:r>
       <w:r>
         <w:rPr>
           <w:b w:val="0"/>
           <w:i/>
         </w:rPr>
-        <w:t>fear</w:t>
-      </w:r>
-      <w:r>
-        <w:rPr>
-          <w:b w:val="0"/>
-          <w:i w:val="0"/>
-        </w:rPr>
-        <w:t xml:space="preserve">, </w:t>
+        <w:t>full</w:t>
+      </w:r>
+      <w:r>
+        <w:rPr>
+          <w:b w:val="0"/>
+          <w:i w:val="0"/>
+        </w:rPr>
+        <w:t>. Too full. Drowning.</w:t>
+      </w:r>
+    </w:p>
+    <w:p>
+      <w:pPr>
+        <w:spacing w:before="40" w:after="40"/>
+        <w:ind w:firstLine="432"/>
+      </w:pPr>
+      <w:r>
+        <w:rPr>
+          <w:b w:val="0"/>
+          <w:i w:val="0"/>
+        </w:rPr>
+        <w:t>Then — one voice, thin and precise, separated from the flood. It reached for him carefully, the way you'd extend a hand to a small animal. Slowly. Aware of the difference in scale.</w:t>
+      </w:r>
+    </w:p>
+    <w:p>
+      <w:pPr>
+        <w:spacing w:before="40" w:after="40"/>
+        <w:ind w:firstLine="432"/>
+      </w:pPr>
+      <w:r>
+        <w:rPr>
+          <w:b w:val="0"/>
+          <w:i w:val="0"/>
+        </w:rPr>
+        <w:t xml:space="preserve">The chord simplified. The Choir was </w:t>
       </w:r>
       <w:r>
         <w:rPr>
           <w:b w:val="0"/>
           <w:i/>
         </w:rPr>
-        <w:t>joy</w:t>
-      </w:r>
-      <w:r>
-        <w:rPr>
-          <w:b w:val="0"/>
-          <w:i w:val="0"/>
-        </w:rPr>
-        <w:t xml:space="preserve">, </w:t>
-      </w:r>
+        <w:t>adjusting</w:t>
+      </w:r>
+      <w:r>
+        <w:rPr>
+          <w:b w:val="0"/>
+          <w:i w:val="0"/>
+        </w:rPr>
+        <w:t xml:space="preserve"> — reshaping its communication to something his mind could hold. It cost them. Kael felt the strain — forty-seven intelligences dampening themselves to a whisper so that one small creature could listen.</w:t>
+      </w:r>
+    </w:p>
+    <w:p>
+      <w:pPr>
+        <w:spacing w:before="40" w:after="40"/>
+        <w:ind w:firstLine="432"/>
+      </w:pPr>
+      <w:r>
+        <w:rPr>
+          <w:b w:val="0"/>
+          <w:i w:val="0"/>
+        </w:rPr>
+        <w:t>An image formed. Not visual — emotional, spatial, temporal, all at once. But Kael's brain translated it into something he could process:</w:t>
+      </w:r>
+    </w:p>
+    <w:p>
+      <w:pPr>
+        <w:spacing w:before="40" w:after="40"/>
+        <w:ind w:firstLine="432"/>
+      </w:pPr>
       <w:r>
         <w:rPr>
           <w:b w:val="0"/>
           <w:i/>
         </w:rPr>
-        <w:t>grief</w:t>
-      </w:r>
-      <w:r>
-        <w:rPr>
-          <w:b w:val="0"/>
-          <w:i w:val="0"/>
-        </w:rPr>
-        <w:t xml:space="preserve"> — the Choir expressed as composite structures, emotions that had no human name because they were built from combinations humans never experienced.</w:t>
-      </w:r>
-    </w:p>
-    <w:p>
-      <w:pPr>
-        <w:spacing w:before="40" w:after="40"/>
-        <w:ind w:firstLine="432"/>
-      </w:pPr>
-      <w:r>
-        <w:rPr>
-          <w:b w:val="0"/>
-          <w:i w:val="0"/>
-        </w:rPr>
-        <w:t>He felt trapped-and-patient-and-furious-and-ancient, all at once, not as separate threads but as a single unified state, the way a major seventh chord is not four notes but one sound. And underneath that chord, another. And another. Layers descending into depths his mind couldn't follow.</w:t>
-      </w:r>
-    </w:p>
-    <w:p>
-      <w:pPr>
-        <w:spacing w:before="40" w:after="40"/>
-        <w:ind w:firstLine="432"/>
-      </w:pPr>
-      <w:r>
-        <w:rPr>
-          <w:b w:val="0"/>
-          <w:i w:val="0"/>
-        </w:rPr>
-        <w:t>He was losing himself. The edges of his identity were softening, dissolving into the Choir's vast collective hum the way a single voice disappears into a cathedral chorus. He could feel his own memories beginning to destabilize — Talon's fledgling weight in his hands, the notch in the Tidebreaker's stock, the taste of Selvaan black tea — all of it growing thin, transparent, as the Choir's signal overwrote everything with its own ancient, layered knowing.</w:t>
-      </w:r>
-    </w:p>
-    <w:p>
-      <w:pPr>
-        <w:spacing w:before="40" w:after="40"/>
-        <w:ind w:firstLine="432"/>
-      </w:pPr>
+        <w:t>A map. The ocean. The cage. And outside the cage — below it, far below, in the bottomless dark — something else. Something that was not the Choir. Something they were between.</w:t>
+      </w:r>
+    </w:p>
+    <w:p>
+      <w:pPr>
+        <w:spacing w:before="40" w:after="40"/>
+        <w:ind w:firstLine="432"/>
+      </w:pPr>
+      <w:r>
+        <w:rPr>
+          <w:b w:val="0"/>
+          <w:i w:val="0"/>
+        </w:rPr>
+        <w:t>"Kael." Miro's voice, distant, as if coming through water. "Kael, your nose is bleeding."</w:t>
+      </w:r>
+    </w:p>
+    <w:p>
+      <w:pPr>
+        <w:spacing w:before="40" w:after="40"/>
+        <w:ind w:firstLine="432"/>
+      </w:pPr>
+      <w:r>
+        <w:rPr>
+          <w:b w:val="0"/>
+          <w:i w:val="0"/>
+        </w:rPr>
+        <w:t xml:space="preserve">He held up one hand. </w:t>
+      </w:r>
       <w:r>
         <w:rPr>
           <w:b w:val="0"/>
           <w:i/>
         </w:rPr>
-        <w:t>Pull me out</w:t>
-      </w:r>
-      <w:r>
-        <w:rPr>
-          <w:b w:val="0"/>
-          <w:i w:val="0"/>
-        </w:rPr>
-        <w:t xml:space="preserve">, he'd told Miro. </w:t>
+        <w:t>Wait.</w:t>
+      </w:r>
+    </w:p>
+    <w:p>
+      <w:pPr>
+        <w:spacing w:before="40" w:after="40"/>
+        <w:ind w:firstLine="432"/>
+      </w:pPr>
+      <w:r>
+        <w:rPr>
+          <w:b w:val="0"/>
+          <w:i w:val="0"/>
+        </w:rPr>
+        <w:t xml:space="preserve">The image sharpened. The Choir showed him the cage from their perspective — not a prison but a </w:t>
       </w:r>
       <w:r>
         <w:rPr>
           <w:b w:val="0"/>
           <w:i/>
         </w:rPr>
-        <w:t>If I go blank.</w:t>
-      </w:r>
-    </w:p>
-    <w:p>
-      <w:pPr>
-        <w:spacing w:before="40" w:after="40"/>
-        <w:ind w:firstLine="432"/>
-      </w:pPr>
-      <w:r>
-        <w:rPr>
-          <w:b w:val="0"/>
-          <w:i w:val="0"/>
-        </w:rPr>
-        <w:t xml:space="preserve">But he wasn't blank. He was </w:t>
-      </w:r>
-      <w:r>
-        <w:rPr>
-          <w:b w:val="0"/>
-          <w:i/>
-        </w:rPr>
-        <w:t>full</w:t>
-      </w:r>
-      <w:r>
-        <w:rPr>
-          <w:b w:val="0"/>
-          <w:i w:val="0"/>
-        </w:rPr>
-        <w:t>. Too full. Drowning in signal.</w:t>
-      </w:r>
-    </w:p>
-    <w:p>
-      <w:pPr>
-        <w:spacing w:before="40" w:after="40"/>
-        <w:ind w:firstLine="432"/>
-      </w:pPr>
-      <w:r>
-        <w:rPr>
-          <w:b w:val="0"/>
-          <w:i w:val="0"/>
-        </w:rPr>
-        <w:t>Then — a single filament of thought, thin and precise, separated from the flood. One voice, stepping forward from the chorus. It reached for him carefully, the way you'd extend a hand to a small animal — slowly, with deliberate gentleness, aware of the difference in scale.</w:t>
-      </w:r>
-    </w:p>
-    <w:p>
-      <w:pPr>
-        <w:spacing w:before="40" w:after="40"/>
-        <w:ind w:firstLine="432"/>
-      </w:pPr>
-      <w:r>
-        <w:rPr>
-          <w:b w:val="0"/>
-          <w:i w:val="0"/>
-        </w:rPr>
-        <w:t xml:space="preserve">The chord simplified. The layers compressed. The Choir was </w:t>
-      </w:r>
-      <w:r>
-        <w:rPr>
-          <w:b w:val="0"/>
-          <w:i/>
-        </w:rPr>
-        <w:t>adjusting</w:t>
-      </w:r>
-      <w:r>
-        <w:rPr>
-          <w:b w:val="0"/>
-          <w:i w:val="0"/>
-        </w:rPr>
-        <w:t xml:space="preserve"> — reshaping its communication to something his mind could hold without shattering. It cost them effort. Kael could feel the strain of it, forty-seven vast intelligences dampening themselves to a whisper so that one small creature could listen.</w:t>
-      </w:r>
-    </w:p>
-    <w:p>
-      <w:pPr>
-        <w:spacing w:before="40" w:after="40"/>
-        <w:ind w:firstLine="432"/>
-      </w:pPr>
-      <w:r>
-        <w:rPr>
-          <w:b w:val="0"/>
-          <w:i w:val="0"/>
-        </w:rPr>
-        <w:t>An image formed. Not visual — emotional, spatial, temporal, all at once. But Kael's brain translated it into something he could process:</w:t>
-      </w:r>
-    </w:p>
-    <w:p>
-      <w:pPr>
-        <w:spacing w:before="40" w:after="40"/>
-        <w:ind w:firstLine="432"/>
-      </w:pPr>
-      <w:r>
-        <w:rPr>
-          <w:b w:val="0"/>
-          <w:i/>
-        </w:rPr>
-        <w:t>A map. The ocean. The cage. And outside the cage — below it, far below, in the bottomless dark — something else. Something that was not the Choir. Something they were between.</w:t>
-      </w:r>
-    </w:p>
-    <w:p>
-      <w:pPr>
-        <w:spacing w:before="40" w:after="40"/>
-        <w:ind w:firstLine="432"/>
-      </w:pPr>
-      <w:r>
-        <w:rPr>
-          <w:b w:val="0"/>
-          <w:i w:val="0"/>
-        </w:rPr>
-        <w:t>"Kael." Miro's voice, distant, as if coming through water. "Kael, your nose is bleeding."</w:t>
-      </w:r>
-    </w:p>
-    <w:p>
-      <w:pPr>
-        <w:spacing w:before="40" w:after="40"/>
-        <w:ind w:firstLine="432"/>
-      </w:pPr>
-      <w:r>
-        <w:rPr>
-          <w:b w:val="0"/>
-          <w:i w:val="0"/>
-        </w:rPr>
-        <w:t xml:space="preserve">He held up one hand. </w:t>
-      </w:r>
-      <w:r>
-        <w:rPr>
-          <w:b w:val="0"/>
-          <w:i/>
-        </w:rPr>
-        <w:t>Wait.</w:t>
-      </w:r>
-    </w:p>
-    <w:p>
-      <w:pPr>
-        <w:spacing w:before="40" w:after="40"/>
-        <w:ind w:firstLine="432"/>
-      </w:pPr>
-      <w:r>
-        <w:rPr>
-          <w:b w:val="0"/>
-          <w:i w:val="0"/>
-        </w:rPr>
-        <w:t xml:space="preserve">The image sharpened. The Choir showed him the cage from their perspective — not a prison but a </w:t>
-      </w:r>
-      <w:r>
-        <w:rPr>
-          <w:b w:val="0"/>
-          <w:i/>
-        </w:rPr>
         <w:t>lid</w:t>
       </w:r>
       <w:r>
@@ -2948,7 +2870,7 @@
           <w:b w:val="0"/>
           <w:i w:val="0"/>
         </w:rPr>
-        <w:t>. The gravitic netting didn't just trap them inside. It sealed something beneath them. The Choir had been here long before the cage. They'd been here for millennia, swimming in slow, ancient circuits above the deep rift where the ocean had no floor. They were not prisoners.</w:t>
+        <w:t>. The gravitic netting didn't just trap them inside. It sealed something beneath them. The Choir had been here long before the cage. They'd been here for millennia, swimming in slow circuits above the deep rift where the ocean had no floor. They were not prisoners.</w:t>
       </w:r>
     </w:p>
     <w:p>
@@ -3357,700 +3279,686 @@
           <w:b w:val="0"/>
           <w:i w:val="0"/>
         </w:rPr>
-        <w:t>, of something coiled in the deepest dark, patient the way geology is patient, waiting the way an avalanche waits. Not alive, exactly. Not dead. Something older than either word.</w:t>
-      </w:r>
-    </w:p>
-    <w:p>
-      <w:pPr>
-        <w:spacing w:before="40" w:after="40"/>
-        <w:ind w:firstLine="432"/>
-      </w:pPr>
-      <w:r>
-        <w:rPr>
-          <w:b w:val="0"/>
-          <w:i w:val="0"/>
-        </w:rPr>
-        <w:t xml:space="preserve">"They don't have a name for it. The closest translation I can manage is — </w:t>
+        <w:t>, of something coiled in the deepest dark, patient the way geology is patient.</w:t>
+      </w:r>
+    </w:p>
+    <w:p>
+      <w:pPr>
+        <w:spacing w:before="40" w:after="40"/>
+        <w:ind w:firstLine="432"/>
+      </w:pPr>
+      <w:r>
+        <w:rPr>
+          <w:b w:val="0"/>
+          <w:i w:val="0"/>
+        </w:rPr>
+        <w:t xml:space="preserve">"They don't have a name for it. The closest I can — it's an anti-frequency. Everything the Choir is — connection, harmony — this thing is the inverse. Severance. Silence. It doesn't destroy life. It destroys the ability of living things to </w:t>
       </w:r>
       <w:r>
         <w:rPr>
           <w:b w:val="0"/>
           <w:i/>
         </w:rPr>
-        <w:t>the tone beneath all tones.</w:t>
-      </w:r>
-      <w:r>
-        <w:rPr>
-          <w:b w:val="0"/>
-          <w:i w:val="0"/>
-        </w:rPr>
-        <w:t xml:space="preserve"> An anti-frequency. Everything the Choir is — connection, harmony, collective thought — this thing is the inverse. Severance. Silence. It doesn't destroy life. It destroys the ability of living things to communicate. To bond. To </w:t>
+        <w:t>hear</w:t>
+      </w:r>
+      <w:r>
+        <w:rPr>
+          <w:b w:val="0"/>
+          <w:i w:val="0"/>
+        </w:rPr>
+        <w:t xml:space="preserve"> each other."</w:t>
+      </w:r>
+    </w:p>
+    <w:p>
+      <w:pPr>
+        <w:spacing w:before="40" w:after="40"/>
+        <w:ind w:firstLine="432"/>
+      </w:pPr>
+      <w:r>
+        <w:rPr>
+          <w:b w:val="0"/>
+          <w:i w:val="0"/>
+        </w:rPr>
+        <w:t>He met Miro's eyes. "If it gets out, every frequency-capable species in the sector goes deaf. Not just animals. Anything that relies on signal — neural networks, hive minds, bonded pairs. Every ship's communication array. Just... silence."</w:t>
+      </w:r>
+    </w:p>
+    <w:p>
+      <w:pPr>
+        <w:spacing w:before="40" w:after="40"/>
+        <w:ind w:firstLine="432"/>
+      </w:pPr>
+      <w:r>
+        <w:rPr>
+          <w:b w:val="0"/>
+          <w:i w:val="0"/>
+        </w:rPr>
+        <w:t>Miro sat back against the console. He was quiet for a long time. Kael watched the grin try to come back and fail, twice, before Miro gave up and just let his face be what it was — afraid.</w:t>
+      </w:r>
+    </w:p>
+    <w:p>
+      <w:pPr>
+        <w:spacing w:before="40" w:after="40"/>
+        <w:ind w:firstLine="432"/>
+      </w:pPr>
+      <w:r>
+        <w:rPr>
+          <w:b w:val="0"/>
+          <w:i w:val="0"/>
+        </w:rPr>
+        <w:t>"So someone knows," Miro said finally. "Someone knows what's down there, and they built this cage specifically to release it."</w:t>
+      </w:r>
+    </w:p>
+    <w:p>
+      <w:pPr>
+        <w:spacing w:before="40" w:after="40"/>
+        <w:ind w:firstLine="432"/>
+      </w:pPr>
+      <w:r>
+        <w:rPr>
+          <w:b w:val="0"/>
+          <w:i w:val="0"/>
+        </w:rPr>
+        <w:t>"Yes."</w:t>
+      </w:r>
+    </w:p>
+    <w:p>
+      <w:pPr>
+        <w:spacing w:before="40" w:after="40"/>
+        <w:ind w:firstLine="432"/>
+      </w:pPr>
+      <w:r>
+        <w:rPr>
+          <w:b w:val="0"/>
+          <w:i w:val="0"/>
+        </w:rPr>
+        <w:t>"And we have seventy-two hours."</w:t>
+      </w:r>
+    </w:p>
+    <w:p>
+      <w:pPr>
+        <w:spacing w:before="40" w:after="40"/>
+        <w:ind w:firstLine="432"/>
+      </w:pPr>
+      <w:r>
+        <w:rPr>
+          <w:b w:val="0"/>
+          <w:i w:val="0"/>
+        </w:rPr>
+        <w:t>"Less now. Sixty-eight, maybe."</w:t>
+      </w:r>
+    </w:p>
+    <w:p>
+      <w:pPr>
+        <w:spacing w:before="40" w:after="40"/>
+        <w:ind w:firstLine="432"/>
+      </w:pPr>
+      <w:r>
+        <w:rPr>
+          <w:b w:val="0"/>
+          <w:i w:val="0"/>
+        </w:rPr>
+        <w:t xml:space="preserve">Miro closed his eyes. Drew a breath. When he opened them, the fear was still there, but it had company — something harder, the same stubbornness Kael had seen when Miro said </w:t>
       </w:r>
       <w:r>
         <w:rPr>
           <w:b w:val="0"/>
           <w:i/>
         </w:rPr>
-        <w:t>hear</w:t>
-      </w:r>
-      <w:r>
-        <w:rPr>
-          <w:b w:val="0"/>
-          <w:i w:val="0"/>
-        </w:rPr>
-        <w:t xml:space="preserve"> each other."</w:t>
-      </w:r>
-    </w:p>
-    <w:p>
-      <w:pPr>
-        <w:spacing w:before="40" w:after="40"/>
-        <w:ind w:firstLine="432"/>
-      </w:pPr>
-      <w:r>
-        <w:rPr>
-          <w:b w:val="0"/>
-          <w:i w:val="0"/>
-        </w:rPr>
-        <w:t>He met Miro's eyes. "If it gets out, every frequency-capable species in the sector goes deaf. Not just animals. Anything that relies on signal — neural networks, hive minds, bonded pairs. Every ship's communication array within range. Every connected intelligence, biological or artificial. Just... silence."</w:t>
-      </w:r>
-    </w:p>
-    <w:p>
-      <w:pPr>
-        <w:spacing w:before="40" w:after="40"/>
-        <w:ind w:firstLine="432"/>
-      </w:pPr>
-      <w:r>
-        <w:rPr>
-          <w:b w:val="0"/>
-          <w:i w:val="0"/>
-        </w:rPr>
-        <w:t>Miro sat back against the console. He was quiet for a long time. Kael watched the grin try to come back and fail, twice, before Miro gave up and just let his face be what it was — afraid.</w:t>
-      </w:r>
-    </w:p>
-    <w:p>
-      <w:pPr>
-        <w:spacing w:before="40" w:after="40"/>
-        <w:ind w:firstLine="432"/>
-      </w:pPr>
-      <w:r>
-        <w:rPr>
-          <w:b w:val="0"/>
-          <w:i w:val="0"/>
-        </w:rPr>
-        <w:t>"So someone knows," Miro said finally. "Someone knows what's down there, and they built this cage specifically to release it."</w:t>
-      </w:r>
-    </w:p>
-    <w:p>
-      <w:pPr>
-        <w:spacing w:before="40" w:after="40"/>
-        <w:ind w:firstLine="432"/>
-      </w:pPr>
-      <w:r>
-        <w:rPr>
-          <w:b w:val="0"/>
-          <w:i w:val="0"/>
-        </w:rPr>
-        <w:t>"Yes."</w:t>
-      </w:r>
-    </w:p>
-    <w:p>
-      <w:pPr>
-        <w:spacing w:before="40" w:after="40"/>
-        <w:ind w:firstLine="432"/>
-      </w:pPr>
-      <w:r>
-        <w:rPr>
-          <w:b w:val="0"/>
-          <w:i w:val="0"/>
-        </w:rPr>
-        <w:t>"And we have seventy-two hours."</w:t>
-      </w:r>
-    </w:p>
-    <w:p>
-      <w:pPr>
-        <w:spacing w:before="40" w:after="40"/>
-        <w:ind w:firstLine="432"/>
-      </w:pPr>
-      <w:r>
-        <w:rPr>
-          <w:b w:val="0"/>
-          <w:i w:val="0"/>
-        </w:rPr>
-        <w:t>"Less now. Sixty-eight, maybe."</w:t>
-      </w:r>
-    </w:p>
-    <w:p>
-      <w:pPr>
-        <w:spacing w:before="40" w:after="40"/>
-        <w:ind w:firstLine="432"/>
-      </w:pPr>
-      <w:r>
-        <w:rPr>
-          <w:b w:val="0"/>
-          <w:i w:val="0"/>
-        </w:rPr>
-        <w:t xml:space="preserve">Miro closed his eyes. Drew a breath. When he opened them, the fear was still there, but it had company — something harder, the same stubbornness Kael had seen when Miro said </w:t>
+        <w:t>because nobody else came.</w:t>
+      </w:r>
+    </w:p>
+    <w:p>
+      <w:pPr>
+        <w:spacing w:before="40" w:after="40"/>
+        <w:ind w:firstLine="432"/>
+      </w:pPr>
+      <w:r>
+        <w:rPr>
+          <w:b w:val="0"/>
+          <w:i w:val="0"/>
+        </w:rPr>
+        <w:t>"Right," he said. He stood, pulled up his scanner, and turned to the viewport where the cage's lattice glowed in the dark water. "Then I need to find the control nexus. That's my job. You said each node communicates on a backbone frequency?"</w:t>
+      </w:r>
+    </w:p>
+    <w:p>
+      <w:pPr>
+        <w:spacing w:before="40" w:after="40"/>
+        <w:ind w:firstLine="432"/>
+      </w:pPr>
+      <w:r>
+        <w:rPr>
+          <w:b w:val="0"/>
+          <w:i w:val="0"/>
+        </w:rPr>
+        <w:t>"That's what you told me."</w:t>
+      </w:r>
+    </w:p>
+    <w:p>
+      <w:pPr>
+        <w:spacing w:before="40" w:after="40"/>
+        <w:ind w:firstLine="432"/>
+      </w:pPr>
+      <w:r>
+        <w:rPr>
+          <w:b w:val="0"/>
+          <w:i w:val="0"/>
+        </w:rPr>
+        <w:t>"I did, and I was right, because I'm very good at my job even when I'm terrified. Give me thirty minutes with the netting. I need to map the signal architecture, trace it back to the hub." He was already pulling up spectral analysis tools, his hands — steady, always steady — flying across the interface. "Fly me along the eastern edge. Slow. I need to read the nodes as we pass."</w:t>
+      </w:r>
+    </w:p>
+    <w:p>
+      <w:pPr>
+        <w:spacing w:before="40" w:after="40"/>
+        <w:ind w:firstLine="432"/>
+      </w:pPr>
+      <w:r>
+        <w:rPr>
+          <w:b w:val="0"/>
+          <w:i w:val="0"/>
+        </w:rPr>
+        <w:t xml:space="preserve">Kael pulled himself into the pilot's seat. His head was still ringing, but his hands were steady too. Talon settled on the headrest behind him and pressed her beak against the back of his skull — a gesture she hadn't made since she was a fledgling, her frequency broadcasting a low, fierce pulse that Kael's brain translated simply as: </w:t>
       </w:r>
       <w:r>
         <w:rPr>
           <w:b w:val="0"/>
           <w:i/>
         </w:rPr>
-        <w:t>because nobody else came.</w:t>
-      </w:r>
-    </w:p>
-    <w:p>
-      <w:pPr>
-        <w:spacing w:before="40" w:after="40"/>
-        <w:ind w:firstLine="432"/>
-      </w:pPr>
-      <w:r>
-        <w:rPr>
-          <w:b w:val="0"/>
-          <w:i w:val="0"/>
-        </w:rPr>
-        <w:t>"Right," he said. He stood, pulled up his scanner, and turned to the viewport where the cage's lattice glowed in the dark water. "Then I need to find the control nexus. That's my job. You said each node communicates on a backbone frequency?"</w:t>
-      </w:r>
-    </w:p>
-    <w:p>
-      <w:pPr>
-        <w:spacing w:before="40" w:after="40"/>
-        <w:ind w:firstLine="432"/>
-      </w:pPr>
-      <w:r>
-        <w:rPr>
-          <w:b w:val="0"/>
-          <w:i w:val="0"/>
-        </w:rPr>
-        <w:t>"That's what you told me."</w:t>
-      </w:r>
-    </w:p>
-    <w:p>
-      <w:pPr>
-        <w:spacing w:before="40" w:after="40"/>
-        <w:ind w:firstLine="432"/>
-      </w:pPr>
-      <w:r>
-        <w:rPr>
-          <w:b w:val="0"/>
-          <w:i w:val="0"/>
-        </w:rPr>
-        <w:t>"I did, and I was right, because I'm very good at my job even when I'm terrified. Give me thirty minutes with the netting. I need to map the signal architecture, trace it back to the hub." He was already pulling up spectral analysis tools, his hands — steady, always steady — flying across the interface. "Fly me along the eastern edge. Slow. I need to read the nodes as we pass."</w:t>
-      </w:r>
-    </w:p>
-    <w:p>
-      <w:pPr>
-        <w:spacing w:before="40" w:after="40"/>
-        <w:ind w:firstLine="432"/>
-      </w:pPr>
-      <w:r>
-        <w:rPr>
-          <w:b w:val="0"/>
-          <w:i w:val="0"/>
-        </w:rPr>
-        <w:t xml:space="preserve">Kael pulled himself into the pilot's seat. His head was still ringing, but his hands were steady too. Talon settled on the headrest behind him and pressed her beak against the back of his skull — a gesture she hadn't made since she was a fledgling, her frequency broadcasting a low, fierce pulse that Kael's brain translated simply as: </w:t>
+        <w:t>mine.</w:t>
+      </w:r>
+    </w:p>
+    <w:p>
+      <w:pPr>
+        <w:spacing w:before="40" w:after="40"/>
+        <w:ind w:firstLine="432"/>
+      </w:pPr>
+      <w:r>
+        <w:rPr>
+          <w:b w:val="0"/>
+          <w:i w:val="0"/>
+        </w:rPr>
+        <w:t>He flew the ship along the cage's edge. The lattice scrolled past the viewport, node after node, each one a small sun of gravitic force. Miro worked in silence — real silence, no jokes, no patter — his focus absolute, cross-referencing signal patterns and muttering numbers under his breath.</w:t>
+      </w:r>
+    </w:p>
+    <w:p>
+      <w:pPr>
+        <w:spacing w:before="40" w:after="40"/>
+        <w:ind w:firstLine="432"/>
+      </w:pPr>
+      <w:r>
+        <w:rPr>
+          <w:b w:val="0"/>
+          <w:i w:val="0"/>
+        </w:rPr>
+        <w:t>Twenty minutes in, he stopped.</w:t>
+      </w:r>
+    </w:p>
+    <w:p>
+      <w:pPr>
+        <w:spacing w:before="40" w:after="40"/>
+        <w:ind w:firstLine="432"/>
+      </w:pPr>
+      <w:r>
+        <w:rPr>
+          <w:b w:val="0"/>
+          <w:i w:val="0"/>
+        </w:rPr>
+        <w:t>"There." He pointed to a section of the netting where the nodes were spaced more densely, their connecting lines converging like roads into a city center. "The signal architecture funnels here. Every node in the grid references this cluster for timing synchronization. Kill this, and the whole net destabilizes."</w:t>
+      </w:r>
+    </w:p>
+    <w:p>
+      <w:pPr>
+        <w:spacing w:before="40" w:after="40"/>
+        <w:ind w:firstLine="432"/>
+      </w:pPr>
+      <w:r>
+        <w:rPr>
+          <w:b w:val="0"/>
+          <w:i w:val="0"/>
+        </w:rPr>
+        <w:t>"Can we reach it?"</w:t>
+      </w:r>
+    </w:p>
+    <w:p>
+      <w:pPr>
+        <w:spacing w:before="40" w:after="40"/>
+        <w:ind w:firstLine="432"/>
+      </w:pPr>
+      <w:r>
+        <w:rPr>
+          <w:b w:val="0"/>
+          <w:i w:val="0"/>
+        </w:rPr>
+        <w:t>"It's inside the cage. About five hundred meters past the barrier." He pulled up more data and froze. "Kael."</w:t>
+      </w:r>
+    </w:p>
+    <w:p>
+      <w:pPr>
+        <w:spacing w:before="40" w:after="40"/>
+        <w:ind w:firstLine="432"/>
+      </w:pPr>
+      <w:r>
+        <w:rPr>
+          <w:b w:val="0"/>
+          <w:i w:val="0"/>
+        </w:rPr>
+        <w:t>"What?"</w:t>
+      </w:r>
+    </w:p>
+    <w:p>
+      <w:pPr>
+        <w:spacing w:before="40" w:after="40"/>
+        <w:ind w:firstLine="432"/>
+      </w:pPr>
+      <w:r>
+        <w:rPr>
+          <w:b w:val="0"/>
+          <w:i w:val="0"/>
+        </w:rPr>
+        <w:t>"The control nexus. I'm reading a manufacturer's stamp on the micro-fusion cells. Union military procurement. And there's a designation code." He read it off the screen, his voice flat. "UMSF-Vanguard. Batch number matches a requisition order from the Thirty-First Strategic Fleet."</w:t>
+      </w:r>
+    </w:p>
+    <w:p>
+      <w:pPr>
+        <w:spacing w:before="40" w:after="40"/>
+        <w:ind w:firstLine="432"/>
+      </w:pPr>
+      <w:r>
+        <w:rPr>
+          <w:b w:val="0"/>
+          <w:i w:val="0"/>
+        </w:rPr>
+        <w:t>"You know it?"</w:t>
+      </w:r>
+    </w:p>
+    <w:p>
+      <w:pPr>
+        <w:spacing w:before="40" w:after="40"/>
+        <w:ind w:firstLine="432"/>
+      </w:pPr>
+      <w:r>
+        <w:rPr>
+          <w:b w:val="0"/>
+          <w:i w:val="0"/>
+        </w:rPr>
+        <w:t>Miro laughed, but there was no humor in it. "The Thirty-First Strategic Fleet doesn't exist. Officially. It's a ghost division — Union black-budget, no congressional oversight, no public mandate. They handle..." He trailed off, then chose his words carefully. "Planetary asset denial. When the Union decides a world's resources are more valuable than its inhabitants, the Thirty-First makes the inhabitants go away. Quietly."</w:t>
+      </w:r>
+    </w:p>
+    <w:p>
+      <w:pPr>
+        <w:spacing w:before="40" w:after="40"/>
+        <w:ind w:firstLine="432"/>
+      </w:pPr>
+      <w:r>
+        <w:rPr>
+          <w:b w:val="0"/>
+          <w:i w:val="0"/>
+        </w:rPr>
+        <w:t xml:space="preserve">The word </w:t>
       </w:r>
       <w:r>
         <w:rPr>
           <w:b w:val="0"/>
           <w:i/>
         </w:rPr>
-        <w:t>mine.</w:t>
-      </w:r>
-    </w:p>
-    <w:p>
-      <w:pPr>
-        <w:spacing w:before="40" w:after="40"/>
-        <w:ind w:firstLine="432"/>
-      </w:pPr>
-      <w:r>
-        <w:rPr>
-          <w:b w:val="0"/>
-          <w:i w:val="0"/>
-        </w:rPr>
-        <w:t>He flew the ship along the cage's edge. The lattice scrolled past the viewport, node after node, each one a small sun of gravitic force. Miro worked in silence — real silence, no jokes, no patter — his focus absolute, cross-referencing signal patterns and muttering numbers under his breath.</w:t>
-      </w:r>
-    </w:p>
-    <w:p>
-      <w:pPr>
-        <w:spacing w:before="40" w:after="40"/>
-        <w:ind w:firstLine="432"/>
-      </w:pPr>
-      <w:r>
-        <w:rPr>
-          <w:b w:val="0"/>
-          <w:i w:val="0"/>
-        </w:rPr>
-        <w:t>Twenty minutes in, he stopped.</w:t>
-      </w:r>
-    </w:p>
-    <w:p>
-      <w:pPr>
-        <w:spacing w:before="40" w:after="40"/>
-        <w:ind w:firstLine="432"/>
-      </w:pPr>
-      <w:r>
-        <w:rPr>
-          <w:b w:val="0"/>
-          <w:i w:val="0"/>
-        </w:rPr>
-        <w:t>"There." He pointed to a section of the netting where the nodes were spaced more densely, their connecting lines converging like roads into a city center. "The signal architecture funnels here. Every node in the grid references this cluster for timing synchronization. Kill this, and the whole net destabilizes."</w:t>
-      </w:r>
-    </w:p>
-    <w:p>
-      <w:pPr>
-        <w:spacing w:before="40" w:after="40"/>
-        <w:ind w:firstLine="432"/>
-      </w:pPr>
-      <w:r>
-        <w:rPr>
-          <w:b w:val="0"/>
-          <w:i w:val="0"/>
-        </w:rPr>
-        <w:t>"Can we reach it?"</w:t>
-      </w:r>
-    </w:p>
-    <w:p>
-      <w:pPr>
-        <w:spacing w:before="40" w:after="40"/>
-        <w:ind w:firstLine="432"/>
-      </w:pPr>
-      <w:r>
-        <w:rPr>
-          <w:b w:val="0"/>
-          <w:i w:val="0"/>
-        </w:rPr>
-        <w:t>"It's inside the cage. About five hundred meters past the barrier." He pulled up more data and froze. "Kael."</w:t>
-      </w:r>
-    </w:p>
-    <w:p>
-      <w:pPr>
-        <w:spacing w:before="40" w:after="40"/>
-        <w:ind w:firstLine="432"/>
-      </w:pPr>
-      <w:r>
-        <w:rPr>
-          <w:b w:val="0"/>
-          <w:i w:val="0"/>
-        </w:rPr>
-        <w:t>"What?"</w:t>
-      </w:r>
-    </w:p>
-    <w:p>
-      <w:pPr>
-        <w:spacing w:before="40" w:after="40"/>
-        <w:ind w:firstLine="432"/>
-      </w:pPr>
-      <w:r>
-        <w:rPr>
-          <w:b w:val="0"/>
-          <w:i w:val="0"/>
-        </w:rPr>
-        <w:t>"The control nexus. I'm reading a manufacturer's stamp on the micro-fusion cells. Union military procurement. And there's a designation code." He read it off the screen, his voice flat. "UMSF-Vanguard. Batch number matches a requisition order from the Thirty-First Strategic Fleet."</w:t>
-      </w:r>
-    </w:p>
-    <w:p>
-      <w:pPr>
-        <w:spacing w:before="40" w:after="40"/>
-        <w:ind w:firstLine="432"/>
-      </w:pPr>
-      <w:r>
-        <w:rPr>
-          <w:b w:val="0"/>
-          <w:i w:val="0"/>
-        </w:rPr>
-        <w:t>"You know it?"</w:t>
-      </w:r>
-    </w:p>
-    <w:p>
-      <w:pPr>
-        <w:spacing w:before="40" w:after="40"/>
-        <w:ind w:firstLine="432"/>
-      </w:pPr>
-      <w:r>
-        <w:rPr>
-          <w:b w:val="0"/>
-          <w:i w:val="0"/>
-        </w:rPr>
-        <w:t>Miro laughed, but there was no humor in it. "The Thirty-First Strategic Fleet doesn't exist. Officially. It's a ghost division — Union black-budget, no congressional oversight, no public mandate. They handle..." He trailed off, then chose his words carefully. "Planetary asset denial. When the Union decides a world's resources are more valuable than its inhabitants, the Thirty-First makes the inhabitants go away. Quietly."</w:t>
-      </w:r>
-    </w:p>
-    <w:p>
-      <w:pPr>
-        <w:spacing w:before="40" w:after="40"/>
-        <w:ind w:firstLine="432"/>
-      </w:pPr>
-      <w:r>
-        <w:rPr>
-          <w:b w:val="0"/>
-          <w:i w:val="0"/>
-        </w:rPr>
-        <w:t xml:space="preserve">The word </w:t>
+        <w:t>defunded</w:t>
+      </w:r>
+      <w:r>
+        <w:rPr>
+          <w:b w:val="0"/>
+          <w:i w:val="0"/>
+        </w:rPr>
+        <w:t xml:space="preserve"> echoed in Kael's memory. Miro's research. Species that met the threshold for protected status, swimming over mineral deposits the Union had already sold.</w:t>
+      </w:r>
+    </w:p>
+    <w:p>
+      <w:pPr>
+        <w:spacing w:before="40" w:after="40"/>
+        <w:ind w:firstLine="432"/>
+      </w:pPr>
+      <w:r>
+        <w:rPr>
+          <w:b w:val="0"/>
+          <w:i w:val="0"/>
+        </w:rPr>
+        <w:t>"This wasn't an accident," Kael said. "Someone in the Union command structure knows what the Choir guards. They built this cage knowing exactly what would happen when the Choir died."</w:t>
+      </w:r>
+    </w:p>
+    <w:p>
+      <w:pPr>
+        <w:spacing w:before="40" w:after="40"/>
+        <w:ind w:firstLine="432"/>
+      </w:pPr>
+      <w:r>
+        <w:rPr>
+          <w:b w:val="0"/>
+          <w:i w:val="0"/>
+        </w:rPr>
+        <w:t>"They want the rift open."</w:t>
+      </w:r>
+    </w:p>
+    <w:p>
+      <w:pPr>
+        <w:spacing w:before="40" w:after="40"/>
+        <w:ind w:firstLine="432"/>
+      </w:pPr>
+      <w:r>
+        <w:rPr>
+          <w:b w:val="0"/>
+          <w:i w:val="0"/>
+        </w:rPr>
+        <w:t>"Or they want what comes out of it. An anti-frequency weapon that severs communication across an entire sector — that's not a natural disaster. That's a military asset."</w:t>
+      </w:r>
+    </w:p>
+    <w:p>
+      <w:pPr>
+        <w:spacing w:before="40" w:after="40"/>
+        <w:ind w:firstLine="432"/>
+      </w:pPr>
+      <w:r>
+        <w:rPr>
+          <w:b w:val="0"/>
+          <w:i w:val="0"/>
+        </w:rPr>
+        <w:t>Miro stared at the designation code on his screen. "I spent eleven years filing reports. I thought I was fighting bureaucratic indifference. Bad priorities. Budget —" He shook his head. "It wasn't indifference. They knew. They've known all along."</w:t>
+      </w:r>
+    </w:p>
+    <w:p>
+      <w:pPr>
+        <w:spacing w:before="40" w:after="40"/>
+        <w:ind w:firstLine="432"/>
+      </w:pPr>
+      <w:r>
+        <w:rPr>
+          <w:b w:val="0"/>
+          <w:i w:val="0"/>
+        </w:rPr>
+        <w:t>The ship drifted beside the cage. Beyond the lattice, the Choir moved — shapes trailing curtains of light, their song pressing against the hull, against Kael's mind. Even filtered through the ship's insulation, he could feel their exhaustion. Their frequency was thinner than it should have been. Fraying. They were holding the seal with everything they had left, and everything they had left was not enough for sixty-eight more hours.</w:t>
+      </w:r>
+    </w:p>
+    <w:p>
+      <w:pPr>
+        <w:spacing w:before="40" w:after="40"/>
+        <w:ind w:firstLine="432"/>
+      </w:pPr>
+      <w:r>
+        <w:rPr>
+          <w:b w:val="0"/>
+          <w:i w:val="0"/>
+        </w:rPr>
+        <w:t>"We need to get inside the cage," Kael said. "Destroy the nexus."</w:t>
+      </w:r>
+    </w:p>
+    <w:p>
+      <w:pPr>
+        <w:spacing w:before="40" w:after="40"/>
+        <w:ind w:firstLine="432"/>
+      </w:pPr>
+      <w:r>
+        <w:rPr>
+          <w:b w:val="0"/>
+          <w:i w:val="0"/>
+        </w:rPr>
+        <w:t>"The barrier will crush anything biological that tries to pass through."</w:t>
+      </w:r>
+    </w:p>
+    <w:p>
+      <w:pPr>
+        <w:spacing w:before="40" w:after="40"/>
+        <w:ind w:firstLine="432"/>
+      </w:pPr>
+      <w:r>
+        <w:rPr>
+          <w:b w:val="0"/>
+          <w:i w:val="0"/>
+        </w:rPr>
+        <w:t>"Then we don't go through. We go under." He pulled up the cage schematics Miro had mapped. "The netting has to anchor somewhere. What's the lowest point?"</w:t>
+      </w:r>
+    </w:p>
+    <w:p>
+      <w:pPr>
+        <w:spacing w:before="40" w:after="40"/>
+        <w:ind w:firstLine="432"/>
+      </w:pPr>
+      <w:r>
+        <w:rPr>
+          <w:b w:val="0"/>
+          <w:i w:val="0"/>
+        </w:rPr>
+        <w:t>Miro scanned. "Bottom edge terminates at eleven thousand meters. Below that, it's open ocean — just the rift. But Kael, the pressure at eleven thousand meters —"</w:t>
+      </w:r>
+    </w:p>
+    <w:p>
+      <w:pPr>
+        <w:spacing w:before="40" w:after="40"/>
+        <w:ind w:firstLine="432"/>
+      </w:pPr>
+      <w:r>
+        <w:rPr>
+          <w:b w:val="0"/>
+          <w:i w:val="0"/>
+        </w:rPr>
+        <w:t xml:space="preserve">"The </w:t>
       </w:r>
       <w:r>
         <w:rPr>
           <w:b w:val="0"/>
           <w:i/>
         </w:rPr>
-        <w:t>defunded</w:t>
-      </w:r>
-      <w:r>
-        <w:rPr>
-          <w:b w:val="0"/>
-          <w:i w:val="0"/>
-        </w:rPr>
-        <w:t xml:space="preserve"> echoed in Kael's memory. Miro's research. Species that met the threshold for protected status, swimming over mineral deposits the Union had already sold.</w:t>
-      </w:r>
-    </w:p>
-    <w:p>
-      <w:pPr>
-        <w:spacing w:before="40" w:after="40"/>
-        <w:ind w:firstLine="432"/>
-      </w:pPr>
-      <w:r>
-        <w:rPr>
-          <w:b w:val="0"/>
-          <w:i w:val="0"/>
-        </w:rPr>
-        <w:t>"This wasn't an accident," Kael said. "Someone in the Union command structure knows what the Choir guards. They built this cage knowing exactly what would happen when the Choir died."</w:t>
-      </w:r>
-    </w:p>
-    <w:p>
-      <w:pPr>
-        <w:spacing w:before="40" w:after="40"/>
-        <w:ind w:firstLine="432"/>
-      </w:pPr>
-      <w:r>
-        <w:rPr>
-          <w:b w:val="0"/>
-          <w:i w:val="0"/>
-        </w:rPr>
-        <w:t>"They want the rift open."</w:t>
-      </w:r>
-    </w:p>
-    <w:p>
-      <w:pPr>
-        <w:spacing w:before="40" w:after="40"/>
-        <w:ind w:firstLine="432"/>
-      </w:pPr>
-      <w:r>
-        <w:rPr>
-          <w:b w:val="0"/>
-          <w:i w:val="0"/>
-        </w:rPr>
-        <w:t>"Or they want what comes out of it. An anti-frequency weapon that severs communication across an entire sector — that's not a natural disaster. That's a military asset."</w:t>
-      </w:r>
-    </w:p>
-    <w:p>
-      <w:pPr>
-        <w:spacing w:before="40" w:after="40"/>
-        <w:ind w:firstLine="432"/>
-      </w:pPr>
-      <w:r>
-        <w:rPr>
-          <w:b w:val="0"/>
-          <w:i w:val="0"/>
-        </w:rPr>
-        <w:t>Miro stared at the designation code on his screen. "I spent eleven years filing reports. I thought I was fighting bureaucratic indifference. Bad priorities. Budget politics." He shook his head slowly. "It wasn't indifference. They knew. They've known all along."</w:t>
-      </w:r>
-    </w:p>
-    <w:p>
-      <w:pPr>
-        <w:spacing w:before="40" w:after="40"/>
-        <w:ind w:firstLine="432"/>
-      </w:pPr>
-      <w:r>
-        <w:rPr>
-          <w:b w:val="0"/>
-          <w:i w:val="0"/>
-        </w:rPr>
-        <w:t>The ship drifted beside the cage. Beyond the lattice, the Choir moved — vast shapes trailing curtains of blue light, their song pressing against the hull, against Kael's mind, against everything. Even dampened, even filtered through the ship's insulation, he could feel their exhaustion. Their frequency was thinner than it should have been. Fraying at the edges. They were holding the seal with everything they had left, and everything they had left was not enough for sixty-eight more hours.</w:t>
-      </w:r>
-    </w:p>
-    <w:p>
-      <w:pPr>
-        <w:spacing w:before="40" w:after="40"/>
-        <w:ind w:firstLine="432"/>
-      </w:pPr>
-      <w:r>
-        <w:rPr>
-          <w:b w:val="0"/>
-          <w:i w:val="0"/>
-        </w:rPr>
-        <w:t>"We need to get inside the cage," Kael said. "Destroy the nexus."</w:t>
-      </w:r>
-    </w:p>
-    <w:p>
-      <w:pPr>
-        <w:spacing w:before="40" w:after="40"/>
-        <w:ind w:firstLine="432"/>
-      </w:pPr>
-      <w:r>
-        <w:rPr>
-          <w:b w:val="0"/>
-          <w:i w:val="0"/>
-        </w:rPr>
-        <w:t>"The barrier will crush anything biological that tries to pass through."</w:t>
-      </w:r>
-    </w:p>
-    <w:p>
-      <w:pPr>
-        <w:spacing w:before="40" w:after="40"/>
-        <w:ind w:firstLine="432"/>
-      </w:pPr>
-      <w:r>
-        <w:rPr>
-          <w:b w:val="0"/>
-          <w:i w:val="0"/>
-        </w:rPr>
-        <w:t>"Then we don't go through. We go under." He pulled up the cage schematics Miro had mapped. "The netting has to anchor somewhere. What's the lowest point?"</w:t>
-      </w:r>
-    </w:p>
-    <w:p>
-      <w:pPr>
-        <w:spacing w:before="40" w:after="40"/>
-        <w:ind w:firstLine="432"/>
-      </w:pPr>
-      <w:r>
-        <w:rPr>
-          <w:b w:val="0"/>
-          <w:i w:val="0"/>
-        </w:rPr>
-        <w:t>Miro scanned. "Bottom edge terminates at eleven thousand meters. Below that, it's open ocean — just the rift. But Kael, the pressure at eleven thousand meters —"</w:t>
-      </w:r>
-    </w:p>
-    <w:p>
-      <w:pPr>
-        <w:spacing w:before="40" w:after="40"/>
-        <w:ind w:firstLine="432"/>
-      </w:pPr>
-      <w:r>
-        <w:rPr>
-          <w:b w:val="0"/>
-          <w:i w:val="0"/>
-        </w:rPr>
-        <w:t xml:space="preserve">"The </w:t>
-      </w:r>
+        <w:t>Fang &amp; Fable</w:t>
+      </w:r>
+      <w:r>
+        <w:rPr>
+          <w:b w:val="0"/>
+          <w:i w:val="0"/>
+        </w:rPr>
+        <w:t xml:space="preserve"> is rated to twelve."</w:t>
+      </w:r>
+    </w:p>
+    <w:p>
+      <w:pPr>
+        <w:spacing w:before="40" w:after="40"/>
+        <w:ind w:firstLine="432"/>
+      </w:pPr>
+      <w:r>
+        <w:rPr>
+          <w:b w:val="0"/>
+          <w:i w:val="0"/>
+        </w:rPr>
+        <w:t>"Rated by whom?"</w:t>
+      </w:r>
+    </w:p>
+    <w:p>
+      <w:pPr>
+        <w:spacing w:before="40" w:after="40"/>
+        <w:ind w:firstLine="432"/>
+      </w:pPr>
+      <w:r>
+        <w:rPr>
+          <w:b w:val="0"/>
+          <w:i w:val="0"/>
+        </w:rPr>
+        <w:t>"Me. I reinforced the hull myself."</w:t>
+      </w:r>
+    </w:p>
+    <w:p>
+      <w:pPr>
+        <w:spacing w:before="40" w:after="40"/>
+        <w:ind w:firstLine="432"/>
+      </w:pPr>
+      <w:r>
+        <w:rPr>
+          <w:b w:val="0"/>
+          <w:i w:val="0"/>
+        </w:rPr>
+        <w:t>"With what?"</w:t>
+      </w:r>
+    </w:p>
+    <w:p>
+      <w:pPr>
+        <w:spacing w:before="40" w:after="40"/>
+        <w:ind w:firstLine="432"/>
+      </w:pPr>
+      <w:r>
+        <w:rPr>
+          <w:b w:val="0"/>
+          <w:i w:val="0"/>
+        </w:rPr>
+        <w:t>"Illegal solder and sheer stubbornness."</w:t>
+      </w:r>
+    </w:p>
+    <w:p>
+      <w:pPr>
+        <w:spacing w:before="40" w:after="40"/>
+        <w:ind w:firstLine="432"/>
+      </w:pPr>
+      <w:r>
+        <w:rPr>
+          <w:b w:val="0"/>
+          <w:i w:val="0"/>
+        </w:rPr>
+        <w:t>Miro stared at him. Then, slowly, the grin came back — battered, tired, but real. "You know what? I believe you. I absolutely believe this ship runs on spite."</w:t>
+      </w:r>
+    </w:p>
+    <w:p>
+      <w:pPr>
+        <w:spacing w:before="40" w:after="40"/>
+        <w:ind w:firstLine="432"/>
+      </w:pPr>
+      <w:r>
+        <w:rPr>
+          <w:b w:val="0"/>
+          <w:i w:val="0"/>
+        </w:rPr>
+        <w:t>"It runs on a Kellerman-IV drive core. But spite helps."</w:t>
+      </w:r>
+    </w:p>
+    <w:p>
+      <w:pPr>
+        <w:spacing w:before="40" w:after="40"/>
+        <w:ind w:firstLine="432"/>
+      </w:pPr>
+      <w:r>
+        <w:rPr>
+          <w:b w:val="0"/>
+          <w:i w:val="0"/>
+        </w:rPr>
+        <w:t>Miro opened his mouth, closed it, then tried anyway: "Spite — the renewable energy source they don't want you to know about."</w:t>
+      </w:r>
+    </w:p>
+    <w:p>
+      <w:pPr>
+        <w:spacing w:before="40" w:after="40"/>
+        <w:ind w:firstLine="432"/>
+      </w:pPr>
+      <w:r>
+        <w:rPr>
+          <w:b w:val="0"/>
+          <w:i w:val="0"/>
+        </w:rPr>
+        <w:t>Nothing. Kael was checking the depth gauge. Talon was preening a wing feather. The line hung in the recycled air for a beat too long, and Miro's eyes registered it — a flicker, barely visible, the micro-awareness of a rhythm missed — before he moved on as if it hadn't happened.</w:t>
+      </w:r>
+    </w:p>
+    <w:p>
+      <w:pPr>
+        <w:spacing w:before="40" w:after="40"/>
+        <w:ind w:firstLine="432"/>
+      </w:pPr>
+      <w:r>
+        <w:rPr>
+          <w:b w:val="0"/>
+          <w:i w:val="0"/>
+        </w:rPr>
+        <w:t>"Sixty-eight hours," Miro said.</w:t>
+      </w:r>
+    </w:p>
+    <w:p>
+      <w:pPr>
+        <w:spacing w:before="40" w:after="40"/>
+        <w:ind w:firstLine="432"/>
+      </w:pPr>
+      <w:r>
+        <w:rPr>
+          <w:b w:val="0"/>
+          <w:i w:val="0"/>
+        </w:rPr>
+        <w:t>"Sixty-seven and change."</w:t>
+      </w:r>
+    </w:p>
+    <w:p>
+      <w:pPr>
+        <w:spacing w:before="40" w:after="40"/>
+        <w:ind w:firstLine="432"/>
+      </w:pPr>
+      <w:r>
+        <w:rPr>
+          <w:b w:val="0"/>
+          <w:i w:val="0"/>
+        </w:rPr>
+        <w:t>"Then let's stop sitting here looking at it." He strapped in. "Take us down, Orin. Under the cage. And if your illegal solder holds, I'll buy you a drink on whatever station we find next."</w:t>
+      </w:r>
+    </w:p>
+    <w:p>
+      <w:pPr>
+        <w:spacing w:before="40" w:after="40"/>
+        <w:ind w:firstLine="432"/>
+      </w:pPr>
+      <w:r>
+        <w:rPr>
+          <w:b w:val="0"/>
+          <w:i w:val="0"/>
+        </w:rPr>
+        <w:t>"And if it doesn't hold?"</w:t>
+      </w:r>
+    </w:p>
+    <w:p>
+      <w:pPr>
+        <w:spacing w:before="40" w:after="40"/>
+        <w:ind w:firstLine="432"/>
+      </w:pPr>
+      <w:r>
+        <w:rPr>
+          <w:b w:val="0"/>
+          <w:i w:val="0"/>
+        </w:rPr>
+        <w:t>"Then we'll be too flat to care."</w:t>
+      </w:r>
+    </w:p>
+    <w:p>
+      <w:pPr>
+        <w:spacing w:before="40" w:after="40"/>
+        <w:ind w:firstLine="432"/>
+      </w:pPr>
+      <w:r>
+        <w:rPr>
+          <w:b w:val="0"/>
+          <w:i w:val="0"/>
+        </w:rPr>
+        <w:t>Kael took the ship down.</w:t>
+      </w:r>
+    </w:p>
+    <w:p>
+      <w:pPr>
+        <w:spacing w:before="40" w:after="40"/>
+        <w:ind w:firstLine="432"/>
+      </w:pPr>
+      <w:r>
+        <w:rPr>
+          <w:b w:val="0"/>
+          <w:i w:val="0"/>
+        </w:rPr>
+        <w:t>Behind them, the Choir's song shifted — a new chord, but even Kael's battered frequency-sense could read its root note clearly:</w:t>
+      </w:r>
+    </w:p>
+    <w:p>
+      <w:pPr>
+        <w:spacing w:before="40" w:after="40"/>
+        <w:ind w:firstLine="432"/>
+      </w:pPr>
       <w:r>
         <w:rPr>
           <w:b w:val="0"/>
           <w:i/>
         </w:rPr>
-        <w:t>Fang &amp; Fable</w:t>
-      </w:r>
-      <w:r>
-        <w:rPr>
-          <w:b w:val="0"/>
-          <w:i w:val="0"/>
-        </w:rPr>
-        <w:t xml:space="preserve"> is rated to twelve."</w:t>
-      </w:r>
-    </w:p>
-    <w:p>
-      <w:pPr>
-        <w:spacing w:before="40" w:after="40"/>
-        <w:ind w:firstLine="432"/>
-      </w:pPr>
-      <w:r>
-        <w:rPr>
-          <w:b w:val="0"/>
-          <w:i w:val="0"/>
-        </w:rPr>
-        <w:t>"Rated by whom?"</w:t>
-      </w:r>
-    </w:p>
-    <w:p>
-      <w:pPr>
-        <w:spacing w:before="40" w:after="40"/>
-        <w:ind w:firstLine="432"/>
-      </w:pPr>
-      <w:r>
-        <w:rPr>
-          <w:b w:val="0"/>
-          <w:i w:val="0"/>
-        </w:rPr>
-        <w:t>"Me. I reinforced the hull myself."</w:t>
-      </w:r>
-    </w:p>
-    <w:p>
-      <w:pPr>
-        <w:spacing w:before="40" w:after="40"/>
-        <w:ind w:firstLine="432"/>
-      </w:pPr>
-      <w:r>
-        <w:rPr>
-          <w:b w:val="0"/>
-          <w:i w:val="0"/>
-        </w:rPr>
-        <w:t>"With what?"</w:t>
-      </w:r>
-    </w:p>
-    <w:p>
-      <w:pPr>
-        <w:spacing w:before="40" w:after="40"/>
-        <w:ind w:firstLine="432"/>
-      </w:pPr>
-      <w:r>
-        <w:rPr>
-          <w:b w:val="0"/>
-          <w:i w:val="0"/>
-        </w:rPr>
-        <w:t>"Illegal solder and sheer stubbornness."</w:t>
-      </w:r>
-    </w:p>
-    <w:p>
-      <w:pPr>
-        <w:spacing w:before="40" w:after="40"/>
-        <w:ind w:firstLine="432"/>
-      </w:pPr>
-      <w:r>
-        <w:rPr>
-          <w:b w:val="0"/>
-          <w:i w:val="0"/>
-        </w:rPr>
-        <w:t>Miro stared at him. Then, slowly, the grin came back — battered, tired, but real. "You know what? I believe you. I absolutely believe this ship runs on spite."</w:t>
-      </w:r>
-    </w:p>
-    <w:p>
-      <w:pPr>
-        <w:spacing w:before="40" w:after="40"/>
-        <w:ind w:firstLine="432"/>
-      </w:pPr>
-      <w:r>
-        <w:rPr>
-          <w:b w:val="0"/>
-          <w:i w:val="0"/>
-        </w:rPr>
-        <w:t>"It runs on a Kellerman-IV drive core. But spite helps."</w:t>
-      </w:r>
-    </w:p>
-    <w:p>
-      <w:pPr>
-        <w:spacing w:before="40" w:after="40"/>
-        <w:ind w:firstLine="432"/>
-      </w:pPr>
-      <w:r>
-        <w:rPr>
-          <w:b w:val="0"/>
-          <w:i w:val="0"/>
-        </w:rPr>
-        <w:t>Miro opened his mouth, closed it, then tried anyway: "Spite — the renewable energy source they don't want you to know about." [NEW]</w:t>
-      </w:r>
-    </w:p>
-    <w:p>
-      <w:pPr>
-        <w:spacing w:before="40" w:after="40"/>
-        <w:ind w:firstLine="432"/>
-      </w:pPr>
-      <w:r>
-        <w:rPr>
-          <w:b w:val="0"/>
-          <w:i w:val="0"/>
-        </w:rPr>
-        <w:t>Nothing. Kael was checking the depth gauge. Talon was preening a wing feather. The line hung in the recycled air for a beat too long, and Miro's eyes registered it — a flicker, barely visible, the micro-awareness of a rhythm missed — before he moved on as if it hadn't happened. [NEW]</w:t>
-      </w:r>
-    </w:p>
-    <w:p>
-      <w:pPr>
-        <w:spacing w:before="40" w:after="40"/>
-        <w:ind w:firstLine="432"/>
-      </w:pPr>
-      <w:r>
-        <w:rPr>
-          <w:b w:val="0"/>
-          <w:i w:val="0"/>
-        </w:rPr>
-        <w:t>"Sixty-eight hours," Miro said.</w:t>
-      </w:r>
-    </w:p>
-    <w:p>
-      <w:pPr>
-        <w:spacing w:before="40" w:after="40"/>
-        <w:ind w:firstLine="432"/>
-      </w:pPr>
-      <w:r>
-        <w:rPr>
-          <w:b w:val="0"/>
-          <w:i w:val="0"/>
-        </w:rPr>
-        <w:t>"Sixty-seven and change."</w:t>
-      </w:r>
-    </w:p>
-    <w:p>
-      <w:pPr>
-        <w:spacing w:before="40" w:after="40"/>
-        <w:ind w:firstLine="432"/>
-      </w:pPr>
-      <w:r>
-        <w:rPr>
-          <w:b w:val="0"/>
-          <w:i w:val="0"/>
-        </w:rPr>
-        <w:t>"Then let's stop sitting here looking at it." He strapped in. "Take us down, Orin. Under the cage. And if your illegal solder holds, I'll buy you a drink on whatever station we find next."</w:t>
-      </w:r>
-    </w:p>
-    <w:p>
-      <w:pPr>
-        <w:spacing w:before="40" w:after="40"/>
-        <w:ind w:firstLine="432"/>
-      </w:pPr>
-      <w:r>
-        <w:rPr>
-          <w:b w:val="0"/>
-          <w:i w:val="0"/>
-        </w:rPr>
-        <w:t>"And if it doesn't hold?"</w:t>
-      </w:r>
-    </w:p>
-    <w:p>
-      <w:pPr>
-        <w:spacing w:before="40" w:after="40"/>
-        <w:ind w:firstLine="432"/>
-      </w:pPr>
-      <w:r>
-        <w:rPr>
-          <w:b w:val="0"/>
-          <w:i w:val="0"/>
-        </w:rPr>
-        <w:t>"Then we'll be too flat to care."</w:t>
-      </w:r>
-    </w:p>
-    <w:p>
-      <w:pPr>
-        <w:spacing w:before="40" w:after="40"/>
-        <w:ind w:firstLine="432"/>
-      </w:pPr>
-      <w:r>
-        <w:rPr>
-          <w:b w:val="0"/>
-          <w:i w:val="0"/>
-        </w:rPr>
-        <w:t>Kael took the ship down.</w:t>
-      </w:r>
-    </w:p>
-    <w:p>
-      <w:pPr>
-        <w:spacing w:before="40" w:after="40"/>
-        <w:ind w:firstLine="432"/>
-      </w:pPr>
-      <w:r>
-        <w:rPr>
-          <w:b w:val="0"/>
-          <w:i w:val="0"/>
-        </w:rPr>
-        <w:t>Behind them, the Choir's song shifted — a new chord, layered and complex, but even Kael's battered frequency-sense could read its root note clearly:</w:t>
-      </w:r>
-    </w:p>
-    <w:p>
-      <w:pPr>
-        <w:spacing w:before="40" w:after="40"/>
-        <w:ind w:firstLine="432"/>
-      </w:pPr>
-      <w:r>
-        <w:rPr>
-          <w:b w:val="0"/>
-          <w:i/>
-        </w:rPr>
         <w:t>Hurry.</w:t>
       </w:r>
     </w:p>
@@ -4064,7 +3972,7 @@
           <w:b w:val="0"/>
           <w:i w:val="0"/>
         </w:rPr>
-        <w:t>Below them, the ocean went on forever. The cage glowed above like a false sky, and somewhere in the lightless deep, the rift waited — sealed by song, threatened by silence, and counting down to a zero that would deafen the stars.</w:t>
+        <w:t>Below them, the ocean went on forever. The cage glowed above like a false sky.</w:t>
       </w:r>
     </w:p>
     <w:p>
@@ -4566,7 +4474,7 @@
           <w:b w:val="0"/>
           <w:i w:val="0"/>
         </w:rPr>
-        <w:t>, Kael thought, and immediately buried it. [NEW]</w:t>
+        <w:t>, Kael thought, and immediately buried it.</w:t>
       </w:r>
     </w:p>
     <w:p>
@@ -5053,7 +4961,7 @@
           <w:b w:val="0"/>
           <w:i w:val="0"/>
         </w:rPr>
-        <w:t>"It changes the scope. Not the obligation." She straightened. "The Covenant doesn't answer to the Union. It doesn't answer to any single government. The Accord of Settled Worlds was ratified by four hundred and twelve civilizations specifically because no one nation could be trusted to police itself. If the Union has caged a sentient population, the Union will answer for it. But first — the population survives. That's Article One. Before justice, survival."</w:t>
+        <w:t>"It changes the scope. Not the obligation." She straightened. "The Covenant doesn't answer to the Union. Never has." A pause — not for effect, but the practiced pause of someone choosing language that would hold up under cross-examination. "The Accord was ratified by four hundred and twelve civilizations for one reason: no single nation can be trusted to police itself. If the Union caged a sentient population — and the evidence strongly suggests they did — the Union answers for it. But first, the population survives. Article One. Before justice, survival."</w:t>
       </w:r>
     </w:p>
     <w:p>
@@ -5171,7 +5079,7 @@
           <w:b w:val="0"/>
           <w:i w:val="0"/>
         </w:rPr>
-        <w:t>Sera's jaw tightened. Kael watched her weigh it — the law against the living, the procedure against the ticking clock. He'd seen that look before, on the faces of people who believed in systems. The good ones always struggled the hardest when the system and the right thing pulled in different directions.</w:t>
+        <w:t>Sera's jaw tightened. Kael watched her weigh it — the law against the living, the procedure against the ticking clock. Two kinds of pressure, and she was the thing being crushed between them. [MOTIF] He'd seen that look before, on the faces of people who believed in systems.</w:t>
       </w:r>
     </w:p>
     <w:p>
@@ -5315,7 +5223,7 @@
           <w:b w:val="0"/>
           <w:i w:val="0"/>
         </w:rPr>
-        <w:t>"I'll accompany you," she said. "My ship has the legal transponder codes to log the operation as an official Covenant action. Everything that happens inside that cage will be on record."</w:t>
+        <w:t>"I'll accompany you," she said. "My ship has the legal transponder codes to log this as an official Covenant action. Everything inside that cage becomes admissible evidence the moment I'm present." She glanced at the data core. "Chain of custody starts now."</w:t>
       </w:r>
     </w:p>
     <w:p>
@@ -5891,7 +5799,7 @@
           <w:b w:val="0"/>
           <w:i w:val="0"/>
         </w:rPr>
-        <w:t>They rose around the ship like living mountains — vast translucent shapes drifting in the enclosed water, their bioluminescent filaments painting the darkness in slow, sweeping waves of blue and white. This close, inside their space, the frequency was overwhelming even through the hull. Kael felt it in his bones, in the fluid of his eyes, in the rhythm of his heartbeat syncing involuntarily to the Choir's pulse.</w:t>
+        <w:t>They rose around the ship like living mountains — translucent, shifting, their filaments painting the darkness in waves of blue and white. This close, inside their space, the frequency was overwhelming. Kael felt it in his bones, in his heartbeat syncing involuntarily to the Choir's pulse.</w:t>
       </w:r>
     </w:p>
     <w:p>
@@ -6140,7 +6048,7 @@
           <w:b w:val="0"/>
           <w:i w:val="0"/>
         </w:rPr>
-        <w:t>The response came in a chord. Gentler than before — they were still dampening themselves for him, holding their vast collective voice to a whisper.</w:t>
+        <w:t>The response came in a chord. Gentler than before — they were still dampening themselves for him, holding their collective voice to a whisper.</w:t>
       </w:r>
     </w:p>
     <w:p>
@@ -6166,7 +6074,7 @@
           <w:b w:val="0"/>
           <w:i w:val="0"/>
         </w:rPr>
-        <w:t>And they were. Forty-seven beings, each kilometers long, holding perfectly motionless in the dark water as one small human drifted among them. Kael felt the effort it cost them — every instinct screaming to move, to flee, to thrash against the cage that had starved them for two years. They held still because he asked. Because trust, however new, was all they had left.</w:t>
+        <w:t>And they were. Forty-seven beings, each kilometers long, holding perfectly motionless in the dark water as one small human drifted among them. Kael felt the effort it cost them — every instinct screaming to move, to flee, to thrash against the cage that had starved them for two years. They held still because they had no choice, Kael told himself. Because when you're starving and caged, you'll trust anyone who says they're here to help. [MISJUDGMENT]</w:t>
       </w:r>
     </w:p>
     <w:p>
@@ -6205,7 +6113,7 @@
           <w:b w:val="0"/>
           <w:i w:val="0"/>
         </w:rPr>
-        <w:t>"He's not mine. We're partners." A pause. "But yes. He is."</w:t>
+        <w:t>"He's not mine. We're partners. The Covenant classifies it as a bilateral neural bond, if you want the filing term." A pause. "But yes. He is."</w:t>
       </w:r>
     </w:p>
     <w:p>
@@ -6257,7 +6165,7 @@
           <w:b w:val="0"/>
           <w:i w:val="0"/>
         </w:rPr>
-        <w:t>"The Academy said a lot of things." He heard something in her voice — not defensiveness, exactly. Something closer to the weariness of having been underestimated for a long time by people who should have known better. "Wick chose me. That's how corvaxis bonding works. You don't select them. They select you. And once they do, it's permanent. Not just emotional — neurological. His frequency architecture maps onto mine. I can feel what he feels. Not the way you do — I'm not a Zoolinguist. But I know when he's alert, when he's calm, when something's wrong."</w:t>
+        <w:t>"The Academy said a lot of things." Something in her voice — not defensiveness. The weariness of having been underestimated by people who should have known better. "Wick chose me. That's how corvaxis bonding works — you don't select them, they select you. Once they do, it's permanent." She adjusted Wick's position on her shoulder — an unconscious gesture, practiced. "Not just emotional. Neurological. His frequency architecture maps onto mine. I'm not a Zoolinguist, but I know when he's alert, when he's calm, when something's wrong."</w:t>
       </w:r>
     </w:p>
     <w:p>
@@ -6564,20 +6472,34 @@
           <w:b w:val="0"/>
           <w:i w:val="0"/>
         </w:rPr>
-        <w:t>'s hull screamed and the depth counter jumped two hundred meters in a heartbeat as the ship was physically compressed downward. Kael was slammed into the pilot's seat. Talon shrieked. Wick went silent — a corvaxis response to extreme stress, all energy redirected to processing.</w:t>
-      </w:r>
-    </w:p>
-    <w:p>
-      <w:pPr>
-        <w:spacing w:before="40" w:after="40"/>
-        <w:ind w:firstLine="432"/>
-      </w:pPr>
-      <w:r>
-        <w:rPr>
-          <w:b w:val="0"/>
-          <w:i w:val="0"/>
-        </w:rPr>
-        <w:t>Sera's counter-field hit Miro's position like a fist of inverted gravity, wrapping him in a bubble of normal space while the world outside tried to crush itself flat. Four seconds. The longest four seconds of Kael's life.</w:t>
+        <w:t>'s hull screamed. The depth counter jumped two hundred meters in a heartbeat. Kael was slammed into the pilot's seat, his spine compressing, his wrists buckling against the controls. The taste of ozone flooded his mouth. Something in the overhead panel cracked — a sharp, percussive snap that meant structural stress. Talon shrieked. Wick went silent — all energy redirected to processing.</w:t>
+      </w:r>
+    </w:p>
+    <w:p>
+      <w:pPr>
+        <w:spacing w:before="40" w:after="40"/>
+        <w:ind w:firstLine="432"/>
+      </w:pPr>
+      <w:r>
+        <w:rPr>
+          <w:b w:val="0"/>
+          <w:i w:val="0"/>
+        </w:rPr>
+        <w:t xml:space="preserve">Sera's counter-field hit Miro's position like a fist of inverted gravity, wrapping him in a bubble of normal space while the world outside tried to crush itself flat. Four seconds. Kael couldn't breathe. His ribs pressed inward, and the hull groaned — a sound he'd never heard the </w:t>
+      </w:r>
+      <w:r>
+        <w:rPr>
+          <w:b w:val="0"/>
+          <w:i/>
+        </w:rPr>
+        <w:t>Fang &amp; Fable</w:t>
+      </w:r>
+      <w:r>
+        <w:rPr>
+          <w:b w:val="0"/>
+          <w:i w:val="0"/>
+        </w:rPr>
+        <w:t xml:space="preserve"> make, low and animal, like a ship learning what pain was.</w:t>
       </w:r>
     </w:p>
     <w:p>
@@ -6603,7 +6525,7 @@
           <w:b w:val="0"/>
           <w:i w:val="0"/>
         </w:rPr>
-        <w:t>The nodes burned out, one by one, like stars dying in sequence. The lattice flickered, guttered, and went black. The gravitic fields collapsed. The pressure normalized with a rush that made Kael's ears pop so hard he tasted copper.</w:t>
+        <w:t>The nodes burned out. One by one. The lattice flickered, guttered, went black. The gravitic fields collapsed. The pressure normalized with a rush that made Kael's ears pop so hard he tasted copper.</w:t>
       </w:r>
     </w:p>
     <w:p>
@@ -6669,7 +6591,7 @@
           <w:b w:val="0"/>
           <w:i w:val="0"/>
         </w:rPr>
-        <w:t>Not human joy. Not the sharp, bright burst of relief or the warm glow of satisfaction. This was joy as architecture — a towering, multi-layered harmonic that used emotional registers Kael didn't have names for, each voice of the Choir contributing a different strand until the combined frequency was so vast and so complex that it transcended emotion entirely and became something closer to music. To prayer. To a sound the universe makes when something broken becomes whole.</w:t>
+        <w:t>Not human joy. This was joy as architecture — a multi-layered harmonic that used emotional registers Kael didn't have names for, each voice contributing a strand until the combined frequency became something closer to music. To prayer.</w:t>
       </w:r>
     </w:p>
     <w:p>
@@ -6696,7 +6618,7 @@
           <w:b w:val="0"/>
           <w:i w:val="0"/>
         </w:rPr>
-        <w:t xml:space="preserve">. Kael felt that distinction like a blade — clean and immediate. He remembered Miro's cracked rib, the eleven minutes of laughter that had been a weapon, a frequency shoved into a man's skull until his body betrayed him. This was the opposite. This was not forced, not aimed, not desperate. This was forty-seven beings feeling something so large they couldn't contain it, and the overflow washing across everything nearby like light from a star. The same species. The same capability. Used not to compel, but simply to </w:t>
+        <w:t xml:space="preserve">. Kael felt that distinction like a blade. He remembered Miro's cracked rib, the eleven minutes of laughter that had been a weapon. This was the opposite — not forced, not aimed, not desperate. Forty-seven beings feeling something so large they couldn't contain it, the overflow washing across everything nearby like light from a star. The same capability. Used not to compel, but simply to </w:t>
       </w:r>
       <w:r>
         <w:rPr>
@@ -6710,7 +6632,7 @@
           <w:b w:val="0"/>
           <w:i w:val="0"/>
         </w:rPr>
-        <w:t>. Kael understood, then, how afraid they must have been — to have turned that gift into a weapon at all.</w:t>
+        <w:t>.</w:t>
       </w:r>
     </w:p>
     <w:p>
@@ -6736,7 +6658,20 @@
           <w:b w:val="0"/>
           <w:i w:val="0"/>
         </w:rPr>
-        <w:t>"Miro," Sera said, her voice carefully level. "Report."</w:t>
+        <w:t>Sera's hand was on the viewport glass. She pulled it back when she saw Kael looking — a quick, sharp motion, as if the glass had burned her. Whatever she'd been reaching toward in those four seconds, she wasn't going to name it.</w:t>
+      </w:r>
+    </w:p>
+    <w:p>
+      <w:pPr>
+        <w:spacing w:before="40" w:after="40"/>
+        <w:ind w:firstLine="432"/>
+      </w:pPr>
+      <w:r>
+        <w:rPr>
+          <w:b w:val="0"/>
+          <w:i w:val="0"/>
+        </w:rPr>
+        <w:t>"Miro," she said, her voice carefully level. "Report."</w:t>
       </w:r>
     </w:p>
     <w:p>
@@ -6843,7 +6778,7 @@
           <w:b w:val="0"/>
           <w:i w:val="0"/>
         </w:rPr>
-        <w:t>Outside the viewport, the Choir was moving. For the first time in two years, they had space. The cage was dead — a lattice of dark, inert metal drifting in the current, already being colonized by the deep-ocean organisms that had been eating it from below. The Choir unfolded, spreading out into the open water, their bioluminescent filaments extending to their full reach. The darkness lit up — blue and white and pale gold, a living galaxy of light expanding in every direction.</w:t>
+        <w:t>Outside the viewport, the Choir was moving. For the first time in two years, they had space. The cage was dead — dark, inert metal drifting in the current, already being colonized by the organisms that had been eating it from below. The Choir unfolded into the open water, filaments extending to full reach. Blue and white and pale gold — light expanding in every direction.</w:t>
       </w:r>
     </w:p>
     <w:p>
@@ -7068,7 +7003,7 @@
           <w:b w:val="0"/>
           <w:i w:val="0"/>
         </w:rPr>
-        <w:t>Behind them, the Choir sang — free, strengthening, their ancient song pouring down into the rift like light into a crack, sealing what must not be opened. And Kael listened to them, really listened, the way only he could — and underneath the joy, underneath the gratitude, he heard the thing they hadn't told him yet.</w:t>
+        <w:t>Behind them, the Choir sang — free, strengthening, their song pouring down into the rift like light into a crack, sealing what must not be opened. And Kael listened to them, really listened, the way only he could — and underneath the joy, underneath the gratitude, he heard the thing they hadn't told him yet.</w:t>
       </w:r>
     </w:p>
     <w:p>
@@ -7120,47 +7055,33 @@
           <w:b w:val="0"/>
           <w:i w:val="0"/>
         </w:rPr>
-        <w:t>Kael let the frequency fade and opened his eyes. Through the viewport, the Choir's light painted the water in slow, vast brushstrokes — beautiful, impossibly fragile for all its scale. He did the math the way he always did, quietly, without sharing. One ship held together by illegal solder. One Lawkeeper interceptor built for speed, not sustained combat. One xenobiologist in a damp EVA suit. One Lawkeeper who gripped consoles too hard when she thought no one was looking. A hawk and an owl who couldn't agree on anything. And forty-seven beings the size of city districts who had spent two years starving and could barely hold their song together.</w:t>
-      </w:r>
-    </w:p>
-    <w:p>
-      <w:pPr>
-        <w:spacing w:before="40" w:after="40"/>
-        <w:ind w:firstLine="432"/>
-      </w:pPr>
-      <w:r>
-        <w:rPr>
-          <w:b w:val="0"/>
-          <w:i w:val="0"/>
-        </w:rPr>
-        <w:t>Against the Thirty-First Strategic Fleet. A ghost division with black-budget warships and the institutional will to cage a sentient species for a weapon.</w:t>
-      </w:r>
-    </w:p>
-    <w:p>
-      <w:pPr>
-        <w:spacing w:before="40" w:after="40"/>
-        <w:ind w:firstLine="432"/>
-      </w:pPr>
-      <w:r>
-        <w:rPr>
-          <w:b w:val="0"/>
-          <w:i w:val="0"/>
-        </w:rPr>
-        <w:t xml:space="preserve">He'd had worse odds. He was almost sure of it. But sitting in the pilot's seat of the </w:t>
-      </w:r>
-      <w:r>
-        <w:rPr>
-          <w:b w:val="0"/>
-          <w:i/>
-        </w:rPr>
-        <w:t>Fang &amp; Fable</w:t>
-      </w:r>
-      <w:r>
-        <w:rPr>
-          <w:b w:val="0"/>
-          <w:i w:val="0"/>
-        </w:rPr>
-        <w:t>, listening to the song of something ancient and grateful and afraid, he couldn't remember when.</w:t>
+        <w:t>Kael let the frequency fade and opened his eyes. Through the viewport, the Choir's light painted the water — blue, white, pale gold. He did the math the way he always did, quietly, without sharing. One ship held together by illegal solder. One Lawkeeper interceptor built for speed, not sustained combat. One xenobiologist in a damp EVA suit. One Lawkeeper who gripped consoles too hard when she thought no one was looking. A hawk and an owl who couldn't agree on anything. And forty-seven beings the size of city districts who had spent two years starving and could barely hold their song together.</w:t>
+      </w:r>
+    </w:p>
+    <w:p>
+      <w:pPr>
+        <w:spacing w:before="40" w:after="40"/>
+        <w:ind w:firstLine="432"/>
+      </w:pPr>
+      <w:r>
+        <w:rPr>
+          <w:b w:val="0"/>
+          <w:i w:val="0"/>
+        </w:rPr>
+        <w:t>Against the Thirty-First Strategic Fleet.</w:t>
+      </w:r>
+    </w:p>
+    <w:p>
+      <w:pPr>
+        <w:spacing w:before="40" w:after="40"/>
+        <w:ind w:firstLine="432"/>
+      </w:pPr>
+      <w:r>
+        <w:rPr>
+          <w:b w:val="0"/>
+          <w:i w:val="0"/>
+        </w:rPr>
+        <w:t>Kael put his hands on the controls. Above them, the ocean went on forever. Below, the Choir sang.</w:t>
       </w:r>
     </w:p>
     <w:p>
@@ -7612,20 +7533,20 @@
           <w:b w:val="0"/>
           <w:i w:val="0"/>
         </w:rPr>
-        <w:t>They came slowly — vast shapes converging from all directions, their bioluminescent filaments dimming to a soft, low glow as they drew close. Something quieter than communication. Something that needed no translation.</w:t>
-      </w:r>
-    </w:p>
-    <w:p>
-      <w:pPr>
-        <w:spacing w:before="40" w:after="40"/>
-        <w:ind w:firstLine="432"/>
-      </w:pPr>
-      <w:r>
-        <w:rPr>
-          <w:b w:val="0"/>
-          <w:i w:val="0"/>
-        </w:rPr>
-        <w:t>They formed a ring. Forty-six beings, the smallest still larger than a starship, arranging themselves in a perfect circle around the forty-seventh. Their filaments reached inward, not quite touching the dying member but close — close enough that the light from their bodies merged at the center, creating a soft luminous haze that wrapped around the Note Between like a cocoon.</w:t>
+        <w:t>They came slowly — shapes converging from all directions, their filaments dimming to a low glow as they drew close. Something quieter than communication.</w:t>
+      </w:r>
+    </w:p>
+    <w:p>
+      <w:pPr>
+        <w:spacing w:before="40" w:after="40"/>
+        <w:ind w:firstLine="432"/>
+      </w:pPr>
+      <w:r>
+        <w:rPr>
+          <w:b w:val="0"/>
+          <w:i w:val="0"/>
+        </w:rPr>
+        <w:t>They formed a ring. Forty-six beings arranging themselves in a perfect circle around the forty-seventh. Their filaments reached inward, not quite touching — close enough that the light merged at the center, wrapping the Note Between like a cocoon.</w:t>
       </w:r>
     </w:p>
     <w:p>
@@ -7651,7 +7572,7 @@
           <w:b w:val="0"/>
           <w:i w:val="0"/>
         </w:rPr>
-        <w:t>Not the distress signal. Not the joyful explosion that had followed the cage's fall. This was something older — a song that Kael could tell, even through the filter of his human mind, had been sung before. Many times. Over millennia. A song with a structure worn smooth by repetition the way river stones are worn smooth by water, every phrase landing in a place that had been shaped by all the voices that had come before.</w:t>
+        <w:t>Not the distress signal. Not the joy that had followed the cage's fall. Something older. A song that had been sung before — many times, over millennia. Its structure worn smooth by repetition the way river stones are worn smooth by water, every phrase landing in a place shaped by all the voices that had come before.</w:t>
       </w:r>
     </w:p>
     <w:p>
@@ -7703,7 +7624,7 @@
           <w:b w:val="0"/>
           <w:i w:val="0"/>
         </w:rPr>
-        <w:t xml:space="preserve">Each voice in the ring was singing not just its own note but fragments of the Note Between's frequency — pieces of the dying member's harmonic signature, woven into their own songs, distributed across the collective. They were taking the dying voice into themselves. Not saving it. Not preserving it like a recording. </w:t>
+        <w:t xml:space="preserve">Each voice in the ring was singing fragments of the Note Between's frequency — pieces of the dying member's harmonic signature, woven into their own songs, distributed across the collective. Not saving it. Not preserving it like a recording. </w:t>
       </w:r>
       <w:r>
         <w:rPr>
@@ -7717,20 +7638,20 @@
           <w:b w:val="0"/>
           <w:i w:val="0"/>
         </w:rPr>
-        <w:t xml:space="preserve"> it — letting it change them, letting it modify their own frequencies the way the Note Between had modified the Choir's harmony for all the long millennia it had sung.</w:t>
-      </w:r>
-    </w:p>
-    <w:p>
-      <w:pPr>
-        <w:spacing w:before="40" w:after="40"/>
-        <w:ind w:firstLine="432"/>
-      </w:pPr>
-      <w:r>
-        <w:rPr>
-          <w:b w:val="0"/>
-          <w:i w:val="0"/>
-        </w:rPr>
-        <w:t>The dying member would be gone. But every surviving voice would carry a piece of its resonance forever. The chord would change. The song would be different. But the Note Between would still be there — distributed, transformed, alive in the spaces between forty-six voices that would never again sound quite the way they had before.</w:t>
+        <w:t xml:space="preserve"> it — letting it change them, the way the Note Between had changed the Choir's harmony for all the millennia it had sung.</w:t>
+      </w:r>
+    </w:p>
+    <w:p>
+      <w:pPr>
+        <w:spacing w:before="40" w:after="40"/>
+        <w:ind w:firstLine="432"/>
+      </w:pPr>
+      <w:r>
+        <w:rPr>
+          <w:b w:val="0"/>
+          <w:i w:val="0"/>
+        </w:rPr>
+        <w:t>The dying member would be gone. But every surviving voice would carry a piece of its resonance. The chord would change. The Note Between would still be there — distributed, transformed, alive in the spaces between forty-six voices that would never again sound quite the way they had before.</w:t>
       </w:r>
     </w:p>
     <w:p>
@@ -7848,7 +7769,7 @@
           <w:b w:val="0"/>
           <w:i w:val="0"/>
         </w:rPr>
-        <w:t>Its bioluminescence faded last — the filaments going dark in slow sequence, like lights turning off in the windows of a building, floor by floor, until the final glow winked out and there was only a vast dark shape, still and silent in the center of the ring.</w:t>
+        <w:t>Its bioluminescence faded last — the filaments going dark in slow sequence, like lights turning off in the windows of a building, floor by floor, until the final glow winked out and there was only a dark shape, still and silent in the center of the ring.</w:t>
       </w:r>
     </w:p>
     <w:p>
@@ -8661,7 +8582,7 @@
           <w:b w:val="0"/>
           <w:i w:val="0"/>
         </w:rPr>
-        <w:t>Miro looked at the display. Then at Kael. Then at the viewport, where forty-six ancient beings sang their wounded song above an abyss that wanted to swallow the stars.</w:t>
+        <w:t>Miro looked at the display. Then at Kael. Then at the viewport, where forty-six beings sang their wounded song above the abyss.</w:t>
       </w:r>
     </w:p>
     <w:p>
@@ -8785,20 +8706,20 @@
           <w:b w:val="0"/>
           <w:i w:val="0"/>
         </w:rPr>
-        <w:t>"We do what we came here to do," Kael said. He put his hands on the controls. "We protect them."</w:t>
-      </w:r>
-    </w:p>
-    <w:p>
-      <w:pPr>
-        <w:spacing w:before="40" w:after="40"/>
-        <w:ind w:firstLine="432"/>
-      </w:pPr>
-      <w:r>
-        <w:rPr>
-          <w:b w:val="0"/>
-          <w:i w:val="0"/>
-        </w:rPr>
-        <w:t>Outside, the ocean darkened above them as eight warships descended. And below, the rift pulsed once — just once — as if something in the deepest dark had felt the song grow thinner and was, for the first time in millennia, beginning to hope.</w:t>
+        <w:t>"We stay," Kael said. He put his hands on the controls. "We keep them alive."</w:t>
+      </w:r>
+    </w:p>
+    <w:p>
+      <w:pPr>
+        <w:spacing w:before="40" w:after="40"/>
+        <w:ind w:firstLine="432"/>
+      </w:pPr>
+      <w:r>
+        <w:rPr>
+          <w:b w:val="0"/>
+          <w:i w:val="0"/>
+        </w:rPr>
+        <w:t>Outside, the ocean darkened above them as eight warships descended. And below, the rift pulsed once — just once — and the water around it went still.</w:t>
       </w:r>
     </w:p>
     <w:p>
@@ -9203,7 +9124,7 @@
           <w:b w:val="0"/>
           <w:i w:val="0"/>
         </w:rPr>
-        <w:t xml:space="preserve"> them, into the deep water, into the frequency channels the requiem had traveled. He was listening for echoes. For answers. For the thing that happened when an ancient song reached ancient ears.</w:t>
+        <w:t xml:space="preserve"> them, into the deep water, into the frequency channels the requiem had traveled. He was listening for echoes. For answers. For the thing that happened when a deep song reached deep ears.</w:t>
       </w:r>
     </w:p>
     <w:p>
@@ -9269,7 +9190,7 @@
           <w:b w:val="0"/>
           <w:i w:val="0"/>
         </w:rPr>
-        <w:t xml:space="preserve"> — from out past the continental shelf, past the abyssal plain, from somewhere in the deep galaxy that no Covenant map had ever charted. A frequency that rhymed with the Choir's the way a grandmother's voice rhymes with a grandchild's. The same harmonic family. The same ancient roots. But older. Deeper. Rougher, like a voice that had been singing for so long it had worn grooves into the fabric of space itself.</w:t>
+        <w:t xml:space="preserve"> — from out past the continental shelf, past the abyssal plain, from somewhere in the deep galaxy that no Covenant map had ever charted. A frequency that rhymed with the Choir's the way a grandmother's voice rhymes with a grandchild's. The same harmonic family. The same deep roots. But older. Deeper. Rougher, like a voice that had been singing for so long it had worn grooves into the fabric of space itself.</w:t>
       </w:r>
     </w:p>
     <w:p>
@@ -9362,7 +9283,7 @@
           <w:b w:val="0"/>
           <w:i w:val="0"/>
         </w:rPr>
-        <w:t xml:space="preserve">They came through the water column in combat formation — eight ships, dark-hulled and angular, their gravitic drives cutting through the ocean like heated blades. Two Crucible-class heavy cruisers at the center, each one a hundred and sixty meters of armored malice. Four Stilletto escort frigates flanking in pairs, fast and sharp, designed for exactly this kind of containment operation. And two Veil-class sensor ships hanging back, painting the deep with targeting arrays that lit up the </w:t>
+        <w:t xml:space="preserve">They came through the water column in combat formation. Eight ships, dark-hulled and angular. Their gravitic drives cut through the ocean like heated blades. Two Crucible-class heavy cruisers at the center, each one a hundred and sixty meters of armored malice. Four Stilletto escort frigates flanking in pairs, fast and sharp, designed for exactly this kind of containment operation. And two Veil-class sensor ships hanging back, painting the deep with targeting arrays that lit up the </w:t>
       </w:r>
       <w:r>
         <w:rPr>
@@ -9428,7 +9349,7 @@
           <w:b w:val="0"/>
           <w:i w:val="0"/>
         </w:rPr>
-        <w:t>"That's how it works." Sera's jaw was tight. "Classified operations don't have faces. They have coordinates."</w:t>
+        <w:t>"That's how it works." Sera's jaw was tight. "You don't have to see what you're killing if you call it a coordinate set."</w:t>
       </w:r>
     </w:p>
     <w:p>
@@ -9862,7 +9783,7 @@
           <w:b w:val="0"/>
           <w:i w:val="0"/>
         </w:rPr>
-        <w:t>They were not the Choir. They were something else — something related but different, the way a wolf is related to but different from a dog. Where the Choir was luminous, fluid, graceful, these beings were rough and dark and scarred, their bodies dense with age, their bioluminescence not the Choir's soft blue-white but a deep, slow amber — the color of old fires, of embers that had been burning for longer than anyone had bothered to count. They were smaller than the Choir, most of them — hundreds of meters rather than kilometers — but they moved with a heaviness that had nothing to do with size and everything to do with time. They moved the way mountains would move if mountains decided they'd had enough.</w:t>
+        <w:t>They were not the Choir. Something related but different, the way a wolf is related to a dog. Where the Choir was luminous and fluid, these beings were rough and dark and scarred, their bodies dense with age, their glow not blue-white but a deep, slow amber — the color of old fires. Smaller than the Choir, most of them — hundreds of meters rather than kilometers — but they moved with a heaviness that had nothing to do with size. They moved the way mountains would move if mountains decided they'd had enough.</w:t>
       </w:r>
     </w:p>
     <w:p>
@@ -9915,7 +9836,7 @@
           <w:b w:val="0"/>
           <w:i w:val="0"/>
         </w:rPr>
-        <w:t>Men and women and others who didn't fit either category, their faces lined and weathered, their eyes bright. Their suits were patched and worn and covered in the accumulated markings of decades — frequency sigils, species glyphs, navigational tattoos that mapped routes no jump-gate had ever serviced. Some of them carried tools. Some carried instruments that Kael didn't recognize. One — a woman at the front of the largest platform, her white hair streaming in the current, her face a map of laugh lines and scar tissue — carried nothing at all. She didn't need to. The frequency coming off her was so powerful, so layered, so dense with experience and authority that Kael could feel it through the hull like a physical weight.</w:t>
+        <w:t>Men and women and others who didn't fit either category, faces lined and weathered, eyes bright. Their suits were patched and covered in the accumulated markings of decades — frequency sigils, species glyphs, navigational tattoos that mapped routes no jump-gate had ever serviced. One — a woman at the front of the largest platform, her white hair streaming in the current, her face a map of laugh lines and scar tissue — carried nothing at all. The frequency coming off her was so powerful, so dense with experience that Kael could feel it through the hull like a physical weight.</w:t>
       </w:r>
     </w:p>
     <w:p>
@@ -9941,7 +9862,7 @@
           <w:b w:val="0"/>
           <w:i w:val="0"/>
         </w:rPr>
-        <w:t>Listeners. Frequency-listeners, like him — but not like him. Not trained by the Academy, not certified by the Covenant, not registered in any database that the Union or the Lawkeepers or anyone else maintained. These were the ones who had walked away from the mapped sectors entirely. The ones who had gone into the deep galaxy and never come back. The ones the Academy called "lost" and the Union called "rogue" and who called themselves nothing at all, because when you've spent forty years living alongside beings older than your species, names feel like a very small idea.</w:t>
+        <w:t>Listeners. Not trained by the Academy, not certified by the Covenant, not registered in any database. The ones who had gone into the deep galaxy and never come back. The Academy called them "lost." The Union called them "rogue." They called themselves nothing at all.</w:t>
       </w:r>
     </w:p>
     <w:p>
@@ -10113,7 +10034,7 @@
           <w:b w:val="0"/>
           <w:i w:val="0"/>
         </w:rPr>
-        <w:t>Sera's hand tightened on the rail. "Forty-three people operating outside Covenant jurisdiction. No registration. No oversight. No legal mandate for any of this." She said it quietly, almost to herself, and Kael heard the discomfort in it — not fear, not hostility, just the instinctive friction of a woman whose entire life was built on frameworks encountering something that existed outside all of them. It bothered her. He could tell it bothered her more than the incoming fleet, which was irrational, and he could tell she knew it was irrational, and it bothered her anyway. Then Wick shifted on her shoulder — a small, deliberate settling of weight — and his frequency pulsed once, low and steady. Whatever the owl communicated, it was enough. Sera's grip eased. She didn't mention it again. [NEW]</w:t>
+        <w:t>Sera's hand tightened on the rail. "Forty-three people operating outside Covenant jurisdiction. No registration. No oversight. No legal mandate for any of this." She said it quietly, almost to herself, and Kael heard the discomfort in it — not fear, not hostility, just the instinctive friction of a woman whose entire life was built on frameworks encountering something that existed outside all of them. It bothered her. He could tell it bothered her more than the incoming fleet, which was irrational, and he could tell she knew it was irrational, and it bothered her anyway. Then Wick shifted on her shoulder — a small, deliberate settling of weight — and his frequency pulsed once, low and steady. Whatever the owl communicated, it was enough. Sera's grip eased. She didn't mention it again.</w:t>
       </w:r>
     </w:p>
     <w:p>
@@ -10167,7 +10088,7 @@
           <w:b w:val="0"/>
           <w:i w:val="0"/>
         </w:rPr>
-        <w:t xml:space="preserve"> of thing. They had stood between the ancient and the violent before. It was, Kael realized, what they did. What they had always done. Out there in the unmapped dark, while the Covenant filed paperwork and the Union built cages, these people had been standing on the backs of old gods and saying </w:t>
+        <w:t xml:space="preserve"> of thing. They had stood between the old and the violent before. It was, Kael realized, what they did. What they had always done. Out there in the unmapped dark, while the Covenant filed paperwork and the Union built cages, these people had been standing on the backs of old gods and saying </w:t>
       </w:r>
       <w:r>
         <w:rPr>
@@ -10408,7 +10329,7 @@
           <w:b w:val="0"/>
           <w:i w:val="0"/>
         </w:rPr>
-        <w:t>"Two Veil-class sensors are trying to jam my transmission," Sera called over the comm. "If they succeed, we lose the legal record."</w:t>
+        <w:t>"Two Veil-class sensors are trying to jam my transmission," Sera called over the comm. "If they succeed, we lose the evidentiary record. Everything we've documented becomes, in all probability, inadmissible."</w:t>
       </w:r>
     </w:p>
     <w:p>
@@ -10527,7 +10448,7 @@
           <w:b w:val="0"/>
           <w:i w:val="0"/>
         </w:rPr>
-        <w:t xml:space="preserve">Not the requiem. Not the Choir's ancient melody. Something new — a war-song, if war-songs could be beautiful and terrible at the same time. Forty-three human voices, augmented by eighteen ancient beings, channeling a collective frequency that Kael felt in his marrow. It was not an attack — not exactly. It was a </w:t>
+        <w:t xml:space="preserve">Not the requiem. Not the Choir's melody. Something new — a war-song, if war-songs could be beautiful and terrible at the same time. Forty-three human voices augmented by eighteen beings older than starlight, channeling a collective frequency that Kael felt in his marrow. Not an attack — not exactly. A </w:t>
       </w:r>
       <w:r>
         <w:rPr>
@@ -10541,7 +10462,7 @@
           <w:b w:val="0"/>
           <w:i w:val="0"/>
         </w:rPr>
-        <w:t xml:space="preserve"> A harmonic barrier, a frequency so dense and so precisely calibrated that the gravitic lances lost coherence when they passed through it. The weapons designed to kill the Choir struck the barrier and </w:t>
+        <w:t xml:space="preserve"> A harmonic barrier so dense that the gravitic lances lost coherence passing through it. The weapons designed to kill the Choir struck the barrier and </w:t>
       </w:r>
       <w:r>
         <w:rPr>
@@ -10555,46 +10476,46 @@
           <w:b w:val="0"/>
           <w:i w:val="0"/>
         </w:rPr>
-        <w:t xml:space="preserve"> — their energy scattered, refracted, turned from focused beams into diffuse light that washed over the Choir's bodies without harm.</w:t>
-      </w:r>
-    </w:p>
-    <w:p>
-      <w:pPr>
-        <w:spacing w:before="40" w:after="40"/>
-        <w:ind w:firstLine="432"/>
-      </w:pPr>
-      <w:r>
-        <w:rPr>
-          <w:b w:val="0"/>
-          <w:i w:val="0"/>
-        </w:rPr>
-        <w:t>The white-haired woman was the anchor. Kael could feel her at the center of the harmonic wall, her frequency the foundation on which forty-two others built. But she was old, and the effort was enormous, and he could hear the strain in her signal the way you hear a bridge creaking under too much weight.</w:t>
-      </w:r>
-    </w:p>
-    <w:p>
-      <w:pPr>
-        <w:spacing w:before="40" w:after="40"/>
-        <w:ind w:firstLine="432"/>
-      </w:pPr>
-      <w:r>
-        <w:rPr>
-          <w:b w:val="0"/>
-          <w:i w:val="0"/>
-        </w:rPr>
-        <w:t>The Choir added their voices. Forty-six — no longer forty-seven — threading their ancient harmonics into the deep listeners' wall, strengthening it, filling the gaps with frequencies that only they could produce. The combined sound was staggering. Kael's frequency-sense overloaded and reset twice, his brain struggling to process a signal that existed on more layers than human neurology was designed to handle.</w:t>
-      </w:r>
-    </w:p>
-    <w:p>
-      <w:pPr>
-        <w:spacing w:before="40" w:after="40"/>
-        <w:ind w:firstLine="432"/>
-      </w:pPr>
-      <w:r>
-        <w:rPr>
-          <w:b w:val="0"/>
-          <w:i w:val="0"/>
-        </w:rPr>
-        <w:t>He flew by instinct when that happened. Flew blind, by feel, by the copper thread of Talon's frequency and the muscle memory of ten thousand hours in this cockpit. His mouth was so dry his tongue stuck to his teeth. There was a water bottle in the storage net behind the seat and he could not reach it and it was, absurdly, the thing that bothered him most. [NEW]</w:t>
+        <w:t xml:space="preserve"> — energy scattered, refracted, turned from focused beams into diffuse light that washed over the Choir without harm.</w:t>
+      </w:r>
+    </w:p>
+    <w:p>
+      <w:pPr>
+        <w:spacing w:before="40" w:after="40"/>
+        <w:ind w:firstLine="432"/>
+      </w:pPr>
+      <w:r>
+        <w:rPr>
+          <w:b w:val="0"/>
+          <w:i w:val="0"/>
+        </w:rPr>
+        <w:t>The white-haired woman was the anchor — her frequency the foundation on which forty-two others built. She was old, and the effort was enormous. Kael could hear the strain the way you hear a bridge creaking under too much weight.</w:t>
+      </w:r>
+    </w:p>
+    <w:p>
+      <w:pPr>
+        <w:spacing w:before="40" w:after="40"/>
+        <w:ind w:firstLine="432"/>
+      </w:pPr>
+      <w:r>
+        <w:rPr>
+          <w:b w:val="0"/>
+          <w:i w:val="0"/>
+        </w:rPr>
+        <w:t>The Choir added their voices. Forty-six — no longer forty-seven — threading their harmonics into the deep listeners' wall, filling gaps with frequencies only they could produce. The combined sound was staggering. Kael's frequency-sense overloaded and reset twice.</w:t>
+      </w:r>
+    </w:p>
+    <w:p>
+      <w:pPr>
+        <w:spacing w:before="40" w:after="40"/>
+        <w:ind w:firstLine="432"/>
+      </w:pPr>
+      <w:r>
+        <w:rPr>
+          <w:b w:val="0"/>
+          <w:i w:val="0"/>
+        </w:rPr>
+        <w:t>He flew by instinct when that happened. Flew blind, by feel, by the copper thread of Talon's frequency and the muscle memory of ten thousand hours in this cockpit. His mouth was so dry his tongue stuck to his teeth. There was a water bottle in the storage net behind the seat and he could not reach it and it was, absurdly, the thing that bothered him most.</w:t>
       </w:r>
     </w:p>
     <w:p>
@@ -10621,7 +10542,7 @@
           <w:b w:val="0"/>
           <w:i w:val="0"/>
         </w:rPr>
-        <w:t xml:space="preserve">, according to Sera's tactical feed — changed tactics. Instead of firing through the harmonic wall, it began to circle, searching for a gap. Its captain was smart. The wall couldn't be everywhere at once. The deep listeners had to concentrate their strength, and the Choir had to maintain their position above the rift. There were flanks. There were angles. And the </w:t>
+        <w:t xml:space="preserve">, according to Sera's tactical feed — changed tactics. Instead of firing through the harmonic wall, it began to circle, searching for a gap. Pressure always found the weak point. [MOTIF] The wall couldn't be everywhere at once. The deep listeners had to concentrate their strength, and the Choir had to maintain their position above the rift. There were flanks. There were angles. And the </w:t>
       </w:r>
       <w:r>
         <w:rPr>
@@ -10887,7 +10808,7 @@
           <w:b w:val="0"/>
           <w:i w:val="0"/>
         </w:rPr>
-        <w:t>The wounded mount listed downward, its amber glow fading to a dull pulse. It would survive — these creatures were ancient, and ancient things are hard to kill — but the scar would be permanent. A patch of dead tissue, lightless and silent, where the lance had burned through. It would carry that wound the way the Choir carried the Note Between's absence — not as a weakness but as a cost. The price of standing between.</w:t>
+        <w:t>The wounded mount listed downward, its amber glow fading to a dull pulse. It would survive — these creatures had endured longer than empires, and old things are hard to kill — but the scar would be permanent. A patch of dead tissue, lightless and silent, where the lance had burned through. It would carry that wound the way the Choir carried the Note Between's absence — not as a weakness but as a cost. The price of standing between.</w:t>
       </w:r>
     </w:p>
     <w:p>
@@ -11692,20 +11613,20 @@
           <w:b w:val="0"/>
           <w:i w:val="0"/>
         </w:rPr>
-        <w:t>Through the viewport, the deep ocean glowed. Blue and white and amber and gold — two choruses, old and older, weaving their songs together above the rift. Forty-six and eighteen. The ancient and the ancient's ancient. And somewhere in the harmony, in a gap that had been empty since the forty-seventh voice went silent, Kael's own frequency still hummed — small, human, stubbornly present. Changed.</w:t>
-      </w:r>
-    </w:p>
-    <w:p>
-      <w:pPr>
-        <w:spacing w:before="40" w:after="40"/>
-        <w:ind w:firstLine="432"/>
-      </w:pPr>
-      <w:r>
-        <w:rPr>
-          <w:b w:val="0"/>
-          <w:i w:val="0"/>
-        </w:rPr>
-        <w:t>The detective in his novel would have had a line for this. Something wry, something clever, something that tied the impossible up in a bow. Kael didn't have a line. He had a cup of bad coffee, a bleeding nose, a frequency-sense that would never work the same way again, and the distant, impossible sound of someone else calling for help from the other side of the galaxy.</w:t>
+        <w:t>Through the viewport, the deep ocean glowed. Blue and white and amber and gold — two choruses, old and older, weaving their songs together above the rift. Forty-six and eighteen. And somewhere in the harmony, in a gap that had been empty since the forty-seventh voice went silent, Kael's own frequency still hummed — small, human, stubbornly present. Changed.</w:t>
+      </w:r>
+    </w:p>
+    <w:p>
+      <w:pPr>
+        <w:spacing w:before="40" w:after="40"/>
+        <w:ind w:firstLine="432"/>
+      </w:pPr>
+      <w:r>
+        <w:rPr>
+          <w:b w:val="0"/>
+          <w:i w:val="0"/>
+        </w:rPr>
+        <w:t>He had a cup of bad coffee, a bleeding nose, a frequency-sense that would never work the same way again, and the distant, impossible sound of someone calling for help from the other side of the galaxy.</w:t>
       </w:r>
     </w:p>
     <w:p>

</xml_diff>

<commit_message>
Apply 13 targeted text replacements across Chapters 3-6
- Rift description: "It doesn't kill you. It just makes you alone."
- Joy passage: simpler, steadier — "something ancient finally allowed to breathe again"
- Pellan-V: added "I remember the smell" for Sera's personal stake
- Legal line: "If we die, it will be properly documented"
- Pressure motif: "Two pressures. She stood between them and didn't move."
- Sera human moment: sleeve adjustment after viewport reach
- Cage ending (Ch3): "The cage hung above them. Wrong."
- Choir strength line: "You could lend strength. You couldn't lend time."
- Ch5 ending: new inventory + "Let's see who breaks first"
- Kael's systems line after Miro's revelation
- Hawk/owl: "A hawk who trusted instinct. An owl who trusted evidence."
- Sera deep-listener reaction: removed Kael's interpretation, let her words carry

https://claude.ai/code/session_01XVZGKMeTpqLFzCVEmX6JZq
</commit_message>
<xml_diff>
--- a/The_Wildtongue_Chronicles.docx
+++ b/The_Wildtongue_Chronicles.docx
@@ -3292,673 +3292,672 @@
           <w:b w:val="0"/>
           <w:i w:val="0"/>
         </w:rPr>
-        <w:t xml:space="preserve">"They don't have a name for it. The closest I can — it's an anti-frequency. Everything the Choir is — connection, harmony — this thing is the inverse. Severance. Silence. It doesn't destroy life. It destroys the ability of living things to </w:t>
+        <w:t>"They don't have a name for it. The closest I can — it's an anti-frequency. Everything the Choir is — connection, harmony — this thing is the inverse. Severance. Silence. It doesn't kill you. It just makes you alone."</w:t>
+      </w:r>
+    </w:p>
+    <w:p>
+      <w:pPr>
+        <w:spacing w:before="40" w:after="40"/>
+        <w:ind w:firstLine="432"/>
+      </w:pPr>
+      <w:r>
+        <w:rPr>
+          <w:b w:val="0"/>
+          <w:i w:val="0"/>
+        </w:rPr>
+        <w:t>He met Miro's eyes. "If it gets out, every frequency-capable species in the sector goes deaf. Not just animals. Anything that relies on signal — neural networks, hive minds, bonded pairs. Every ship's communication array. Just... silence."</w:t>
+      </w:r>
+    </w:p>
+    <w:p>
+      <w:pPr>
+        <w:spacing w:before="40" w:after="40"/>
+        <w:ind w:firstLine="432"/>
+      </w:pPr>
+      <w:r>
+        <w:rPr>
+          <w:b w:val="0"/>
+          <w:i w:val="0"/>
+        </w:rPr>
+        <w:t>Miro sat back against the console. He was quiet for a long time. Kael watched the grin try to come back and fail, twice, before Miro gave up and just let his face be what it was — afraid.</w:t>
+      </w:r>
+    </w:p>
+    <w:p>
+      <w:pPr>
+        <w:spacing w:before="40" w:after="40"/>
+        <w:ind w:firstLine="432"/>
+      </w:pPr>
+      <w:r>
+        <w:rPr>
+          <w:b w:val="0"/>
+          <w:i w:val="0"/>
+        </w:rPr>
+        <w:t>"So someone knows," Miro said finally. "Someone knows what's down there, and they built this cage specifically to release it."</w:t>
+      </w:r>
+    </w:p>
+    <w:p>
+      <w:pPr>
+        <w:spacing w:before="40" w:after="40"/>
+        <w:ind w:firstLine="432"/>
+      </w:pPr>
+      <w:r>
+        <w:rPr>
+          <w:b w:val="0"/>
+          <w:i w:val="0"/>
+        </w:rPr>
+        <w:t>"Yes."</w:t>
+      </w:r>
+    </w:p>
+    <w:p>
+      <w:pPr>
+        <w:spacing w:before="40" w:after="40"/>
+        <w:ind w:firstLine="432"/>
+      </w:pPr>
+      <w:r>
+        <w:rPr>
+          <w:b w:val="0"/>
+          <w:i w:val="0"/>
+        </w:rPr>
+        <w:t>"And we have seventy-two hours."</w:t>
+      </w:r>
+    </w:p>
+    <w:p>
+      <w:pPr>
+        <w:spacing w:before="40" w:after="40"/>
+        <w:ind w:firstLine="432"/>
+      </w:pPr>
+      <w:r>
+        <w:rPr>
+          <w:b w:val="0"/>
+          <w:i w:val="0"/>
+        </w:rPr>
+        <w:t>"Less now. Sixty-eight, maybe."</w:t>
+      </w:r>
+    </w:p>
+    <w:p>
+      <w:pPr>
+        <w:spacing w:before="40" w:after="40"/>
+        <w:ind w:firstLine="432"/>
+      </w:pPr>
+      <w:r>
+        <w:rPr>
+          <w:b w:val="0"/>
+          <w:i w:val="0"/>
+        </w:rPr>
+        <w:t xml:space="preserve">Miro closed his eyes. Drew a breath. When he opened them, the fear was still there, but it had company — something harder, the same stubbornness Kael had seen when Miro said </w:t>
       </w:r>
       <w:r>
         <w:rPr>
           <w:b w:val="0"/>
           <w:i/>
         </w:rPr>
-        <w:t>hear</w:t>
-      </w:r>
-      <w:r>
-        <w:rPr>
-          <w:b w:val="0"/>
-          <w:i w:val="0"/>
-        </w:rPr>
-        <w:t xml:space="preserve"> each other."</w:t>
-      </w:r>
-    </w:p>
-    <w:p>
-      <w:pPr>
-        <w:spacing w:before="40" w:after="40"/>
-        <w:ind w:firstLine="432"/>
-      </w:pPr>
-      <w:r>
-        <w:rPr>
-          <w:b w:val="0"/>
-          <w:i w:val="0"/>
-        </w:rPr>
-        <w:t>He met Miro's eyes. "If it gets out, every frequency-capable species in the sector goes deaf. Not just animals. Anything that relies on signal — neural networks, hive minds, bonded pairs. Every ship's communication array. Just... silence."</w:t>
-      </w:r>
-    </w:p>
-    <w:p>
-      <w:pPr>
-        <w:spacing w:before="40" w:after="40"/>
-        <w:ind w:firstLine="432"/>
-      </w:pPr>
-      <w:r>
-        <w:rPr>
-          <w:b w:val="0"/>
-          <w:i w:val="0"/>
-        </w:rPr>
-        <w:t>Miro sat back against the console. He was quiet for a long time. Kael watched the grin try to come back and fail, twice, before Miro gave up and just let his face be what it was — afraid.</w:t>
-      </w:r>
-    </w:p>
-    <w:p>
-      <w:pPr>
-        <w:spacing w:before="40" w:after="40"/>
-        <w:ind w:firstLine="432"/>
-      </w:pPr>
-      <w:r>
-        <w:rPr>
-          <w:b w:val="0"/>
-          <w:i w:val="0"/>
-        </w:rPr>
-        <w:t>"So someone knows," Miro said finally. "Someone knows what's down there, and they built this cage specifically to release it."</w:t>
-      </w:r>
-    </w:p>
-    <w:p>
-      <w:pPr>
-        <w:spacing w:before="40" w:after="40"/>
-        <w:ind w:firstLine="432"/>
-      </w:pPr>
-      <w:r>
-        <w:rPr>
-          <w:b w:val="0"/>
-          <w:i w:val="0"/>
-        </w:rPr>
-        <w:t>"Yes."</w:t>
-      </w:r>
-    </w:p>
-    <w:p>
-      <w:pPr>
-        <w:spacing w:before="40" w:after="40"/>
-        <w:ind w:firstLine="432"/>
-      </w:pPr>
-      <w:r>
-        <w:rPr>
-          <w:b w:val="0"/>
-          <w:i w:val="0"/>
-        </w:rPr>
-        <w:t>"And we have seventy-two hours."</w:t>
-      </w:r>
-    </w:p>
-    <w:p>
-      <w:pPr>
-        <w:spacing w:before="40" w:after="40"/>
-        <w:ind w:firstLine="432"/>
-      </w:pPr>
-      <w:r>
-        <w:rPr>
-          <w:b w:val="0"/>
-          <w:i w:val="0"/>
-        </w:rPr>
-        <w:t>"Less now. Sixty-eight, maybe."</w:t>
-      </w:r>
-    </w:p>
-    <w:p>
-      <w:pPr>
-        <w:spacing w:before="40" w:after="40"/>
-        <w:ind w:firstLine="432"/>
-      </w:pPr>
-      <w:r>
-        <w:rPr>
-          <w:b w:val="0"/>
-          <w:i w:val="0"/>
-        </w:rPr>
-        <w:t xml:space="preserve">Miro closed his eyes. Drew a breath. When he opened them, the fear was still there, but it had company — something harder, the same stubbornness Kael had seen when Miro said </w:t>
+        <w:t>because nobody else came.</w:t>
+      </w:r>
+    </w:p>
+    <w:p>
+      <w:pPr>
+        <w:spacing w:before="40" w:after="40"/>
+        <w:ind w:firstLine="432"/>
+      </w:pPr>
+      <w:r>
+        <w:rPr>
+          <w:b w:val="0"/>
+          <w:i w:val="0"/>
+        </w:rPr>
+        <w:t>"Right," he said. He stood, pulled up his scanner, and turned to the viewport where the cage's lattice glowed in the dark water. "Then I need to find the control nexus. That's my job. You said each node communicates on a backbone frequency?"</w:t>
+      </w:r>
+    </w:p>
+    <w:p>
+      <w:pPr>
+        <w:spacing w:before="40" w:after="40"/>
+        <w:ind w:firstLine="432"/>
+      </w:pPr>
+      <w:r>
+        <w:rPr>
+          <w:b w:val="0"/>
+          <w:i w:val="0"/>
+        </w:rPr>
+        <w:t>"That's what you told me."</w:t>
+      </w:r>
+    </w:p>
+    <w:p>
+      <w:pPr>
+        <w:spacing w:before="40" w:after="40"/>
+        <w:ind w:firstLine="432"/>
+      </w:pPr>
+      <w:r>
+        <w:rPr>
+          <w:b w:val="0"/>
+          <w:i w:val="0"/>
+        </w:rPr>
+        <w:t>"I did, and I was right, because I'm very good at my job even when I'm terrified. Give me thirty minutes with the netting. I need to map the signal architecture, trace it back to the hub." He was already pulling up spectral analysis tools, his hands — steady, always steady — flying across the interface. "Fly me along the eastern edge. Slow. I need to read the nodes as we pass."</w:t>
+      </w:r>
+    </w:p>
+    <w:p>
+      <w:pPr>
+        <w:spacing w:before="40" w:after="40"/>
+        <w:ind w:firstLine="432"/>
+      </w:pPr>
+      <w:r>
+        <w:rPr>
+          <w:b w:val="0"/>
+          <w:i w:val="0"/>
+        </w:rPr>
+        <w:t xml:space="preserve">Kael pulled himself into the pilot's seat. His head was still ringing, but his hands were steady too. Talon settled on the headrest behind him and pressed her beak against the back of his skull — a gesture she hadn't made since she was a fledgling, her frequency broadcasting a low, fierce pulse that Kael's brain translated simply as: </w:t>
       </w:r>
       <w:r>
         <w:rPr>
           <w:b w:val="0"/>
           <w:i/>
         </w:rPr>
-        <w:t>because nobody else came.</w:t>
-      </w:r>
-    </w:p>
-    <w:p>
-      <w:pPr>
-        <w:spacing w:before="40" w:after="40"/>
-        <w:ind w:firstLine="432"/>
-      </w:pPr>
-      <w:r>
-        <w:rPr>
-          <w:b w:val="0"/>
-          <w:i w:val="0"/>
-        </w:rPr>
-        <w:t>"Right," he said. He stood, pulled up his scanner, and turned to the viewport where the cage's lattice glowed in the dark water. "Then I need to find the control nexus. That's my job. You said each node communicates on a backbone frequency?"</w:t>
-      </w:r>
-    </w:p>
-    <w:p>
-      <w:pPr>
-        <w:spacing w:before="40" w:after="40"/>
-        <w:ind w:firstLine="432"/>
-      </w:pPr>
-      <w:r>
-        <w:rPr>
-          <w:b w:val="0"/>
-          <w:i w:val="0"/>
-        </w:rPr>
-        <w:t>"That's what you told me."</w:t>
-      </w:r>
-    </w:p>
-    <w:p>
-      <w:pPr>
-        <w:spacing w:before="40" w:after="40"/>
-        <w:ind w:firstLine="432"/>
-      </w:pPr>
-      <w:r>
-        <w:rPr>
-          <w:b w:val="0"/>
-          <w:i w:val="0"/>
-        </w:rPr>
-        <w:t>"I did, and I was right, because I'm very good at my job even when I'm terrified. Give me thirty minutes with the netting. I need to map the signal architecture, trace it back to the hub." He was already pulling up spectral analysis tools, his hands — steady, always steady — flying across the interface. "Fly me along the eastern edge. Slow. I need to read the nodes as we pass."</w:t>
-      </w:r>
-    </w:p>
-    <w:p>
-      <w:pPr>
-        <w:spacing w:before="40" w:after="40"/>
-        <w:ind w:firstLine="432"/>
-      </w:pPr>
-      <w:r>
-        <w:rPr>
-          <w:b w:val="0"/>
-          <w:i w:val="0"/>
-        </w:rPr>
-        <w:t xml:space="preserve">Kael pulled himself into the pilot's seat. His head was still ringing, but his hands were steady too. Talon settled on the headrest behind him and pressed her beak against the back of his skull — a gesture she hadn't made since she was a fledgling, her frequency broadcasting a low, fierce pulse that Kael's brain translated simply as: </w:t>
+        <w:t>mine.</w:t>
+      </w:r>
+    </w:p>
+    <w:p>
+      <w:pPr>
+        <w:spacing w:before="40" w:after="40"/>
+        <w:ind w:firstLine="432"/>
+      </w:pPr>
+      <w:r>
+        <w:rPr>
+          <w:b w:val="0"/>
+          <w:i w:val="0"/>
+        </w:rPr>
+        <w:t>He flew the ship along the cage's edge. The lattice scrolled past the viewport, node after node, each one a small sun of gravitic force. Miro worked in silence — real silence, no jokes, no patter — his focus absolute, cross-referencing signal patterns and muttering numbers under his breath.</w:t>
+      </w:r>
+    </w:p>
+    <w:p>
+      <w:pPr>
+        <w:spacing w:before="40" w:after="40"/>
+        <w:ind w:firstLine="432"/>
+      </w:pPr>
+      <w:r>
+        <w:rPr>
+          <w:b w:val="0"/>
+          <w:i w:val="0"/>
+        </w:rPr>
+        <w:t>Twenty minutes in, he stopped.</w:t>
+      </w:r>
+    </w:p>
+    <w:p>
+      <w:pPr>
+        <w:spacing w:before="40" w:after="40"/>
+        <w:ind w:firstLine="432"/>
+      </w:pPr>
+      <w:r>
+        <w:rPr>
+          <w:b w:val="0"/>
+          <w:i w:val="0"/>
+        </w:rPr>
+        <w:t>"There." He pointed to a section of the netting where the nodes were spaced more densely, their connecting lines converging like roads into a city center. "The signal architecture funnels here. Every node in the grid references this cluster for timing synchronization. Kill this, and the whole net destabilizes."</w:t>
+      </w:r>
+    </w:p>
+    <w:p>
+      <w:pPr>
+        <w:spacing w:before="40" w:after="40"/>
+        <w:ind w:firstLine="432"/>
+      </w:pPr>
+      <w:r>
+        <w:rPr>
+          <w:b w:val="0"/>
+          <w:i w:val="0"/>
+        </w:rPr>
+        <w:t>"Can we reach it?"</w:t>
+      </w:r>
+    </w:p>
+    <w:p>
+      <w:pPr>
+        <w:spacing w:before="40" w:after="40"/>
+        <w:ind w:firstLine="432"/>
+      </w:pPr>
+      <w:r>
+        <w:rPr>
+          <w:b w:val="0"/>
+          <w:i w:val="0"/>
+        </w:rPr>
+        <w:t>"It's inside the cage. About five hundred meters past the barrier." He pulled up more data and froze. "Kael."</w:t>
+      </w:r>
+    </w:p>
+    <w:p>
+      <w:pPr>
+        <w:spacing w:before="40" w:after="40"/>
+        <w:ind w:firstLine="432"/>
+      </w:pPr>
+      <w:r>
+        <w:rPr>
+          <w:b w:val="0"/>
+          <w:i w:val="0"/>
+        </w:rPr>
+        <w:t>"What?"</w:t>
+      </w:r>
+    </w:p>
+    <w:p>
+      <w:pPr>
+        <w:spacing w:before="40" w:after="40"/>
+        <w:ind w:firstLine="432"/>
+      </w:pPr>
+      <w:r>
+        <w:rPr>
+          <w:b w:val="0"/>
+          <w:i w:val="0"/>
+        </w:rPr>
+        <w:t>"The control nexus. I'm reading a manufacturer's stamp on the micro-fusion cells. Union military procurement. And there's a designation code." He read it off the screen, his voice flat. "UMSF-Vanguard. Batch number matches a requisition order from the Thirty-First Strategic Fleet."</w:t>
+      </w:r>
+    </w:p>
+    <w:p>
+      <w:pPr>
+        <w:spacing w:before="40" w:after="40"/>
+        <w:ind w:firstLine="432"/>
+      </w:pPr>
+      <w:r>
+        <w:rPr>
+          <w:b w:val="0"/>
+          <w:i w:val="0"/>
+        </w:rPr>
+        <w:t>"You know it?"</w:t>
+      </w:r>
+    </w:p>
+    <w:p>
+      <w:pPr>
+        <w:spacing w:before="40" w:after="40"/>
+        <w:ind w:firstLine="432"/>
+      </w:pPr>
+      <w:r>
+        <w:rPr>
+          <w:b w:val="0"/>
+          <w:i w:val="0"/>
+        </w:rPr>
+        <w:t>Miro laughed, but there was no humor in it. "The Thirty-First Strategic Fleet doesn't exist. Officially. It's a ghost division — Union black-budget, no congressional oversight, no public mandate. They handle..." He trailed off, then chose his words carefully. "Planetary asset denial. When the Union decides a world's resources are more valuable than its inhabitants, the Thirty-First makes the inhabitants go away. Quietly."</w:t>
+      </w:r>
+    </w:p>
+    <w:p>
+      <w:pPr>
+        <w:spacing w:before="40" w:after="40"/>
+        <w:ind w:firstLine="432"/>
+      </w:pPr>
+      <w:r>
+        <w:rPr>
+          <w:b w:val="0"/>
+          <w:i w:val="0"/>
+        </w:rPr>
+        <w:t xml:space="preserve">The word </w:t>
       </w:r>
       <w:r>
         <w:rPr>
           <w:b w:val="0"/>
           <w:i/>
         </w:rPr>
-        <w:t>mine.</w:t>
-      </w:r>
-    </w:p>
-    <w:p>
-      <w:pPr>
-        <w:spacing w:before="40" w:after="40"/>
-        <w:ind w:firstLine="432"/>
-      </w:pPr>
-      <w:r>
-        <w:rPr>
-          <w:b w:val="0"/>
-          <w:i w:val="0"/>
-        </w:rPr>
-        <w:t>He flew the ship along the cage's edge. The lattice scrolled past the viewport, node after node, each one a small sun of gravitic force. Miro worked in silence — real silence, no jokes, no patter — his focus absolute, cross-referencing signal patterns and muttering numbers under his breath.</w:t>
-      </w:r>
-    </w:p>
-    <w:p>
-      <w:pPr>
-        <w:spacing w:before="40" w:after="40"/>
-        <w:ind w:firstLine="432"/>
-      </w:pPr>
-      <w:r>
-        <w:rPr>
-          <w:b w:val="0"/>
-          <w:i w:val="0"/>
-        </w:rPr>
-        <w:t>Twenty minutes in, he stopped.</w:t>
-      </w:r>
-    </w:p>
-    <w:p>
-      <w:pPr>
-        <w:spacing w:before="40" w:after="40"/>
-        <w:ind w:firstLine="432"/>
-      </w:pPr>
-      <w:r>
-        <w:rPr>
-          <w:b w:val="0"/>
-          <w:i w:val="0"/>
-        </w:rPr>
-        <w:t>"There." He pointed to a section of the netting where the nodes were spaced more densely, their connecting lines converging like roads into a city center. "The signal architecture funnels here. Every node in the grid references this cluster for timing synchronization. Kill this, and the whole net destabilizes."</w:t>
-      </w:r>
-    </w:p>
-    <w:p>
-      <w:pPr>
-        <w:spacing w:before="40" w:after="40"/>
-        <w:ind w:firstLine="432"/>
-      </w:pPr>
-      <w:r>
-        <w:rPr>
-          <w:b w:val="0"/>
-          <w:i w:val="0"/>
-        </w:rPr>
-        <w:t>"Can we reach it?"</w:t>
-      </w:r>
-    </w:p>
-    <w:p>
-      <w:pPr>
-        <w:spacing w:before="40" w:after="40"/>
-        <w:ind w:firstLine="432"/>
-      </w:pPr>
-      <w:r>
-        <w:rPr>
-          <w:b w:val="0"/>
-          <w:i w:val="0"/>
-        </w:rPr>
-        <w:t>"It's inside the cage. About five hundred meters past the barrier." He pulled up more data and froze. "Kael."</w:t>
-      </w:r>
-    </w:p>
-    <w:p>
-      <w:pPr>
-        <w:spacing w:before="40" w:after="40"/>
-        <w:ind w:firstLine="432"/>
-      </w:pPr>
-      <w:r>
-        <w:rPr>
-          <w:b w:val="0"/>
-          <w:i w:val="0"/>
-        </w:rPr>
-        <w:t>"What?"</w:t>
-      </w:r>
-    </w:p>
-    <w:p>
-      <w:pPr>
-        <w:spacing w:before="40" w:after="40"/>
-        <w:ind w:firstLine="432"/>
-      </w:pPr>
-      <w:r>
-        <w:rPr>
-          <w:b w:val="0"/>
-          <w:i w:val="0"/>
-        </w:rPr>
-        <w:t>"The control nexus. I'm reading a manufacturer's stamp on the micro-fusion cells. Union military procurement. And there's a designation code." He read it off the screen, his voice flat. "UMSF-Vanguard. Batch number matches a requisition order from the Thirty-First Strategic Fleet."</w:t>
-      </w:r>
-    </w:p>
-    <w:p>
-      <w:pPr>
-        <w:spacing w:before="40" w:after="40"/>
-        <w:ind w:firstLine="432"/>
-      </w:pPr>
-      <w:r>
-        <w:rPr>
-          <w:b w:val="0"/>
-          <w:i w:val="0"/>
-        </w:rPr>
-        <w:t>"You know it?"</w:t>
-      </w:r>
-    </w:p>
-    <w:p>
-      <w:pPr>
-        <w:spacing w:before="40" w:after="40"/>
-        <w:ind w:firstLine="432"/>
-      </w:pPr>
-      <w:r>
-        <w:rPr>
-          <w:b w:val="0"/>
-          <w:i w:val="0"/>
-        </w:rPr>
-        <w:t>Miro laughed, but there was no humor in it. "The Thirty-First Strategic Fleet doesn't exist. Officially. It's a ghost division — Union black-budget, no congressional oversight, no public mandate. They handle..." He trailed off, then chose his words carefully. "Planetary asset denial. When the Union decides a world's resources are more valuable than its inhabitants, the Thirty-First makes the inhabitants go away. Quietly."</w:t>
-      </w:r>
-    </w:p>
-    <w:p>
-      <w:pPr>
-        <w:spacing w:before="40" w:after="40"/>
-        <w:ind w:firstLine="432"/>
-      </w:pPr>
-      <w:r>
-        <w:rPr>
-          <w:b w:val="0"/>
-          <w:i w:val="0"/>
-        </w:rPr>
-        <w:t xml:space="preserve">The word </w:t>
+        <w:t>defunded</w:t>
+      </w:r>
+      <w:r>
+        <w:rPr>
+          <w:b w:val="0"/>
+          <w:i w:val="0"/>
+        </w:rPr>
+        <w:t xml:space="preserve"> echoed in Kael's memory. Miro's research. Species that met the threshold for protected status, swimming over mineral deposits the Union had already sold.</w:t>
+      </w:r>
+    </w:p>
+    <w:p>
+      <w:pPr>
+        <w:spacing w:before="40" w:after="40"/>
+        <w:ind w:firstLine="432"/>
+      </w:pPr>
+      <w:r>
+        <w:rPr>
+          <w:b w:val="0"/>
+          <w:i w:val="0"/>
+        </w:rPr>
+        <w:t>"This wasn't an accident," Kael said. "Someone in the Union command structure knows what the Choir guards. They built this cage knowing exactly what would happen when the Choir died."</w:t>
+      </w:r>
+    </w:p>
+    <w:p>
+      <w:pPr>
+        <w:spacing w:before="40" w:after="40"/>
+        <w:ind w:firstLine="432"/>
+      </w:pPr>
+      <w:r>
+        <w:rPr>
+          <w:b w:val="0"/>
+          <w:i w:val="0"/>
+        </w:rPr>
+        <w:t>"They want the rift open."</w:t>
+      </w:r>
+    </w:p>
+    <w:p>
+      <w:pPr>
+        <w:spacing w:before="40" w:after="40"/>
+        <w:ind w:firstLine="432"/>
+      </w:pPr>
+      <w:r>
+        <w:rPr>
+          <w:b w:val="0"/>
+          <w:i w:val="0"/>
+        </w:rPr>
+        <w:t>"Or they want what comes out of it. An anti-frequency weapon that severs communication across an entire sector — that's not a natural disaster. That's a military asset."</w:t>
+      </w:r>
+    </w:p>
+    <w:p>
+      <w:pPr>
+        <w:spacing w:before="40" w:after="40"/>
+        <w:ind w:firstLine="432"/>
+      </w:pPr>
+      <w:r>
+        <w:rPr>
+          <w:b w:val="0"/>
+          <w:i w:val="0"/>
+        </w:rPr>
+        <w:t>Miro stared at the designation code on his screen. "I spent eleven years filing reports. I thought I was fighting bureaucratic indifference. Bad priorities. Budget —" He shook his head. "It wasn't indifference. They knew. They've known all along."</w:t>
+      </w:r>
+    </w:p>
+    <w:p>
+      <w:pPr>
+        <w:spacing w:before="40" w:after="40"/>
+        <w:ind w:firstLine="432"/>
+      </w:pPr>
+      <w:r>
+        <w:rPr>
+          <w:b w:val="0"/>
+          <w:i w:val="0"/>
+        </w:rPr>
+        <w:t>"Systems don't fail," Kael said quietly. "People design them that way."</w:t>
+      </w:r>
+    </w:p>
+    <w:p>
+      <w:pPr>
+        <w:spacing w:before="40" w:after="40"/>
+        <w:ind w:firstLine="432"/>
+      </w:pPr>
+      <w:r>
+        <w:rPr>
+          <w:b w:val="0"/>
+          <w:i w:val="0"/>
+        </w:rPr>
+        <w:t>The ship drifted beside the cage. Beyond the lattice, the Choir moved — shapes trailing curtains of light, their song pressing against the hull, against Kael's mind. Even filtered through the ship's insulation, he could feel their exhaustion. Their frequency was thinner than it should have been. Fraying. They were holding the seal with everything they had left, and everything they had left was not enough for sixty-eight more hours.</w:t>
+      </w:r>
+    </w:p>
+    <w:p>
+      <w:pPr>
+        <w:spacing w:before="40" w:after="40"/>
+        <w:ind w:firstLine="432"/>
+      </w:pPr>
+      <w:r>
+        <w:rPr>
+          <w:b w:val="0"/>
+          <w:i w:val="0"/>
+        </w:rPr>
+        <w:t>"We need to get inside the cage," Kael said. "Destroy the nexus."</w:t>
+      </w:r>
+    </w:p>
+    <w:p>
+      <w:pPr>
+        <w:spacing w:before="40" w:after="40"/>
+        <w:ind w:firstLine="432"/>
+      </w:pPr>
+      <w:r>
+        <w:rPr>
+          <w:b w:val="0"/>
+          <w:i w:val="0"/>
+        </w:rPr>
+        <w:t>"The barrier will crush anything biological that tries to pass through."</w:t>
+      </w:r>
+    </w:p>
+    <w:p>
+      <w:pPr>
+        <w:spacing w:before="40" w:after="40"/>
+        <w:ind w:firstLine="432"/>
+      </w:pPr>
+      <w:r>
+        <w:rPr>
+          <w:b w:val="0"/>
+          <w:i w:val="0"/>
+        </w:rPr>
+        <w:t>"Then we don't go through. We go under." He pulled up the cage schematics Miro had mapped. "The netting has to anchor somewhere. What's the lowest point?"</w:t>
+      </w:r>
+    </w:p>
+    <w:p>
+      <w:pPr>
+        <w:spacing w:before="40" w:after="40"/>
+        <w:ind w:firstLine="432"/>
+      </w:pPr>
+      <w:r>
+        <w:rPr>
+          <w:b w:val="0"/>
+          <w:i w:val="0"/>
+        </w:rPr>
+        <w:t>Miro scanned. "Bottom edge terminates at eleven thousand meters. Below that, it's open ocean — just the rift. But Kael, the pressure at eleven thousand meters —"</w:t>
+      </w:r>
+    </w:p>
+    <w:p>
+      <w:pPr>
+        <w:spacing w:before="40" w:after="40"/>
+        <w:ind w:firstLine="432"/>
+      </w:pPr>
+      <w:r>
+        <w:rPr>
+          <w:b w:val="0"/>
+          <w:i w:val="0"/>
+        </w:rPr>
+        <w:t xml:space="preserve">"The </w:t>
       </w:r>
       <w:r>
         <w:rPr>
           <w:b w:val="0"/>
           <w:i/>
         </w:rPr>
-        <w:t>defunded</w:t>
-      </w:r>
-      <w:r>
-        <w:rPr>
-          <w:b w:val="0"/>
-          <w:i w:val="0"/>
-        </w:rPr>
-        <w:t xml:space="preserve"> echoed in Kael's memory. Miro's research. Species that met the threshold for protected status, swimming over mineral deposits the Union had already sold.</w:t>
-      </w:r>
-    </w:p>
-    <w:p>
-      <w:pPr>
-        <w:spacing w:before="40" w:after="40"/>
-        <w:ind w:firstLine="432"/>
-      </w:pPr>
-      <w:r>
-        <w:rPr>
-          <w:b w:val="0"/>
-          <w:i w:val="0"/>
-        </w:rPr>
-        <w:t>"This wasn't an accident," Kael said. "Someone in the Union command structure knows what the Choir guards. They built this cage knowing exactly what would happen when the Choir died."</w:t>
-      </w:r>
-    </w:p>
-    <w:p>
-      <w:pPr>
-        <w:spacing w:before="40" w:after="40"/>
-        <w:ind w:firstLine="432"/>
-      </w:pPr>
-      <w:r>
-        <w:rPr>
-          <w:b w:val="0"/>
-          <w:i w:val="0"/>
-        </w:rPr>
-        <w:t>"They want the rift open."</w:t>
-      </w:r>
-    </w:p>
-    <w:p>
-      <w:pPr>
-        <w:spacing w:before="40" w:after="40"/>
-        <w:ind w:firstLine="432"/>
-      </w:pPr>
-      <w:r>
-        <w:rPr>
-          <w:b w:val="0"/>
-          <w:i w:val="0"/>
-        </w:rPr>
-        <w:t>"Or they want what comes out of it. An anti-frequency weapon that severs communication across an entire sector — that's not a natural disaster. That's a military asset."</w:t>
-      </w:r>
-    </w:p>
-    <w:p>
-      <w:pPr>
-        <w:spacing w:before="40" w:after="40"/>
-        <w:ind w:firstLine="432"/>
-      </w:pPr>
-      <w:r>
-        <w:rPr>
-          <w:b w:val="0"/>
-          <w:i w:val="0"/>
-        </w:rPr>
-        <w:t>Miro stared at the designation code on his screen. "I spent eleven years filing reports. I thought I was fighting bureaucratic indifference. Bad priorities. Budget —" He shook his head. "It wasn't indifference. They knew. They've known all along."</w:t>
-      </w:r>
-    </w:p>
-    <w:p>
-      <w:pPr>
-        <w:spacing w:before="40" w:after="40"/>
-        <w:ind w:firstLine="432"/>
-      </w:pPr>
-      <w:r>
-        <w:rPr>
-          <w:b w:val="0"/>
-          <w:i w:val="0"/>
-        </w:rPr>
-        <w:t>The ship drifted beside the cage. Beyond the lattice, the Choir moved — shapes trailing curtains of light, their song pressing against the hull, against Kael's mind. Even filtered through the ship's insulation, he could feel their exhaustion. Their frequency was thinner than it should have been. Fraying. They were holding the seal with everything they had left, and everything they had left was not enough for sixty-eight more hours.</w:t>
-      </w:r>
-    </w:p>
-    <w:p>
-      <w:pPr>
-        <w:spacing w:before="40" w:after="40"/>
-        <w:ind w:firstLine="432"/>
-      </w:pPr>
-      <w:r>
-        <w:rPr>
-          <w:b w:val="0"/>
-          <w:i w:val="0"/>
-        </w:rPr>
-        <w:t>"We need to get inside the cage," Kael said. "Destroy the nexus."</w:t>
-      </w:r>
-    </w:p>
-    <w:p>
-      <w:pPr>
-        <w:spacing w:before="40" w:after="40"/>
-        <w:ind w:firstLine="432"/>
-      </w:pPr>
-      <w:r>
-        <w:rPr>
-          <w:b w:val="0"/>
-          <w:i w:val="0"/>
-        </w:rPr>
-        <w:t>"The barrier will crush anything biological that tries to pass through."</w:t>
-      </w:r>
-    </w:p>
-    <w:p>
-      <w:pPr>
-        <w:spacing w:before="40" w:after="40"/>
-        <w:ind w:firstLine="432"/>
-      </w:pPr>
-      <w:r>
-        <w:rPr>
-          <w:b w:val="0"/>
-          <w:i w:val="0"/>
-        </w:rPr>
-        <w:t>"Then we don't go through. We go under." He pulled up the cage schematics Miro had mapped. "The netting has to anchor somewhere. What's the lowest point?"</w:t>
-      </w:r>
-    </w:p>
-    <w:p>
-      <w:pPr>
-        <w:spacing w:before="40" w:after="40"/>
-        <w:ind w:firstLine="432"/>
-      </w:pPr>
-      <w:r>
-        <w:rPr>
-          <w:b w:val="0"/>
-          <w:i w:val="0"/>
-        </w:rPr>
-        <w:t>Miro scanned. "Bottom edge terminates at eleven thousand meters. Below that, it's open ocean — just the rift. But Kael, the pressure at eleven thousand meters —"</w:t>
-      </w:r>
-    </w:p>
-    <w:p>
-      <w:pPr>
-        <w:spacing w:before="40" w:after="40"/>
-        <w:ind w:firstLine="432"/>
-      </w:pPr>
-      <w:r>
-        <w:rPr>
-          <w:b w:val="0"/>
-          <w:i w:val="0"/>
-        </w:rPr>
-        <w:t xml:space="preserve">"The </w:t>
-      </w:r>
+        <w:t>Fang &amp; Fable</w:t>
+      </w:r>
+      <w:r>
+        <w:rPr>
+          <w:b w:val="0"/>
+          <w:i w:val="0"/>
+        </w:rPr>
+        <w:t xml:space="preserve"> is rated to twelve."</w:t>
+      </w:r>
+    </w:p>
+    <w:p>
+      <w:pPr>
+        <w:spacing w:before="40" w:after="40"/>
+        <w:ind w:firstLine="432"/>
+      </w:pPr>
+      <w:r>
+        <w:rPr>
+          <w:b w:val="0"/>
+          <w:i w:val="0"/>
+        </w:rPr>
+        <w:t>"Rated by whom?"</w:t>
+      </w:r>
+    </w:p>
+    <w:p>
+      <w:pPr>
+        <w:spacing w:before="40" w:after="40"/>
+        <w:ind w:firstLine="432"/>
+      </w:pPr>
+      <w:r>
+        <w:rPr>
+          <w:b w:val="0"/>
+          <w:i w:val="0"/>
+        </w:rPr>
+        <w:t>"Me. I reinforced the hull myself."</w:t>
+      </w:r>
+    </w:p>
+    <w:p>
+      <w:pPr>
+        <w:spacing w:before="40" w:after="40"/>
+        <w:ind w:firstLine="432"/>
+      </w:pPr>
+      <w:r>
+        <w:rPr>
+          <w:b w:val="0"/>
+          <w:i w:val="0"/>
+        </w:rPr>
+        <w:t>"With what?"</w:t>
+      </w:r>
+    </w:p>
+    <w:p>
+      <w:pPr>
+        <w:spacing w:before="40" w:after="40"/>
+        <w:ind w:firstLine="432"/>
+      </w:pPr>
+      <w:r>
+        <w:rPr>
+          <w:b w:val="0"/>
+          <w:i w:val="0"/>
+        </w:rPr>
+        <w:t>"Illegal solder and sheer stubbornness."</w:t>
+      </w:r>
+    </w:p>
+    <w:p>
+      <w:pPr>
+        <w:spacing w:before="40" w:after="40"/>
+        <w:ind w:firstLine="432"/>
+      </w:pPr>
+      <w:r>
+        <w:rPr>
+          <w:b w:val="0"/>
+          <w:i w:val="0"/>
+        </w:rPr>
+        <w:t>Miro stared at him. Then, slowly, the grin came back — battered, tired, but real. "You know what? I believe you. I absolutely believe this ship runs on spite."</w:t>
+      </w:r>
+    </w:p>
+    <w:p>
+      <w:pPr>
+        <w:spacing w:before="40" w:after="40"/>
+        <w:ind w:firstLine="432"/>
+      </w:pPr>
+      <w:r>
+        <w:rPr>
+          <w:b w:val="0"/>
+          <w:i w:val="0"/>
+        </w:rPr>
+        <w:t>"It runs on a Kellerman-IV drive core. But spite helps."</w:t>
+      </w:r>
+    </w:p>
+    <w:p>
+      <w:pPr>
+        <w:spacing w:before="40" w:after="40"/>
+        <w:ind w:firstLine="432"/>
+      </w:pPr>
+      <w:r>
+        <w:rPr>
+          <w:b w:val="0"/>
+          <w:i w:val="0"/>
+        </w:rPr>
+        <w:t>Miro opened his mouth, closed it, then tried anyway: "Spite — the renewable energy source they don't want you to know about."</w:t>
+      </w:r>
+    </w:p>
+    <w:p>
+      <w:pPr>
+        <w:spacing w:before="40" w:after="40"/>
+        <w:ind w:firstLine="432"/>
+      </w:pPr>
+      <w:r>
+        <w:rPr>
+          <w:b w:val="0"/>
+          <w:i w:val="0"/>
+        </w:rPr>
+        <w:t>Nothing. Kael was checking the depth gauge. Talon was preening a wing feather. The line hung in the recycled air for a beat too long, and Miro's eyes registered it — a flicker, barely visible, the micro-awareness of a rhythm missed — before he moved on as if it hadn't happened.</w:t>
+      </w:r>
+    </w:p>
+    <w:p>
+      <w:pPr>
+        <w:spacing w:before="40" w:after="40"/>
+        <w:ind w:firstLine="432"/>
+      </w:pPr>
+      <w:r>
+        <w:rPr>
+          <w:b w:val="0"/>
+          <w:i w:val="0"/>
+        </w:rPr>
+        <w:t>"Sixty-eight hours," Miro said.</w:t>
+      </w:r>
+    </w:p>
+    <w:p>
+      <w:pPr>
+        <w:spacing w:before="40" w:after="40"/>
+        <w:ind w:firstLine="432"/>
+      </w:pPr>
+      <w:r>
+        <w:rPr>
+          <w:b w:val="0"/>
+          <w:i w:val="0"/>
+        </w:rPr>
+        <w:t>"Sixty-seven and change."</w:t>
+      </w:r>
+    </w:p>
+    <w:p>
+      <w:pPr>
+        <w:spacing w:before="40" w:after="40"/>
+        <w:ind w:firstLine="432"/>
+      </w:pPr>
+      <w:r>
+        <w:rPr>
+          <w:b w:val="0"/>
+          <w:i w:val="0"/>
+        </w:rPr>
+        <w:t>"Then let's stop sitting here looking at it." He strapped in. "Take us down, Orin. Under the cage. And if your illegal solder holds, I'll buy you a drink on whatever station we find next."</w:t>
+      </w:r>
+    </w:p>
+    <w:p>
+      <w:pPr>
+        <w:spacing w:before="40" w:after="40"/>
+        <w:ind w:firstLine="432"/>
+      </w:pPr>
+      <w:r>
+        <w:rPr>
+          <w:b w:val="0"/>
+          <w:i w:val="0"/>
+        </w:rPr>
+        <w:t>"And if it doesn't hold?"</w:t>
+      </w:r>
+    </w:p>
+    <w:p>
+      <w:pPr>
+        <w:spacing w:before="40" w:after="40"/>
+        <w:ind w:firstLine="432"/>
+      </w:pPr>
+      <w:r>
+        <w:rPr>
+          <w:b w:val="0"/>
+          <w:i w:val="0"/>
+        </w:rPr>
+        <w:t>"Then we'll be too flat to care."</w:t>
+      </w:r>
+    </w:p>
+    <w:p>
+      <w:pPr>
+        <w:spacing w:before="40" w:after="40"/>
+        <w:ind w:firstLine="432"/>
+      </w:pPr>
+      <w:r>
+        <w:rPr>
+          <w:b w:val="0"/>
+          <w:i w:val="0"/>
+        </w:rPr>
+        <w:t>Kael took the ship down.</w:t>
+      </w:r>
+    </w:p>
+    <w:p>
+      <w:pPr>
+        <w:spacing w:before="40" w:after="40"/>
+        <w:ind w:firstLine="432"/>
+      </w:pPr>
+      <w:r>
+        <w:rPr>
+          <w:b w:val="0"/>
+          <w:i w:val="0"/>
+        </w:rPr>
+        <w:t>Behind them, the Choir's song shifted — a new chord, but even Kael's battered frequency-sense could read its root note clearly:</w:t>
+      </w:r>
+    </w:p>
+    <w:p>
+      <w:pPr>
+        <w:spacing w:before="40" w:after="40"/>
+        <w:ind w:firstLine="432"/>
+      </w:pPr>
       <w:r>
         <w:rPr>
           <w:b w:val="0"/>
           <w:i/>
         </w:rPr>
-        <w:t>Fang &amp; Fable</w:t>
-      </w:r>
-      <w:r>
-        <w:rPr>
-          <w:b w:val="0"/>
-          <w:i w:val="0"/>
-        </w:rPr>
-        <w:t xml:space="preserve"> is rated to twelve."</w:t>
-      </w:r>
-    </w:p>
-    <w:p>
-      <w:pPr>
-        <w:spacing w:before="40" w:after="40"/>
-        <w:ind w:firstLine="432"/>
-      </w:pPr>
-      <w:r>
-        <w:rPr>
-          <w:b w:val="0"/>
-          <w:i w:val="0"/>
-        </w:rPr>
-        <w:t>"Rated by whom?"</w:t>
-      </w:r>
-    </w:p>
-    <w:p>
-      <w:pPr>
-        <w:spacing w:before="40" w:after="40"/>
-        <w:ind w:firstLine="432"/>
-      </w:pPr>
-      <w:r>
-        <w:rPr>
-          <w:b w:val="0"/>
-          <w:i w:val="0"/>
-        </w:rPr>
-        <w:t>"Me. I reinforced the hull myself."</w:t>
-      </w:r>
-    </w:p>
-    <w:p>
-      <w:pPr>
-        <w:spacing w:before="40" w:after="40"/>
-        <w:ind w:firstLine="432"/>
-      </w:pPr>
-      <w:r>
-        <w:rPr>
-          <w:b w:val="0"/>
-          <w:i w:val="0"/>
-        </w:rPr>
-        <w:t>"With what?"</w:t>
-      </w:r>
-    </w:p>
-    <w:p>
-      <w:pPr>
-        <w:spacing w:before="40" w:after="40"/>
-        <w:ind w:firstLine="432"/>
-      </w:pPr>
-      <w:r>
-        <w:rPr>
-          <w:b w:val="0"/>
-          <w:i w:val="0"/>
-        </w:rPr>
-        <w:t>"Illegal solder and sheer stubbornness."</w:t>
-      </w:r>
-    </w:p>
-    <w:p>
-      <w:pPr>
-        <w:spacing w:before="40" w:after="40"/>
-        <w:ind w:firstLine="432"/>
-      </w:pPr>
-      <w:r>
-        <w:rPr>
-          <w:b w:val="0"/>
-          <w:i w:val="0"/>
-        </w:rPr>
-        <w:t>Miro stared at him. Then, slowly, the grin came back — battered, tired, but real. "You know what? I believe you. I absolutely believe this ship runs on spite."</w:t>
-      </w:r>
-    </w:p>
-    <w:p>
-      <w:pPr>
-        <w:spacing w:before="40" w:after="40"/>
-        <w:ind w:firstLine="432"/>
-      </w:pPr>
-      <w:r>
-        <w:rPr>
-          <w:b w:val="0"/>
-          <w:i w:val="0"/>
-        </w:rPr>
-        <w:t>"It runs on a Kellerman-IV drive core. But spite helps."</w:t>
-      </w:r>
-    </w:p>
-    <w:p>
-      <w:pPr>
-        <w:spacing w:before="40" w:after="40"/>
-        <w:ind w:firstLine="432"/>
-      </w:pPr>
-      <w:r>
-        <w:rPr>
-          <w:b w:val="0"/>
-          <w:i w:val="0"/>
-        </w:rPr>
-        <w:t>Miro opened his mouth, closed it, then tried anyway: "Spite — the renewable energy source they don't want you to know about."</w:t>
-      </w:r>
-    </w:p>
-    <w:p>
-      <w:pPr>
-        <w:spacing w:before="40" w:after="40"/>
-        <w:ind w:firstLine="432"/>
-      </w:pPr>
-      <w:r>
-        <w:rPr>
-          <w:b w:val="0"/>
-          <w:i w:val="0"/>
-        </w:rPr>
-        <w:t>Nothing. Kael was checking the depth gauge. Talon was preening a wing feather. The line hung in the recycled air for a beat too long, and Miro's eyes registered it — a flicker, barely visible, the micro-awareness of a rhythm missed — before he moved on as if it hadn't happened.</w:t>
-      </w:r>
-    </w:p>
-    <w:p>
-      <w:pPr>
-        <w:spacing w:before="40" w:after="40"/>
-        <w:ind w:firstLine="432"/>
-      </w:pPr>
-      <w:r>
-        <w:rPr>
-          <w:b w:val="0"/>
-          <w:i w:val="0"/>
-        </w:rPr>
-        <w:t>"Sixty-eight hours," Miro said.</w:t>
-      </w:r>
-    </w:p>
-    <w:p>
-      <w:pPr>
-        <w:spacing w:before="40" w:after="40"/>
-        <w:ind w:firstLine="432"/>
-      </w:pPr>
-      <w:r>
-        <w:rPr>
-          <w:b w:val="0"/>
-          <w:i w:val="0"/>
-        </w:rPr>
-        <w:t>"Sixty-seven and change."</w:t>
-      </w:r>
-    </w:p>
-    <w:p>
-      <w:pPr>
-        <w:spacing w:before="40" w:after="40"/>
-        <w:ind w:firstLine="432"/>
-      </w:pPr>
-      <w:r>
-        <w:rPr>
-          <w:b w:val="0"/>
-          <w:i w:val="0"/>
-        </w:rPr>
-        <w:t>"Then let's stop sitting here looking at it." He strapped in. "Take us down, Orin. Under the cage. And if your illegal solder holds, I'll buy you a drink on whatever station we find next."</w:t>
-      </w:r>
-    </w:p>
-    <w:p>
-      <w:pPr>
-        <w:spacing w:before="40" w:after="40"/>
-        <w:ind w:firstLine="432"/>
-      </w:pPr>
-      <w:r>
-        <w:rPr>
-          <w:b w:val="0"/>
-          <w:i w:val="0"/>
-        </w:rPr>
-        <w:t>"And if it doesn't hold?"</w:t>
-      </w:r>
-    </w:p>
-    <w:p>
-      <w:pPr>
-        <w:spacing w:before="40" w:after="40"/>
-        <w:ind w:firstLine="432"/>
-      </w:pPr>
-      <w:r>
-        <w:rPr>
-          <w:b w:val="0"/>
-          <w:i w:val="0"/>
-        </w:rPr>
-        <w:t>"Then we'll be too flat to care."</w:t>
-      </w:r>
-    </w:p>
-    <w:p>
-      <w:pPr>
-        <w:spacing w:before="40" w:after="40"/>
-        <w:ind w:firstLine="432"/>
-      </w:pPr>
-      <w:r>
-        <w:rPr>
-          <w:b w:val="0"/>
-          <w:i w:val="0"/>
-        </w:rPr>
-        <w:t>Kael took the ship down.</w:t>
-      </w:r>
-    </w:p>
-    <w:p>
-      <w:pPr>
-        <w:spacing w:before="40" w:after="40"/>
-        <w:ind w:firstLine="432"/>
-      </w:pPr>
-      <w:r>
-        <w:rPr>
-          <w:b w:val="0"/>
-          <w:i w:val="0"/>
-        </w:rPr>
-        <w:t>Behind them, the Choir's song shifted — a new chord, but even Kael's battered frequency-sense could read its root note clearly:</w:t>
-      </w:r>
-    </w:p>
-    <w:p>
-      <w:pPr>
-        <w:spacing w:before="40" w:after="40"/>
-        <w:ind w:firstLine="432"/>
-      </w:pPr>
-      <w:r>
-        <w:rPr>
-          <w:b w:val="0"/>
-          <w:i/>
-        </w:rPr>
         <w:t>Hurry.</w:t>
       </w:r>
     </w:p>
@@ -3972,7 +3971,7 @@
           <w:b w:val="0"/>
           <w:i w:val="0"/>
         </w:rPr>
-        <w:t>Below them, the ocean went on forever. The cage glowed above like a false sky.</w:t>
+        <w:t>Below them, the ocean went on forever. The cage hung above them. Wrong.</w:t>
       </w:r>
     </w:p>
     <w:p>
@@ -4935,7 +4934,7 @@
           <w:b w:val="0"/>
           <w:i w:val="0"/>
         </w:rPr>
-        <w:t xml:space="preserve"> that shouldn't have been there, a half-second gap where the machinery of her composure had to catch and re-engage. "I've encountered their work before. A colony on Pellan-V — indigenous population relocated overnight. Official records said voluntary resettlement. The ground still had scorch marks." Her hand released the console. She didn't look at it, didn't acknowledge the grip, but Kael saw the blood return to her fingers. Whatever Pellan-V was to her, it wasn't just a case file. "If this is their operation, then it was authorized at the highest level of Union military command. Which means the Union itself is in violation of the Accord."</w:t>
+        <w:t xml:space="preserve"> that shouldn't have been there, a half-second gap where the machinery of her composure had to catch and re-engage. "I've encountered their work before. A colony on Pellan-V — indigenous population relocated overnight. Official records said voluntary resettlement. The ground still had scorch marks. I remember the smell." Her hand released the console. She didn't look at it, didn't acknowledge the grip, but Kael saw the blood return to her fingers. Whatever Pellan-V was to her, it wasn't just a case file. "If this is their operation, then it was authorized at the highest level of Union military command. Which means the Union itself is in violation of the Accord."</w:t>
       </w:r>
     </w:p>
     <w:p>
@@ -5079,7 +5078,7 @@
           <w:b w:val="0"/>
           <w:i w:val="0"/>
         </w:rPr>
-        <w:t>Sera's jaw tightened. Kael watched her weigh it — the law against the living, the procedure against the ticking clock. Two kinds of pressure, and she was the thing being crushed between them. [MOTIF] He'd seen that look before, on the faces of people who believed in systems.</w:t>
+        <w:t>Sera's jaw tightened. Kael watched her weigh it — the law against the living, the procedure against the ticking clock. Two pressures. She stood between them and didn't move. [MOTIF] He'd seen that look before, on the faces of people who believed in systems.</w:t>
       </w:r>
     </w:p>
     <w:p>
@@ -5681,7 +5680,7 @@
           <w:b w:val="0"/>
           <w:i w:val="0"/>
         </w:rPr>
-        <w:t>"Logging this as an authorized Covenant emergency intervention," she said. "Under Article Twelve, subsection four — immediate action to preserve sentient life where delay would result in irreversible harm." She paused. "If we die, the legal record will show we died correctly."</w:t>
+        <w:t>"Logging this as an authorized Covenant emergency intervention," she said. "Under Article Twelve, subsection four — immediate action to preserve sentient life where delay would result in irreversible harm." She paused. "If we die, it will be properly documented."</w:t>
       </w:r>
     </w:p>
     <w:p>
@@ -6591,7 +6590,7 @@
           <w:b w:val="0"/>
           <w:i w:val="0"/>
         </w:rPr>
-        <w:t>Not human joy. This was joy as architecture — a multi-layered harmonic that used emotional registers Kael didn't have names for, each voice contributing a strand until the combined frequency became something closer to music. To prayer.</w:t>
+        <w:t>It wasn't human joy. It was too large for that. Too steady. Like something ancient finally allowed to breathe again.</w:t>
       </w:r>
     </w:p>
     <w:p>
@@ -6658,7 +6657,7 @@
           <w:b w:val="0"/>
           <w:i w:val="0"/>
         </w:rPr>
-        <w:t>Sera's hand was on the viewport glass. She pulled it back when she saw Kael looking — a quick, sharp motion, as if the glass had burned her. Whatever she'd been reaching toward in those four seconds, she wasn't going to name it.</w:t>
+        <w:t>Sera's hand was on the viewport glass. She pulled it back when she saw Kael looking — a quick, sharp motion, as if the glass had burned her. She adjusted her sleeve as if that had been the point. Whatever she'd been reaching toward in those four seconds, she wasn't going to name it.</w:t>
       </w:r>
     </w:p>
     <w:p>
@@ -7055,7 +7054,7 @@
           <w:b w:val="0"/>
           <w:i w:val="0"/>
         </w:rPr>
-        <w:t>Kael let the frequency fade and opened his eyes. Through the viewport, the Choir's light painted the water — blue, white, pale gold. He did the math the way he always did, quietly, without sharing. One ship held together by illegal solder. One Lawkeeper interceptor built for speed, not sustained combat. One xenobiologist in a damp EVA suit. One Lawkeeper who gripped consoles too hard when she thought no one was looking. A hawk and an owl who couldn't agree on anything. And forty-seven beings the size of city districts who had spent two years starving and could barely hold their song together.</w:t>
+        <w:t>Kael let the frequency fade and opened his eyes. Through the viewport, the Choir's light painted the water — blue, white, pale gold. He did the math the way he always did, quietly, without sharing. One ship held together by illegal solder. One Lawkeeper interceptor built for speed, not sustained combat. One xenobiologist in a damp EVA suit. One Lawkeeper who gripped consoles too hard when she thought no one was looking. A hawk who trusted instinct. An owl who trusted evidence. And forty-seven beings the size of city districts who had spent two years starving and could barely hold their song together.</w:t>
       </w:r>
     </w:p>
     <w:p>
@@ -7296,7 +7295,7 @@
           <w:b w:val="0"/>
           <w:i w:val="0"/>
         </w:rPr>
-        <w:t>Kael felt it before the bioscanners confirmed it. A thinning in the frequency, like a voice going hoarse. One strand of the Choir's forty-seven-part harmony was losing coherence, its signal fraying at the edges, dropping in and out of phase with the collective. The others were compensating — closing ranks around the weakening voice, bolstering it with their own frequencies, trying to hold the song together the way you'd hold a wounded friend upright. But there was a limit. You could share strength. You couldn't share life.</w:t>
+        <w:t>Kael felt it before the bioscanners confirmed it. A thinning in the frequency, like a voice going hoarse. One strand of the Choir's forty-seven-part harmony was losing coherence, its signal fraying at the edges, dropping in and out of phase with the collective. The others were compensating — closing ranks around the weakening voice, bolstering it with their own frequencies, trying to hold the song together the way you'd hold a wounded friend upright. But there was a limit. You could lend strength. You couldn't lend time.</w:t>
       </w:r>
     </w:p>
     <w:p>
@@ -8680,46 +8679,46 @@
           <w:b w:val="0"/>
           <w:i w:val="0"/>
         </w:rPr>
-        <w:t>Kael took a breath. The Choir's song pressed against the hull. He could feel all forty-six of them — grieving, exhausted, afraid — and beneath the fear, beneath everything, the same thing that had made the Note Between shield a stranger with its dying body.</w:t>
-      </w:r>
-    </w:p>
-    <w:p>
-      <w:pPr>
-        <w:spacing w:before="40" w:after="40"/>
-        <w:ind w:firstLine="432"/>
-      </w:pPr>
-      <w:r>
-        <w:rPr>
-          <w:b w:val="0"/>
-          <w:i/>
-        </w:rPr>
-        <w:t>Trust.</w:t>
-      </w:r>
-    </w:p>
-    <w:p>
-      <w:pPr>
-        <w:spacing w:before="40" w:after="40"/>
-        <w:ind w:firstLine="432"/>
-      </w:pPr>
-      <w:r>
-        <w:rPr>
-          <w:b w:val="0"/>
-          <w:i w:val="0"/>
-        </w:rPr>
-        <w:t>"We stay," Kael said. He put his hands on the controls. "We keep them alive."</w:t>
-      </w:r>
-    </w:p>
-    <w:p>
-      <w:pPr>
-        <w:spacing w:before="40" w:after="40"/>
-        <w:ind w:firstLine="432"/>
-      </w:pPr>
-      <w:r>
-        <w:rPr>
-          <w:b w:val="0"/>
-          <w:i w:val="0"/>
-        </w:rPr>
-        <w:t>Outside, the ocean darkened above them as eight warships descended. And below, the rift pulsed once — just once — and the water around it went still.</w:t>
+        <w:t>One solder-held ship. One Lawkeeper who believed in systems. One xenobiologist who couldn't stop showing up. Two birds who refused to lose.</w:t>
+      </w:r>
+    </w:p>
+    <w:p>
+      <w:pPr>
+        <w:spacing w:before="40" w:after="40"/>
+        <w:ind w:firstLine="432"/>
+      </w:pPr>
+      <w:r>
+        <w:rPr>
+          <w:b w:val="0"/>
+          <w:i w:val="0"/>
+        </w:rPr>
+        <w:t>And something in the dark that wanted silence.</w:t>
+      </w:r>
+    </w:p>
+    <w:p>
+      <w:pPr>
+        <w:spacing w:before="40" w:after="40"/>
+        <w:ind w:firstLine="432"/>
+      </w:pPr>
+      <w:r>
+        <w:rPr>
+          <w:b w:val="0"/>
+          <w:i w:val="0"/>
+        </w:rPr>
+        <w:t>Kael put his hands on the controls.</w:t>
+      </w:r>
+    </w:p>
+    <w:p>
+      <w:pPr>
+        <w:spacing w:before="40" w:after="40"/>
+        <w:ind w:firstLine="432"/>
+      </w:pPr>
+      <w:r>
+        <w:rPr>
+          <w:b w:val="0"/>
+          <w:i w:val="0"/>
+        </w:rPr>
+        <w:t>"Alright," he said. "Let's see who breaks first."</w:t>
       </w:r>
     </w:p>
     <w:p>
@@ -10034,7 +10033,7 @@
           <w:b w:val="0"/>
           <w:i w:val="0"/>
         </w:rPr>
-        <w:t>Sera's hand tightened on the rail. "Forty-three people operating outside Covenant jurisdiction. No registration. No oversight. No legal mandate for any of this." She said it quietly, almost to herself, and Kael heard the discomfort in it — not fear, not hostility, just the instinctive friction of a woman whose entire life was built on frameworks encountering something that existed outside all of them. It bothered her. He could tell it bothered her more than the incoming fleet, which was irrational, and he could tell she knew it was irrational, and it bothered her anyway. Then Wick shifted on her shoulder — a small, deliberate settling of weight — and his frequency pulsed once, low and steady. Whatever the owl communicated, it was enough. Sera's grip eased. She didn't mention it again.</w:t>
+        <w:t>Sera's hand tightened on the rail. "Forty-three people operating outside Covenant jurisdiction. No registration. No oversight. No legal mandate for any of this." She said it quietly, almost to herself. Then Wick shifted on her shoulder — a small, deliberate settling of weight — and his frequency pulsed once, low and steady. Sera's grip eased. She didn't mention it again.</w:t>
       </w:r>
     </w:p>
     <w:p>

</xml_diff>

<commit_message>
Add Chapter 7: The Forty-Seventh
Kael discovers the seal's structural weakness — the Note Between's gap
cannot be filled by distributed resonance alone. The rift entity probes
the thinness with patient, geological persistence.

Sera receives word from Arbiter Station: emergency Conclave convened,
charges drafted, but the Union invokes the Existential Defense Framework
for the first time in Covenant history. She departs to fight the legal
battle in person — the law is the only shield that scales.

Kael resolves his misjudgment: the Choir's trust was never desperation.
It was nature. Connection is what they are. This understanding lets him
feel the gap clearly — and realize he's the only one who can fill it.

He enters the song. Becomes the forty-seventh voice. The seal holds.
But the entity presses against his human mind, and Talon's copper
thread dims toward silence.

https://claude.ai/code/session_01XVZGKMeTpqLFzCVEmX6JZq
</commit_message>
<xml_diff>
--- a/The_Wildtongue_Chronicles.docx
+++ b/The_Wildtongue_Chronicles.docx
@@ -11652,6 +11652,2264 @@
           <w:i w:val="0"/>
         </w:rPr>
         <w:t>He dog-eared the thought. Not for later. For next.</w:t>
+      </w:r>
+    </w:p>
+    <w:p>
+      <w:r>
+        <w:br w:type="page"/>
+      </w:r>
+    </w:p>
+    <w:p>
+      <w:pPr>
+        <w:spacing w:before="960" w:after="480"/>
+        <w:jc w:val="center"/>
+      </w:pPr>
+      <w:r>
+        <w:rPr>
+          <w:rFonts w:ascii="Georgia" w:hAnsi="Georgia"/>
+          <w:b/>
+          <w:sz w:val="36"/>
+        </w:rPr>
+        <w:t>CHAPTER 7 — THE FORTY-SEVENTH</w:t>
+      </w:r>
+    </w:p>
+    <w:p>
+      <w:pPr>
+        <w:spacing w:before="40" w:after="40"/>
+        <w:ind w:firstLine="432"/>
+      </w:pPr>
+      <w:r>
+        <w:rPr>
+          <w:b w:val="0"/>
+          <w:i w:val="0"/>
+        </w:rPr>
+        <w:t>The mystery novel had seventeen pages left.</w:t>
+      </w:r>
+    </w:p>
+    <w:p>
+      <w:pPr>
+        <w:spacing w:before="40" w:after="40"/>
+        <w:ind w:firstLine="432"/>
+      </w:pPr>
+      <w:r>
+        <w:rPr>
+          <w:b w:val="0"/>
+          <w:i w:val="0"/>
+        </w:rPr>
+        <w:t>Kael held it open on his knee, the spine cracked, the pages swollen with moisture from three days at depth. The detective was cornered. The killer had been the lawyer all along — Kael had called that in the Pellara system — and now there was a standoff in a clock tower, and the detective was saying something about time being the only honest judge, and Kael couldn't focus on a single word because the ocean wouldn't stop talking.</w:t>
+      </w:r>
+    </w:p>
+    <w:p>
+      <w:pPr>
+        <w:spacing w:before="40" w:after="40"/>
+        <w:ind w:firstLine="432"/>
+      </w:pPr>
+      <w:r>
+        <w:rPr>
+          <w:b w:val="0"/>
+          <w:i w:val="0"/>
+        </w:rPr>
+        <w:t>That was the drift.</w:t>
+      </w:r>
+    </w:p>
+    <w:p>
+      <w:pPr>
+        <w:spacing w:before="40" w:after="40"/>
+        <w:ind w:firstLine="432"/>
+      </w:pPr>
+      <w:r>
+        <w:rPr>
+          <w:b w:val="0"/>
+          <w:i w:val="0"/>
+        </w:rPr>
+        <w:t>Since the full-spectrum burst in the battle, everything was louder. Not louder the way turning up a dial is louder — louder the way opening a door is louder, letting in a room you didn't know was there. He could hear the geological hum of the ocean floor, a bass tone so low it was more sensation than sound. He could hear the deep listeners' mounts breathing — a slow tidal rhythm, each inhale drawing water across filtration membranes the size of buildings. He could hear the crystalline chime of the rift itself, sharp and strange, like a glass harmonic played in a cathedral.</w:t>
+      </w:r>
+    </w:p>
+    <w:p>
+      <w:pPr>
+        <w:spacing w:before="40" w:after="40"/>
+        <w:ind w:firstLine="432"/>
+      </w:pPr>
+      <w:r>
+        <w:rPr>
+          <w:b w:val="0"/>
+          <w:i w:val="0"/>
+        </w:rPr>
+        <w:t>And beneath all of it — beneath the music, beneath the life, beneath the deep listeners' ancient song and the Choir's wounded harmony — he could hear something else.</w:t>
+      </w:r>
+    </w:p>
+    <w:p>
+      <w:pPr>
+        <w:spacing w:before="40" w:after="40"/>
+        <w:ind w:firstLine="432"/>
+      </w:pPr>
+      <w:r>
+        <w:rPr>
+          <w:b w:val="0"/>
+          <w:i w:val="0"/>
+        </w:rPr>
+        <w:t>A sound like silence pushing.</w:t>
+      </w:r>
+    </w:p>
+    <w:p>
+      <w:pPr>
+        <w:spacing w:before="40" w:after="40"/>
+        <w:ind w:firstLine="432"/>
+      </w:pPr>
+      <w:r>
+        <w:rPr>
+          <w:b w:val="0"/>
+          <w:i w:val="0"/>
+        </w:rPr>
+        <w:t>He closed the novel. The detective would have to wait. The detective had it easy — his monster was human.</w:t>
+      </w:r>
+    </w:p>
+    <w:p>
+      <w:pPr>
+        <w:spacing w:before="320" w:after="320"/>
+        <w:jc w:val="center"/>
+      </w:pPr>
+      <w:r>
+        <w:rPr>
+          <w:rFonts w:ascii="Georgia" w:hAnsi="Georgia"/>
+          <w:color w:val="787878"/>
+          <w:sz w:val="24"/>
+        </w:rPr>
+        <w:t>* * *</w:t>
+      </w:r>
+    </w:p>
+    <w:p>
+      <w:pPr>
+        <w:spacing w:before="40" w:after="40"/>
+        <w:ind w:firstLine="432"/>
+      </w:pPr>
+      <w:r>
+        <w:rPr>
+          <w:b w:val="0"/>
+          <w:i w:val="0"/>
+        </w:rPr>
+        <w:t>"You're hearing it," the old woman said.</w:t>
+      </w:r>
+    </w:p>
+    <w:p>
+      <w:pPr>
+        <w:spacing w:before="40" w:after="40"/>
+        <w:ind w:firstLine="432"/>
+      </w:pPr>
+      <w:r>
+        <w:rPr>
+          <w:b w:val="0"/>
+          <w:i w:val="0"/>
+        </w:rPr>
+        <w:t xml:space="preserve">She was on the main display — not in person, not frequency-to-frequency, but through a cobbled-together video link that Miro had rigged between the </w:t>
+      </w:r>
+      <w:r>
+        <w:rPr>
+          <w:b w:val="0"/>
+          <w:i/>
+        </w:rPr>
+        <w:t>Fang &amp; Fable</w:t>
+      </w:r>
+      <w:r>
+        <w:rPr>
+          <w:b w:val="0"/>
+          <w:i w:val="0"/>
+        </w:rPr>
+        <w:t>'s comm array and the organic interface on her mount's platform. The image was grainy, washed in amber light, and the old woman's face filled most of the frame — pale eyes, white hair drifting in the current, the kind of face that made you want to sit down and listen.</w:t>
+      </w:r>
+    </w:p>
+    <w:p>
+      <w:pPr>
+        <w:spacing w:before="40" w:after="40"/>
+        <w:ind w:firstLine="432"/>
+      </w:pPr>
+      <w:r>
+        <w:rPr>
+          <w:b w:val="0"/>
+          <w:i w:val="0"/>
+        </w:rPr>
+        <w:t>Kael nodded. "The rift. Something's changed."</w:t>
+      </w:r>
+    </w:p>
+    <w:p>
+      <w:pPr>
+        <w:spacing w:before="40" w:after="40"/>
+        <w:ind w:firstLine="432"/>
+      </w:pPr>
+      <w:r>
+        <w:rPr>
+          <w:b w:val="0"/>
+          <w:i w:val="0"/>
+        </w:rPr>
+        <w:t>"Nothing has changed. You have." She said it without judgment. "The drift opened channels in your neurology that weren't there before. You're hearing what the deep listeners hear. What I hear. The rift's frequency has always been there — you just couldn't perceive it."</w:t>
+      </w:r>
+    </w:p>
+    <w:p>
+      <w:pPr>
+        <w:spacing w:before="40" w:after="40"/>
+        <w:ind w:firstLine="432"/>
+      </w:pPr>
+      <w:r>
+        <w:rPr>
+          <w:b w:val="0"/>
+          <w:i w:val="0"/>
+        </w:rPr>
+        <w:t>"What I'm hearing — it's testing the seal. Probing. Like fingers running along a wall, looking for a crack."</w:t>
+      </w:r>
+    </w:p>
+    <w:p>
+      <w:pPr>
+        <w:spacing w:before="40" w:after="40"/>
+        <w:ind w:firstLine="432"/>
+      </w:pPr>
+      <w:r>
+        <w:rPr>
+          <w:b w:val="0"/>
+          <w:i w:val="0"/>
+        </w:rPr>
+        <w:t>"Yes."</w:t>
+      </w:r>
+    </w:p>
+    <w:p>
+      <w:pPr>
+        <w:spacing w:before="40" w:after="40"/>
+        <w:ind w:firstLine="432"/>
+      </w:pPr>
+      <w:r>
+        <w:rPr>
+          <w:b w:val="0"/>
+          <w:i w:val="0"/>
+        </w:rPr>
+        <w:t>"And it's finding one."</w:t>
+      </w:r>
+    </w:p>
+    <w:p>
+      <w:pPr>
+        <w:spacing w:before="40" w:after="40"/>
+        <w:ind w:firstLine="432"/>
+      </w:pPr>
+      <w:r>
+        <w:rPr>
+          <w:b w:val="0"/>
+          <w:i w:val="0"/>
+        </w:rPr>
+        <w:t>The old woman was quiet for a moment. Behind her, two of her deep listeners were tending to the wounded mount — the one that had taken the lance broadside. Its amber glow was dim but steady, and the patch of dead tissue where the lance had hit was visible even on the grainy display, a dark stripe across its flank like a burn scar.</w:t>
+      </w:r>
+    </w:p>
+    <w:p>
+      <w:pPr>
+        <w:spacing w:before="40" w:after="40"/>
+        <w:ind w:firstLine="432"/>
+      </w:pPr>
+      <w:r>
+        <w:rPr>
+          <w:b w:val="0"/>
+          <w:i w:val="0"/>
+        </w:rPr>
+        <w:t xml:space="preserve">"The Note Between held an interval," she said finally. "A specific harmonic position in the Choir's song. When it died, the other forty-six distributed its resonance — absorbed fragments of its frequency into their own voices. This preserved the Note Between's </w:t>
+      </w:r>
+      <w:r>
+        <w:rPr>
+          <w:b w:val="0"/>
+          <w:i/>
+        </w:rPr>
+        <w:t>identity</w:t>
+      </w:r>
+      <w:r>
+        <w:rPr>
+          <w:b w:val="0"/>
+          <w:i w:val="0"/>
+        </w:rPr>
+        <w:t xml:space="preserve">. It did not preserve its </w:t>
+      </w:r>
+      <w:r>
+        <w:rPr>
+          <w:b w:val="0"/>
+          <w:i/>
+        </w:rPr>
+        <w:t>function</w:t>
+      </w:r>
+      <w:r>
+        <w:rPr>
+          <w:b w:val="0"/>
+          <w:i w:val="0"/>
+        </w:rPr>
+        <w:t>."</w:t>
+      </w:r>
+    </w:p>
+    <w:p>
+      <w:pPr>
+        <w:spacing w:before="40" w:after="40"/>
+        <w:ind w:firstLine="432"/>
+      </w:pPr>
+      <w:r>
+        <w:rPr>
+          <w:b w:val="0"/>
+          <w:i w:val="0"/>
+        </w:rPr>
+        <w:t>"The function being the seal."</w:t>
+      </w:r>
+    </w:p>
+    <w:p>
+      <w:pPr>
+        <w:spacing w:before="40" w:after="40"/>
+        <w:ind w:firstLine="432"/>
+      </w:pPr>
+      <w:r>
+        <w:rPr>
+          <w:b w:val="0"/>
+          <w:i w:val="0"/>
+        </w:rPr>
+        <w:t>"The seal is not just song. It is architecture. Each voice holds a position the way a stone holds a position in an arch. You can grind a stone to dust and spread it among the other stones. They will carry its weight. But the space where it stood remains empty. Pressure —" She paused on the word, and Kael felt it land in his chest. "Pressure concentrates at the gaps."</w:t>
+      </w:r>
+    </w:p>
+    <w:p>
+      <w:pPr>
+        <w:spacing w:before="40" w:after="40"/>
+        <w:ind w:firstLine="432"/>
+      </w:pPr>
+      <w:r>
+        <w:rPr>
+          <w:b w:val="0"/>
+          <w:i w:val="0"/>
+        </w:rPr>
+        <w:t>Miro leaned forward from the secondary console. He'd been running comparative scans on the Choir's frequency output for the last four hours, and the data on his screen told the same story the old woman was telling. "She's right. I'm seeing a three-percent harmonic variance at the position where the Note Between sang. The other forty-six are compensating, but there's a resonance node that none of them can fully occupy. It's like — imagine a forty-seven-piece orchestra playing a piece written for forty-seven instruments. You lose one. The others can cover, improvise, fill in. But there's a frequency only that instrument produced. And the silence where it should be isn't silence. It's a hole."</w:t>
+      </w:r>
+    </w:p>
+    <w:p>
+      <w:pPr>
+        <w:spacing w:before="40" w:after="40"/>
+        <w:ind w:firstLine="432"/>
+      </w:pPr>
+      <w:r>
+        <w:rPr>
+          <w:b w:val="0"/>
+          <w:i w:val="0"/>
+        </w:rPr>
+        <w:t>"How long?" Kael asked.</w:t>
+      </w:r>
+    </w:p>
+    <w:p>
+      <w:pPr>
+        <w:spacing w:before="40" w:after="40"/>
+        <w:ind w:firstLine="432"/>
+      </w:pPr>
+      <w:r>
+        <w:rPr>
+          <w:b w:val="0"/>
+          <w:i w:val="0"/>
+        </w:rPr>
+        <w:t>The old woman and Miro exchanged a look through the display — the unlikely communion of a rogue deep listener and a Union xenobiologist, united by data.</w:t>
+      </w:r>
+    </w:p>
+    <w:p>
+      <w:pPr>
+        <w:spacing w:before="40" w:after="40"/>
+        <w:ind w:firstLine="432"/>
+      </w:pPr>
+      <w:r>
+        <w:rPr>
+          <w:b w:val="0"/>
+          <w:i w:val="0"/>
+        </w:rPr>
+        <w:t>"Months," Miro said. "If nothing changes. The Choir is recovering — feeding, regaining strength. That helps. But the gap is structural. It doesn't heal with food. It heals with a forty-seventh voice, and that voice is gone."</w:t>
+      </w:r>
+    </w:p>
+    <w:p>
+      <w:pPr>
+        <w:spacing w:before="40" w:after="40"/>
+        <w:ind w:firstLine="432"/>
+      </w:pPr>
+      <w:r>
+        <w:rPr>
+          <w:b w:val="0"/>
+          <w:i w:val="0"/>
+        </w:rPr>
+        <w:t xml:space="preserve">"Weeks," the old woman corrected. "Your scans measure the song's strength. I can feel the entity's patience thinning. It has been sealed for longer than your species has existed. It does not think in months. But it has felt the gap, and now it is </w:t>
+      </w:r>
+      <w:r>
+        <w:rPr>
+          <w:b w:val="0"/>
+          <w:i/>
+        </w:rPr>
+        <w:t>interested</w:t>
+      </w:r>
+      <w:r>
+        <w:rPr>
+          <w:b w:val="0"/>
+          <w:i w:val="0"/>
+        </w:rPr>
+        <w:t>. Interest, in a thing that old, is the most dangerous state there is."</w:t>
+      </w:r>
+    </w:p>
+    <w:p>
+      <w:pPr>
+        <w:spacing w:before="320" w:after="320"/>
+        <w:jc w:val="center"/>
+      </w:pPr>
+      <w:r>
+        <w:rPr>
+          <w:rFonts w:ascii="Georgia" w:hAnsi="Georgia"/>
+          <w:color w:val="787878"/>
+          <w:sz w:val="24"/>
+        </w:rPr>
+        <w:t>* * *</w:t>
+      </w:r>
+    </w:p>
+    <w:p>
+      <w:pPr>
+        <w:spacing w:before="40" w:after="40"/>
+        <w:ind w:firstLine="432"/>
+      </w:pPr>
+      <w:r>
+        <w:rPr>
+          <w:b w:val="0"/>
+          <w:i w:val="0"/>
+        </w:rPr>
+        <w:t>Sera's wrist display chimed at hour six.</w:t>
+      </w:r>
+    </w:p>
+    <w:p>
+      <w:pPr>
+        <w:spacing w:before="40" w:after="40"/>
+        <w:ind w:firstLine="432"/>
+      </w:pPr>
+      <w:r>
+        <w:rPr>
+          <w:b w:val="0"/>
+          <w:i w:val="0"/>
+        </w:rPr>
+        <w:t>She was at the secondary console, Wick perched on the headrest beside her, when the burst transmission came through — compressed, encrypted, relayed through seventeen Covenant comm nodes across four sectors to reach the bottom of an alien ocean. She decoded it in silence, her eyes moving across the text, and Kael watched her expression not change, which told him everything.</w:t>
+      </w:r>
+    </w:p>
+    <w:p>
+      <w:pPr>
+        <w:spacing w:before="40" w:after="40"/>
+        <w:ind w:firstLine="432"/>
+      </w:pPr>
+      <w:r>
+        <w:rPr>
+          <w:b w:val="0"/>
+          <w:i w:val="0"/>
+        </w:rPr>
+        <w:t>"Arbiter Station received our transmission," she said. "The High Arbiter convened an emergency session of the Judicial Conclave within ninety minutes of receipt. Fastest emergency session in Covenant history."</w:t>
+      </w:r>
+    </w:p>
+    <w:p>
+      <w:pPr>
+        <w:spacing w:before="40" w:after="40"/>
+        <w:ind w:firstLine="432"/>
+      </w:pPr>
+      <w:r>
+        <w:rPr>
+          <w:b w:val="0"/>
+          <w:i w:val="0"/>
+        </w:rPr>
+        <w:t>"That's good," Miro said.</w:t>
+      </w:r>
+    </w:p>
+    <w:p>
+      <w:pPr>
+        <w:spacing w:before="40" w:after="40"/>
+        <w:ind w:firstLine="432"/>
+      </w:pPr>
+      <w:r>
+        <w:rPr>
+          <w:b w:val="0"/>
+          <w:i w:val="0"/>
+        </w:rPr>
+        <w:t>"It is. The Conclave reviewed the evidence — the cage schematics, the UMSF-Vanguard designation, the biosensor data confirming Class Twelve sentience, Wick's frequency recordings of the battle and the requiem. They've drafted preliminary charges against Union Strategic Command. Article Nine violations. Article Twelve violations. Article Ninety-One — hostile action against a protected species in its sovereign habitat." She paused. "The charges name Captain Maren Dahl by rank and badge number. They name the Thirty-First Strategic Fleet by designation. And they request — formally, through the Covenant's interstellar judiciary — the identification and prosecution of the authorizing command chain."</w:t>
+      </w:r>
+    </w:p>
+    <w:p>
+      <w:pPr>
+        <w:spacing w:before="40" w:after="40"/>
+        <w:ind w:firstLine="432"/>
+      </w:pPr>
+      <w:r>
+        <w:rPr>
+          <w:b w:val="0"/>
+          <w:i w:val="0"/>
+        </w:rPr>
+        <w:t>Kael felt the weight of it. Names. Badge numbers. Not abstract condemnations but specific people, held to specific account.</w:t>
+      </w:r>
+    </w:p>
+    <w:p>
+      <w:pPr>
+        <w:spacing w:before="40" w:after="40"/>
+        <w:ind w:firstLine="432"/>
+      </w:pPr>
+      <w:r>
+        <w:rPr>
+          <w:b w:val="0"/>
+          <w:i w:val="0"/>
+        </w:rPr>
+        <w:t>"But," he said.</w:t>
+      </w:r>
+    </w:p>
+    <w:p>
+      <w:pPr>
+        <w:spacing w:before="40" w:after="40"/>
+        <w:ind w:firstLine="432"/>
+      </w:pPr>
+      <w:r>
+        <w:rPr>
+          <w:b w:val="0"/>
+          <w:i w:val="0"/>
+        </w:rPr>
+        <w:t>"But." Sera set the display down. Wick shifted on the headrest, his amber eyes tracking her hands. "The Union has filed a counter-motion. They're invoking the Existential Defense Framework — Article One Hundred and Forty-Four of the Accord's emergency provisions. It's never been used. Not once, in the entire history of the Covenant."</w:t>
+      </w:r>
+    </w:p>
+    <w:p>
+      <w:pPr>
+        <w:spacing w:before="40" w:after="40"/>
+        <w:ind w:firstLine="432"/>
+      </w:pPr>
+      <w:r>
+        <w:rPr>
+          <w:b w:val="0"/>
+          <w:i w:val="0"/>
+        </w:rPr>
+        <w:t>"What does it do?"</w:t>
+      </w:r>
+    </w:p>
+    <w:p>
+      <w:pPr>
+        <w:spacing w:before="40" w:after="40"/>
+        <w:ind w:firstLine="432"/>
+      </w:pPr>
+      <w:r>
+        <w:rPr>
+          <w:b w:val="0"/>
+          <w:i w:val="0"/>
+        </w:rPr>
+        <w:t>"It argues that a member state's strategic survival supersedes species-protection mandates when the threat is classified as existential. The Union is claiming that the rift entity constitutes an existential threat to all settled worlds, and that the cage — the deliberate weakening of the Choir — was a controlled strategic response to manage that threat." She said each word carefully, the way a surgeon handles a blade. "They're not denying they built the cage. They're arguing they had the legal right to."</w:t>
+      </w:r>
+    </w:p>
+    <w:p>
+      <w:pPr>
+        <w:spacing w:before="40" w:after="40"/>
+        <w:ind w:firstLine="432"/>
+      </w:pPr>
+      <w:r>
+        <w:rPr>
+          <w:b w:val="0"/>
+          <w:i w:val="0"/>
+        </w:rPr>
+        <w:t>"The right to starve sentient beings to death."</w:t>
+      </w:r>
+    </w:p>
+    <w:p>
+      <w:pPr>
+        <w:spacing w:before="40" w:after="40"/>
+        <w:ind w:firstLine="432"/>
+      </w:pPr>
+      <w:r>
+        <w:rPr>
+          <w:b w:val="0"/>
+          <w:i w:val="0"/>
+        </w:rPr>
+        <w:t>"Under EDF provisions, yes. If the Conclave accepts the argument, the Choir's sentience becomes irrelevant. Any species, any population, any individual can be sacrificed if the threat is deemed existential and the response proportionate."</w:t>
+      </w:r>
+    </w:p>
+    <w:p>
+      <w:pPr>
+        <w:spacing w:before="40" w:after="40"/>
+        <w:ind w:firstLine="432"/>
+      </w:pPr>
+      <w:r>
+        <w:rPr>
+          <w:b w:val="0"/>
+          <w:i w:val="0"/>
+        </w:rPr>
+        <w:t>The cockpit was quiet.</w:t>
+      </w:r>
+    </w:p>
+    <w:p>
+      <w:pPr>
+        <w:spacing w:before="40" w:after="40"/>
+        <w:ind w:firstLine="432"/>
+      </w:pPr>
+      <w:r>
+        <w:rPr>
+          <w:b w:val="0"/>
+          <w:i w:val="0"/>
+        </w:rPr>
+        <w:t>"That's the end of the Covenant," Miro said softly. "If that argument holds, every protected species in the galaxy is one military assessment away from a cage."</w:t>
+      </w:r>
+    </w:p>
+    <w:p>
+      <w:pPr>
+        <w:spacing w:before="40" w:after="40"/>
+        <w:ind w:firstLine="432"/>
+      </w:pPr>
+      <w:r>
+        <w:rPr>
+          <w:b w:val="0"/>
+          <w:i w:val="0"/>
+        </w:rPr>
+        <w:t xml:space="preserve">"Yes." Sera's voice was steady, but her hands were flat on the console, pressed down, the tendons visible. "The Accord was built on one principle: that sentient life has inherent value that no government, no military, no strategic calculation can override. Article One — before justice, survival. It means the survival of the </w:t>
+      </w:r>
+      <w:r>
+        <w:rPr>
+          <w:b w:val="0"/>
+          <w:i/>
+        </w:rPr>
+        <w:t>protected</w:t>
+      </w:r>
+      <w:r>
+        <w:rPr>
+          <w:b w:val="0"/>
+          <w:i w:val="0"/>
+        </w:rPr>
+        <w:t>, not the convenience of the protector. If the EDF motion passes, Article One means nothing. Every article means nothing. The Covenant becomes a suggestion."</w:t>
+      </w:r>
+    </w:p>
+    <w:p>
+      <w:pPr>
+        <w:spacing w:before="40" w:after="40"/>
+        <w:ind w:firstLine="432"/>
+      </w:pPr>
+      <w:r>
+        <w:rPr>
+          <w:b w:val="0"/>
+          <w:i w:val="0"/>
+        </w:rPr>
+        <w:t>"What do they need from you?"</w:t>
+      </w:r>
+    </w:p>
+    <w:p>
+      <w:pPr>
+        <w:spacing w:before="40" w:after="40"/>
+        <w:ind w:firstLine="432"/>
+      </w:pPr>
+      <w:r>
+        <w:rPr>
+          <w:b w:val="0"/>
+          <w:i w:val="0"/>
+        </w:rPr>
+        <w:t>"Testimony. In person. The data core, decoded — it contains the operational orders, the authorization chain. Without it, the Union can claim rogue action by a field commander. With it, the chain leads to Strategic Command." She looked at Kael. "I need to leave. Take my ship to Arbiter Station. Present the evidence before the full Conclave."</w:t>
+      </w:r>
+    </w:p>
+    <w:p>
+      <w:pPr>
+        <w:spacing w:before="40" w:after="40"/>
+        <w:ind w:firstLine="432"/>
+      </w:pPr>
+      <w:r>
+        <w:rPr>
+          <w:b w:val="0"/>
+          <w:i w:val="0"/>
+        </w:rPr>
+        <w:t>"How long?"</w:t>
+      </w:r>
+    </w:p>
+    <w:p>
+      <w:pPr>
+        <w:spacing w:before="40" w:after="40"/>
+        <w:ind w:firstLine="432"/>
+      </w:pPr>
+      <w:r>
+        <w:rPr>
+          <w:b w:val="0"/>
+          <w:i w:val="0"/>
+        </w:rPr>
+        <w:t>"Round trip — eight days via jump-gate. Four to Arbiter Station, the testimony, four back. Assuming no delays."</w:t>
+      </w:r>
+    </w:p>
+    <w:p>
+      <w:pPr>
+        <w:spacing w:before="40" w:after="40"/>
+        <w:ind w:firstLine="432"/>
+      </w:pPr>
+      <w:r>
+        <w:rPr>
+          <w:b w:val="0"/>
+          <w:i w:val="0"/>
+        </w:rPr>
+        <w:t>"That's eight days without a Lawkeeper's ship protecting the Choir."</w:t>
+      </w:r>
+    </w:p>
+    <w:p>
+      <w:pPr>
+        <w:spacing w:before="40" w:after="40"/>
+        <w:ind w:firstLine="432"/>
+      </w:pPr>
+      <w:r>
+        <w:rPr>
+          <w:b w:val="0"/>
+          <w:i w:val="0"/>
+        </w:rPr>
+        <w:t>"I know." She didn't flinch from it. "But the legal battle is the battle. If the EDF motion passes, it doesn't matter what we do here. The Union sends a hundred ships, and every one of them arrives with legal authority to finish what the Thirty-First started. The only shield that holds across all nine sectors, all six hundred and twelve worlds, is the law. I have to go make sure the law still works."</w:t>
+      </w:r>
+    </w:p>
+    <w:p>
+      <w:pPr>
+        <w:spacing w:before="40" w:after="40"/>
+        <w:ind w:firstLine="432"/>
+      </w:pPr>
+      <w:r>
+        <w:rPr>
+          <w:b w:val="0"/>
+          <w:i w:val="0"/>
+        </w:rPr>
+        <w:t>Wick pressed his head against Sera's jaw — the same gesture from the requiem, the same quiet support. His frequency pulsed once: low, steady, certain. The owl who trusted evidence was telling his partner the evidence was strong enough.</w:t>
+      </w:r>
+    </w:p>
+    <w:p>
+      <w:pPr>
+        <w:spacing w:before="40" w:after="40"/>
+        <w:ind w:firstLine="432"/>
+      </w:pPr>
+      <w:r>
+        <w:rPr>
+          <w:b w:val="0"/>
+          <w:i w:val="0"/>
+        </w:rPr>
+        <w:t>"Go," Kael said. "We'll hold."</w:t>
+      </w:r>
+    </w:p>
+    <w:p>
+      <w:pPr>
+        <w:spacing w:before="40" w:after="40"/>
+        <w:ind w:firstLine="432"/>
+      </w:pPr>
+      <w:r>
+        <w:rPr>
+          <w:b w:val="0"/>
+          <w:i w:val="0"/>
+        </w:rPr>
+        <w:t>Sera met his eyes. Something passed between them that wasn't frequency — just the ordinary human thing, the recognition between two people who understand the stakes and have decided separately, for different reasons, to pay them.</w:t>
+      </w:r>
+    </w:p>
+    <w:p>
+      <w:pPr>
+        <w:spacing w:before="40" w:after="40"/>
+        <w:ind w:firstLine="432"/>
+      </w:pPr>
+      <w:r>
+        <w:rPr>
+          <w:b w:val="0"/>
+          <w:i w:val="0"/>
+        </w:rPr>
+        <w:t>"I'll leave my ship's transponder codes with your comm array. Anything that happens here while I'm gone gets logged as an active Covenant operation. It won't stop a fleet. But it makes every shot they fire a war crime on the record."</w:t>
+      </w:r>
+    </w:p>
+    <w:p>
+      <w:pPr>
+        <w:spacing w:before="40" w:after="40"/>
+        <w:ind w:firstLine="432"/>
+      </w:pPr>
+      <w:r>
+        <w:rPr>
+          <w:b w:val="0"/>
+          <w:i w:val="0"/>
+        </w:rPr>
+        <w:t>"That helps."</w:t>
+      </w:r>
+    </w:p>
+    <w:p>
+      <w:pPr>
+        <w:spacing w:before="40" w:after="40"/>
+        <w:ind w:firstLine="432"/>
+      </w:pPr>
+      <w:r>
+        <w:rPr>
+          <w:b w:val="0"/>
+          <w:i w:val="0"/>
+        </w:rPr>
+        <w:t>"It's what I have." She stood. Straightened the charcoal field-coat. Touched the Arbiter's seal above her heart — an unconscious gesture, the way some people touch a ring or a pendant. The open eye inside the balanced scale.</w:t>
+      </w:r>
+    </w:p>
+    <w:p>
+      <w:pPr>
+        <w:spacing w:before="40" w:after="40"/>
+        <w:ind w:firstLine="432"/>
+      </w:pPr>
+      <w:r>
+        <w:rPr>
+          <w:b w:val="0"/>
+          <w:i w:val="0"/>
+        </w:rPr>
+        <w:t>"Lawkeeper Voss," Miro said. "For what it's worth — I spent eleven years watching the system fail. It's good to see someone fight for it."</w:t>
+      </w:r>
+    </w:p>
+    <w:p>
+      <w:pPr>
+        <w:spacing w:before="40" w:after="40"/>
+        <w:ind w:firstLine="432"/>
+      </w:pPr>
+      <w:r>
+        <w:rPr>
+          <w:b w:val="0"/>
+          <w:i w:val="0"/>
+        </w:rPr>
+        <w:t>Sera paused at the airlock. She didn't turn around.</w:t>
+      </w:r>
+    </w:p>
+    <w:p>
+      <w:pPr>
+        <w:spacing w:before="40" w:after="40"/>
+        <w:ind w:firstLine="432"/>
+      </w:pPr>
+      <w:r>
+        <w:rPr>
+          <w:b w:val="0"/>
+          <w:i w:val="0"/>
+        </w:rPr>
+        <w:t>"Systems don't fail on their own," she said quietly. "Someone reminded me of that recently."</w:t>
+      </w:r>
+    </w:p>
+    <w:p>
+      <w:pPr>
+        <w:spacing w:before="40" w:after="40"/>
+        <w:ind w:firstLine="432"/>
+      </w:pPr>
+      <w:r>
+        <w:rPr>
+          <w:b w:val="0"/>
+          <w:i w:val="0"/>
+        </w:rPr>
+        <w:t>Then she was gone. The docking tube hissed, disconnected, and through the viewport Kael watched the Lawkeeper interceptor detach — sleek and dark, its hull drinking the light — and rise through the water column. Fast. Purposeful. A blade aimed at a courtroom.</w:t>
+      </w:r>
+    </w:p>
+    <w:p>
+      <w:pPr>
+        <w:spacing w:before="320" w:after="320"/>
+        <w:jc w:val="center"/>
+      </w:pPr>
+      <w:r>
+        <w:rPr>
+          <w:rFonts w:ascii="Georgia" w:hAnsi="Georgia"/>
+          <w:color w:val="787878"/>
+          <w:sz w:val="24"/>
+        </w:rPr>
+        <w:t>* * *</w:t>
+      </w:r>
+    </w:p>
+    <w:p>
+      <w:pPr>
+        <w:spacing w:before="40" w:after="40"/>
+        <w:ind w:firstLine="432"/>
+      </w:pPr>
+      <w:r>
+        <w:rPr>
+          <w:b w:val="0"/>
+          <w:i w:val="0"/>
+        </w:rPr>
+        <w:t>Kael went back into the song.</w:t>
+      </w:r>
+    </w:p>
+    <w:p>
+      <w:pPr>
+        <w:spacing w:before="40" w:after="40"/>
+        <w:ind w:firstLine="432"/>
+      </w:pPr>
+      <w:r>
+        <w:rPr>
+          <w:b w:val="0"/>
+          <w:i w:val="0"/>
+        </w:rPr>
+        <w:t xml:space="preserve">Not out of duty. Not out of obligation. Out of something the drift had given him that he was only now beginning to understand — an </w:t>
+      </w:r>
+      <w:r>
+        <w:rPr>
+          <w:b w:val="0"/>
+          <w:i/>
+        </w:rPr>
+        <w:t>inability</w:t>
+      </w:r>
+      <w:r>
+        <w:rPr>
+          <w:b w:val="0"/>
+          <w:i w:val="0"/>
+        </w:rPr>
+        <w:t xml:space="preserve"> to look away. The old Kael, the Academy-trained Kael, had always maintained distance. Professional detachment. You listen, you translate, you report. You don't become part of the frequency. That was the first rule.</w:t>
+      </w:r>
+    </w:p>
+    <w:p>
+      <w:pPr>
+        <w:spacing w:before="40" w:after="40"/>
+        <w:ind w:firstLine="432"/>
+      </w:pPr>
+      <w:r>
+        <w:rPr>
+          <w:b w:val="0"/>
+          <w:i w:val="0"/>
+        </w:rPr>
+        <w:t>The drift had broken the first rule. And sitting cross-legged on the cockpit floor, palms flat on the deck plates, Kael opened his frequency wider than he'd ever opened it in controlled contact and let the Choir in.</w:t>
+      </w:r>
+    </w:p>
+    <w:p>
+      <w:pPr>
+        <w:spacing w:before="40" w:after="40"/>
+        <w:ind w:firstLine="432"/>
+      </w:pPr>
+      <w:r>
+        <w:rPr>
+          <w:b w:val="0"/>
+          <w:i w:val="0"/>
+        </w:rPr>
+        <w:t>They came gently. They always came gently — and this time, Kael understood why.</w:t>
+      </w:r>
+    </w:p>
+    <w:p>
+      <w:pPr>
+        <w:spacing w:before="40" w:after="40"/>
+        <w:ind w:firstLine="432"/>
+      </w:pPr>
+      <w:r>
+        <w:rPr>
+          <w:b w:val="0"/>
+          <w:i w:val="0"/>
+        </w:rPr>
+        <w:t>Not desperation. Not the reflexive trust of creatures with no other option.</w:t>
+      </w:r>
+    </w:p>
+    <w:p>
+      <w:pPr>
+        <w:spacing w:before="40" w:after="40"/>
+        <w:ind w:firstLine="432"/>
+      </w:pPr>
+      <w:r>
+        <w:rPr>
+          <w:b w:val="0"/>
+          <w:i/>
+        </w:rPr>
+        <w:t>Nature.</w:t>
+      </w:r>
+    </w:p>
+    <w:p>
+      <w:pPr>
+        <w:spacing w:before="40" w:after="40"/>
+        <w:ind w:firstLine="432"/>
+      </w:pPr>
+      <w:r>
+        <w:rPr>
+          <w:b w:val="0"/>
+          <w:i w:val="0"/>
+        </w:rPr>
+        <w:t>The Choir trusted because trust was what they were. Connection was their biology, their cognition, their reason for existing. The Note Between hadn't shielded Miro out of survival instinct. It had shielded him because reaching toward another living thing — protecting it, bridging the gap between self and other — was the most fundamental act the Choir could perform. It was their equivalent of breathing.</w:t>
+      </w:r>
+    </w:p>
+    <w:p>
+      <w:pPr>
+        <w:spacing w:before="40" w:after="40"/>
+        <w:ind w:firstLine="432"/>
+      </w:pPr>
+      <w:r>
+        <w:rPr>
+          <w:b w:val="0"/>
+          <w:i w:val="0"/>
+        </w:rPr>
+        <w:t xml:space="preserve">Kael had misread them. He'd looked at starving, caged beings offering trust and seen desperation — because desperation was what </w:t>
+      </w:r>
+      <w:r>
+        <w:rPr>
+          <w:b w:val="0"/>
+          <w:i/>
+        </w:rPr>
+        <w:t>he</w:t>
+      </w:r>
+      <w:r>
+        <w:rPr>
+          <w:b w:val="0"/>
+          <w:i w:val="0"/>
+        </w:rPr>
+        <w:t xml:space="preserve"> would have felt. He'd projected his own fear onto creatures whose emotional architecture was so different from his that the comparison was meaningless.</w:t>
+      </w:r>
+    </w:p>
+    <w:p>
+      <w:pPr>
+        <w:spacing w:before="40" w:after="40"/>
+        <w:ind w:firstLine="432"/>
+      </w:pPr>
+      <w:r>
+        <w:rPr>
+          <w:b w:val="0"/>
+          <w:i/>
+        </w:rPr>
+        <w:t>I was wrong about you</w:t>
+      </w:r>
+      <w:r>
+        <w:rPr>
+          <w:b w:val="0"/>
+          <w:i w:val="0"/>
+        </w:rPr>
+        <w:t xml:space="preserve">, he pushed into the frequency. </w:t>
+      </w:r>
+      <w:r>
+        <w:rPr>
+          <w:b w:val="0"/>
+          <w:i/>
+        </w:rPr>
+        <w:t>I thought you trusted me because you had nothing left. You trusted me because that's what you do. What you've always done.</w:t>
+      </w:r>
+    </w:p>
+    <w:p>
+      <w:pPr>
+        <w:spacing w:before="40" w:after="40"/>
+        <w:ind w:firstLine="432"/>
+      </w:pPr>
+      <w:r>
+        <w:rPr>
+          <w:b w:val="0"/>
+          <w:i w:val="0"/>
+        </w:rPr>
+        <w:t>The Choir's response was not words. It was a harmonic shift — the collective song adjusting around his presence the way a river adjusts around a stone. Acceptance. Not forgiveness, because forgiveness implied offense, and the Choir had not been offended. They had simply waited for him to understand.</w:t>
+      </w:r>
+    </w:p>
+    <w:p>
+      <w:pPr>
+        <w:spacing w:before="40" w:after="40"/>
+        <w:ind w:firstLine="432"/>
+      </w:pPr>
+      <w:r>
+        <w:rPr>
+          <w:b w:val="0"/>
+          <w:i w:val="0"/>
+        </w:rPr>
+        <w:t>And now, inside the song, closer than he'd ever been, he could feel the gap.</w:t>
+      </w:r>
+    </w:p>
+    <w:p>
+      <w:pPr>
+        <w:spacing w:before="40" w:after="40"/>
+        <w:ind w:firstLine="432"/>
+      </w:pPr>
+      <w:r>
+        <w:rPr>
+          <w:b w:val="0"/>
+          <w:i w:val="0"/>
+        </w:rPr>
+        <w:t xml:space="preserve">It was exactly where Miro's data said it would be — a resonance node in the harmonic architecture, a position in the frequency structure that forty-six voices were straining to cover and couldn't. Not a silence. A </w:t>
+      </w:r>
+      <w:r>
+        <w:rPr>
+          <w:b w:val="0"/>
+          <w:i/>
+        </w:rPr>
+        <w:t>thinness</w:t>
+      </w:r>
+      <w:r>
+        <w:rPr>
+          <w:b w:val="0"/>
+          <w:i w:val="0"/>
+        </w:rPr>
+        <w:t>. Like a wall that's solid everywhere except one patch where the plaster has gone translucent, and through that translucence, something pressed.</w:t>
+      </w:r>
+    </w:p>
+    <w:p>
+      <w:pPr>
+        <w:spacing w:before="40" w:after="40"/>
+        <w:ind w:firstLine="432"/>
+      </w:pPr>
+      <w:r>
+        <w:rPr>
+          <w:b w:val="0"/>
+          <w:i w:val="0"/>
+        </w:rPr>
+        <w:t>Kael turned his attention toward the gap.</w:t>
+      </w:r>
+    </w:p>
+    <w:p>
+      <w:pPr>
+        <w:spacing w:before="40" w:after="40"/>
+        <w:ind w:firstLine="432"/>
+      </w:pPr>
+      <w:r>
+        <w:rPr>
+          <w:b w:val="0"/>
+          <w:i w:val="0"/>
+        </w:rPr>
+        <w:t>The entity was there.</w:t>
+      </w:r>
+    </w:p>
+    <w:p>
+      <w:pPr>
+        <w:spacing w:before="40" w:after="40"/>
+        <w:ind w:firstLine="432"/>
+      </w:pPr>
+      <w:r>
+        <w:rPr>
+          <w:b w:val="0"/>
+          <w:i w:val="0"/>
+        </w:rPr>
+        <w:t>Not breaking through. Not attacking. Just... leaning. The way water leans against a dam. The way darkness leans against a window. Patient. Constant. Applying the smallest, steadiest force, and waiting for the material to give.</w:t>
+      </w:r>
+    </w:p>
+    <w:p>
+      <w:pPr>
+        <w:spacing w:before="40" w:after="40"/>
+        <w:ind w:firstLine="432"/>
+      </w:pPr>
+      <w:r>
+        <w:rPr>
+          <w:b w:val="0"/>
+          <w:i w:val="0"/>
+        </w:rPr>
+        <w:t>He could hear it now — really hear it, not the filtered secondhand impression from his first contact but the thing itself. And what he heard made his hands go cold against the deck plates.</w:t>
+      </w:r>
+    </w:p>
+    <w:p>
+      <w:pPr>
+        <w:spacing w:before="40" w:after="40"/>
+        <w:ind w:firstLine="432"/>
+      </w:pPr>
+      <w:r>
+        <w:rPr>
+          <w:b w:val="0"/>
+          <w:i w:val="0"/>
+        </w:rPr>
+        <w:t xml:space="preserve">It wasn't mindless. It wasn't rage, wasn't hunger, wasn't malice. It was </w:t>
+      </w:r>
+      <w:r>
+        <w:rPr>
+          <w:b w:val="0"/>
+          <w:i/>
+        </w:rPr>
+        <w:t>absence</w:t>
+      </w:r>
+      <w:r>
+        <w:rPr>
+          <w:b w:val="0"/>
+          <w:i w:val="0"/>
+        </w:rPr>
+        <w:t xml:space="preserve"> — a frequency that was the precise inverse of everything the Choir produced. Where they connected, it severed. Where they harmonized, it isolated. Where they reached toward other living things, it withdrew.</w:t>
+      </w:r>
+    </w:p>
+    <w:p>
+      <w:pPr>
+        <w:spacing w:before="40" w:after="40"/>
+        <w:ind w:firstLine="432"/>
+      </w:pPr>
+      <w:r>
+        <w:rPr>
+          <w:b w:val="0"/>
+          <w:i/>
+        </w:rPr>
+        <w:t>It doesn't kill you. It just makes you alone.</w:t>
+      </w:r>
+    </w:p>
+    <w:p>
+      <w:pPr>
+        <w:spacing w:before="40" w:after="40"/>
+        <w:ind w:firstLine="432"/>
+      </w:pPr>
+      <w:r>
+        <w:rPr>
+          <w:b w:val="0"/>
+          <w:i w:val="0"/>
+        </w:rPr>
+        <w:t>And it was almost through.</w:t>
+      </w:r>
+    </w:p>
+    <w:p>
+      <w:pPr>
+        <w:spacing w:before="320" w:after="320"/>
+        <w:jc w:val="center"/>
+      </w:pPr>
+      <w:r>
+        <w:rPr>
+          <w:rFonts w:ascii="Georgia" w:hAnsi="Georgia"/>
+          <w:color w:val="787878"/>
+          <w:sz w:val="24"/>
+        </w:rPr>
+        <w:t>* * *</w:t>
+      </w:r>
+    </w:p>
+    <w:p>
+      <w:pPr>
+        <w:spacing w:before="40" w:after="40"/>
+        <w:ind w:firstLine="432"/>
+      </w:pPr>
+      <w:r>
+        <w:rPr>
+          <w:b w:val="0"/>
+          <w:i w:val="0"/>
+        </w:rPr>
+        <w:t>"There's a way," Kael said.</w:t>
+      </w:r>
+    </w:p>
+    <w:p>
+      <w:pPr>
+        <w:spacing w:before="40" w:after="40"/>
+        <w:ind w:firstLine="432"/>
+      </w:pPr>
+      <w:r>
+        <w:rPr>
+          <w:b w:val="0"/>
+          <w:i w:val="0"/>
+        </w:rPr>
+        <w:t>He was standing at the viewport, his reflection overlaid on the Choir's light. Miro was behind him. The old woman was on the display. Talon was on her perch, her frequency pulled tight, her amber eyes fixed on Kael with an intensity that made his chest ache.</w:t>
+      </w:r>
+    </w:p>
+    <w:p>
+      <w:pPr>
+        <w:spacing w:before="40" w:after="40"/>
+        <w:ind w:firstLine="432"/>
+      </w:pPr>
+      <w:r>
+        <w:rPr>
+          <w:b w:val="0"/>
+          <w:i w:val="0"/>
+        </w:rPr>
+        <w:t>"The gap needs a forty-seventh voice. Not a distributed resonance — a single voice, holding the Note Between's position. The Choir can't produce one. The deep listeners can't — they're outside the harmonic architecture, supporting it but not part of it."</w:t>
+      </w:r>
+    </w:p>
+    <w:p>
+      <w:pPr>
+        <w:spacing w:before="40" w:after="40"/>
+        <w:ind w:firstLine="432"/>
+      </w:pPr>
+      <w:r>
+        <w:rPr>
+          <w:b w:val="0"/>
+          <w:i w:val="0"/>
+        </w:rPr>
+        <w:t>"Kael," Miro said. His voice was very careful.</w:t>
+      </w:r>
+    </w:p>
+    <w:p>
+      <w:pPr>
+        <w:spacing w:before="40" w:after="40"/>
+        <w:ind w:firstLine="432"/>
+      </w:pPr>
+      <w:r>
+        <w:rPr>
+          <w:b w:val="0"/>
+          <w:i w:val="0"/>
+        </w:rPr>
+        <w:t>"My frequency has been altered by the drift. Full-spectrum contact with the Choir reshaped my neural architecture — widened some channels, narrowed others. I'm carrying fragments of their resonance. Pieces of their harmonic signature, woven into my own frequency the same way they absorbed the Note Between's voice."</w:t>
+      </w:r>
+    </w:p>
+    <w:p>
+      <w:pPr>
+        <w:spacing w:before="40" w:after="40"/>
+        <w:ind w:firstLine="432"/>
+      </w:pPr>
+      <w:r>
+        <w:rPr>
+          <w:b w:val="0"/>
+          <w:i w:val="0"/>
+        </w:rPr>
+        <w:t>"You want to fill the gap," the old woman said. Not a question.</w:t>
+      </w:r>
+    </w:p>
+    <w:p>
+      <w:pPr>
+        <w:spacing w:before="40" w:after="40"/>
+        <w:ind w:firstLine="432"/>
+      </w:pPr>
+      <w:r>
+        <w:rPr>
+          <w:b w:val="0"/>
+          <w:i w:val="0"/>
+        </w:rPr>
+        <w:t>"I'm the only one who can. My frequency already partially matches the Choir's harmonic structure. I can occupy the Note Between's position — not the way it did, not permanently, but enough to close the hole. Bridge it. Give the seal structural integrity while Sera fights the legal battle."</w:t>
+      </w:r>
+    </w:p>
+    <w:p>
+      <w:pPr>
+        <w:spacing w:before="40" w:after="40"/>
+        <w:ind w:firstLine="432"/>
+      </w:pPr>
+      <w:r>
+        <w:rPr>
+          <w:b w:val="0"/>
+          <w:i w:val="0"/>
+        </w:rPr>
+        <w:t>Miro stood up. "And what happens to you while you're bridging it?"</w:t>
+      </w:r>
+    </w:p>
+    <w:p>
+      <w:pPr>
+        <w:spacing w:before="40" w:after="40"/>
+        <w:ind w:firstLine="432"/>
+      </w:pPr>
+      <w:r>
+        <w:rPr>
+          <w:b w:val="0"/>
+          <w:i w:val="0"/>
+        </w:rPr>
+        <w:t>"I don't know."</w:t>
+      </w:r>
+    </w:p>
+    <w:p>
+      <w:pPr>
+        <w:spacing w:before="40" w:after="40"/>
+        <w:ind w:firstLine="432"/>
+      </w:pPr>
+      <w:r>
+        <w:rPr>
+          <w:b w:val="0"/>
+          <w:i w:val="0"/>
+        </w:rPr>
+        <w:t>"Yes you do. You know exactly what happens. The Choir's frequency reshapes everything it touches — you said that yourself. Full-spectrum contact nearly killed you in twenty minutes. You're talking about holding that contact for days. Weeks."</w:t>
+      </w:r>
+    </w:p>
+    <w:p>
+      <w:pPr>
+        <w:spacing w:before="40" w:after="40"/>
+        <w:ind w:firstLine="432"/>
+      </w:pPr>
+      <w:r>
+        <w:rPr>
+          <w:b w:val="0"/>
+          <w:i w:val="0"/>
+        </w:rPr>
+        <w:t>"The contact would be controlled. Targeted. I wouldn't be receiving the full force of forty-six minds — I'd be occupying a single position in the harmonic architecture."</w:t>
+      </w:r>
+    </w:p>
+    <w:p>
+      <w:pPr>
+        <w:spacing w:before="40" w:after="40"/>
+        <w:ind w:firstLine="432"/>
+      </w:pPr>
+      <w:r>
+        <w:rPr>
+          <w:b w:val="0"/>
+          <w:i w:val="0"/>
+        </w:rPr>
+        <w:t>"You'd be occupying a position held for millennia by a being the size of a city district. You're a hundred and eighty pounds, Kael. You're a single human with a battered ship and a hawk who —" Miro stopped. Drew a breath. "You're my friend. I've known you for less than a week and you're my friend. Don't do this."</w:t>
+      </w:r>
+    </w:p>
+    <w:p>
+      <w:pPr>
+        <w:spacing w:before="40" w:after="40"/>
+        <w:ind w:firstLine="432"/>
+      </w:pPr>
+      <w:r>
+        <w:rPr>
+          <w:b w:val="0"/>
+          <w:i w:val="0"/>
+        </w:rPr>
+        <w:t>The word landed. Kael hadn't expected it to land that hard.</w:t>
+      </w:r>
+    </w:p>
+    <w:p>
+      <w:pPr>
+        <w:spacing w:before="40" w:after="40"/>
+        <w:ind w:firstLine="432"/>
+      </w:pPr>
+      <w:r>
+        <w:rPr>
+          <w:b w:val="0"/>
+          <w:i w:val="0"/>
+        </w:rPr>
+        <w:t>"The alternative is the seal fails," he said quietly. "The entity comes through. Every frequency-capable species in the sector goes silent. Bonded pairs severed. Hive minds shattered. Communication networks dead. And that's just one rift. There are eleven cages, Miro. Nine worlds. If the Union succeeds in opening this one, they open them all."</w:t>
+      </w:r>
+    </w:p>
+    <w:p>
+      <w:pPr>
+        <w:spacing w:before="40" w:after="40"/>
+        <w:ind w:firstLine="432"/>
+      </w:pPr>
+      <w:r>
+        <w:rPr>
+          <w:b w:val="0"/>
+          <w:i w:val="0"/>
+        </w:rPr>
+        <w:t>The old woman spoke. "He is right. And he is the only one who can do it." She looked at Kael through the display. "But you should know what it will cost."</w:t>
+      </w:r>
+    </w:p>
+    <w:p>
+      <w:pPr>
+        <w:spacing w:before="40" w:after="40"/>
+        <w:ind w:firstLine="432"/>
+      </w:pPr>
+      <w:r>
+        <w:rPr>
+          <w:b w:val="0"/>
+          <w:i w:val="0"/>
+        </w:rPr>
+        <w:t>"Tell me."</w:t>
+      </w:r>
+    </w:p>
+    <w:p>
+      <w:pPr>
+        <w:spacing w:before="40" w:after="40"/>
+        <w:ind w:firstLine="432"/>
+      </w:pPr>
+      <w:r>
+        <w:rPr>
+          <w:b w:val="0"/>
+          <w:i w:val="0"/>
+        </w:rPr>
+        <w:t>"The Choir's frequency will pull at your neural architecture. You will hear more, see more, feel more than any human was designed to process. The drift that has already changed you will accelerate. Your range will expand. Your sensitivity will increase. But the channels that carry your own frequency — the ones that connect you to human things, human bonds —"</w:t>
+      </w:r>
+    </w:p>
+    <w:p>
+      <w:pPr>
+        <w:spacing w:before="40" w:after="40"/>
+        <w:ind w:firstLine="432"/>
+      </w:pPr>
+      <w:r>
+        <w:rPr>
+          <w:b w:val="0"/>
+          <w:i w:val="0"/>
+        </w:rPr>
+        <w:t>She didn't finish. She didn't need to. Kael's hand moved, involuntarily, toward Talon.</w:t>
+      </w:r>
+    </w:p>
+    <w:p>
+      <w:pPr>
+        <w:spacing w:before="40" w:after="40"/>
+        <w:ind w:firstLine="432"/>
+      </w:pPr>
+      <w:r>
+        <w:rPr>
+          <w:b w:val="0"/>
+          <w:i w:val="0"/>
+        </w:rPr>
+        <w:t>The copper thread. Already stretched by the drift. Already further than it should be.</w:t>
+      </w:r>
+    </w:p>
+    <w:p>
+      <w:pPr>
+        <w:spacing w:before="40" w:after="40"/>
+        <w:ind w:firstLine="432"/>
+      </w:pPr>
+      <w:r>
+        <w:rPr>
+          <w:b w:val="0"/>
+          <w:i w:val="0"/>
+        </w:rPr>
+        <w:t>"How far?" he asked.</w:t>
+      </w:r>
+    </w:p>
+    <w:p>
+      <w:pPr>
+        <w:spacing w:before="40" w:after="40"/>
+        <w:ind w:firstLine="432"/>
+      </w:pPr>
+      <w:r>
+        <w:rPr>
+          <w:b w:val="0"/>
+          <w:i w:val="0"/>
+        </w:rPr>
+        <w:t>"I cannot say. It depends on how long you hold the position. Hours — you may lose nothing you cannot recover. Days —" She paused. "The drift widens what it widens. It does not ask permission."</w:t>
+      </w:r>
+    </w:p>
+    <w:p>
+      <w:pPr>
+        <w:spacing w:before="40" w:after="40"/>
+        <w:ind w:firstLine="432"/>
+      </w:pPr>
+      <w:r>
+        <w:rPr>
+          <w:b w:val="0"/>
+          <w:i w:val="0"/>
+        </w:rPr>
+        <w:t>Talon was watching him. She hadn't moved from the perch, hadn't made a sound, but her frequency was doing something Kael had never felt from her — not the bright copper of alert, not the low gray of grief, not the sharp territorial flare. Something new. A frequency he didn't have a name for because she'd never needed to broadcast it before.</w:t>
+      </w:r>
+    </w:p>
+    <w:p>
+      <w:pPr>
+        <w:spacing w:before="40" w:after="40"/>
+        <w:ind w:firstLine="432"/>
+      </w:pPr>
+      <w:r>
+        <w:rPr>
+          <w:b w:val="0"/>
+          <w:i w:val="0"/>
+        </w:rPr>
+        <w:t xml:space="preserve">It felt like </w:t>
+      </w:r>
+      <w:r>
+        <w:rPr>
+          <w:b w:val="0"/>
+          <w:i/>
+        </w:rPr>
+        <w:t>goodbye said sideways, hoping it won't be heard.</w:t>
+      </w:r>
+    </w:p>
+    <w:p>
+      <w:pPr>
+        <w:spacing w:before="40" w:after="40"/>
+        <w:ind w:firstLine="432"/>
+      </w:pPr>
+      <w:r>
+        <w:rPr>
+          <w:b w:val="0"/>
+          <w:i w:val="0"/>
+        </w:rPr>
+        <w:t>"Miro," Kael said. "I need you to monitor my vitals. Neural activity, cardiac rhythm, frequency output. If my pattern starts to decohere — if I start losing the shape of my own signal —"</w:t>
+      </w:r>
+    </w:p>
+    <w:p>
+      <w:pPr>
+        <w:spacing w:before="40" w:after="40"/>
+        <w:ind w:firstLine="432"/>
+      </w:pPr>
+      <w:r>
+        <w:rPr>
+          <w:b w:val="0"/>
+          <w:i w:val="0"/>
+        </w:rPr>
+        <w:t>"I pull you out."</w:t>
+      </w:r>
+    </w:p>
+    <w:p>
+      <w:pPr>
+        <w:spacing w:before="40" w:after="40"/>
+        <w:ind w:firstLine="432"/>
+      </w:pPr>
+      <w:r>
+        <w:rPr>
+          <w:b w:val="0"/>
+          <w:i w:val="0"/>
+        </w:rPr>
+        <w:t>"You pull me out."</w:t>
+      </w:r>
+    </w:p>
+    <w:p>
+      <w:pPr>
+        <w:spacing w:before="40" w:after="40"/>
+        <w:ind w:firstLine="432"/>
+      </w:pPr>
+      <w:r>
+        <w:rPr>
+          <w:b w:val="0"/>
+          <w:i w:val="0"/>
+        </w:rPr>
+        <w:t>"How? Last time, I dragged you off the floor."</w:t>
+      </w:r>
+    </w:p>
+    <w:p>
+      <w:pPr>
+        <w:spacing w:before="40" w:after="40"/>
+        <w:ind w:firstLine="432"/>
+      </w:pPr>
+      <w:r>
+        <w:rPr>
+          <w:b w:val="0"/>
+          <w:i w:val="0"/>
+        </w:rPr>
+        <w:t>"If I'm inside the seal, physical contact won't be enough. You'll need Talon. Her frequency is the only thing that's ever cut through the Choir's signal. She's my tether."</w:t>
+      </w:r>
+    </w:p>
+    <w:p>
+      <w:pPr>
+        <w:spacing w:before="40" w:after="40"/>
+        <w:ind w:firstLine="432"/>
+      </w:pPr>
+      <w:r>
+        <w:rPr>
+          <w:b w:val="0"/>
+          <w:i w:val="0"/>
+        </w:rPr>
+        <w:t xml:space="preserve">He looked at the hawk. She looked back. The new frequency — the </w:t>
+      </w:r>
+      <w:r>
+        <w:rPr>
+          <w:b w:val="0"/>
+          <w:i/>
+        </w:rPr>
+        <w:t>goodbye</w:t>
+      </w:r>
+      <w:r>
+        <w:rPr>
+          <w:b w:val="0"/>
+          <w:i w:val="0"/>
+        </w:rPr>
+        <w:t xml:space="preserve"> — shifted. Became something fiercer. Not goodbye. </w:t>
+      </w:r>
+      <w:r>
+        <w:rPr>
+          <w:b w:val="0"/>
+          <w:i/>
+        </w:rPr>
+        <w:t>I'll come get you.</w:t>
+      </w:r>
+    </w:p>
+    <w:p>
+      <w:pPr>
+        <w:spacing w:before="40" w:after="40"/>
+        <w:ind w:firstLine="432"/>
+      </w:pPr>
+      <w:r>
+        <w:rPr>
+          <w:b w:val="0"/>
+          <w:i w:val="0"/>
+        </w:rPr>
+        <w:t>"And if Talon can't reach you?" Miro asked.</w:t>
+      </w:r>
+    </w:p>
+    <w:p>
+      <w:pPr>
+        <w:spacing w:before="40" w:after="40"/>
+        <w:ind w:firstLine="432"/>
+      </w:pPr>
+      <w:r>
+        <w:rPr>
+          <w:b w:val="0"/>
+          <w:i w:val="0"/>
+        </w:rPr>
+        <w:t>Kael didn't answer that.</w:t>
+      </w:r>
+    </w:p>
+    <w:p>
+      <w:pPr>
+        <w:spacing w:before="320" w:after="320"/>
+        <w:jc w:val="center"/>
+      </w:pPr>
+      <w:r>
+        <w:rPr>
+          <w:rFonts w:ascii="Georgia" w:hAnsi="Georgia"/>
+          <w:color w:val="787878"/>
+          <w:sz w:val="24"/>
+        </w:rPr>
+        <w:t>* * *</w:t>
+      </w:r>
+    </w:p>
+    <w:p>
+      <w:pPr>
+        <w:spacing w:before="40" w:after="40"/>
+        <w:ind w:firstLine="432"/>
+      </w:pPr>
+      <w:r>
+        <w:rPr>
+          <w:b w:val="0"/>
+          <w:i w:val="0"/>
+        </w:rPr>
+        <w:t>The rift cracked at hour nine.</w:t>
+      </w:r>
+    </w:p>
+    <w:p>
+      <w:pPr>
+        <w:spacing w:before="40" w:after="40"/>
+        <w:ind w:firstLine="432"/>
+      </w:pPr>
+      <w:r>
+        <w:rPr>
+          <w:b w:val="0"/>
+          <w:i w:val="0"/>
+        </w:rPr>
+        <w:t>Kael felt it before anyone else — a shudder in the seal's harmonic structure, the deep-frequency equivalent of a foundation shifting. The three-percent variance Miro had measured jumped to seven in the space of a breath, and the sound that came through the gap was not silence but something worse. An active, reaching silence. A frequency designed to unmake connection.</w:t>
+      </w:r>
+    </w:p>
+    <w:p>
+      <w:pPr>
+        <w:spacing w:before="40" w:after="40"/>
+        <w:ind w:firstLine="432"/>
+      </w:pPr>
+      <w:r>
+        <w:rPr>
+          <w:b w:val="0"/>
+          <w:i w:val="0"/>
+        </w:rPr>
+        <w:t>Talon shrieked. Wick — still on the ship, Sera gone — went rigid on the console edge, every feather locked, his amber eyes wide. The owl's layered channels scrambled, reset, scrambled again. For the first time, the corvaxis couldn't process what it was hearing.</w:t>
+      </w:r>
+    </w:p>
+    <w:p>
+      <w:pPr>
+        <w:spacing w:before="40" w:after="40"/>
+        <w:ind w:firstLine="432"/>
+      </w:pPr>
+      <w:r>
+        <w:rPr>
+          <w:b w:val="0"/>
+          <w:i w:val="0"/>
+        </w:rPr>
+        <w:t>"The seal," Miro said, reading his instruments. His voice was flat with control. "Variance at eleven percent. Twelve. It's accelerating."</w:t>
+      </w:r>
+    </w:p>
+    <w:p>
+      <w:pPr>
+        <w:spacing w:before="40" w:after="40"/>
+        <w:ind w:firstLine="432"/>
+      </w:pPr>
+      <w:r>
+        <w:rPr>
+          <w:b w:val="0"/>
+          <w:i w:val="0"/>
+        </w:rPr>
+        <w:t>Through the viewport, the Choir was moving — pulling tighter around the rift, forty-six voices straining, their light flickering like candles in wind. The deep listeners' mounts pressed closer, their amber glow intensifying as the old woman and her people poured their strength into the wall. But it wasn't enough. You could buttress a wall from the outside. You couldn't replace the missing stone.</w:t>
+      </w:r>
+    </w:p>
+    <w:p>
+      <w:pPr>
+        <w:spacing w:before="40" w:after="40"/>
+        <w:ind w:firstLine="432"/>
+      </w:pPr>
+      <w:r>
+        <w:rPr>
+          <w:b w:val="0"/>
+          <w:i w:val="0"/>
+        </w:rPr>
+        <w:t>"Kael," Miro said.</w:t>
+      </w:r>
+    </w:p>
+    <w:p>
+      <w:pPr>
+        <w:spacing w:before="40" w:after="40"/>
+        <w:ind w:firstLine="432"/>
+      </w:pPr>
+      <w:r>
+        <w:rPr>
+          <w:b w:val="0"/>
+          <w:i w:val="0"/>
+        </w:rPr>
+        <w:t>"I know."</w:t>
+      </w:r>
+    </w:p>
+    <w:p>
+      <w:pPr>
+        <w:spacing w:before="40" w:after="40"/>
+        <w:ind w:firstLine="432"/>
+      </w:pPr>
+      <w:r>
+        <w:rPr>
+          <w:b w:val="0"/>
+          <w:i w:val="0"/>
+        </w:rPr>
+        <w:t xml:space="preserve">"Variance at fifteen percent. If it hits twenty, the harmonic structure loses coherence. The seal doesn't thin. It </w:t>
+      </w:r>
+      <w:r>
+        <w:rPr>
+          <w:b w:val="0"/>
+          <w:i/>
+        </w:rPr>
+        <w:t>collapses</w:t>
+      </w:r>
+      <w:r>
+        <w:rPr>
+          <w:b w:val="0"/>
+          <w:i w:val="0"/>
+        </w:rPr>
+        <w:t>."</w:t>
+      </w:r>
+    </w:p>
+    <w:p>
+      <w:pPr>
+        <w:spacing w:before="40" w:after="40"/>
+        <w:ind w:firstLine="432"/>
+      </w:pPr>
+      <w:r>
+        <w:rPr>
+          <w:b w:val="0"/>
+          <w:i w:val="0"/>
+        </w:rPr>
+        <w:t>Kael sat down. Cross-legged. Palms flat. The position was familiar now — the deck plates cold against his ankles, the ridges pressing into his knees.</w:t>
+      </w:r>
+    </w:p>
+    <w:p>
+      <w:pPr>
+        <w:spacing w:before="40" w:after="40"/>
+        <w:ind w:firstLine="432"/>
+      </w:pPr>
+      <w:r>
+        <w:rPr>
+          <w:b w:val="0"/>
+          <w:i w:val="0"/>
+        </w:rPr>
+        <w:t>He looked at Talon.</w:t>
+      </w:r>
+    </w:p>
+    <w:p>
+      <w:pPr>
+        <w:spacing w:before="40" w:after="40"/>
+        <w:ind w:firstLine="432"/>
+      </w:pPr>
+      <w:r>
+        <w:rPr>
+          <w:b w:val="0"/>
+          <w:i w:val="0"/>
+        </w:rPr>
+        <w:t>She looked at him.</w:t>
+      </w:r>
+    </w:p>
+    <w:p>
+      <w:pPr>
+        <w:spacing w:before="40" w:after="40"/>
+        <w:ind w:firstLine="432"/>
+      </w:pPr>
+      <w:r>
+        <w:rPr>
+          <w:b w:val="0"/>
+          <w:i w:val="0"/>
+        </w:rPr>
+        <w:t>No frequency. No signal. Just two sets of eyes, one human and one hawk, holding each other across the cockpit the way they'd held each other across ten years and a hundred bad decisions and one very good one, made in a market on Cygnus Station when a fledgling with copper eyes had landed on his wrist and refused to leave.</w:t>
+      </w:r>
+    </w:p>
+    <w:p>
+      <w:pPr>
+        <w:spacing w:before="40" w:after="40"/>
+        <w:ind w:firstLine="432"/>
+      </w:pPr>
+      <w:r>
+        <w:rPr>
+          <w:b w:val="0"/>
+          <w:i w:val="0"/>
+        </w:rPr>
+        <w:t>"I'll hear you," he said. "I'll always hear you."</w:t>
+      </w:r>
+    </w:p>
+    <w:p>
+      <w:pPr>
+        <w:spacing w:before="40" w:after="40"/>
+        <w:ind w:firstLine="432"/>
+      </w:pPr>
+      <w:r>
+        <w:rPr>
+          <w:b w:val="0"/>
+          <w:i w:val="0"/>
+        </w:rPr>
+        <w:t>Talon's crest rose. Copper. Bright, fierce, unbreaking copper.</w:t>
+      </w:r>
+    </w:p>
+    <w:p>
+      <w:pPr>
+        <w:spacing w:before="40" w:after="40"/>
+        <w:ind w:firstLine="432"/>
+      </w:pPr>
+      <w:r>
+        <w:rPr>
+          <w:b w:val="0"/>
+          <w:i/>
+        </w:rPr>
+        <w:t>You'd better.</w:t>
+      </w:r>
+    </w:p>
+    <w:p>
+      <w:pPr>
+        <w:spacing w:before="40" w:after="40"/>
+        <w:ind w:firstLine="432"/>
+      </w:pPr>
+      <w:r>
+        <w:rPr>
+          <w:b w:val="0"/>
+          <w:i w:val="0"/>
+        </w:rPr>
+        <w:t>Kael closed his eyes.</w:t>
+      </w:r>
+    </w:p>
+    <w:p>
+      <w:pPr>
+        <w:spacing w:before="40" w:after="40"/>
+        <w:ind w:firstLine="432"/>
+      </w:pPr>
+      <w:r>
+        <w:rPr>
+          <w:b w:val="0"/>
+          <w:i w:val="0"/>
+        </w:rPr>
+        <w:t>He opened his frequency — all of it, every channel, every register the drift had given him and every one he'd been born with — and he poured himself into the gap.</w:t>
+      </w:r>
+    </w:p>
+    <w:p>
+      <w:pPr>
+        <w:spacing w:before="320" w:after="320"/>
+        <w:jc w:val="center"/>
+      </w:pPr>
+      <w:r>
+        <w:rPr>
+          <w:rFonts w:ascii="Georgia" w:hAnsi="Georgia"/>
+          <w:color w:val="787878"/>
+          <w:sz w:val="24"/>
+        </w:rPr>
+        <w:t>* * *</w:t>
+      </w:r>
+    </w:p>
+    <w:p>
+      <w:pPr>
+        <w:spacing w:before="40" w:after="40"/>
+        <w:ind w:firstLine="432"/>
+      </w:pPr>
+      <w:r>
+        <w:rPr>
+          <w:b w:val="0"/>
+          <w:i w:val="0"/>
+        </w:rPr>
+        <w:t>The Choir caught him.</w:t>
+      </w:r>
+    </w:p>
+    <w:p>
+      <w:pPr>
+        <w:spacing w:before="40" w:after="40"/>
+        <w:ind w:firstLine="432"/>
+      </w:pPr>
+      <w:r>
+        <w:rPr>
+          <w:b w:val="0"/>
+          <w:i w:val="0"/>
+        </w:rPr>
+        <w:t xml:space="preserve">Forty-six voices, adjusting in real time, reshaping their harmony to accommodate something impossibly small and impossibly fragile and impossibly </w:t>
+      </w:r>
+      <w:r>
+        <w:rPr>
+          <w:b w:val="0"/>
+          <w:i/>
+        </w:rPr>
+        <w:t>there</w:t>
+      </w:r>
+      <w:r>
+        <w:rPr>
+          <w:b w:val="0"/>
+          <w:i w:val="0"/>
+        </w:rPr>
+        <w:t xml:space="preserve">. They didn't crush him the way they had during first contact. They </w:t>
+      </w:r>
+      <w:r>
+        <w:rPr>
+          <w:b w:val="0"/>
+          <w:i/>
+        </w:rPr>
+        <w:t>placed</w:t>
+      </w:r>
+      <w:r>
+        <w:rPr>
+          <w:b w:val="0"/>
+          <w:i w:val="0"/>
+        </w:rPr>
+        <w:t xml:space="preserve"> him — guided his frequency into the Note Between's position with the care of hands settling a stone into an arch.</w:t>
+      </w:r>
+    </w:p>
+    <w:p>
+      <w:pPr>
+        <w:spacing w:before="40" w:after="40"/>
+        <w:ind w:firstLine="432"/>
+      </w:pPr>
+      <w:r>
+        <w:rPr>
+          <w:b w:val="0"/>
+          <w:i w:val="0"/>
+        </w:rPr>
+        <w:t>The gap closed.</w:t>
+      </w:r>
+    </w:p>
+    <w:p>
+      <w:pPr>
+        <w:spacing w:before="40" w:after="40"/>
+        <w:ind w:firstLine="432"/>
+      </w:pPr>
+      <w:r>
+        <w:rPr>
+          <w:b w:val="0"/>
+          <w:i w:val="0"/>
+        </w:rPr>
+        <w:t>The seal locked.</w:t>
+      </w:r>
+    </w:p>
+    <w:p>
+      <w:pPr>
+        <w:spacing w:before="40" w:after="40"/>
+        <w:ind w:firstLine="432"/>
+      </w:pPr>
+      <w:r>
+        <w:rPr>
+          <w:b w:val="0"/>
+          <w:i w:val="0"/>
+        </w:rPr>
+        <w:t>And the entity, pressed against the barrier where the thinness had been, met Kael's mind full-on.</w:t>
+      </w:r>
+    </w:p>
+    <w:p>
+      <w:pPr>
+        <w:spacing w:before="40" w:after="40"/>
+        <w:ind w:firstLine="432"/>
+      </w:pPr>
+      <w:r>
+        <w:rPr>
+          <w:b w:val="0"/>
+          <w:i w:val="0"/>
+        </w:rPr>
+        <w:t>It was like being unmade.</w:t>
+      </w:r>
+    </w:p>
+    <w:p>
+      <w:pPr>
+        <w:spacing w:before="40" w:after="40"/>
+        <w:ind w:firstLine="432"/>
+      </w:pPr>
+      <w:r>
+        <w:rPr>
+          <w:b w:val="0"/>
+          <w:i w:val="0"/>
+        </w:rPr>
+        <w:t>Not pain — nothing so simple as pain. It was the systematic dissolution of every connection his mind had ever formed. He felt his memory of Talon's fledgling weight thin and stretch. He felt the shape of Miro's laugh flatten into data. He felt the Choir's song, which should have been all around him, become abstract — sound without meaning, vibration without warmth.</w:t>
+      </w:r>
+    </w:p>
+    <w:p>
+      <w:pPr>
+        <w:spacing w:before="40" w:after="40"/>
+        <w:ind w:firstLine="432"/>
+      </w:pPr>
+      <w:r>
+        <w:rPr>
+          <w:b w:val="0"/>
+          <w:i/>
+        </w:rPr>
+        <w:t>It doesn't kill you. It just makes you alone.</w:t>
+      </w:r>
+    </w:p>
+    <w:p>
+      <w:pPr>
+        <w:spacing w:before="40" w:after="40"/>
+        <w:ind w:firstLine="432"/>
+      </w:pPr>
+      <w:r>
+        <w:rPr>
+          <w:b w:val="0"/>
+          <w:i w:val="0"/>
+        </w:rPr>
+        <w:t>He held.</w:t>
+      </w:r>
+    </w:p>
+    <w:p>
+      <w:pPr>
+        <w:spacing w:before="40" w:after="40"/>
+        <w:ind w:firstLine="432"/>
+      </w:pPr>
+      <w:r>
+        <w:rPr>
+          <w:b w:val="0"/>
+          <w:i w:val="0"/>
+        </w:rPr>
+        <w:t>He held because the Academy had trained him to hold, and the drift had given him the range to hold, and somewhere behind his closed eyes, on a perch in a cockpit in a ship held together by illegal solder, a hawk was screaming his name in a frequency he could barely hear.</w:t>
+      </w:r>
+    </w:p>
+    <w:p>
+      <w:pPr>
+        <w:spacing w:before="40" w:after="40"/>
+        <w:ind w:firstLine="432"/>
+      </w:pPr>
+      <w:r>
+        <w:rPr>
+          <w:b w:val="0"/>
+          <w:i w:val="0"/>
+        </w:rPr>
+        <w:t>Barely.</w:t>
+      </w:r>
+    </w:p>
+    <w:p>
+      <w:pPr>
+        <w:spacing w:before="40" w:after="40"/>
+        <w:ind w:firstLine="432"/>
+      </w:pPr>
+      <w:r>
+        <w:rPr>
+          <w:b w:val="0"/>
+          <w:i w:val="0"/>
+        </w:rPr>
+        <w:t>The copper thread — thin, stretched, a whisper where it had been a shout — was still there. Talon. Burning through every channel she had, pouring herself into the frequency the way she'd poured herself into every fight since the day she chose him. Not the refined, layered signal of a corvaxis. Not the deep resonance of the Choir. Just one hawk, one bond, copper-bright and furious and refusing — absolutely refusing — to let go.</w:t>
+      </w:r>
+    </w:p>
+    <w:p>
+      <w:pPr>
+        <w:spacing w:before="40" w:after="40"/>
+        <w:ind w:firstLine="432"/>
+      </w:pPr>
+      <w:r>
+        <w:rPr>
+          <w:b w:val="0"/>
+          <w:i w:val="0"/>
+        </w:rPr>
+        <w:t>The entity pressed harder.</w:t>
+      </w:r>
+    </w:p>
+    <w:p>
+      <w:pPr>
+        <w:spacing w:before="40" w:after="40"/>
+        <w:ind w:firstLine="432"/>
+      </w:pPr>
+      <w:r>
+        <w:rPr>
+          <w:b w:val="0"/>
+          <w:i w:val="0"/>
+        </w:rPr>
+        <w:t>Kael's vision went white. Then dark. Then into a register that wasn't vision at all — a frequency-space where the Choir existed as architecture and the seal existed as music and the entity existed as the silence between notes, growing wider, pressing its way into the harmony through the one place it had never been resisted before.</w:t>
+      </w:r>
+    </w:p>
+    <w:p>
+      <w:pPr>
+        <w:spacing w:before="40" w:after="40"/>
+        <w:ind w:firstLine="432"/>
+      </w:pPr>
+      <w:r>
+        <w:rPr>
+          <w:b w:val="0"/>
+          <w:i w:val="0"/>
+        </w:rPr>
+        <w:t>A human mind.</w:t>
+      </w:r>
+    </w:p>
+    <w:p>
+      <w:pPr>
+        <w:spacing w:before="40" w:after="40"/>
+        <w:ind w:firstLine="432"/>
+      </w:pPr>
+      <w:r>
+        <w:rPr>
+          <w:b w:val="0"/>
+          <w:i w:val="0"/>
+        </w:rPr>
+        <w:t>The Choir had held the entity for millennia because their consciousness was collective — it couldn't isolate what was already connected. But Kael was human. Individual. Singular. And the entity's weapon was isolation. It knew how to find the seams in a single mind. It was finding them now.</w:t>
+      </w:r>
+    </w:p>
+    <w:p>
+      <w:pPr>
+        <w:spacing w:before="40" w:after="40"/>
+        <w:ind w:firstLine="432"/>
+      </w:pPr>
+      <w:r>
+        <w:rPr>
+          <w:b w:val="0"/>
+          <w:i/>
+        </w:rPr>
+        <w:t>Come home</w:t>
+      </w:r>
+      <w:r>
+        <w:rPr>
+          <w:b w:val="0"/>
+          <w:i w:val="0"/>
+        </w:rPr>
+        <w:t>, Talon broadcast. The signal was faint. Impossibly faint.</w:t>
+      </w:r>
+    </w:p>
+    <w:p>
+      <w:pPr>
+        <w:spacing w:before="40" w:after="40"/>
+        <w:ind w:firstLine="432"/>
+      </w:pPr>
+      <w:r>
+        <w:rPr>
+          <w:b w:val="0"/>
+          <w:i w:val="0"/>
+        </w:rPr>
+        <w:t>"Variance at zero," Miro's voice said, distant, a sound from another world. "The seal is holding. Kael, the seal is holding. But your neural output — Kael, your pattern is shifting. You're losing coherence. I need you to —"</w:t>
+      </w:r>
+    </w:p>
+    <w:p>
+      <w:pPr>
+        <w:spacing w:before="40" w:after="40"/>
+        <w:ind w:firstLine="432"/>
+      </w:pPr>
+      <w:r>
+        <w:rPr>
+          <w:b w:val="0"/>
+          <w:i w:val="0"/>
+        </w:rPr>
+        <w:t>Kael couldn't hear the rest.</w:t>
+      </w:r>
+    </w:p>
+    <w:p>
+      <w:pPr>
+        <w:spacing w:before="40" w:after="40"/>
+        <w:ind w:firstLine="432"/>
+      </w:pPr>
+      <w:r>
+        <w:rPr>
+          <w:b w:val="0"/>
+          <w:i w:val="0"/>
+        </w:rPr>
+        <w:t xml:space="preserve">The entity filled his perception. Not with sound. Not with vision. With </w:t>
+      </w:r>
+      <w:r>
+        <w:rPr>
+          <w:b w:val="0"/>
+          <w:i/>
+        </w:rPr>
+        <w:t>absence</w:t>
+      </w:r>
+      <w:r>
+        <w:rPr>
+          <w:b w:val="0"/>
+          <w:i w:val="0"/>
+        </w:rPr>
+        <w:t xml:space="preserve"> — a void that had weight, that had texture, that pressed against every connection in his mind and said, with the patient certainty of something that had been waiting since before the stars:</w:t>
+      </w:r>
+    </w:p>
+    <w:p>
+      <w:pPr>
+        <w:spacing w:before="40" w:after="40"/>
+        <w:ind w:firstLine="432"/>
+      </w:pPr>
+      <w:r>
+        <w:rPr>
+          <w:b w:val="0"/>
+          <w:i/>
+        </w:rPr>
+        <w:t>You are alone. You have always been alone. The bonds you feel are noise. The connections you treasure are interference. Let them go. Let it all go quiet.</w:t>
+      </w:r>
+    </w:p>
+    <w:p>
+      <w:pPr>
+        <w:spacing w:before="40" w:after="40"/>
+        <w:ind w:firstLine="432"/>
+      </w:pPr>
+      <w:r>
+        <w:rPr>
+          <w:b w:val="0"/>
+          <w:i w:val="0"/>
+        </w:rPr>
+        <w:t>In the cockpit, Miro was shouting.</w:t>
+      </w:r>
+    </w:p>
+    <w:p>
+      <w:pPr>
+        <w:spacing w:before="40" w:after="40"/>
+        <w:ind w:firstLine="432"/>
+      </w:pPr>
+      <w:r>
+        <w:rPr>
+          <w:b w:val="0"/>
+          <w:i w:val="0"/>
+        </w:rPr>
+        <w:t>Talon was screaming — not frequency, not signal, but her physical voice, the raw raptor shriek that had nothing to do with training or bonds or the Academy. The sound of an animal fighting for its partner.</w:t>
+      </w:r>
+    </w:p>
+    <w:p>
+      <w:pPr>
+        <w:spacing w:before="40" w:after="40"/>
+        <w:ind w:firstLine="432"/>
+      </w:pPr>
+      <w:r>
+        <w:rPr>
+          <w:b w:val="0"/>
+          <w:i w:val="0"/>
+        </w:rPr>
+        <w:t>And Kael, inside the seal, inside the song, inside the silence that wanted to swallow everything — Kael held.</w:t>
+      </w:r>
+    </w:p>
+    <w:p>
+      <w:pPr>
+        <w:spacing w:before="40" w:after="40"/>
+        <w:ind w:firstLine="432"/>
+      </w:pPr>
+      <w:r>
+        <w:rPr>
+          <w:b w:val="0"/>
+          <w:i w:val="0"/>
+        </w:rPr>
+        <w:t>But the copper thread dimmed.</w:t>
+      </w:r>
+    </w:p>
+    <w:p>
+      <w:pPr>
+        <w:spacing w:before="40" w:after="40"/>
+        <w:ind w:firstLine="432"/>
+      </w:pPr>
+      <w:r>
+        <w:rPr>
+          <w:b w:val="0"/>
+          <w:i w:val="0"/>
+        </w:rPr>
+        <w:t>And dimmed.</w:t>
+      </w:r>
+    </w:p>
+    <w:p>
+      <w:pPr>
+        <w:spacing w:before="40" w:after="40"/>
+        <w:ind w:firstLine="432"/>
+      </w:pPr>
+      <w:r>
+        <w:rPr>
+          <w:b w:val="0"/>
+          <w:i w:val="0"/>
+        </w:rPr>
+        <w:t>And dimmed.</w:t>
       </w:r>
     </w:p>
     <w:sectPr>

</xml_diff>

<commit_message>
Add Chapter 8: The Frequency — End of Book One
Kael defeats the entity not with force but by listening — hearing
the isolation beneath its attack, understanding it as condition
rather than malice. He becomes the threshold: the boundary where
connection and isolation meet and neither crosses.

Miro places Talon on Kael's chest. She brings him back with weight
and warmth and the refusal to let go. The copper thread catches —
changed, braided deeper, but unbroken.

The Choir recalibrates around the distributed threshold Kael showed
them. The seal holds in a new form. The old woman departs for other
cages, other work. Sera wins the legal battle — Article One stands,
the EDF motion is denied 11-2, and precedent is set.

Final scene mirrors Chapter 1 beat for beat: cockpit, coffee, the
mystery novel finished at last, Talon on her perch. A new distress
signal. The ship turns. The stars stretch.

End of Book One.

https://claude.ai/code/session_01XVZGKMeTpqLFzCVEmX6JZq
</commit_message>
<xml_diff>
--- a/The_Wildtongue_Chronicles.docx
+++ b/The_Wildtongue_Chronicles.docx
@@ -13910,6 +13910,1865 @@
           <w:i w:val="0"/>
         </w:rPr>
         <w:t>And dimmed.</w:t>
+      </w:r>
+    </w:p>
+    <w:p>
+      <w:r>
+        <w:br w:type="page"/>
+      </w:r>
+    </w:p>
+    <w:p>
+      <w:pPr>
+        <w:spacing w:before="960" w:after="480"/>
+        <w:jc w:val="center"/>
+      </w:pPr>
+      <w:r>
+        <w:rPr>
+          <w:rFonts w:ascii="Georgia" w:hAnsi="Georgia"/>
+          <w:b/>
+          <w:sz w:val="36"/>
+        </w:rPr>
+        <w:t>CHAPTER 8 — THE FREQUENCY</w:t>
+      </w:r>
+    </w:p>
+    <w:p>
+      <w:pPr>
+        <w:spacing w:before="40" w:after="40"/>
+        <w:ind w:firstLine="432"/>
+      </w:pPr>
+      <w:r>
+        <w:rPr>
+          <w:b w:val="0"/>
+          <w:i w:val="0"/>
+        </w:rPr>
+        <w:t>The entity's argument was simple.</w:t>
+      </w:r>
+    </w:p>
+    <w:p>
+      <w:pPr>
+        <w:spacing w:before="40" w:after="40"/>
+        <w:ind w:firstLine="432"/>
+      </w:pPr>
+      <w:r>
+        <w:rPr>
+          <w:b w:val="0"/>
+          <w:i/>
+        </w:rPr>
+        <w:t>You are alone.</w:t>
+      </w:r>
+    </w:p>
+    <w:p>
+      <w:pPr>
+        <w:spacing w:before="40" w:after="40"/>
+        <w:ind w:firstLine="432"/>
+      </w:pPr>
+      <w:r>
+        <w:rPr>
+          <w:b w:val="0"/>
+          <w:i w:val="0"/>
+        </w:rPr>
+        <w:t>It worked through his mind the way water works through stone — not breaking, just finding every crack and filling it. Kael felt his memory of Talon's fledgling weight thin to almost nothing. The sound of Miro's laugh flattened into data. The Choir's song became geometry without warmth — architecture he could perceive but no longer feel.</w:t>
+      </w:r>
+    </w:p>
+    <w:p>
+      <w:pPr>
+        <w:spacing w:before="40" w:after="40"/>
+        <w:ind w:firstLine="432"/>
+      </w:pPr>
+      <w:r>
+        <w:rPr>
+          <w:b w:val="0"/>
+          <w:i w:val="0"/>
+        </w:rPr>
+        <w:t>The copper thread was a filament. A rumor.</w:t>
+      </w:r>
+    </w:p>
+    <w:p>
+      <w:pPr>
+        <w:spacing w:before="40" w:after="40"/>
+        <w:ind w:firstLine="432"/>
+      </w:pPr>
+      <w:r>
+        <w:rPr>
+          <w:b w:val="0"/>
+          <w:i/>
+        </w:rPr>
+        <w:t>Connection is noise. The bonds you treasure are interference. Let them go. Let it all go quiet.</w:t>
+      </w:r>
+    </w:p>
+    <w:p>
+      <w:pPr>
+        <w:spacing w:before="40" w:after="40"/>
+        <w:ind w:firstLine="432"/>
+      </w:pPr>
+      <w:r>
+        <w:rPr>
+          <w:b w:val="0"/>
+          <w:i w:val="0"/>
+        </w:rPr>
+        <w:t>And Kael — inside the seal, inside the song, inside the silence that wanted to be the only thing left — did the only thing he had ever been trained to do.</w:t>
+      </w:r>
+    </w:p>
+    <w:p>
+      <w:pPr>
+        <w:spacing w:before="40" w:after="40"/>
+        <w:ind w:firstLine="432"/>
+      </w:pPr>
+      <w:r>
+        <w:rPr>
+          <w:b w:val="0"/>
+          <w:i w:val="0"/>
+        </w:rPr>
+        <w:t>He listened.</w:t>
+      </w:r>
+    </w:p>
+    <w:p>
+      <w:pPr>
+        <w:spacing w:before="40" w:after="40"/>
+        <w:ind w:firstLine="432"/>
+      </w:pPr>
+      <w:r>
+        <w:rPr>
+          <w:b w:val="0"/>
+          <w:i w:val="0"/>
+        </w:rPr>
+        <w:t>Not to the argument. To what was underneath. The way you listen past the words of a distress call to find the frequency beneath — the emotional architecture that tells you what the signal really means.</w:t>
+      </w:r>
+    </w:p>
+    <w:p>
+      <w:pPr>
+        <w:spacing w:before="40" w:after="40"/>
+        <w:ind w:firstLine="432"/>
+      </w:pPr>
+      <w:r>
+        <w:rPr>
+          <w:b w:val="0"/>
+          <w:i w:val="0"/>
+        </w:rPr>
+        <w:t>The Academy had taught him this with animals. With species so alien their cognition shared nothing with his own. First lesson: when you can't understand, listen harder. Second lesson: everything that communicates is telling you what it needs.</w:t>
+      </w:r>
+    </w:p>
+    <w:p>
+      <w:pPr>
+        <w:spacing w:before="40" w:after="40"/>
+        <w:ind w:firstLine="432"/>
+      </w:pPr>
+      <w:r>
+        <w:rPr>
+          <w:b w:val="0"/>
+          <w:i w:val="0"/>
+        </w:rPr>
+        <w:t>The entity was not attacking.</w:t>
+      </w:r>
+    </w:p>
+    <w:p>
+      <w:pPr>
+        <w:spacing w:before="40" w:after="40"/>
+        <w:ind w:firstLine="432"/>
+      </w:pPr>
+      <w:r>
+        <w:rPr>
+          <w:b w:val="0"/>
+          <w:i w:val="0"/>
+        </w:rPr>
+        <w:t>It was describing.</w:t>
+      </w:r>
+    </w:p>
+    <w:p>
+      <w:pPr>
+        <w:spacing w:before="40" w:after="40"/>
+        <w:ind w:firstLine="432"/>
+      </w:pPr>
+      <w:r>
+        <w:rPr>
+          <w:b w:val="0"/>
+          <w:i w:val="0"/>
+        </w:rPr>
+        <w:t>Itself.</w:t>
+      </w:r>
+    </w:p>
+    <w:p>
+      <w:pPr>
+        <w:spacing w:before="40" w:after="40"/>
+        <w:ind w:firstLine="432"/>
+      </w:pPr>
+      <w:r>
+        <w:rPr>
+          <w:b w:val="0"/>
+          <w:i w:val="0"/>
+        </w:rPr>
+        <w:t>Kael stopped resisting. Not surrender — something finer than that. He stopped pushing against the silence and let it be what it was. And in the space that opened between effort and its absence, he heard the entity clearly for the first time.</w:t>
+      </w:r>
+    </w:p>
+    <w:p>
+      <w:pPr>
+        <w:spacing w:before="40" w:after="40"/>
+        <w:ind w:firstLine="432"/>
+      </w:pPr>
+      <w:r>
+        <w:rPr>
+          <w:b w:val="0"/>
+          <w:i w:val="0"/>
+        </w:rPr>
+        <w:t>It was alone.</w:t>
+      </w:r>
+    </w:p>
+    <w:p>
+      <w:pPr>
+        <w:spacing w:before="40" w:after="40"/>
+        <w:ind w:firstLine="432"/>
+      </w:pPr>
+      <w:r>
+        <w:rPr>
+          <w:b w:val="0"/>
+          <w:i w:val="0"/>
+        </w:rPr>
+        <w:t>Not alone the way a person is alone in a room. Alone the way a law of physics is alone. Fundamental. Structural. Unchangeable. Its nature was severance the way the Choir's nature was connection. Not a weapon. A condition. It did what it was. The way fire burns. The way silence spreads.</w:t>
+      </w:r>
+    </w:p>
+    <w:p>
+      <w:pPr>
+        <w:spacing w:before="40" w:after="40"/>
+        <w:ind w:firstLine="432"/>
+      </w:pPr>
+      <w:r>
+        <w:rPr>
+          <w:b w:val="0"/>
+          <w:i w:val="0"/>
+        </w:rPr>
+        <w:t>And beneath the isolation — so far down that millennia of contact with the Choir's seal had never reached it — the entity was afraid. Not of the Choir. Not of Kael. Afraid of its own permanence. The deep, wordless terror of a thing that cannot change, cannot reach, cannot touch, and knows this with the clarity of an intelligence older than light.</w:t>
+      </w:r>
+    </w:p>
+    <w:p>
+      <w:pPr>
+        <w:spacing w:before="40" w:after="40"/>
+        <w:ind w:firstLine="432"/>
+      </w:pPr>
+      <w:r>
+        <w:rPr>
+          <w:b w:val="0"/>
+          <w:i/>
+        </w:rPr>
+        <w:t>You are alone</w:t>
+      </w:r>
+      <w:r>
+        <w:rPr>
+          <w:b w:val="0"/>
+          <w:i w:val="0"/>
+        </w:rPr>
+        <w:t>, it said.</w:t>
+      </w:r>
+    </w:p>
+    <w:p>
+      <w:pPr>
+        <w:spacing w:before="40" w:after="40"/>
+        <w:ind w:firstLine="432"/>
+      </w:pPr>
+      <w:r>
+        <w:rPr>
+          <w:b w:val="0"/>
+          <w:i w:val="0"/>
+        </w:rPr>
+        <w:t xml:space="preserve">But what Kael heard, underneath, in the frequency beneath the frequency, was: </w:t>
+      </w:r>
+      <w:r>
+        <w:rPr>
+          <w:b w:val="0"/>
+          <w:i/>
+        </w:rPr>
+        <w:t>I am alone. I am alone. I am alone.</w:t>
+      </w:r>
+    </w:p>
+    <w:p>
+      <w:pPr>
+        <w:spacing w:before="40" w:after="40"/>
+        <w:ind w:firstLine="432"/>
+      </w:pPr>
+      <w:r>
+        <w:rPr>
+          <w:b w:val="0"/>
+          <w:i w:val="0"/>
+        </w:rPr>
+        <w:t>This didn't make it less dangerous. A fire that burns because burning is its nature is still a fire. You don't fight it with anger. You fight it with a threshold — a line where burning meets not-burning and neither crosses.</w:t>
+      </w:r>
+    </w:p>
+    <w:p>
+      <w:pPr>
+        <w:spacing w:before="40" w:after="40"/>
+        <w:ind w:firstLine="432"/>
+      </w:pPr>
+      <w:r>
+        <w:rPr>
+          <w:b w:val="0"/>
+          <w:i w:val="0"/>
+        </w:rPr>
+        <w:t>The Note Between had understood this. The name itself said it — the voice that held the interval, the frequency between two others. Not resolving dissonance. Not eliminating it. Holding the space where dissonance and harmony met without either one consuming the other.</w:t>
+      </w:r>
+    </w:p>
+    <w:p>
+      <w:pPr>
+        <w:spacing w:before="40" w:after="40"/>
+        <w:ind w:firstLine="432"/>
+      </w:pPr>
+      <w:r>
+        <w:rPr>
+          <w:b w:val="0"/>
+          <w:i w:val="0"/>
+        </w:rPr>
+        <w:t>The seal didn't need to be a wall. Walls crack. Walls have gaps. A threshold holds because both sides lean against it.</w:t>
+      </w:r>
+    </w:p>
+    <w:p>
+      <w:pPr>
+        <w:spacing w:before="40" w:after="40"/>
+        <w:ind w:firstLine="432"/>
+      </w:pPr>
+      <w:r>
+        <w:rPr>
+          <w:b w:val="0"/>
+          <w:i w:val="0"/>
+        </w:rPr>
+        <w:t>Kael let his frequency settle into the space between — the Choir's connection on one side, the entity's isolation on the other — and he held. Not with force. With presence. The way you hold a doorframe. The way a frequency holds the space between silence and sound.</w:t>
+      </w:r>
+    </w:p>
+    <w:p>
+      <w:pPr>
+        <w:spacing w:before="40" w:after="40"/>
+        <w:ind w:firstLine="432"/>
+      </w:pPr>
+      <w:r>
+        <w:rPr>
+          <w:b w:val="0"/>
+          <w:i w:val="0"/>
+        </w:rPr>
+        <w:t>The entity pressed.</w:t>
+      </w:r>
+    </w:p>
+    <w:p>
+      <w:pPr>
+        <w:spacing w:before="40" w:after="40"/>
+        <w:ind w:firstLine="432"/>
+      </w:pPr>
+      <w:r>
+        <w:rPr>
+          <w:b w:val="0"/>
+          <w:i w:val="0"/>
+        </w:rPr>
+        <w:t>Kael held.</w:t>
+      </w:r>
+    </w:p>
+    <w:p>
+      <w:pPr>
+        <w:spacing w:before="40" w:after="40"/>
+        <w:ind w:firstLine="432"/>
+      </w:pPr>
+      <w:r>
+        <w:rPr>
+          <w:b w:val="0"/>
+          <w:i w:val="0"/>
+        </w:rPr>
+        <w:t>The entity pressed harder — and Kael felt it, the full weight of something that had been alone since before the first star burned, pressing against a single human mind the way an ocean presses against a stone. He held. Not because he was strong enough. Because holding was what thresholds do.</w:t>
+      </w:r>
+    </w:p>
+    <w:p>
+      <w:pPr>
+        <w:spacing w:before="40" w:after="40"/>
+        <w:ind w:firstLine="432"/>
+      </w:pPr>
+      <w:r>
+        <w:rPr>
+          <w:b w:val="0"/>
+          <w:i w:val="0"/>
+        </w:rPr>
+        <w:t xml:space="preserve">The seal stabilized. Not locked, not rigid — </w:t>
+      </w:r>
+      <w:r>
+        <w:rPr>
+          <w:b w:val="0"/>
+          <w:i/>
+        </w:rPr>
+        <w:t>balanced</w:t>
+      </w:r>
+      <w:r>
+        <w:rPr>
+          <w:b w:val="0"/>
+          <w:i w:val="0"/>
+        </w:rPr>
+        <w:t>. The harmonic variance didn't drop to zero. It found equilibrium. A living tension. The kind of structure that holds not because it's unbreakable but because it's in constant, honest negotiation with the forces on either side.</w:t>
+      </w:r>
+    </w:p>
+    <w:p>
+      <w:pPr>
+        <w:spacing w:before="40" w:after="40"/>
+        <w:ind w:firstLine="432"/>
+      </w:pPr>
+      <w:r>
+        <w:rPr>
+          <w:b w:val="0"/>
+          <w:i w:val="0"/>
+        </w:rPr>
+        <w:t>The entity's presence dimmed. Not defeated. Not gone. Met. For the first time in its existence, something had heard it and held the line not with opposition but with understanding, and it had no framework for what that meant.</w:t>
+      </w:r>
+    </w:p>
+    <w:p>
+      <w:pPr>
+        <w:spacing w:before="40" w:after="40"/>
+        <w:ind w:firstLine="432"/>
+      </w:pPr>
+      <w:r>
+        <w:rPr>
+          <w:b w:val="0"/>
+          <w:i w:val="0"/>
+        </w:rPr>
+        <w:t>The silence stopped pressing.</w:t>
+      </w:r>
+    </w:p>
+    <w:p>
+      <w:pPr>
+        <w:spacing w:before="40" w:after="40"/>
+        <w:ind w:firstLine="432"/>
+      </w:pPr>
+      <w:r>
+        <w:rPr>
+          <w:b w:val="0"/>
+          <w:i w:val="0"/>
+        </w:rPr>
+        <w:t>It waited.</w:t>
+      </w:r>
+    </w:p>
+    <w:p>
+      <w:pPr>
+        <w:spacing w:before="40" w:after="40"/>
+        <w:ind w:firstLine="432"/>
+      </w:pPr>
+      <w:r>
+        <w:rPr>
+          <w:b w:val="0"/>
+          <w:i w:val="0"/>
+        </w:rPr>
+        <w:t>And Kael, the threshold, held.</w:t>
+      </w:r>
+    </w:p>
+    <w:p>
+      <w:pPr>
+        <w:spacing w:before="320" w:after="320"/>
+        <w:jc w:val="center"/>
+      </w:pPr>
+      <w:r>
+        <w:rPr>
+          <w:rFonts w:ascii="Georgia" w:hAnsi="Georgia"/>
+          <w:color w:val="787878"/>
+          <w:sz w:val="24"/>
+        </w:rPr>
+        <w:t>* * *</w:t>
+      </w:r>
+    </w:p>
+    <w:p>
+      <w:pPr>
+        <w:spacing w:before="40" w:after="40"/>
+        <w:ind w:firstLine="432"/>
+      </w:pPr>
+      <w:r>
+        <w:rPr>
+          <w:b w:val="0"/>
+          <w:i w:val="0"/>
+        </w:rPr>
+        <w:t>In the cockpit, Miro was watching numbers.</w:t>
+      </w:r>
+    </w:p>
+    <w:p>
+      <w:pPr>
+        <w:spacing w:before="40" w:after="40"/>
+        <w:ind w:firstLine="432"/>
+      </w:pPr>
+      <w:r>
+        <w:rPr>
+          <w:b w:val="0"/>
+          <w:i w:val="0"/>
+        </w:rPr>
+        <w:t>Kael's neural output had gone erratic seven minutes ago. His cardiac rhythm was slowing — not the crash of failure but the deep, spreading deceleration of a mind being pulled into a frequency larger than it was designed to hold. His body was on the cockpit floor. Eyes closed. Breathing shallow and even and too slow.</w:t>
+      </w:r>
+    </w:p>
+    <w:p>
+      <w:pPr>
+        <w:spacing w:before="40" w:after="40"/>
+        <w:ind w:firstLine="432"/>
+      </w:pPr>
+      <w:r>
+        <w:rPr>
+          <w:b w:val="0"/>
+          <w:i w:val="0"/>
+        </w:rPr>
+        <w:t>The seal was holding. Miro could see it on the instruments — variance stable at two percent, the Choir's harmonic structure stronger than it had been in hours. Whatever Kael was doing in there, it was working.</w:t>
+      </w:r>
+    </w:p>
+    <w:p>
+      <w:pPr>
+        <w:spacing w:before="40" w:after="40"/>
+        <w:ind w:firstLine="432"/>
+      </w:pPr>
+      <w:r>
+        <w:rPr>
+          <w:b w:val="0"/>
+          <w:i w:val="0"/>
+        </w:rPr>
+        <w:t>But Kael was leaving.</w:t>
+      </w:r>
+    </w:p>
+    <w:p>
+      <w:pPr>
+        <w:spacing w:before="40" w:after="40"/>
+        <w:ind w:firstLine="432"/>
+      </w:pPr>
+      <w:r>
+        <w:rPr>
+          <w:b w:val="0"/>
+          <w:i w:val="0"/>
+        </w:rPr>
+        <w:t xml:space="preserve">Not dying. Drifting. His frequency output was spreading, thinning, losing the tight coherent pattern that made it </w:t>
+      </w:r>
+      <w:r>
+        <w:rPr>
+          <w:b w:val="0"/>
+          <w:i/>
+        </w:rPr>
+        <w:t>his</w:t>
+      </w:r>
+      <w:r>
+        <w:rPr>
+          <w:b w:val="0"/>
+          <w:i w:val="0"/>
+        </w:rPr>
+        <w:t xml:space="preserve"> and becoming something wider and less defined — a signal dissolving into the noise floor the way a voice dissolves into a crowd.</w:t>
+      </w:r>
+    </w:p>
+    <w:p>
+      <w:pPr>
+        <w:spacing w:before="40" w:after="40"/>
+        <w:ind w:firstLine="432"/>
+      </w:pPr>
+      <w:r>
+        <w:rPr>
+          <w:b w:val="0"/>
+          <w:i w:val="0"/>
+        </w:rPr>
+        <w:t>Miro had tried the comm. No response. Physical contact — hands on Kael's shoulders, shaking, his name said loud and then louder. Nothing. Kael's body was present. The rest of him was in the song.</w:t>
+      </w:r>
+    </w:p>
+    <w:p>
+      <w:pPr>
+        <w:spacing w:before="40" w:after="40"/>
+        <w:ind w:firstLine="432"/>
+      </w:pPr>
+      <w:r>
+        <w:rPr>
+          <w:b w:val="0"/>
+          <w:i/>
+        </w:rPr>
+        <w:t>You'll need Talon. Her frequency is the only thing that's ever cut through the Choir's signal. She's my tether.</w:t>
+      </w:r>
+    </w:p>
+    <w:p>
+      <w:pPr>
+        <w:spacing w:before="40" w:after="40"/>
+        <w:ind w:firstLine="432"/>
+      </w:pPr>
+      <w:r>
+        <w:rPr>
+          <w:b w:val="0"/>
+          <w:i w:val="0"/>
+        </w:rPr>
+        <w:t>Talon was on her perch. She hadn't moved since Kael went under. Feathers locked flat. Amber eyes fixed on Kael with an intensity that Miro — eleven years alone, nine days with humans again, not trained for this — recognized as the thing you feel when someone you chose is somewhere you can't follow.</w:t>
+      </w:r>
+    </w:p>
+    <w:p>
+      <w:pPr>
+        <w:spacing w:before="40" w:after="40"/>
+        <w:ind w:firstLine="432"/>
+      </w:pPr>
+      <w:r>
+        <w:rPr>
+          <w:b w:val="0"/>
+          <w:i w:val="0"/>
+        </w:rPr>
+        <w:t>He stood.</w:t>
+      </w:r>
+    </w:p>
+    <w:p>
+      <w:pPr>
+        <w:spacing w:before="40" w:after="40"/>
+        <w:ind w:firstLine="432"/>
+      </w:pPr>
+      <w:r>
+        <w:rPr>
+          <w:b w:val="0"/>
+          <w:i w:val="0"/>
+        </w:rPr>
+        <w:t>He crossed the cockpit.</w:t>
+      </w:r>
+    </w:p>
+    <w:p>
+      <w:pPr>
+        <w:spacing w:before="40" w:after="40"/>
+        <w:ind w:firstLine="432"/>
+      </w:pPr>
+      <w:r>
+        <w:rPr>
+          <w:b w:val="0"/>
+          <w:i w:val="0"/>
+        </w:rPr>
+        <w:t>He reached up and lifted Talon from the perch.</w:t>
+      </w:r>
+    </w:p>
+    <w:p>
+      <w:pPr>
+        <w:spacing w:before="40" w:after="40"/>
+        <w:ind w:firstLine="432"/>
+      </w:pPr>
+      <w:r>
+        <w:rPr>
+          <w:b w:val="0"/>
+          <w:i w:val="0"/>
+        </w:rPr>
+        <w:t>She didn't resist. She didn't flare. She was warm, and lighter than he expected, and her talons gripped his wrist with a pressure that was careful and precise and completely trusting in a way that closed his throat.</w:t>
+      </w:r>
+    </w:p>
+    <w:p>
+      <w:pPr>
+        <w:spacing w:before="40" w:after="40"/>
+        <w:ind w:firstLine="432"/>
+      </w:pPr>
+      <w:r>
+        <w:rPr>
+          <w:b w:val="0"/>
+          <w:i w:val="0"/>
+        </w:rPr>
+        <w:t>He knelt beside Kael.</w:t>
+      </w:r>
+    </w:p>
+    <w:p>
+      <w:pPr>
+        <w:spacing w:before="40" w:after="40"/>
+        <w:ind w:firstLine="432"/>
+      </w:pPr>
+      <w:r>
+        <w:rPr>
+          <w:b w:val="0"/>
+          <w:i w:val="0"/>
+        </w:rPr>
+        <w:t>He placed Talon on Kael's chest.</w:t>
+      </w:r>
+    </w:p>
+    <w:p>
+      <w:pPr>
+        <w:spacing w:before="40" w:after="40"/>
+        <w:ind w:firstLine="432"/>
+      </w:pPr>
+      <w:r>
+        <w:rPr>
+          <w:b w:val="0"/>
+          <w:i w:val="0"/>
+        </w:rPr>
+        <w:t>She settled. Talons gripping his shirt. Her weight — the small, real, animal weight of a hawk who had crossed ten years and a hundred worlds with this man — pressing into his sternum. She tucked her head against his collarbone, the curve of her beak fitting into the hollow of his throat the way it must have fit a thousand times before, in the dark of a dozen cockpits, after a hundred difficult contacts.</w:t>
+      </w:r>
+    </w:p>
+    <w:p>
+      <w:pPr>
+        <w:spacing w:before="40" w:after="40"/>
+        <w:ind w:firstLine="432"/>
+      </w:pPr>
+      <w:r>
+        <w:rPr>
+          <w:b w:val="0"/>
+          <w:i w:val="0"/>
+        </w:rPr>
+        <w:t>She didn't use frequency.</w:t>
+      </w:r>
+    </w:p>
+    <w:p>
+      <w:pPr>
+        <w:spacing w:before="40" w:after="40"/>
+        <w:ind w:firstLine="432"/>
+      </w:pPr>
+      <w:r>
+        <w:rPr>
+          <w:b w:val="0"/>
+          <w:i w:val="0"/>
+        </w:rPr>
+        <w:t>She used her body. The heat of her. The grip of her. The feathered weight of something alive that had chosen him and would not let go.</w:t>
+      </w:r>
+    </w:p>
+    <w:p>
+      <w:pPr>
+        <w:spacing w:before="40" w:after="40"/>
+        <w:ind w:firstLine="432"/>
+      </w:pPr>
+      <w:r>
+        <w:rPr>
+          <w:b w:val="0"/>
+          <w:i w:val="0"/>
+        </w:rPr>
+        <w:t>Something shifted on the monitor. A flicker. A catch. A single bright thread pulling tight in the dissolving pattern.</w:t>
+      </w:r>
+    </w:p>
+    <w:p>
+      <w:pPr>
+        <w:spacing w:before="40" w:after="40"/>
+        <w:ind w:firstLine="432"/>
+      </w:pPr>
+      <w:r>
+        <w:rPr>
+          <w:b w:val="0"/>
+          <w:i w:val="0"/>
+        </w:rPr>
+        <w:t>Copper braided with something darker. Not heavy. Just deeper.</w:t>
+      </w:r>
+    </w:p>
+    <w:p>
+      <w:pPr>
+        <w:spacing w:before="40" w:after="40"/>
+        <w:ind w:firstLine="432"/>
+      </w:pPr>
+      <w:r>
+        <w:rPr>
+          <w:b w:val="0"/>
+          <w:i w:val="0"/>
+        </w:rPr>
+        <w:t>Talon pressed closer.</w:t>
+      </w:r>
+    </w:p>
+    <w:p>
+      <w:pPr>
+        <w:spacing w:before="40" w:after="40"/>
+        <w:ind w:firstLine="432"/>
+      </w:pPr>
+      <w:r>
+        <w:rPr>
+          <w:b w:val="0"/>
+          <w:i w:val="0"/>
+        </w:rPr>
+        <w:t>The thread held.</w:t>
+      </w:r>
+    </w:p>
+    <w:p>
+      <w:pPr>
+        <w:spacing w:before="40" w:after="40"/>
+        <w:ind w:firstLine="432"/>
+      </w:pPr>
+      <w:r>
+        <w:rPr>
+          <w:b w:val="0"/>
+          <w:i w:val="0"/>
+        </w:rPr>
+        <w:t>And Kael came back. Not all at once. Slowly. The way you surface from deep water — pressure releasing in stages, light returning in degrees. His breathing deepened. His hands moved — fingers curling against the deck plates, finding the cold ridges, the real physical texture of a floor in a ship that was held together by illegal solder and sheer stubbornness. Then his frequency output tightened, coherence returning like a signal emerging from static, the pattern rebuilding itself around that single copper thread the way a crystal grows around a seed.</w:t>
+      </w:r>
+    </w:p>
+    <w:p>
+      <w:pPr>
+        <w:spacing w:before="40" w:after="40"/>
+        <w:ind w:firstLine="432"/>
+      </w:pPr>
+      <w:r>
+        <w:rPr>
+          <w:b w:val="0"/>
+          <w:i w:val="0"/>
+        </w:rPr>
+        <w:t>His eyes opened.</w:t>
+      </w:r>
+    </w:p>
+    <w:p>
+      <w:pPr>
+        <w:spacing w:before="40" w:after="40"/>
+        <w:ind w:firstLine="432"/>
+      </w:pPr>
+      <w:r>
+        <w:rPr>
+          <w:b w:val="0"/>
+          <w:i w:val="0"/>
+        </w:rPr>
+        <w:t>Talon was looking at him from four inches away. Amber eyes. Copper frequency. The steady, fierce, unimpressed gaze of a hawk who had been here the whole time and would like him to know it.</w:t>
+      </w:r>
+    </w:p>
+    <w:p>
+      <w:pPr>
+        <w:spacing w:before="40" w:after="40"/>
+        <w:ind w:firstLine="432"/>
+      </w:pPr>
+      <w:r>
+        <w:rPr>
+          <w:b w:val="0"/>
+          <w:i w:val="0"/>
+        </w:rPr>
+        <w:t>"Okay," Kael said. His voice was rough. Barely there.</w:t>
+      </w:r>
+    </w:p>
+    <w:p>
+      <w:pPr>
+        <w:spacing w:before="40" w:after="40"/>
+        <w:ind w:firstLine="432"/>
+      </w:pPr>
+      <w:r>
+        <w:rPr>
+          <w:b w:val="0"/>
+          <w:i w:val="0"/>
+        </w:rPr>
+        <w:t>Talon clicked her beak once.</w:t>
+      </w:r>
+    </w:p>
+    <w:p>
+      <w:pPr>
+        <w:spacing w:before="40" w:after="40"/>
+        <w:ind w:firstLine="432"/>
+      </w:pPr>
+      <w:r>
+        <w:rPr>
+          <w:b w:val="0"/>
+          <w:i/>
+        </w:rPr>
+        <w:t>About time.</w:t>
+      </w:r>
+    </w:p>
+    <w:p>
+      <w:pPr>
+        <w:spacing w:before="320" w:after="320"/>
+        <w:jc w:val="center"/>
+      </w:pPr>
+      <w:r>
+        <w:rPr>
+          <w:rFonts w:ascii="Georgia" w:hAnsi="Georgia"/>
+          <w:color w:val="787878"/>
+          <w:sz w:val="24"/>
+        </w:rPr>
+        <w:t>* * *</w:t>
+      </w:r>
+    </w:p>
+    <w:p>
+      <w:pPr>
+        <w:spacing w:before="40" w:after="40"/>
+        <w:ind w:firstLine="432"/>
+      </w:pPr>
+      <w:r>
+        <w:rPr>
+          <w:b w:val="0"/>
+          <w:i w:val="0"/>
+        </w:rPr>
+        <w:t>The Choir's song had changed.</w:t>
+      </w:r>
+    </w:p>
+    <w:p>
+      <w:pPr>
+        <w:spacing w:before="40" w:after="40"/>
+        <w:ind w:firstLine="432"/>
+      </w:pPr>
+      <w:r>
+        <w:rPr>
+          <w:b w:val="0"/>
+          <w:i w:val="0"/>
+        </w:rPr>
+        <w:t>Kael sat in the cockpit with a blanket around his shoulders — Miro had produced it from somewhere, emergency kit or sheer instinct — and listened. The seal was holding. Not the rigid, straining hold of forty-six voices compensating for a missing forty-seventh, but something new. A recalibrated architecture. The Choir's harmonic structure had reshaped itself around the threshold Kael had found — the way a river reshapes its bed around a new stone. The gap was closed. Not because Kael was still filling it, but because his presence in the song had shown the forty-six a shape they hadn't known was possible. A way to hold the interval that didn't require a single dedicated voice. A distributed threshold instead of a solitary bridge.</w:t>
+      </w:r>
+    </w:p>
+    <w:p>
+      <w:pPr>
+        <w:spacing w:before="40" w:after="40"/>
+        <w:ind w:firstLine="432"/>
+      </w:pPr>
+      <w:r>
+        <w:rPr>
+          <w:b w:val="0"/>
+          <w:i w:val="0"/>
+        </w:rPr>
+        <w:t>He'd held long enough for the arch to find a new form.</w:t>
+      </w:r>
+    </w:p>
+    <w:p>
+      <w:pPr>
+        <w:spacing w:before="40" w:after="40"/>
+        <w:ind w:firstLine="432"/>
+      </w:pPr>
+      <w:r>
+        <w:rPr>
+          <w:b w:val="0"/>
+          <w:i w:val="0"/>
+        </w:rPr>
+        <w:t>"Here," Miro said.</w:t>
+      </w:r>
+    </w:p>
+    <w:p>
+      <w:pPr>
+        <w:spacing w:before="40" w:after="40"/>
+        <w:ind w:firstLine="432"/>
+      </w:pPr>
+      <w:r>
+        <w:rPr>
+          <w:b w:val="0"/>
+          <w:i w:val="0"/>
+        </w:rPr>
+        <w:t>Kael looked up. Miro was holding a cup. It was steaming.</w:t>
+      </w:r>
+    </w:p>
+    <w:p>
+      <w:pPr>
+        <w:spacing w:before="40" w:after="40"/>
+        <w:ind w:firstLine="432"/>
+      </w:pPr>
+      <w:r>
+        <w:rPr>
+          <w:b w:val="0"/>
+          <w:i w:val="0"/>
+        </w:rPr>
+        <w:t>"What is this?"</w:t>
+      </w:r>
+    </w:p>
+    <w:p>
+      <w:pPr>
+        <w:spacing w:before="40" w:after="40"/>
+        <w:ind w:firstLine="432"/>
+      </w:pPr>
+      <w:r>
+        <w:rPr>
+          <w:b w:val="0"/>
+          <w:i w:val="0"/>
+        </w:rPr>
+        <w:t>"Coffee. Cygnan roast. Found a vacuum canister in the docking supplies Sera left behind."</w:t>
+      </w:r>
+    </w:p>
+    <w:p>
+      <w:pPr>
+        <w:spacing w:before="40" w:after="40"/>
+        <w:ind w:firstLine="432"/>
+      </w:pPr>
+      <w:r>
+        <w:rPr>
+          <w:b w:val="0"/>
+          <w:i w:val="0"/>
+        </w:rPr>
+        <w:t>"She left her coffee?"</w:t>
+      </w:r>
+    </w:p>
+    <w:p>
+      <w:pPr>
+        <w:spacing w:before="40" w:after="40"/>
+        <w:ind w:firstLine="432"/>
+      </w:pPr>
+      <w:r>
+        <w:rPr>
+          <w:b w:val="0"/>
+          <w:i w:val="0"/>
+        </w:rPr>
+        <w:t>"I think it was deliberate. I think it was the closest thing Lawkeeper Voss gets to leaving a gift."</w:t>
+      </w:r>
+    </w:p>
+    <w:p>
+      <w:pPr>
+        <w:spacing w:before="40" w:after="40"/>
+        <w:ind w:firstLine="432"/>
+      </w:pPr>
+      <w:r>
+        <w:rPr>
+          <w:b w:val="0"/>
+          <w:i w:val="0"/>
+        </w:rPr>
+        <w:t>Kael took the cup. The heat was immediate, real, ordinary — the kind of warmth that belongs to mornings and kitchens and all the small rituals that hold a life together. He drank. It was good. Not the Selvaan black tea he'd been nursing since this story started, but good.</w:t>
+      </w:r>
+    </w:p>
+    <w:p>
+      <w:pPr>
+        <w:spacing w:before="40" w:after="40"/>
+        <w:ind w:firstLine="432"/>
+      </w:pPr>
+      <w:r>
+        <w:rPr>
+          <w:b w:val="0"/>
+          <w:i w:val="0"/>
+        </w:rPr>
+        <w:t>Talon was back on her perch. One eye closed, one eye open. Her frequency pulsed slow and steady — the new copper, changed but certain. She was watching him with the expression of a hawk who was monitoring a situation and reserving judgment.</w:t>
+      </w:r>
+    </w:p>
+    <w:p>
+      <w:pPr>
+        <w:spacing w:before="40" w:after="40"/>
+        <w:ind w:firstLine="432"/>
+      </w:pPr>
+      <w:r>
+        <w:rPr>
+          <w:b w:val="0"/>
+          <w:i w:val="0"/>
+        </w:rPr>
+        <w:t>"You scared me," Miro said. He sat down across from Kael, back against the bulkhead. "I want you to know that. Formal complaint. I've known you for a week and you've nearly died twice and I did not agree to this."</w:t>
+      </w:r>
+    </w:p>
+    <w:p>
+      <w:pPr>
+        <w:spacing w:before="40" w:after="40"/>
+        <w:ind w:firstLine="432"/>
+      </w:pPr>
+      <w:r>
+        <w:rPr>
+          <w:b w:val="0"/>
+          <w:i w:val="0"/>
+        </w:rPr>
+        <w:t>"What did you agree to?"</w:t>
+      </w:r>
+    </w:p>
+    <w:p>
+      <w:pPr>
+        <w:spacing w:before="40" w:after="40"/>
+        <w:ind w:firstLine="432"/>
+      </w:pPr>
+      <w:r>
+        <w:rPr>
+          <w:b w:val="0"/>
+          <w:i w:val="0"/>
+        </w:rPr>
+        <w:t>"Algae. Quiet, non-sacrificial algae. Algae that stays where you put it and doesn't try to become the forty-seventh voice in an ancient harmonic seal."</w:t>
+      </w:r>
+    </w:p>
+    <w:p>
+      <w:pPr>
+        <w:spacing w:before="40" w:after="40"/>
+        <w:ind w:firstLine="432"/>
+      </w:pPr>
+      <w:r>
+        <w:rPr>
+          <w:b w:val="0"/>
+          <w:i w:val="0"/>
+        </w:rPr>
+        <w:t>Kael almost smiled. Almost. His face wasn't ready for it — the muscles felt distant, belonging to someone he'd been away from for a long time. But the impulse was there, and that was enough.</w:t>
+      </w:r>
+    </w:p>
+    <w:p>
+      <w:pPr>
+        <w:spacing w:before="40" w:after="40"/>
+        <w:ind w:firstLine="432"/>
+      </w:pPr>
+      <w:r>
+        <w:rPr>
+          <w:b w:val="0"/>
+          <w:i w:val="0"/>
+        </w:rPr>
+        <w:t>"The novel," Miro said.</w:t>
+      </w:r>
+    </w:p>
+    <w:p>
+      <w:pPr>
+        <w:spacing w:before="40" w:after="40"/>
+        <w:ind w:firstLine="432"/>
+      </w:pPr>
+      <w:r>
+        <w:rPr>
+          <w:b w:val="0"/>
+          <w:i w:val="0"/>
+        </w:rPr>
+        <w:t>"What?"</w:t>
+      </w:r>
+    </w:p>
+    <w:p>
+      <w:pPr>
+        <w:spacing w:before="40" w:after="40"/>
+        <w:ind w:firstLine="432"/>
+      </w:pPr>
+      <w:r>
+        <w:rPr>
+          <w:b w:val="0"/>
+          <w:i w:val="0"/>
+        </w:rPr>
+        <w:t>"Your mystery novel. The detective. The clock tower. You've been carrying that thing since the Pellara system." He nodded toward the book, still wedged beside the console. "Read the ending."</w:t>
+      </w:r>
+    </w:p>
+    <w:p>
+      <w:pPr>
+        <w:spacing w:before="40" w:after="40"/>
+        <w:ind w:firstLine="432"/>
+      </w:pPr>
+      <w:r>
+        <w:rPr>
+          <w:b w:val="0"/>
+          <w:i w:val="0"/>
+        </w:rPr>
+        <w:t>"Later."</w:t>
+      </w:r>
+    </w:p>
+    <w:p>
+      <w:pPr>
+        <w:spacing w:before="40" w:after="40"/>
+        <w:ind w:firstLine="432"/>
+      </w:pPr>
+      <w:r>
+        <w:rPr>
+          <w:b w:val="0"/>
+          <w:i w:val="0"/>
+        </w:rPr>
+        <w:t>"It's been six systems, Kael."</w:t>
+      </w:r>
+    </w:p>
+    <w:p>
+      <w:pPr>
+        <w:spacing w:before="40" w:after="40"/>
+        <w:ind w:firstLine="432"/>
+      </w:pPr>
+      <w:r>
+        <w:rPr>
+          <w:b w:val="0"/>
+          <w:i w:val="0"/>
+        </w:rPr>
+        <w:t>"Later."</w:t>
+      </w:r>
+    </w:p>
+    <w:p>
+      <w:pPr>
+        <w:spacing w:before="40" w:after="40"/>
+        <w:ind w:firstLine="432"/>
+      </w:pPr>
+      <w:r>
+        <w:rPr>
+          <w:b w:val="0"/>
+          <w:i w:val="0"/>
+        </w:rPr>
+        <w:t>Miro let it go. They sat in the quiet — the real quiet, the cockpit-hum-and-breathing quiet that Kael had almost forgotten existed. Through the viewport, the Choir's light pulsed. Slow. Steady. The song of forty-six beings who had been caged and starved and broken and had survived, and whose music — ancient and vast and stubbornly, impossibly alive — was stronger now than it had been in years.</w:t>
+      </w:r>
+    </w:p>
+    <w:p>
+      <w:pPr>
+        <w:spacing w:before="320" w:after="320"/>
+        <w:jc w:val="center"/>
+      </w:pPr>
+      <w:r>
+        <w:rPr>
+          <w:rFonts w:ascii="Georgia" w:hAnsi="Georgia"/>
+          <w:color w:val="787878"/>
+          <w:sz w:val="24"/>
+        </w:rPr>
+        <w:t>* * *</w:t>
+      </w:r>
+    </w:p>
+    <w:p>
+      <w:pPr>
+        <w:spacing w:before="40" w:after="40"/>
+        <w:ind w:firstLine="432"/>
+      </w:pPr>
+      <w:r>
+        <w:rPr>
+          <w:b w:val="0"/>
+          <w:i w:val="0"/>
+        </w:rPr>
+        <w:t>The old woman appeared on the display an hour later.</w:t>
+      </w:r>
+    </w:p>
+    <w:p>
+      <w:pPr>
+        <w:spacing w:before="40" w:after="40"/>
+        <w:ind w:firstLine="432"/>
+      </w:pPr>
+      <w:r>
+        <w:rPr>
+          <w:b w:val="0"/>
+          <w:i w:val="0"/>
+        </w:rPr>
+        <w:t>She looked at Kael for a long time. Pale eyes taking in the blanket, the cup, the hawk on the perch, the lines around his eyes that hadn't been there a week ago. She said nothing about any of it.</w:t>
+      </w:r>
+    </w:p>
+    <w:p>
+      <w:pPr>
+        <w:spacing w:before="40" w:after="40"/>
+        <w:ind w:firstLine="432"/>
+      </w:pPr>
+      <w:r>
+        <w:rPr>
+          <w:b w:val="0"/>
+          <w:i w:val="0"/>
+        </w:rPr>
+        <w:t>"The seal is stable," she said. "The architecture has shifted. The Choir will need time to fully strengthen it, but the equilibrium you found is sound. Better than sound." A pause. "The Note Between held the interval alone for millennia. What you showed them distributes the burden. It may hold longer than the original."</w:t>
+      </w:r>
+    </w:p>
+    <w:p>
+      <w:pPr>
+        <w:spacing w:before="40" w:after="40"/>
+        <w:ind w:firstLine="432"/>
+      </w:pPr>
+      <w:r>
+        <w:rPr>
+          <w:b w:val="0"/>
+          <w:i w:val="0"/>
+        </w:rPr>
+        <w:t>"I didn't show them anything. I just held on."</w:t>
+      </w:r>
+    </w:p>
+    <w:p>
+      <w:pPr>
+        <w:spacing w:before="40" w:after="40"/>
+        <w:ind w:firstLine="432"/>
+      </w:pPr>
+      <w:r>
+        <w:rPr>
+          <w:b w:val="0"/>
+          <w:i w:val="0"/>
+        </w:rPr>
+        <w:t>"Yes." The faintest shift in her expression — not a smile, not warmth, but recognition. The kind one deep listener gives another. "That is what I said."</w:t>
+      </w:r>
+    </w:p>
+    <w:p>
+      <w:pPr>
+        <w:spacing w:before="40" w:after="40"/>
+        <w:ind w:firstLine="432"/>
+      </w:pPr>
+      <w:r>
+        <w:rPr>
+          <w:b w:val="0"/>
+          <w:i w:val="0"/>
+        </w:rPr>
+        <w:t>Behind her, the deep listeners were moving — mounts pulling away from the Choir, amber lights dimming as they descended into the deeper dark. Leaving.</w:t>
+      </w:r>
+    </w:p>
+    <w:p>
+      <w:pPr>
+        <w:spacing w:before="40" w:after="40"/>
+        <w:ind w:firstLine="432"/>
+      </w:pPr>
+      <w:r>
+        <w:rPr>
+          <w:b w:val="0"/>
+          <w:i w:val="0"/>
+        </w:rPr>
+        <w:t>"There are other cages," she said. "Other songs. The work does not end here."</w:t>
+      </w:r>
+    </w:p>
+    <w:p>
+      <w:pPr>
+        <w:spacing w:before="40" w:after="40"/>
+        <w:ind w:firstLine="432"/>
+      </w:pPr>
+      <w:r>
+        <w:rPr>
+          <w:b w:val="0"/>
+          <w:i w:val="0"/>
+        </w:rPr>
+        <w:t>"I know."</w:t>
+      </w:r>
+    </w:p>
+    <w:p>
+      <w:pPr>
+        <w:spacing w:before="40" w:after="40"/>
+        <w:ind w:firstLine="432"/>
+      </w:pPr>
+      <w:r>
+        <w:rPr>
+          <w:b w:val="0"/>
+          <w:i w:val="0"/>
+        </w:rPr>
+        <w:t>"You will hear them now. The drift has seen to that. Whether you go to them is your choice." She studied him. "You held a threshold that was not built for your kind. Most would have been unmade."</w:t>
+      </w:r>
+    </w:p>
+    <w:p>
+      <w:pPr>
+        <w:spacing w:before="40" w:after="40"/>
+        <w:ind w:firstLine="432"/>
+      </w:pPr>
+      <w:r>
+        <w:rPr>
+          <w:b w:val="0"/>
+          <w:i w:val="0"/>
+        </w:rPr>
+        <w:t>"Most would have had the sense not to try."</w:t>
+      </w:r>
+    </w:p>
+    <w:p>
+      <w:pPr>
+        <w:spacing w:before="40" w:after="40"/>
+        <w:ind w:firstLine="432"/>
+      </w:pPr>
+      <w:r>
+        <w:rPr>
+          <w:b w:val="0"/>
+          <w:i w:val="0"/>
+        </w:rPr>
+        <w:t>"Yes." Something in her voice — not approval, not amusement. Something older than both. "That is also what I said."</w:t>
+      </w:r>
+    </w:p>
+    <w:p>
+      <w:pPr>
+        <w:spacing w:before="40" w:after="40"/>
+        <w:ind w:firstLine="432"/>
+      </w:pPr>
+      <w:r>
+        <w:rPr>
+          <w:b w:val="0"/>
+          <w:i w:val="0"/>
+        </w:rPr>
+        <w:t>The display went dark. The deep listeners sank into the black water, amber glow fading like embers, and then they were gone — back into the deep ocean, back into the silence they had chosen and the work they would never finish. The old woman. The ancient mounts. The listeners who had decided, long ago, that some things were worth hearing even when the galaxy preferred them quiet.</w:t>
+      </w:r>
+    </w:p>
+    <w:p>
+      <w:pPr>
+        <w:spacing w:before="40" w:after="40"/>
+        <w:ind w:firstLine="432"/>
+      </w:pPr>
+      <w:r>
+        <w:rPr>
+          <w:b w:val="0"/>
+          <w:i w:val="0"/>
+        </w:rPr>
+        <w:t>Kael watched them go.</w:t>
+      </w:r>
+    </w:p>
+    <w:p>
+      <w:pPr>
+        <w:spacing w:before="320" w:after="320"/>
+        <w:jc w:val="center"/>
+      </w:pPr>
+      <w:r>
+        <w:rPr>
+          <w:rFonts w:ascii="Georgia" w:hAnsi="Georgia"/>
+          <w:color w:val="787878"/>
+          <w:sz w:val="24"/>
+        </w:rPr>
+        <w:t>* * *</w:t>
+      </w:r>
+    </w:p>
+    <w:p>
+      <w:pPr>
+        <w:spacing w:before="40" w:after="40"/>
+        <w:ind w:firstLine="432"/>
+      </w:pPr>
+      <w:r>
+        <w:rPr>
+          <w:b w:val="0"/>
+          <w:i w:val="0"/>
+        </w:rPr>
+        <w:t>Sera's transmission came two days later.</w:t>
+      </w:r>
+    </w:p>
+    <w:p>
+      <w:pPr>
+        <w:spacing w:before="40" w:after="40"/>
+        <w:ind w:firstLine="432"/>
+      </w:pPr>
+      <w:r>
+        <w:rPr>
+          <w:b w:val="0"/>
+          <w:i w:val="0"/>
+        </w:rPr>
+        <w:t xml:space="preserve">They were still at depth — the </w:t>
+      </w:r>
+      <w:r>
+        <w:rPr>
+          <w:b w:val="0"/>
+          <w:i/>
+        </w:rPr>
+        <w:t>Fang &amp; Fable</w:t>
+      </w:r>
+      <w:r>
+        <w:rPr>
+          <w:b w:val="0"/>
+          <w:i w:val="0"/>
+        </w:rPr>
+        <w:t xml:space="preserve"> holding position above the Choir while Miro ran his final biological surveys and Kael's neural architecture slowly, painfully rebuilt itself around the new baseline the drift had made permanent. He was different. He knew this the way you know a room has been rearranged in the dark — not by seeing it but by reaching for something and finding it shifted. His frequency range was wider. His sensitivity was sharper. And the copper thread to Talon carried harmonics it hadn't carried before — not just her emotions but the faintest edges of her sensory world. Wind patterns. Thermal currents. The weight of light on feathers. The drift had pushed their bond past translation into something closer to shared experience.</w:t>
+      </w:r>
+    </w:p>
+    <w:p>
+      <w:pPr>
+        <w:spacing w:before="40" w:after="40"/>
+        <w:ind w:firstLine="432"/>
+      </w:pPr>
+      <w:r>
+        <w:rPr>
+          <w:b w:val="0"/>
+          <w:i w:val="0"/>
+        </w:rPr>
+        <w:t>He was still Kael. But the edges were different.</w:t>
+      </w:r>
+    </w:p>
+    <w:p>
+      <w:pPr>
+        <w:spacing w:before="40" w:after="40"/>
+        <w:ind w:firstLine="432"/>
+      </w:pPr>
+      <w:r>
+        <w:rPr>
+          <w:b w:val="0"/>
+          <w:i w:val="0"/>
+        </w:rPr>
+        <w:t>Sera's face on the display was composed in the way that meant she had won.</w:t>
+      </w:r>
+    </w:p>
+    <w:p>
+      <w:pPr>
+        <w:spacing w:before="40" w:after="40"/>
+        <w:ind w:firstLine="432"/>
+      </w:pPr>
+      <w:r>
+        <w:rPr>
+          <w:b w:val="0"/>
+          <w:i w:val="0"/>
+        </w:rPr>
+        <w:t>"The Judicial Conclave voted eleven to two," she said. "The Existential Defense Framework motion is denied. Article One stands." She let the words settle the way a stone settles in deep water — slowly, with weight. "The ruling establishes precedent. Strategic classification of a threat does not authorize suspension of species-protection mandates. The Choir's sentience is formally recognized under full Covenant jurisdiction. The data core evidence has been admitted into record. Charges are proceeding against Union Strategic Command through the authorized chain."</w:t>
+      </w:r>
+    </w:p>
+    <w:p>
+      <w:pPr>
+        <w:spacing w:before="40" w:after="40"/>
+        <w:ind w:firstLine="432"/>
+      </w:pPr>
+      <w:r>
+        <w:rPr>
+          <w:b w:val="0"/>
+          <w:i w:val="0"/>
+        </w:rPr>
+        <w:t>Miro exhaled. A sound like something heavy being set down.</w:t>
+      </w:r>
+    </w:p>
+    <w:p>
+      <w:pPr>
+        <w:spacing w:before="40" w:after="40"/>
+        <w:ind w:firstLine="432"/>
+      </w:pPr>
+      <w:r>
+        <w:rPr>
+          <w:b w:val="0"/>
+          <w:i w:val="0"/>
+        </w:rPr>
+        <w:t>"It's not over," Sera continued. "The Union will appeal. The political machinery will fight at every level. This will take years." Her jaw tightened — a fracture in the composure, brief and real. "But the precedent is set. What they did here is illegal. What they did here will be prosecuted. And the next time someone in a uniform looks at a cage and sees a strategic asset instead of a sentient being, they will know that the law saw them first."</w:t>
+      </w:r>
+    </w:p>
+    <w:p>
+      <w:pPr>
+        <w:spacing w:before="40" w:after="40"/>
+        <w:ind w:firstLine="432"/>
+      </w:pPr>
+      <w:r>
+        <w:rPr>
+          <w:b w:val="0"/>
+          <w:i w:val="0"/>
+        </w:rPr>
+        <w:t>"Where are you?" Kael asked.</w:t>
+      </w:r>
+    </w:p>
+    <w:p>
+      <w:pPr>
+        <w:spacing w:before="40" w:after="40"/>
+        <w:ind w:firstLine="432"/>
+      </w:pPr>
+      <w:r>
+        <w:rPr>
+          <w:b w:val="0"/>
+          <w:i w:val="0"/>
+        </w:rPr>
+        <w:t>"Already in transit. Wick and I are following —" She glanced at something offscreen. "Reports. From other systems."</w:t>
+      </w:r>
+    </w:p>
+    <w:p>
+      <w:pPr>
+        <w:spacing w:before="40" w:after="40"/>
+        <w:ind w:firstLine="432"/>
+      </w:pPr>
+      <w:r>
+        <w:rPr>
+          <w:b w:val="0"/>
+          <w:i w:val="0"/>
+        </w:rPr>
+        <w:t>"The other cages."</w:t>
+      </w:r>
+    </w:p>
+    <w:p>
+      <w:pPr>
+        <w:spacing w:before="40" w:after="40"/>
+        <w:ind w:firstLine="432"/>
+      </w:pPr>
+      <w:r>
+        <w:rPr>
+          <w:b w:val="0"/>
+          <w:i w:val="0"/>
+        </w:rPr>
+        <w:t>"I can't confirm that." A beat. Then, quieter: "I can't deny it either."</w:t>
+      </w:r>
+    </w:p>
+    <w:p>
+      <w:pPr>
+        <w:spacing w:before="40" w:after="40"/>
+        <w:ind w:firstLine="432"/>
+      </w:pPr>
+      <w:r>
+        <w:rPr>
+          <w:b w:val="0"/>
+          <w:i w:val="0"/>
+        </w:rPr>
+        <w:t xml:space="preserve">She stood. She was in the cockpit of her interceptor — dark, clean lines, everything in its place. Wick was on her shoulder, amber eyes steady, his layered frequency carrying a pulse that Kael could read even through compressed video: </w:t>
+      </w:r>
+      <w:r>
+        <w:rPr>
+          <w:b w:val="0"/>
+          <w:i/>
+        </w:rPr>
+        <w:t>Be well.</w:t>
+      </w:r>
+    </w:p>
+    <w:p>
+      <w:pPr>
+        <w:spacing w:before="40" w:after="40"/>
+        <w:ind w:firstLine="432"/>
+      </w:pPr>
+      <w:r>
+        <w:rPr>
+          <w:b w:val="0"/>
+          <w:i w:val="0"/>
+        </w:rPr>
+        <w:t>Sera straightened the charcoal field-coat. Touched the Arbiter's seal above her heart — the open eye inside the balanced scale. The gesture that was reflex and faith and identity all at once.</w:t>
+      </w:r>
+    </w:p>
+    <w:p>
+      <w:pPr>
+        <w:spacing w:before="40" w:after="40"/>
+        <w:ind w:firstLine="432"/>
+      </w:pPr>
+      <w:r>
+        <w:rPr>
+          <w:b w:val="0"/>
+          <w:i w:val="0"/>
+        </w:rPr>
+        <w:t>She looked at Kael through the screen.</w:t>
+      </w:r>
+    </w:p>
+    <w:p>
+      <w:pPr>
+        <w:spacing w:before="40" w:after="40"/>
+        <w:ind w:firstLine="432"/>
+      </w:pPr>
+      <w:r>
+        <w:rPr>
+          <w:b w:val="0"/>
+          <w:i w:val="0"/>
+        </w:rPr>
+        <w:t>"Survive," she said.</w:t>
+      </w:r>
+    </w:p>
+    <w:p>
+      <w:pPr>
+        <w:spacing w:before="40" w:after="40"/>
+        <w:ind w:firstLine="432"/>
+      </w:pPr>
+      <w:r>
+        <w:rPr>
+          <w:b w:val="0"/>
+          <w:i w:val="0"/>
+        </w:rPr>
+        <w:t>The transmission ended.</w:t>
+      </w:r>
+    </w:p>
+    <w:p>
+      <w:pPr>
+        <w:spacing w:before="320" w:after="320"/>
+        <w:jc w:val="center"/>
+      </w:pPr>
+      <w:r>
+        <w:rPr>
+          <w:rFonts w:ascii="Georgia" w:hAnsi="Georgia"/>
+          <w:color w:val="787878"/>
+          <w:sz w:val="24"/>
+        </w:rPr>
+        <w:t>* * *</w:t>
+      </w:r>
+    </w:p>
+    <w:p>
+      <w:pPr>
+        <w:spacing w:before="40" w:after="40"/>
+        <w:ind w:firstLine="432"/>
+      </w:pPr>
+      <w:r>
+        <w:rPr>
+          <w:b w:val="0"/>
+          <w:i w:val="0"/>
+        </w:rPr>
+        <w:t>Three days after.</w:t>
+      </w:r>
+    </w:p>
+    <w:p>
+      <w:pPr>
+        <w:spacing w:before="40" w:after="40"/>
+        <w:ind w:firstLine="432"/>
+      </w:pPr>
+      <w:r>
+        <w:rPr>
+          <w:b w:val="0"/>
+          <w:i w:val="0"/>
+        </w:rPr>
+        <w:t xml:space="preserve">Kael sat in the cockpit of the </w:t>
+      </w:r>
+      <w:r>
+        <w:rPr>
+          <w:b w:val="0"/>
+          <w:i/>
+        </w:rPr>
+        <w:t>Fang &amp; Fable</w:t>
+      </w:r>
+      <w:r>
+        <w:rPr>
+          <w:b w:val="0"/>
+          <w:i w:val="0"/>
+        </w:rPr>
+        <w:t>, boots up on the console, a cup of Cygnan roast cooling in his hand. He took a slow sip, eyes on the viewport, and picked up the mystery novel from beside the console. Water-stained. Dog-eared. Held together almost as poorly as his ship. Seventeen pages left.</w:t>
+      </w:r>
+    </w:p>
+    <w:p>
+      <w:pPr>
+        <w:spacing w:before="40" w:after="40"/>
+        <w:ind w:firstLine="432"/>
+      </w:pPr>
+      <w:r>
+        <w:rPr>
+          <w:b w:val="0"/>
+          <w:i w:val="0"/>
+        </w:rPr>
+        <w:t>He read them.</w:t>
+      </w:r>
+    </w:p>
+    <w:p>
+      <w:pPr>
+        <w:spacing w:before="40" w:after="40"/>
+        <w:ind w:firstLine="432"/>
+      </w:pPr>
+      <w:r>
+        <w:rPr>
+          <w:b w:val="0"/>
+          <w:i w:val="0"/>
+        </w:rPr>
+        <w:t>The detective confronted the lawyer in the clock tower. There was a speech about justice. A gunshot that turned out to be a clock striking midnight. The lawyer confessed — not because the evidence was overwhelming but because the detective had listened long enough to hear the guilt underneath the argument. The detective walked out into the rain and said something about truth being the only frequency that doesn't decay, which was the kind of line that only worked in novels and sounded better than it held up.</w:t>
+      </w:r>
+    </w:p>
+    <w:p>
+      <w:pPr>
+        <w:spacing w:before="40" w:after="40"/>
+        <w:ind w:firstLine="432"/>
+      </w:pPr>
+      <w:r>
+        <w:rPr>
+          <w:b w:val="0"/>
+          <w:i w:val="0"/>
+        </w:rPr>
+        <w:t>He closed the book. Set it on the console. Done. Maybe he'd find another on the next station. Something longer. Something without a detective — he'd had enough of impossible cases for a while.</w:t>
+      </w:r>
+    </w:p>
+    <w:p>
+      <w:pPr>
+        <w:spacing w:before="40" w:after="40"/>
+        <w:ind w:firstLine="432"/>
+      </w:pPr>
+      <w:r>
+        <w:rPr>
+          <w:b w:val="0"/>
+          <w:i w:val="0"/>
+        </w:rPr>
+        <w:t>Talon shifted on her perch.</w:t>
+      </w:r>
+    </w:p>
+    <w:p>
+      <w:pPr>
+        <w:spacing w:before="40" w:after="40"/>
+        <w:ind w:firstLine="432"/>
+      </w:pPr>
+      <w:r>
+        <w:rPr>
+          <w:b w:val="0"/>
+          <w:i w:val="0"/>
+        </w:rPr>
+        <w:t xml:space="preserve">The </w:t>
+      </w:r>
+      <w:r>
+        <w:rPr>
+          <w:b w:val="0"/>
+          <w:i/>
+        </w:rPr>
+        <w:t>Fang &amp; Fable</w:t>
+      </w:r>
+      <w:r>
+        <w:rPr>
+          <w:b w:val="0"/>
+          <w:i w:val="0"/>
+        </w:rPr>
+        <w:t xml:space="preserve"> rose through the water column — past the deep dark, past the thermocline, past the shallows where light came back in shades of green and silver. Water streamed off the hull. The sky appeared — wide and pale, the kind of light that makes you squint after days in the deep. Then pale blue became dark blue became the star-scattered black of open space. The planet fell away — a swirling blue marble ribboned with white cloud bands. No landmasses. One orbital station now visible on long scan, Covenant-flagged, newly arrived. Erythis-3 was no longer classified as empty. It never would be again.</w:t>
+      </w:r>
+    </w:p>
+    <w:p>
+      <w:pPr>
+        <w:spacing w:before="40" w:after="40"/>
+        <w:ind w:firstLine="432"/>
+      </w:pPr>
+      <w:r>
+        <w:rPr>
+          <w:b w:val="0"/>
+          <w:i w:val="0"/>
+        </w:rPr>
+        <w:t>And somewhere below, in the deep water, the Choir sang. Forty-six voices, holding a seal that was older than human memory, their song carrying through kilometers of ocean and out into the dark between stars. Not a cry for help. Not anymore. Just a song. The sound of beings who had survived the worst thing the galaxy could do to them and had chosen, with the full weight of their ancient, collective, unbreakable will, to keep singing.</w:t>
+      </w:r>
+    </w:p>
+    <w:p>
+      <w:pPr>
+        <w:spacing w:before="40" w:after="40"/>
+        <w:ind w:firstLine="432"/>
+      </w:pPr>
+      <w:r>
+        <w:rPr>
+          <w:b w:val="0"/>
+          <w:i w:val="0"/>
+        </w:rPr>
+        <w:t>Kael set the cup down.</w:t>
+      </w:r>
+    </w:p>
+    <w:p>
+      <w:pPr>
+        <w:spacing w:before="40" w:after="40"/>
+        <w:ind w:firstLine="432"/>
+      </w:pPr>
+      <w:r>
+        <w:rPr>
+          <w:b w:val="0"/>
+          <w:i w:val="0"/>
+        </w:rPr>
+        <w:t>At the bottom of his hearing — faint, persistent, impossible to ignore — a frequency. Not the Choir. Something else. Low, aching, rhythmic. A signal from far away, pressing through deep space in the hope that someone, somewhere, was listening. Another ocean. Another world. Another song that needed protecting.</w:t>
+      </w:r>
+    </w:p>
+    <w:p>
+      <w:pPr>
+        <w:spacing w:before="40" w:after="40"/>
+        <w:ind w:firstLine="432"/>
+      </w:pPr>
+      <w:r>
+        <w:rPr>
+          <w:b w:val="0"/>
+          <w:i w:val="0"/>
+        </w:rPr>
+        <w:t xml:space="preserve">The drift had given him this. He hadn't asked for it. But it was his now — the ability to hear what the galaxy kept quiet. The frequencies filed under </w:t>
+      </w:r>
+      <w:r>
+        <w:rPr>
+          <w:b w:val="0"/>
+          <w:i/>
+        </w:rPr>
+        <w:t>no known sentient population</w:t>
+      </w:r>
+      <w:r>
+        <w:rPr>
+          <w:b w:val="0"/>
+          <w:i w:val="0"/>
+        </w:rPr>
+        <w:t>. The songs beneath the silence.</w:t>
+      </w:r>
+    </w:p>
+    <w:p>
+      <w:pPr>
+        <w:spacing w:before="40" w:after="40"/>
+        <w:ind w:firstLine="432"/>
+      </w:pPr>
+      <w:r>
+        <w:rPr>
+          <w:b w:val="0"/>
+          <w:i w:val="0"/>
+        </w:rPr>
+        <w:t>"Talon," he said.</w:t>
+      </w:r>
+    </w:p>
+    <w:p>
+      <w:pPr>
+        <w:spacing w:before="40" w:after="40"/>
+        <w:ind w:firstLine="432"/>
+      </w:pPr>
+      <w:r>
+        <w:rPr>
+          <w:b w:val="0"/>
+          <w:i w:val="0"/>
+        </w:rPr>
+        <w:t>A rust-feathered hawk the size of a large dog shifted on the perch bolted to the ceiling. She opened one amber eye.</w:t>
+      </w:r>
+    </w:p>
+    <w:p>
+      <w:pPr>
+        <w:spacing w:before="40" w:after="40"/>
+        <w:ind w:firstLine="432"/>
+      </w:pPr>
+      <w:r>
+        <w:rPr>
+          <w:b w:val="0"/>
+          <w:i w:val="0"/>
+        </w:rPr>
+        <w:t>The copper thread hummed between them — deeper than it had been, braided with harmonics that hadn't existed a week ago, carrying the weight of everything they'd survived and the quiet certainty that they would survive whatever came next. Changed. But there. The one frequency in Kael's life that had never once failed to answer.</w:t>
+      </w:r>
+    </w:p>
+    <w:p>
+      <w:pPr>
+        <w:spacing w:before="40" w:after="40"/>
+        <w:ind w:firstLine="432"/>
+      </w:pPr>
+      <w:r>
+        <w:rPr>
+          <w:b w:val="0"/>
+          <w:i w:val="0"/>
+        </w:rPr>
+        <w:t>Talon clicked her beak twice.</w:t>
+      </w:r>
+    </w:p>
+    <w:p>
+      <w:pPr>
+        <w:spacing w:before="40" w:after="40"/>
+        <w:ind w:firstLine="432"/>
+      </w:pPr>
+      <w:r>
+        <w:rPr>
+          <w:b w:val="0"/>
+          <w:i/>
+        </w:rPr>
+        <w:t>Yes. Distress. Not human.</w:t>
+      </w:r>
+    </w:p>
+    <w:p>
+      <w:pPr>
+        <w:spacing w:before="40" w:after="40"/>
+        <w:ind w:firstLine="432"/>
+      </w:pPr>
+      <w:r>
+        <w:rPr>
+          <w:b w:val="0"/>
+          <w:i w:val="0"/>
+        </w:rPr>
+        <w:t>Kael reached for the nav console. The star map bloomed across the viewport — pale blue lines tracing routes through nebulae and jump-gates and all the vast, indifferent space between worlds where something was calling and no one else could hear.</w:t>
+      </w:r>
+    </w:p>
+    <w:p>
+      <w:pPr>
+        <w:spacing w:before="40" w:after="40"/>
+        <w:ind w:firstLine="432"/>
+      </w:pPr>
+      <w:r>
+        <w:rPr>
+          <w:b w:val="0"/>
+          <w:i w:val="0"/>
+        </w:rPr>
+        <w:t>The ship turned.</w:t>
+      </w:r>
+    </w:p>
+    <w:p>
+      <w:pPr>
+        <w:spacing w:before="40" w:after="40"/>
+        <w:ind w:firstLine="432"/>
+      </w:pPr>
+      <w:r>
+        <w:rPr>
+          <w:b w:val="0"/>
+          <w:i w:val="0"/>
+        </w:rPr>
+        <w:t xml:space="preserve">The stars stretched into white threads, and the </w:t>
+      </w:r>
+      <w:r>
+        <w:rPr>
+          <w:b w:val="0"/>
+          <w:i/>
+        </w:rPr>
+        <w:t>Fang &amp; Fable</w:t>
+      </w:r>
+      <w:r>
+        <w:rPr>
+          <w:b w:val="0"/>
+          <w:i w:val="0"/>
+        </w:rPr>
+        <w:t xml:space="preserve"> tore a hole through normal space.</w:t>
       </w:r>
     </w:p>
     <w:sectPr>

</xml_diff>

<commit_message>
Final cleanup pass on Chapters 7 and 8
1. Compress entity voice in Ch8 ~20%: argument stated once, then
   becomes pressure/weight/absence. Removed re-explanations, fear
   paragraph, Academy lesson elaboration. Kept the "I am alone" turn
   and fire metaphor.

2. Add three drift disruption moments to Ch7: Kael mishears Miro
   (answers a question not asked), flinches toward a deep-ocean signal
   mid-conversation with Sera, and sends a blurred narrow-channel
   pulse to Talon. Small, scattered, uncommented.

3. Remove one "It doesn't kill you" instance (Ch7 mid-chapter
   observation). Two appearances remain: Ch3 first description and
   Ch7 cliffhanger entity encounter. Motif, not tagline.

4. Mystery novel ending made less thematically perfect: lawyer
   confesses from exhaustion, not guilt. No speech, no revelation.
   Subtler mirror — things end because they run out of energy, not
   because they're solved.

https://claude.ai/code/session_01XVZGKMeTpqLFzCVEmX6JZq
</commit_message>
<xml_diff>
--- a/The_Wildtongue_Chronicles.docx
+++ b/The_Wildtongue_Chronicles.docx
@@ -11986,7 +11986,46 @@
           <w:b w:val="0"/>
           <w:i w:val="0"/>
         </w:rPr>
-        <w:t>"How long?" Kael asked.</w:t>
+        <w:t>"Can you offset the node with —" Kael started, then stopped. Miro was looking at him.</w:t>
+      </w:r>
+    </w:p>
+    <w:p>
+      <w:pPr>
+        <w:spacing w:before="40" w:after="40"/>
+        <w:ind w:firstLine="432"/>
+      </w:pPr>
+      <w:r>
+        <w:rPr>
+          <w:b w:val="0"/>
+          <w:i w:val="0"/>
+        </w:rPr>
+        <w:t>"I didn't ask anything," Miro said.</w:t>
+      </w:r>
+    </w:p>
+    <w:p>
+      <w:pPr>
+        <w:spacing w:before="40" w:after="40"/>
+        <w:ind w:firstLine="432"/>
+      </w:pPr>
+      <w:r>
+        <w:rPr>
+          <w:b w:val="0"/>
+          <w:i w:val="0"/>
+        </w:rPr>
+        <w:t>A beat of silence. Kael pressed a knuckle against his temple.</w:t>
+      </w:r>
+    </w:p>
+    <w:p>
+      <w:pPr>
+        <w:spacing w:before="40" w:after="40"/>
+        <w:ind w:firstLine="432"/>
+      </w:pPr>
+      <w:r>
+        <w:rPr>
+          <w:b w:val="0"/>
+          <w:i w:val="0"/>
+        </w:rPr>
+        <w:t>"Right. Sorry. How long?"</w:t>
       </w:r>
     </w:p>
     <w:p>
@@ -12157,6 +12196,33 @@
           <w:b w:val="0"/>
           <w:i w:val="0"/>
         </w:rPr>
+        <w:t xml:space="preserve">Kael's head turned — a sharp involuntary jerk toward the port bulkhead. Something deep in the ocean, below any range he'd had a week ago, had cut across his awareness and vanished. Miro glanced at him. Kael shook his head — </w:t>
+      </w:r>
+      <w:r>
+        <w:rPr>
+          <w:b w:val="0"/>
+          <w:i/>
+        </w:rPr>
+        <w:t>nothing</w:t>
+      </w:r>
+      <w:r>
+        <w:rPr>
+          <w:b w:val="0"/>
+          <w:i w:val="0"/>
+        </w:rPr>
+        <w:t xml:space="preserve"> — and looked back at Sera.</w:t>
+      </w:r>
+    </w:p>
+    <w:p>
+      <w:pPr>
+        <w:spacing w:before="40" w:after="40"/>
+        <w:ind w:firstLine="432"/>
+      </w:pPr>
+      <w:r>
+        <w:rPr>
+          <w:b w:val="0"/>
+          <w:i w:val="0"/>
+        </w:rPr>
         <w:t>"But." Sera set the display down. Wick shifted on the headrest, his amber eyes tracking her hands. "The Union has filed a counter-motion. They're invoking the Existential Defense Framework — Article One Hundred and Forty-Four of the Accord's emergency provisions. It's never been used. Not once, in the entire history of the Covenant."</w:t>
       </w:r>
     </w:p>
@@ -12786,19 +12852,6 @@
       <w:r>
         <w:rPr>
           <w:b w:val="0"/>
-          <w:i/>
-        </w:rPr>
-        <w:t>It doesn't kill you. It just makes you alone.</w:t>
-      </w:r>
-    </w:p>
-    <w:p>
-      <w:pPr>
-        <w:spacing w:before="40" w:after="40"/>
-        <w:ind w:firstLine="432"/>
-      </w:pPr>
-      <w:r>
-        <w:rPr>
-          <w:b w:val="0"/>
           <w:i w:val="0"/>
         </w:rPr>
         <w:t>And it was almost through.</w:t>
@@ -13199,7 +13252,34 @@
           <w:b w:val="0"/>
           <w:i w:val="0"/>
         </w:rPr>
-        <w:t xml:space="preserve">He looked at the hawk. She looked back. The new frequency — the </w:t>
+        <w:t xml:space="preserve">He looked at the hawk and pushed a narrow-channel pulse — the simple </w:t>
+      </w:r>
+      <w:r>
+        <w:rPr>
+          <w:b w:val="0"/>
+          <w:i/>
+        </w:rPr>
+        <w:t>I trust you</w:t>
+      </w:r>
+      <w:r>
+        <w:rPr>
+          <w:b w:val="0"/>
+          <w:i w:val="0"/>
+        </w:rPr>
+        <w:t xml:space="preserve"> he'd sent a thousand times. It came out wide, the focused beam scattering into overlapping harmonics. Talon received it but tilted her head — the look she gave him was the hawk equivalent of someone straining to parse a mumble.</w:t>
+      </w:r>
+    </w:p>
+    <w:p>
+      <w:pPr>
+        <w:spacing w:before="40" w:after="40"/>
+        <w:ind w:firstLine="432"/>
+      </w:pPr>
+      <w:r>
+        <w:rPr>
+          <w:b w:val="0"/>
+          <w:i w:val="0"/>
+        </w:rPr>
+        <w:t xml:space="preserve">She looked back. The new frequency — the </w:t>
       </w:r>
       <w:r>
         <w:rPr>
@@ -13954,20 +14034,20 @@
           <w:b w:val="0"/>
           <w:i/>
         </w:rPr>
-        <w:t>You are alone.</w:t>
-      </w:r>
-    </w:p>
-    <w:p>
-      <w:pPr>
-        <w:spacing w:before="40" w:after="40"/>
-        <w:ind w:firstLine="432"/>
-      </w:pPr>
-      <w:r>
-        <w:rPr>
-          <w:b w:val="0"/>
-          <w:i w:val="0"/>
-        </w:rPr>
-        <w:t>It worked through his mind the way water works through stone — not breaking, just finding every crack and filling it. Kael felt his memory of Talon's fledgling weight thin to almost nothing. The sound of Miro's laugh flattened into data. The Choir's song became geometry without warmth — architecture he could perceive but no longer feel.</w:t>
+        <w:t>You are alone. Connection is noise. The bonds you treasure are interference. Let them go. Let it all go quiet.</w:t>
+      </w:r>
+    </w:p>
+    <w:p>
+      <w:pPr>
+        <w:spacing w:before="40" w:after="40"/>
+        <w:ind w:firstLine="432"/>
+      </w:pPr>
+      <w:r>
+        <w:rPr>
+          <w:b w:val="0"/>
+          <w:i w:val="0"/>
+        </w:rPr>
+        <w:t>It worked through his mind the way water works through stone — not breaking, just finding every crack and filling it. His memory of Talon's fledgling weight thinned to almost nothing. Miro's laugh flattened into data. The Choir's song became geometry without warmth.</w:t>
       </w:r>
     </w:p>
     <w:p>
@@ -13991,302 +14071,263 @@
       <w:r>
         <w:rPr>
           <w:b w:val="0"/>
+          <w:i w:val="0"/>
+        </w:rPr>
+        <w:t>And Kael — inside the seal, inside the song, inside the silence that wanted to be the only thing left — did the only thing he had ever been trained to do.</w:t>
+      </w:r>
+    </w:p>
+    <w:p>
+      <w:pPr>
+        <w:spacing w:before="40" w:after="40"/>
+        <w:ind w:firstLine="432"/>
+      </w:pPr>
+      <w:r>
+        <w:rPr>
+          <w:b w:val="0"/>
+          <w:i w:val="0"/>
+        </w:rPr>
+        <w:t>He listened.</w:t>
+      </w:r>
+    </w:p>
+    <w:p>
+      <w:pPr>
+        <w:spacing w:before="40" w:after="40"/>
+        <w:ind w:firstLine="432"/>
+      </w:pPr>
+      <w:r>
+        <w:rPr>
+          <w:b w:val="0"/>
+          <w:i w:val="0"/>
+        </w:rPr>
+        <w:t>Not to the argument. To what was underneath. The way you listen past the words of a distress call to find the frequency beneath.</w:t>
+      </w:r>
+    </w:p>
+    <w:p>
+      <w:pPr>
+        <w:spacing w:before="40" w:after="40"/>
+        <w:ind w:firstLine="432"/>
+      </w:pPr>
+      <w:r>
+        <w:rPr>
+          <w:b w:val="0"/>
+          <w:i w:val="0"/>
+        </w:rPr>
+        <w:t>The entity was not attacking.</w:t>
+      </w:r>
+    </w:p>
+    <w:p>
+      <w:pPr>
+        <w:spacing w:before="40" w:after="40"/>
+        <w:ind w:firstLine="432"/>
+      </w:pPr>
+      <w:r>
+        <w:rPr>
+          <w:b w:val="0"/>
+          <w:i w:val="0"/>
+        </w:rPr>
+        <w:t>It was describing.</w:t>
+      </w:r>
+    </w:p>
+    <w:p>
+      <w:pPr>
+        <w:spacing w:before="40" w:after="40"/>
+        <w:ind w:firstLine="432"/>
+      </w:pPr>
+      <w:r>
+        <w:rPr>
+          <w:b w:val="0"/>
+          <w:i w:val="0"/>
+        </w:rPr>
+        <w:t>Itself.</w:t>
+      </w:r>
+    </w:p>
+    <w:p>
+      <w:pPr>
+        <w:spacing w:before="40" w:after="40"/>
+        <w:ind w:firstLine="432"/>
+      </w:pPr>
+      <w:r>
+        <w:rPr>
+          <w:b w:val="0"/>
+          <w:i w:val="0"/>
+        </w:rPr>
+        <w:t>Kael stopped resisting. Not surrender — something finer. He stopped pushing against the silence and let it be what it was. And in the space that opened, he heard the entity clearly for the first time.</w:t>
+      </w:r>
+    </w:p>
+    <w:p>
+      <w:pPr>
+        <w:spacing w:before="40" w:after="40"/>
+        <w:ind w:firstLine="432"/>
+      </w:pPr>
+      <w:r>
+        <w:rPr>
+          <w:b w:val="0"/>
+          <w:i w:val="0"/>
+        </w:rPr>
+        <w:t>It was alone. Not alone the way a person is alone in a room. Alone the way a law of physics is alone. Its nature was severance the way the Choir's nature was connection. Not a weapon. A condition. It did what it was. The way fire burns. The way silence spreads.</w:t>
+      </w:r>
+    </w:p>
+    <w:p>
+      <w:pPr>
+        <w:spacing w:before="40" w:after="40"/>
+        <w:ind w:firstLine="432"/>
+      </w:pPr>
+      <w:r>
+        <w:rPr>
+          <w:b w:val="0"/>
           <w:i/>
         </w:rPr>
-        <w:t>Connection is noise. The bonds you treasure are interference. Let them go. Let it all go quiet.</w:t>
-      </w:r>
-    </w:p>
-    <w:p>
-      <w:pPr>
-        <w:spacing w:before="40" w:after="40"/>
-        <w:ind w:firstLine="432"/>
-      </w:pPr>
-      <w:r>
-        <w:rPr>
-          <w:b w:val="0"/>
-          <w:i w:val="0"/>
-        </w:rPr>
-        <w:t>And Kael — inside the seal, inside the song, inside the silence that wanted to be the only thing left — did the only thing he had ever been trained to do.</w:t>
-      </w:r>
-    </w:p>
-    <w:p>
-      <w:pPr>
-        <w:spacing w:before="40" w:after="40"/>
-        <w:ind w:firstLine="432"/>
-      </w:pPr>
-      <w:r>
-        <w:rPr>
-          <w:b w:val="0"/>
-          <w:i w:val="0"/>
-        </w:rPr>
-        <w:t>He listened.</w:t>
-      </w:r>
-    </w:p>
-    <w:p>
-      <w:pPr>
-        <w:spacing w:before="40" w:after="40"/>
-        <w:ind w:firstLine="432"/>
-      </w:pPr>
-      <w:r>
-        <w:rPr>
-          <w:b w:val="0"/>
-          <w:i w:val="0"/>
-        </w:rPr>
-        <w:t>Not to the argument. To what was underneath. The way you listen past the words of a distress call to find the frequency beneath — the emotional architecture that tells you what the signal really means.</w:t>
-      </w:r>
-    </w:p>
-    <w:p>
-      <w:pPr>
-        <w:spacing w:before="40" w:after="40"/>
-        <w:ind w:firstLine="432"/>
-      </w:pPr>
-      <w:r>
-        <w:rPr>
-          <w:b w:val="0"/>
-          <w:i w:val="0"/>
-        </w:rPr>
-        <w:t>The Academy had taught him this with animals. With species so alien their cognition shared nothing with his own. First lesson: when you can't understand, listen harder. Second lesson: everything that communicates is telling you what it needs.</w:t>
-      </w:r>
-    </w:p>
-    <w:p>
-      <w:pPr>
-        <w:spacing w:before="40" w:after="40"/>
-        <w:ind w:firstLine="432"/>
-      </w:pPr>
-      <w:r>
-        <w:rPr>
-          <w:b w:val="0"/>
-          <w:i w:val="0"/>
-        </w:rPr>
-        <w:t>The entity was not attacking.</w:t>
-      </w:r>
-    </w:p>
-    <w:p>
-      <w:pPr>
-        <w:spacing w:before="40" w:after="40"/>
-        <w:ind w:firstLine="432"/>
-      </w:pPr>
-      <w:r>
-        <w:rPr>
-          <w:b w:val="0"/>
-          <w:i w:val="0"/>
-        </w:rPr>
-        <w:t>It was describing.</w:t>
-      </w:r>
-    </w:p>
-    <w:p>
-      <w:pPr>
-        <w:spacing w:before="40" w:after="40"/>
-        <w:ind w:firstLine="432"/>
-      </w:pPr>
-      <w:r>
-        <w:rPr>
-          <w:b w:val="0"/>
-          <w:i w:val="0"/>
-        </w:rPr>
-        <w:t>Itself.</w:t>
-      </w:r>
-    </w:p>
-    <w:p>
-      <w:pPr>
-        <w:spacing w:before="40" w:after="40"/>
-        <w:ind w:firstLine="432"/>
-      </w:pPr>
-      <w:r>
-        <w:rPr>
-          <w:b w:val="0"/>
-          <w:i w:val="0"/>
-        </w:rPr>
-        <w:t>Kael stopped resisting. Not surrender — something finer than that. He stopped pushing against the silence and let it be what it was. And in the space that opened between effort and its absence, he heard the entity clearly for the first time.</w:t>
-      </w:r>
-    </w:p>
-    <w:p>
-      <w:pPr>
-        <w:spacing w:before="40" w:after="40"/>
-        <w:ind w:firstLine="432"/>
-      </w:pPr>
-      <w:r>
-        <w:rPr>
-          <w:b w:val="0"/>
-          <w:i w:val="0"/>
-        </w:rPr>
-        <w:t>It was alone.</w:t>
-      </w:r>
-    </w:p>
-    <w:p>
-      <w:pPr>
-        <w:spacing w:before="40" w:after="40"/>
-        <w:ind w:firstLine="432"/>
-      </w:pPr>
-      <w:r>
-        <w:rPr>
-          <w:b w:val="0"/>
-          <w:i w:val="0"/>
-        </w:rPr>
-        <w:t>Not alone the way a person is alone in a room. Alone the way a law of physics is alone. Fundamental. Structural. Unchangeable. Its nature was severance the way the Choir's nature was connection. Not a weapon. A condition. It did what it was. The way fire burns. The way silence spreads.</w:t>
-      </w:r>
-    </w:p>
-    <w:p>
-      <w:pPr>
-        <w:spacing w:before="40" w:after="40"/>
-        <w:ind w:firstLine="432"/>
-      </w:pPr>
-      <w:r>
-        <w:rPr>
-          <w:b w:val="0"/>
-          <w:i w:val="0"/>
-        </w:rPr>
-        <w:t>And beneath the isolation — so far down that millennia of contact with the Choir's seal had never reached it — the entity was afraid. Not of the Choir. Not of Kael. Afraid of its own permanence. The deep, wordless terror of a thing that cannot change, cannot reach, cannot touch, and knows this with the clarity of an intelligence older than light.</w:t>
-      </w:r>
-    </w:p>
-    <w:p>
-      <w:pPr>
-        <w:spacing w:before="40" w:after="40"/>
-        <w:ind w:firstLine="432"/>
-      </w:pPr>
+        <w:t>You are alone</w:t>
+      </w:r>
+      <w:r>
+        <w:rPr>
+          <w:b w:val="0"/>
+          <w:i w:val="0"/>
+        </w:rPr>
+        <w:t>, it said.</w:t>
+      </w:r>
+    </w:p>
+    <w:p>
+      <w:pPr>
+        <w:spacing w:before="40" w:after="40"/>
+        <w:ind w:firstLine="432"/>
+      </w:pPr>
+      <w:r>
+        <w:rPr>
+          <w:b w:val="0"/>
+          <w:i w:val="0"/>
+        </w:rPr>
+        <w:t xml:space="preserve">But what Kael heard, underneath, in the frequency beneath the frequency, was: </w:t>
+      </w:r>
       <w:r>
         <w:rPr>
           <w:b w:val="0"/>
           <w:i/>
         </w:rPr>
-        <w:t>You are alone</w:t>
-      </w:r>
-      <w:r>
-        <w:rPr>
-          <w:b w:val="0"/>
-          <w:i w:val="0"/>
-        </w:rPr>
-        <w:t>, it said.</w:t>
-      </w:r>
-    </w:p>
-    <w:p>
-      <w:pPr>
-        <w:spacing w:before="40" w:after="40"/>
-        <w:ind w:firstLine="432"/>
-      </w:pPr>
-      <w:r>
-        <w:rPr>
-          <w:b w:val="0"/>
-          <w:i w:val="0"/>
-        </w:rPr>
-        <w:t xml:space="preserve">But what Kael heard, underneath, in the frequency beneath the frequency, was: </w:t>
+        <w:t>I am alone. I am alone. I am alone.</w:t>
+      </w:r>
+    </w:p>
+    <w:p>
+      <w:pPr>
+        <w:spacing w:before="40" w:after="40"/>
+        <w:ind w:firstLine="432"/>
+      </w:pPr>
+      <w:r>
+        <w:rPr>
+          <w:b w:val="0"/>
+          <w:i w:val="0"/>
+        </w:rPr>
+        <w:t>This didn't make it less dangerous. A fire that burns because burning is its nature is still a fire. You don't fight it with anger. You fight it with a threshold — a line where burning meets not-burning and neither crosses.</w:t>
+      </w:r>
+    </w:p>
+    <w:p>
+      <w:pPr>
+        <w:spacing w:before="40" w:after="40"/>
+        <w:ind w:firstLine="432"/>
+      </w:pPr>
+      <w:r>
+        <w:rPr>
+          <w:b w:val="0"/>
+          <w:i w:val="0"/>
+        </w:rPr>
+        <w:t>The Note Between had understood this. The name itself said it — the voice that held the interval. Not resolving dissonance. Holding the space where dissonance and harmony met without either one consuming the other.</w:t>
+      </w:r>
+    </w:p>
+    <w:p>
+      <w:pPr>
+        <w:spacing w:before="40" w:after="40"/>
+        <w:ind w:firstLine="432"/>
+      </w:pPr>
+      <w:r>
+        <w:rPr>
+          <w:b w:val="0"/>
+          <w:i w:val="0"/>
+        </w:rPr>
+        <w:t>The seal didn't need to be a wall. Walls crack. Walls have gaps. A threshold holds because both sides lean against it.</w:t>
+      </w:r>
+    </w:p>
+    <w:p>
+      <w:pPr>
+        <w:spacing w:before="40" w:after="40"/>
+        <w:ind w:firstLine="432"/>
+      </w:pPr>
+      <w:r>
+        <w:rPr>
+          <w:b w:val="0"/>
+          <w:i w:val="0"/>
+        </w:rPr>
+        <w:t>Kael let his frequency settle into the space between — the Choir's connection on one side, the entity's isolation on the other — and he held. Not with force. With presence.</w:t>
+      </w:r>
+    </w:p>
+    <w:p>
+      <w:pPr>
+        <w:spacing w:before="40" w:after="40"/>
+        <w:ind w:firstLine="432"/>
+      </w:pPr>
+      <w:r>
+        <w:rPr>
+          <w:b w:val="0"/>
+          <w:i w:val="0"/>
+        </w:rPr>
+        <w:t>The entity pressed.</w:t>
+      </w:r>
+    </w:p>
+    <w:p>
+      <w:pPr>
+        <w:spacing w:before="40" w:after="40"/>
+        <w:ind w:firstLine="432"/>
+      </w:pPr>
+      <w:r>
+        <w:rPr>
+          <w:b w:val="0"/>
+          <w:i w:val="0"/>
+        </w:rPr>
+        <w:t>Kael held.</w:t>
+      </w:r>
+    </w:p>
+    <w:p>
+      <w:pPr>
+        <w:spacing w:before="40" w:after="40"/>
+        <w:ind w:firstLine="432"/>
+      </w:pPr>
+      <w:r>
+        <w:rPr>
+          <w:b w:val="0"/>
+          <w:i w:val="0"/>
+        </w:rPr>
+        <w:t>The entity pressed harder.</w:t>
+      </w:r>
+    </w:p>
+    <w:p>
+      <w:pPr>
+        <w:spacing w:before="40" w:after="40"/>
+        <w:ind w:firstLine="432"/>
+      </w:pPr>
+      <w:r>
+        <w:rPr>
+          <w:b w:val="0"/>
+          <w:i w:val="0"/>
+        </w:rPr>
+        <w:t>Kael held. Not because he was strong enough. Because holding was what thresholds do.</w:t>
+      </w:r>
+    </w:p>
+    <w:p>
+      <w:pPr>
+        <w:spacing w:before="40" w:after="40"/>
+        <w:ind w:firstLine="432"/>
+      </w:pPr>
+      <w:r>
+        <w:rPr>
+          <w:b w:val="0"/>
+          <w:i w:val="0"/>
+        </w:rPr>
+        <w:t xml:space="preserve">The seal stabilized. Not locked, not rigid — </w:t>
       </w:r>
       <w:r>
         <w:rPr>
           <w:b w:val="0"/>
           <w:i/>
         </w:rPr>
-        <w:t>I am alone. I am alone. I am alone.</w:t>
-      </w:r>
-    </w:p>
-    <w:p>
-      <w:pPr>
-        <w:spacing w:before="40" w:after="40"/>
-        <w:ind w:firstLine="432"/>
-      </w:pPr>
-      <w:r>
-        <w:rPr>
-          <w:b w:val="0"/>
-          <w:i w:val="0"/>
-        </w:rPr>
-        <w:t>This didn't make it less dangerous. A fire that burns because burning is its nature is still a fire. You don't fight it with anger. You fight it with a threshold — a line where burning meets not-burning and neither crosses.</w:t>
-      </w:r>
-    </w:p>
-    <w:p>
-      <w:pPr>
-        <w:spacing w:before="40" w:after="40"/>
-        <w:ind w:firstLine="432"/>
-      </w:pPr>
-      <w:r>
-        <w:rPr>
-          <w:b w:val="0"/>
-          <w:i w:val="0"/>
-        </w:rPr>
-        <w:t>The Note Between had understood this. The name itself said it — the voice that held the interval, the frequency between two others. Not resolving dissonance. Not eliminating it. Holding the space where dissonance and harmony met without either one consuming the other.</w:t>
-      </w:r>
-    </w:p>
-    <w:p>
-      <w:pPr>
-        <w:spacing w:before="40" w:after="40"/>
-        <w:ind w:firstLine="432"/>
-      </w:pPr>
-      <w:r>
-        <w:rPr>
-          <w:b w:val="0"/>
-          <w:i w:val="0"/>
-        </w:rPr>
-        <w:t>The seal didn't need to be a wall. Walls crack. Walls have gaps. A threshold holds because both sides lean against it.</w:t>
-      </w:r>
-    </w:p>
-    <w:p>
-      <w:pPr>
-        <w:spacing w:before="40" w:after="40"/>
-        <w:ind w:firstLine="432"/>
-      </w:pPr>
-      <w:r>
-        <w:rPr>
-          <w:b w:val="0"/>
-          <w:i w:val="0"/>
-        </w:rPr>
-        <w:t>Kael let his frequency settle into the space between — the Choir's connection on one side, the entity's isolation on the other — and he held. Not with force. With presence. The way you hold a doorframe. The way a frequency holds the space between silence and sound.</w:t>
-      </w:r>
-    </w:p>
-    <w:p>
-      <w:pPr>
-        <w:spacing w:before="40" w:after="40"/>
-        <w:ind w:firstLine="432"/>
-      </w:pPr>
-      <w:r>
-        <w:rPr>
-          <w:b w:val="0"/>
-          <w:i w:val="0"/>
-        </w:rPr>
-        <w:t>The entity pressed.</w:t>
-      </w:r>
-    </w:p>
-    <w:p>
-      <w:pPr>
-        <w:spacing w:before="40" w:after="40"/>
-        <w:ind w:firstLine="432"/>
-      </w:pPr>
-      <w:r>
-        <w:rPr>
-          <w:b w:val="0"/>
-          <w:i w:val="0"/>
-        </w:rPr>
-        <w:t>Kael held.</w:t>
-      </w:r>
-    </w:p>
-    <w:p>
-      <w:pPr>
-        <w:spacing w:before="40" w:after="40"/>
-        <w:ind w:firstLine="432"/>
-      </w:pPr>
-      <w:r>
-        <w:rPr>
-          <w:b w:val="0"/>
-          <w:i w:val="0"/>
-        </w:rPr>
-        <w:t>The entity pressed harder — and Kael felt it, the full weight of something that had been alone since before the first star burned, pressing against a single human mind the way an ocean presses against a stone. He held. Not because he was strong enough. Because holding was what thresholds do.</w:t>
-      </w:r>
-    </w:p>
-    <w:p>
-      <w:pPr>
-        <w:spacing w:before="40" w:after="40"/>
-        <w:ind w:firstLine="432"/>
-      </w:pPr>
-      <w:r>
-        <w:rPr>
-          <w:b w:val="0"/>
-          <w:i w:val="0"/>
-        </w:rPr>
-        <w:t xml:space="preserve">The seal stabilized. Not locked, not rigid — </w:t>
-      </w:r>
-      <w:r>
-        <w:rPr>
-          <w:b w:val="0"/>
-          <w:i/>
-        </w:rPr>
         <w:t>balanced</w:t>
       </w:r>
       <w:r>
@@ -14294,20 +14335,20 @@
           <w:b w:val="0"/>
           <w:i w:val="0"/>
         </w:rPr>
-        <w:t>. The harmonic variance didn't drop to zero. It found equilibrium. A living tension. The kind of structure that holds not because it's unbreakable but because it's in constant, honest negotiation with the forces on either side.</w:t>
-      </w:r>
-    </w:p>
-    <w:p>
-      <w:pPr>
-        <w:spacing w:before="40" w:after="40"/>
-        <w:ind w:firstLine="432"/>
-      </w:pPr>
-      <w:r>
-        <w:rPr>
-          <w:b w:val="0"/>
-          <w:i w:val="0"/>
-        </w:rPr>
-        <w:t>The entity's presence dimmed. Not defeated. Not gone. Met. For the first time in its existence, something had heard it and held the line not with opposition but with understanding, and it had no framework for what that meant.</w:t>
+        <w:t>. A living tension between forces that would never resolve, only negotiate.</w:t>
+      </w:r>
+    </w:p>
+    <w:p>
+      <w:pPr>
+        <w:spacing w:before="40" w:after="40"/>
+        <w:ind w:firstLine="432"/>
+      </w:pPr>
+      <w:r>
+        <w:rPr>
+          <w:b w:val="0"/>
+          <w:i w:val="0"/>
+        </w:rPr>
+        <w:t>The entity's presence dimmed. Not defeated. Not gone. Met.</w:t>
       </w:r>
     </w:p>
     <w:p>
@@ -15531,20 +15572,20 @@
           <w:b w:val="0"/>
           <w:i w:val="0"/>
         </w:rPr>
-        <w:t>The detective confronted the lawyer in the clock tower. There was a speech about justice. A gunshot that turned out to be a clock striking midnight. The lawyer confessed — not because the evidence was overwhelming but because the detective had listened long enough to hear the guilt underneath the argument. The detective walked out into the rain and said something about truth being the only frequency that doesn't decay, which was the kind of line that only worked in novels and sounded better than it held up.</w:t>
-      </w:r>
-    </w:p>
-    <w:p>
-      <w:pPr>
-        <w:spacing w:before="40" w:after="40"/>
-        <w:ind w:firstLine="432"/>
-      </w:pPr>
-      <w:r>
-        <w:rPr>
-          <w:b w:val="0"/>
-          <w:i w:val="0"/>
-        </w:rPr>
-        <w:t>He closed the book. Set it on the console. Done. Maybe he'd find another on the next station. Something longer. Something without a detective — he'd had enough of impossible cases for a while.</w:t>
+        <w:t>The detective confronted the lawyer in the clock tower. The clock struck midnight. The lawyer confessed — not out of guilt, not because the evidence cornered him, but because he was tired. Done lying. That was it. No speech. No revelation. The detective stood there in the rain and the novel ended, and Kael sat for a moment with the mild dissatisfaction of a man who'd carried a book across six systems for an ending that simply stopped.</w:t>
+      </w:r>
+    </w:p>
+    <w:p>
+      <w:pPr>
+        <w:spacing w:before="40" w:after="40"/>
+        <w:ind w:firstLine="432"/>
+      </w:pPr>
+      <w:r>
+        <w:rPr>
+          <w:b w:val="0"/>
+          <w:i w:val="0"/>
+        </w:rPr>
+        <w:t>He closed the book. Set it on the console. Maybe he'd find another on the next station. Something longer.</w:t>
       </w:r>
     </w:p>
     <w:p>

</xml_diff>

<commit_message>
Regenerate docx and pdf with cleaned chapter files
Rebuilt both output files after removing leftover [MOTIF] editorial tags
from chapters 3, 4, and 6.

https://claude.ai/code/session_01XVZGKMeTpqLFzCVEmX6JZq
</commit_message>
<xml_diff>
--- a/The_Wildtongue_Chronicles.docx
+++ b/The_Wildtongue_Chronicles.docx
@@ -2624,7 +2624,7 @@
           <w:b w:val="0"/>
           <w:i w:val="0"/>
         </w:rPr>
-        <w:t>The weight of their consciousness pressed against his skull the way the ocean pressed against the hull — just pressure, applied from a different direction, and it didn't matter which kind when you were the thing being crushed. [MOTIF]</w:t>
+        <w:t>The weight of their consciousness pressed against his skull the way the ocean pressed against the hull — just pressure, applied from a different direction, and it didn't matter which kind when you were the thing being crushed.</w:t>
       </w:r>
     </w:p>
     <w:p>
@@ -5078,7 +5078,7 @@
           <w:b w:val="0"/>
           <w:i w:val="0"/>
         </w:rPr>
-        <w:t>Sera's jaw tightened. Kael watched her weigh it — the law against the living, the procedure against the ticking clock. Two pressures. She stood between them and didn't move. [MOTIF] He'd seen that look before, on the faces of people who believed in systems.</w:t>
+        <w:t>Sera's jaw tightened. Kael watched her weigh it — the law against the living, the procedure against the ticking clock. Two pressures. She stood between them and didn't move. He'd seen that look before, on the faces of people who believed in systems.</w:t>
       </w:r>
     </w:p>
     <w:p>
@@ -10541,7 +10541,7 @@
           <w:b w:val="0"/>
           <w:i w:val="0"/>
         </w:rPr>
-        <w:t xml:space="preserve">, according to Sera's tactical feed — changed tactics. Instead of firing through the harmonic wall, it began to circle, searching for a gap. Pressure always found the weak point. [MOTIF] The wall couldn't be everywhere at once. The deep listeners had to concentrate their strength, and the Choir had to maintain their position above the rift. There were flanks. There were angles. And the </w:t>
+        <w:t xml:space="preserve">, according to Sera's tactical feed — changed tactics. Instead of firing through the harmonic wall, it began to circle, searching for a gap. Pressure always found the weak point. The wall couldn't be everywhere at once. The deep listeners had to concentrate their strength, and the Choir had to maintain their position above the rift. There were flanks. There were angles. And the </w:t>
       </w:r>
       <w:r>
         <w:rPr>

</xml_diff>